<commit_message>
Curso em Vídeo - Adicionando um novo código na apostila
</commit_message>
<xml_diff>
--- a/Curso de Banco de Dados Curso em Vídeo/Comandos MySQL.docx
+++ b/Curso de Banco de Dados Curso em Vídeo/Comandos MySQL.docx
@@ -17782,2066 +17782,2303 @@
         </w:rPr>
         <w:t>Comando utilizado para fazer uma consulta na tabela de dados de uma coluna específica que tenham letras específicas no começo e no final e depois da letra final tenham números ou caracteres.</w:t>
       </w:r>
+    </w:p>
+    <w:p>
+      <w:pPr>
+        <w:jc w:val="left"/>
+        <w:rPr>
+          <w:rFonts w:hint="default" w:ascii="Bahnschrift Light SemiCondensed" w:hAnsi="Bahnschrift Light SemiCondensed"/>
+          <w:b w:val="0"/>
+          <w:bCs w:val="0"/>
+          <w:i w:val="0"/>
+          <w:iCs w:val="0"/>
+          <w:color w:val="auto"/>
+          <w:sz w:val="24"/>
+          <w:szCs w:val="24"/>
+          <w:u w:val="none"/>
+          <w:lang w:val="pt-BR"/>
+        </w:rPr>
+      </w:pPr>
+    </w:p>
+    <w:p>
+      <w:pPr>
+        <w:jc w:val="left"/>
+        <w:rPr>
+          <w:rFonts w:hint="default" w:ascii="Bahnschrift Light SemiCondensed" w:hAnsi="Bahnschrift Light SemiCondensed"/>
+          <w:b w:val="0"/>
+          <w:bCs w:val="0"/>
+          <w:i w:val="0"/>
+          <w:iCs w:val="0"/>
+          <w:color w:val="auto"/>
+          <w:sz w:val="24"/>
+          <w:szCs w:val="24"/>
+          <w:u w:val="none"/>
+          <w:lang w:val="pt-BR"/>
+        </w:rPr>
+      </w:pPr>
+    </w:p>
+    <w:p>
+      <w:pPr>
+        <w:jc w:val="left"/>
+        <w:rPr>
+          <w:rFonts w:hint="default" w:ascii="Bahnschrift Light SemiCondensed" w:hAnsi="Bahnschrift Light SemiCondensed"/>
+          <w:b/>
+          <w:bCs/>
+          <w:i w:val="0"/>
+          <w:iCs w:val="0"/>
+          <w:color w:val="auto"/>
+          <w:sz w:val="24"/>
+          <w:szCs w:val="24"/>
+          <w:u w:val="none"/>
+          <w:lang w:val="pt-BR"/>
+        </w:rPr>
+      </w:pPr>
+      <w:r>
+        <w:rPr>
+          <w:rFonts w:hint="default" w:ascii="Bahnschrift Light SemiCondensed" w:hAnsi="Bahnschrift Light SemiCondensed"/>
+          <w:b/>
+          <w:bCs/>
+          <w:i w:val="0"/>
+          <w:iCs w:val="0"/>
+          <w:color w:val="auto"/>
+          <w:sz w:val="24"/>
+          <w:szCs w:val="24"/>
+          <w:u w:val="none"/>
+          <w:lang w:val="pt-BR"/>
+        </w:rPr>
+        <w:t xml:space="preserve">SELECT * FROM </w:t>
+      </w:r>
+      <w:r>
+        <w:rPr>
+          <w:rFonts w:hint="default" w:ascii="Bahnschrift Light SemiCondensed" w:hAnsi="Bahnschrift Light SemiCondensed"/>
+          <w:b w:val="0"/>
+          <w:bCs w:val="0"/>
+          <w:i w:val="0"/>
+          <w:iCs w:val="0"/>
+          <w:color w:val="auto"/>
+          <w:sz w:val="24"/>
+          <w:szCs w:val="24"/>
+          <w:u w:val="single"/>
+          <w:lang w:val="pt-BR"/>
+        </w:rPr>
+        <w:t>nome_da_tabela</w:t>
+      </w:r>
+    </w:p>
+    <w:p>
+      <w:pPr>
+        <w:jc w:val="left"/>
+        <w:rPr>
+          <w:rFonts w:hint="default" w:ascii="Bahnschrift Light SemiCondensed" w:hAnsi="Bahnschrift Light SemiCondensed"/>
+          <w:b w:val="0"/>
+          <w:bCs w:val="0"/>
+          <w:i w:val="0"/>
+          <w:iCs w:val="0"/>
+          <w:color w:val="auto"/>
+          <w:sz w:val="24"/>
+          <w:szCs w:val="24"/>
+          <w:u w:val="none"/>
+          <w:lang w:val="pt-BR"/>
+        </w:rPr>
+      </w:pPr>
+      <w:r>
+        <w:rPr>
+          <w:rFonts w:hint="default" w:ascii="Bahnschrift Light SemiCondensed" w:hAnsi="Bahnschrift Light SemiCondensed"/>
+          <w:b/>
+          <w:bCs/>
+          <w:i w:val="0"/>
+          <w:iCs w:val="0"/>
+          <w:color w:val="auto"/>
+          <w:sz w:val="24"/>
+          <w:szCs w:val="24"/>
+          <w:u w:val="none"/>
+          <w:lang w:val="pt-BR"/>
+        </w:rPr>
+        <w:t xml:space="preserve">WHERE </w:t>
+      </w:r>
+      <w:r>
+        <w:rPr>
+          <w:rFonts w:hint="default" w:ascii="Bahnschrift Light SemiCondensed" w:hAnsi="Bahnschrift Light SemiCondensed"/>
+          <w:b w:val="0"/>
+          <w:bCs w:val="0"/>
+          <w:i w:val="0"/>
+          <w:iCs w:val="0"/>
+          <w:color w:val="auto"/>
+          <w:sz w:val="24"/>
+          <w:szCs w:val="24"/>
+          <w:u w:val="single"/>
+          <w:lang w:val="pt-BR"/>
+        </w:rPr>
+        <w:t>coluna_da_tabela</w:t>
+      </w:r>
+      <w:r>
+        <w:rPr>
+          <w:rFonts w:hint="default" w:ascii="Bahnschrift Light SemiCondensed" w:hAnsi="Bahnschrift Light SemiCondensed"/>
+          <w:b w:val="0"/>
+          <w:bCs w:val="0"/>
+          <w:i w:val="0"/>
+          <w:iCs w:val="0"/>
+          <w:color w:val="auto"/>
+          <w:sz w:val="24"/>
+          <w:szCs w:val="24"/>
+          <w:u w:val="none"/>
+          <w:lang w:val="pt-BR"/>
+        </w:rPr>
+        <w:t xml:space="preserve"> </w:t>
+      </w:r>
+      <w:r>
+        <w:rPr>
+          <w:rFonts w:hint="default" w:ascii="Bahnschrift Light SemiCondensed" w:hAnsi="Bahnschrift Light SemiCondensed"/>
+          <w:b/>
+          <w:bCs/>
+          <w:i w:val="0"/>
+          <w:iCs w:val="0"/>
+          <w:color w:val="auto"/>
+          <w:sz w:val="24"/>
+          <w:szCs w:val="24"/>
+          <w:u w:val="none"/>
+          <w:lang w:val="pt-BR"/>
+        </w:rPr>
+        <w:t xml:space="preserve">LIKE </w:t>
+      </w:r>
+      <w:r>
+        <w:rPr>
+          <w:rFonts w:hint="default" w:ascii="Bahnschrift Light SemiCondensed" w:hAnsi="Bahnschrift Light SemiCondensed"/>
+          <w:b w:val="0"/>
+          <w:bCs w:val="0"/>
+          <w:i w:val="0"/>
+          <w:iCs w:val="0"/>
+          <w:color w:val="auto"/>
+          <w:sz w:val="24"/>
+          <w:szCs w:val="24"/>
+          <w:u w:val="single"/>
+          <w:lang w:val="pt-BR"/>
+        </w:rPr>
+        <w:t>‘letras(intervalo de letras)letras%’</w:t>
+      </w:r>
+      <w:r>
+        <w:rPr>
+          <w:rFonts w:hint="default" w:ascii="Bahnschrift Light SemiCondensed" w:hAnsi="Bahnschrift Light SemiCondensed"/>
+          <w:b w:val="0"/>
+          <w:bCs w:val="0"/>
+          <w:i w:val="0"/>
+          <w:iCs w:val="0"/>
+          <w:color w:val="auto"/>
+          <w:sz w:val="24"/>
+          <w:szCs w:val="24"/>
+          <w:u w:val="none"/>
+          <w:lang w:val="pt-BR"/>
+        </w:rPr>
+        <w:t xml:space="preserve"> </w:t>
+      </w:r>
+      <w:r>
+        <w:rPr>
+          <w:rFonts w:hint="default" w:ascii="Bahnschrift Light SemiCondensed" w:hAnsi="Bahnschrift Light SemiCondensed"/>
+          <w:b/>
+          <w:bCs/>
+          <w:i w:val="0"/>
+          <w:iCs w:val="0"/>
+          <w:color w:val="auto"/>
+          <w:sz w:val="24"/>
+          <w:szCs w:val="24"/>
+          <w:u w:val="none"/>
+          <w:lang w:val="pt-BR"/>
+        </w:rPr>
+        <w:t>;</w:t>
+      </w:r>
+      <w:r>
+        <w:rPr>
+          <w:rFonts w:hint="default" w:ascii="Bahnschrift Light SemiCondensed" w:hAnsi="Bahnschrift Light SemiCondensed"/>
+          <w:b w:val="0"/>
+          <w:bCs w:val="0"/>
+          <w:i w:val="0"/>
+          <w:iCs w:val="0"/>
+          <w:color w:val="auto"/>
+          <w:sz w:val="24"/>
+          <w:szCs w:val="24"/>
+          <w:u w:val="none"/>
+          <w:lang w:val="pt-BR"/>
+        </w:rPr>
+        <w:tab/>
+      </w:r>
+      <w:r>
+        <w:rPr>
+          <w:rFonts w:hint="default" w:ascii="Bahnschrift Light SemiCondensed" w:hAnsi="Bahnschrift Light SemiCondensed"/>
+          <w:b w:val="0"/>
+          <w:bCs w:val="0"/>
+          <w:i w:val="0"/>
+          <w:iCs w:val="0"/>
+          <w:color w:val="auto"/>
+          <w:sz w:val="24"/>
+          <w:szCs w:val="24"/>
+          <w:u w:val="none"/>
+          <w:lang w:val="pt-BR"/>
+        </w:rPr>
+        <w:tab/>
+      </w:r>
+      <w:r>
+        <w:rPr>
+          <w:rFonts w:hint="default" w:ascii="Bahnschrift Light SemiCondensed" w:hAnsi="Bahnschrift Light SemiCondensed"/>
+          <w:b w:val="0"/>
+          <w:bCs w:val="0"/>
+          <w:i w:val="0"/>
+          <w:iCs w:val="0"/>
+          <w:color w:val="auto"/>
+          <w:sz w:val="24"/>
+          <w:szCs w:val="24"/>
+          <w:u w:val="none"/>
+          <w:lang w:val="pt-BR"/>
+        </w:rPr>
+        <w:tab/>
+      </w:r>
+      <w:r>
+        <w:rPr>
+          <w:rFonts w:hint="default" w:ascii="Bahnschrift Light SemiCondensed" w:hAnsi="Bahnschrift Light SemiCondensed"/>
+          <w:b w:val="0"/>
+          <w:bCs w:val="0"/>
+          <w:i w:val="0"/>
+          <w:iCs w:val="0"/>
+          <w:color w:val="auto"/>
+          <w:sz w:val="24"/>
+          <w:szCs w:val="24"/>
+          <w:u w:val="none"/>
+          <w:lang w:val="pt-BR"/>
+        </w:rPr>
+        <w:tab/>
+      </w:r>
+      <w:r>
+        <w:rPr>
+          <w:rFonts w:hint="default" w:ascii="Bahnschrift Light SemiCondensed" w:hAnsi="Bahnschrift Light SemiCondensed"/>
+          <w:b w:val="0"/>
+          <w:bCs w:val="0"/>
+          <w:i w:val="0"/>
+          <w:iCs w:val="0"/>
+          <w:color w:val="auto"/>
+          <w:sz w:val="24"/>
+          <w:szCs w:val="24"/>
+          <w:u w:val="none"/>
+          <w:lang w:val="pt-BR"/>
+        </w:rPr>
+        <w:tab/>
+      </w:r>
+      <w:r>
+        <w:rPr>
+          <w:rFonts w:hint="default" w:ascii="Bahnschrift Light SemiCondensed" w:hAnsi="Bahnschrift Light SemiCondensed"/>
+          <w:b w:val="0"/>
+          <w:bCs w:val="0"/>
+          <w:i w:val="0"/>
+          <w:iCs w:val="0"/>
+          <w:color w:val="auto"/>
+          <w:sz w:val="24"/>
+          <w:szCs w:val="24"/>
+          <w:u w:val="none"/>
+          <w:lang w:val="pt-BR"/>
+        </w:rPr>
+        <w:t>→</w:t>
+      </w:r>
+    </w:p>
+    <w:p>
+      <w:pPr>
+        <w:jc w:val="left"/>
+        <w:rPr>
+          <w:rFonts w:hint="default" w:ascii="Bahnschrift Light SemiCondensed" w:hAnsi="Bahnschrift Light SemiCondensed"/>
+          <w:b w:val="0"/>
+          <w:bCs w:val="0"/>
+          <w:i w:val="0"/>
+          <w:iCs w:val="0"/>
+          <w:color w:val="auto"/>
+          <w:sz w:val="24"/>
+          <w:szCs w:val="24"/>
+          <w:u w:val="none"/>
+          <w:lang w:val="pt-BR"/>
+        </w:rPr>
+      </w:pPr>
+    </w:p>
+    <w:p>
+      <w:pPr>
+        <w:jc w:val="left"/>
+        <w:rPr>
+          <w:rFonts w:hint="default" w:ascii="Bahnschrift Light SemiCondensed" w:hAnsi="Bahnschrift Light SemiCondensed"/>
+          <w:b w:val="0"/>
+          <w:bCs w:val="0"/>
+          <w:i w:val="0"/>
+          <w:iCs w:val="0"/>
+          <w:color w:val="auto"/>
+          <w:sz w:val="24"/>
+          <w:szCs w:val="24"/>
+          <w:u w:val="none"/>
+          <w:lang w:val="pt-BR"/>
+        </w:rPr>
+      </w:pPr>
+    </w:p>
+    <w:p>
+      <w:pPr>
+        <w:jc w:val="left"/>
+        <w:rPr>
+          <w:rFonts w:hint="default" w:ascii="Bahnschrift Light SemiCondensed" w:hAnsi="Bahnschrift Light SemiCondensed"/>
+          <w:b w:val="0"/>
+          <w:bCs w:val="0"/>
+          <w:i w:val="0"/>
+          <w:iCs w:val="0"/>
+          <w:color w:val="auto"/>
+          <w:sz w:val="24"/>
+          <w:szCs w:val="24"/>
+          <w:u w:val="none"/>
+          <w:lang w:val="pt-BR"/>
+        </w:rPr>
+      </w:pPr>
+      <w:r>
+        <w:rPr>
+          <w:rFonts w:hint="default" w:ascii="Bahnschrift Light SemiCondensed" w:hAnsi="Bahnschrift Light SemiCondensed"/>
+          <w:b w:val="0"/>
+          <w:bCs w:val="0"/>
+          <w:i w:val="0"/>
+          <w:iCs w:val="0"/>
+          <w:color w:val="auto"/>
+          <w:sz w:val="24"/>
+          <w:szCs w:val="24"/>
+          <w:u w:val="none"/>
+          <w:lang w:val="pt-BR"/>
+        </w:rPr>
+        <w:tab/>
+      </w:r>
+      <w:r>
+        <w:rPr>
+          <w:rFonts w:hint="default" w:ascii="Bahnschrift Light SemiCondensed" w:hAnsi="Bahnschrift Light SemiCondensed"/>
+          <w:b w:val="0"/>
+          <w:bCs w:val="0"/>
+          <w:i w:val="0"/>
+          <w:iCs w:val="0"/>
+          <w:color w:val="auto"/>
+          <w:sz w:val="24"/>
+          <w:szCs w:val="24"/>
+          <w:u w:val="none"/>
+          <w:lang w:val="pt-BR"/>
+        </w:rPr>
+        <w:tab/>
+      </w:r>
+      <w:r>
+        <w:rPr>
+          <w:rFonts w:hint="default" w:ascii="Bahnschrift Light SemiCondensed" w:hAnsi="Bahnschrift Light SemiCondensed"/>
+          <w:b w:val="0"/>
+          <w:bCs w:val="0"/>
+          <w:i w:val="0"/>
+          <w:iCs w:val="0"/>
+          <w:color w:val="auto"/>
+          <w:sz w:val="24"/>
+          <w:szCs w:val="24"/>
+          <w:u w:val="none"/>
+          <w:lang w:val="pt-BR"/>
+        </w:rPr>
+        <w:t>Comando utilizado para fazer uma consulta na tabela de dados de uma coluna específica que tenham letras específicas no começo, um intervalo de letras e após outra letra ou um conjunto de letras específicos.</w:t>
+      </w:r>
+    </w:p>
+    <w:p>
+      <w:pPr>
+        <w:jc w:val="left"/>
+        <w:rPr>
+          <w:rFonts w:hint="default" w:ascii="Bahnschrift Light SemiCondensed" w:hAnsi="Bahnschrift Light SemiCondensed"/>
+          <w:b w:val="0"/>
+          <w:bCs w:val="0"/>
+          <w:i w:val="0"/>
+          <w:iCs w:val="0"/>
+          <w:color w:val="auto"/>
+          <w:sz w:val="24"/>
+          <w:szCs w:val="24"/>
+          <w:u w:val="none"/>
+          <w:lang w:val="pt-BR"/>
+        </w:rPr>
+      </w:pPr>
+    </w:p>
+    <w:p>
+      <w:pPr>
+        <w:jc w:val="left"/>
+        <w:rPr>
+          <w:rFonts w:hint="default" w:ascii="Bahnschrift Light SemiCondensed" w:hAnsi="Bahnschrift Light SemiCondensed"/>
+          <w:b w:val="0"/>
+          <w:bCs w:val="0"/>
+          <w:i w:val="0"/>
+          <w:iCs w:val="0"/>
+          <w:color w:val="auto"/>
+          <w:sz w:val="24"/>
+          <w:szCs w:val="24"/>
+          <w:u w:val="none"/>
+          <w:lang w:val="pt-BR"/>
+        </w:rPr>
+      </w:pPr>
+    </w:p>
+    <w:p>
+      <w:pPr>
+        <w:jc w:val="left"/>
+        <w:rPr>
+          <w:rFonts w:hint="default" w:ascii="Bahnschrift Light SemiCondensed" w:hAnsi="Bahnschrift Light SemiCondensed"/>
+          <w:b/>
+          <w:bCs/>
+          <w:i w:val="0"/>
+          <w:iCs w:val="0"/>
+          <w:color w:val="auto"/>
+          <w:sz w:val="24"/>
+          <w:szCs w:val="24"/>
+          <w:u w:val="none"/>
+          <w:lang w:val="pt-BR"/>
+        </w:rPr>
+      </w:pPr>
+      <w:r>
+        <w:rPr>
+          <w:rFonts w:hint="default" w:ascii="Bahnschrift Light SemiCondensed" w:hAnsi="Bahnschrift Light SemiCondensed"/>
+          <w:b/>
+          <w:bCs/>
+          <w:i w:val="0"/>
+          <w:iCs w:val="0"/>
+          <w:color w:val="auto"/>
+          <w:sz w:val="24"/>
+          <w:szCs w:val="24"/>
+          <w:u w:val="none"/>
+          <w:lang w:val="pt-BR"/>
+        </w:rPr>
+        <w:t xml:space="preserve">SELECT DISTINCT </w:t>
+      </w:r>
+      <w:r>
+        <w:rPr>
+          <w:rFonts w:hint="default" w:ascii="Bahnschrift Light SemiCondensed" w:hAnsi="Bahnschrift Light SemiCondensed"/>
+          <w:b w:val="0"/>
+          <w:bCs w:val="0"/>
+          <w:i w:val="0"/>
+          <w:iCs w:val="0"/>
+          <w:color w:val="auto"/>
+          <w:sz w:val="24"/>
+          <w:szCs w:val="24"/>
+          <w:u w:val="single"/>
+          <w:lang w:val="pt-BR"/>
+        </w:rPr>
+        <w:t>coluna_da_tabela</w:t>
+      </w:r>
+      <w:r>
+        <w:rPr>
+          <w:rFonts w:hint="default" w:ascii="Bahnschrift Light SemiCondensed" w:hAnsi="Bahnschrift Light SemiCondensed"/>
+          <w:b/>
+          <w:bCs/>
+          <w:i w:val="0"/>
+          <w:iCs w:val="0"/>
+          <w:color w:val="auto"/>
+          <w:sz w:val="24"/>
+          <w:szCs w:val="24"/>
+          <w:u w:val="none"/>
+          <w:lang w:val="pt-BR"/>
+        </w:rPr>
+        <w:t xml:space="preserve"> FROM gafanhotos</w:t>
+      </w:r>
+    </w:p>
+    <w:p>
+      <w:pPr>
+        <w:jc w:val="left"/>
+        <w:rPr>
+          <w:rFonts w:hint="default" w:ascii="Bahnschrift Light SemiCondensed" w:hAnsi="Bahnschrift Light SemiCondensed"/>
+          <w:b/>
+          <w:bCs/>
+          <w:i w:val="0"/>
+          <w:iCs w:val="0"/>
+          <w:color w:val="auto"/>
+          <w:sz w:val="24"/>
+          <w:szCs w:val="24"/>
+          <w:u w:val="none"/>
+          <w:lang w:val="pt-BR"/>
+        </w:rPr>
+      </w:pPr>
+      <w:r>
+        <w:rPr>
+          <w:rFonts w:hint="default" w:ascii="Bahnschrift Light SemiCondensed" w:hAnsi="Bahnschrift Light SemiCondensed"/>
+          <w:b/>
+          <w:bCs/>
+          <w:i w:val="0"/>
+          <w:iCs w:val="0"/>
+          <w:color w:val="auto"/>
+          <w:sz w:val="24"/>
+          <w:szCs w:val="24"/>
+          <w:u w:val="none"/>
+          <w:lang w:val="pt-BR"/>
+        </w:rPr>
+        <w:t xml:space="preserve">ORDER BY </w:t>
+      </w:r>
+      <w:r>
+        <w:rPr>
+          <w:rFonts w:hint="default" w:ascii="Bahnschrift Light SemiCondensed" w:hAnsi="Bahnschrift Light SemiCondensed"/>
+          <w:b w:val="0"/>
+          <w:bCs w:val="0"/>
+          <w:i w:val="0"/>
+          <w:iCs w:val="0"/>
+          <w:color w:val="auto"/>
+          <w:sz w:val="24"/>
+          <w:szCs w:val="24"/>
+          <w:u w:val="single"/>
+          <w:lang w:val="pt-BR"/>
+        </w:rPr>
+        <w:t>coluna_da_tabela</w:t>
+      </w:r>
+      <w:r>
+        <w:rPr>
+          <w:rFonts w:hint="default" w:ascii="Bahnschrift Light SemiCondensed" w:hAnsi="Bahnschrift Light SemiCondensed"/>
+          <w:b/>
+          <w:bCs/>
+          <w:i w:val="0"/>
+          <w:iCs w:val="0"/>
+          <w:color w:val="auto"/>
+          <w:sz w:val="24"/>
+          <w:szCs w:val="24"/>
+          <w:u w:val="none"/>
+          <w:lang w:val="pt-BR"/>
+        </w:rPr>
+        <w:t>;</w:t>
+      </w:r>
+      <w:r>
+        <w:rPr>
+          <w:rFonts w:hint="default" w:ascii="Bahnschrift Light SemiCondensed" w:hAnsi="Bahnschrift Light SemiCondensed"/>
+          <w:b/>
+          <w:bCs/>
+          <w:i w:val="0"/>
+          <w:iCs w:val="0"/>
+          <w:color w:val="auto"/>
+          <w:sz w:val="24"/>
+          <w:szCs w:val="24"/>
+          <w:u w:val="none"/>
+          <w:lang w:val="pt-BR"/>
+        </w:rPr>
+        <w:tab/>
+      </w:r>
+      <w:r>
+        <w:rPr>
+          <w:rFonts w:hint="default" w:ascii="Bahnschrift Light SemiCondensed" w:hAnsi="Bahnschrift Light SemiCondensed"/>
+          <w:b/>
+          <w:bCs/>
+          <w:i w:val="0"/>
+          <w:iCs w:val="0"/>
+          <w:color w:val="auto"/>
+          <w:sz w:val="24"/>
+          <w:szCs w:val="24"/>
+          <w:u w:val="none"/>
+          <w:lang w:val="pt-BR"/>
+        </w:rPr>
+        <w:tab/>
+      </w:r>
+      <w:r>
+        <w:rPr>
+          <w:rFonts w:hint="default" w:ascii="Bahnschrift Light SemiCondensed" w:hAnsi="Bahnschrift Light SemiCondensed"/>
+          <w:b/>
+          <w:bCs/>
+          <w:i w:val="0"/>
+          <w:iCs w:val="0"/>
+          <w:color w:val="auto"/>
+          <w:sz w:val="24"/>
+          <w:szCs w:val="24"/>
+          <w:u w:val="none"/>
+          <w:lang w:val="pt-BR"/>
+        </w:rPr>
+        <w:tab/>
+      </w:r>
+      <w:r>
+        <w:rPr>
+          <w:rFonts w:hint="default" w:ascii="Bahnschrift Light SemiCondensed" w:hAnsi="Bahnschrift Light SemiCondensed"/>
+          <w:b/>
+          <w:bCs/>
+          <w:i w:val="0"/>
+          <w:iCs w:val="0"/>
+          <w:color w:val="auto"/>
+          <w:sz w:val="24"/>
+          <w:szCs w:val="24"/>
+          <w:u w:val="none"/>
+          <w:lang w:val="pt-BR"/>
+        </w:rPr>
+        <w:tab/>
+      </w:r>
+      <w:r>
+        <w:rPr>
+          <w:rFonts w:hint="default" w:ascii="Bahnschrift Light SemiCondensed" w:hAnsi="Bahnschrift Light SemiCondensed"/>
+          <w:b/>
+          <w:bCs/>
+          <w:i w:val="0"/>
+          <w:iCs w:val="0"/>
+          <w:color w:val="auto"/>
+          <w:sz w:val="24"/>
+          <w:szCs w:val="24"/>
+          <w:u w:val="none"/>
+          <w:lang w:val="pt-BR"/>
+        </w:rPr>
+        <w:t>→</w:t>
+      </w:r>
+    </w:p>
+    <w:p>
+      <w:pPr>
+        <w:jc w:val="left"/>
+        <w:rPr>
+          <w:rFonts w:hint="default" w:ascii="Bahnschrift Light SemiCondensed" w:hAnsi="Bahnschrift Light SemiCondensed"/>
+          <w:b/>
+          <w:bCs/>
+          <w:i w:val="0"/>
+          <w:iCs w:val="0"/>
+          <w:color w:val="auto"/>
+          <w:sz w:val="24"/>
+          <w:szCs w:val="24"/>
+          <w:u w:val="none"/>
+          <w:lang w:val="pt-BR"/>
+        </w:rPr>
+      </w:pPr>
+    </w:p>
+    <w:p>
+      <w:pPr>
+        <w:jc w:val="left"/>
+        <w:rPr>
+          <w:rFonts w:hint="default" w:ascii="Bahnschrift Light SemiCondensed" w:hAnsi="Bahnschrift Light SemiCondensed"/>
+          <w:b/>
+          <w:bCs/>
+          <w:i w:val="0"/>
+          <w:iCs w:val="0"/>
+          <w:color w:val="auto"/>
+          <w:sz w:val="24"/>
+          <w:szCs w:val="24"/>
+          <w:u w:val="none"/>
+          <w:lang w:val="pt-BR"/>
+        </w:rPr>
+      </w:pPr>
+    </w:p>
+    <w:p>
+      <w:pPr>
+        <w:jc w:val="left"/>
+        <w:rPr>
+          <w:rFonts w:hint="default" w:ascii="Bahnschrift Light SemiCondensed" w:hAnsi="Bahnschrift Light SemiCondensed"/>
+          <w:b w:val="0"/>
+          <w:bCs w:val="0"/>
+          <w:i w:val="0"/>
+          <w:iCs w:val="0"/>
+          <w:color w:val="auto"/>
+          <w:sz w:val="24"/>
+          <w:szCs w:val="24"/>
+          <w:u w:val="none"/>
+          <w:lang w:val="pt-BR"/>
+        </w:rPr>
+      </w:pPr>
+      <w:r>
+        <w:rPr>
+          <w:rFonts w:hint="default" w:ascii="Bahnschrift Light SemiCondensed" w:hAnsi="Bahnschrift Light SemiCondensed"/>
+          <w:b/>
+          <w:bCs/>
+          <w:i w:val="0"/>
+          <w:iCs w:val="0"/>
+          <w:color w:val="auto"/>
+          <w:sz w:val="24"/>
+          <w:szCs w:val="24"/>
+          <w:u w:val="none"/>
+          <w:lang w:val="pt-BR"/>
+        </w:rPr>
+        <w:tab/>
+      </w:r>
+      <w:r>
+        <w:rPr>
+          <w:rFonts w:hint="default" w:ascii="Bahnschrift Light SemiCondensed" w:hAnsi="Bahnschrift Light SemiCondensed"/>
+          <w:b/>
+          <w:bCs/>
+          <w:i w:val="0"/>
+          <w:iCs w:val="0"/>
+          <w:color w:val="auto"/>
+          <w:sz w:val="24"/>
+          <w:szCs w:val="24"/>
+          <w:u w:val="none"/>
+          <w:lang w:val="pt-BR"/>
+        </w:rPr>
+        <w:tab/>
+      </w:r>
+      <w:r>
+        <w:rPr>
+          <w:rFonts w:hint="default" w:ascii="Bahnschrift Light SemiCondensed" w:hAnsi="Bahnschrift Light SemiCondensed"/>
+          <w:b/>
+          <w:bCs/>
+          <w:i w:val="0"/>
+          <w:iCs w:val="0"/>
+          <w:color w:val="auto"/>
+          <w:sz w:val="24"/>
+          <w:szCs w:val="24"/>
+          <w:u w:val="none"/>
+          <w:lang w:val="pt-BR"/>
+        </w:rPr>
+        <w:tab/>
+      </w:r>
+      <w:r>
+        <w:rPr>
+          <w:rFonts w:hint="default" w:ascii="Bahnschrift Light SemiCondensed" w:hAnsi="Bahnschrift Light SemiCondensed"/>
+          <w:b w:val="0"/>
+          <w:bCs w:val="0"/>
+          <w:i w:val="0"/>
+          <w:iCs w:val="0"/>
+          <w:color w:val="auto"/>
+          <w:sz w:val="24"/>
+          <w:szCs w:val="24"/>
+          <w:u w:val="none"/>
+          <w:lang w:val="pt-BR"/>
+        </w:rPr>
+        <w:t>Comando utilizado para verificar cada único de colunas específicas em uma tabela.</w:t>
+      </w:r>
+    </w:p>
+    <w:p>
+      <w:pPr>
+        <w:jc w:val="left"/>
+        <w:rPr>
+          <w:rFonts w:hint="default" w:ascii="Bahnschrift Light SemiCondensed" w:hAnsi="Bahnschrift Light SemiCondensed"/>
+          <w:b w:val="0"/>
+          <w:bCs w:val="0"/>
+          <w:i w:val="0"/>
+          <w:iCs w:val="0"/>
+          <w:color w:val="auto"/>
+          <w:sz w:val="24"/>
+          <w:szCs w:val="24"/>
+          <w:u w:val="none"/>
+          <w:lang w:val="pt-BR"/>
+        </w:rPr>
+      </w:pPr>
+    </w:p>
+    <w:p>
+      <w:pPr>
+        <w:jc w:val="left"/>
+        <w:rPr>
+          <w:rFonts w:hint="default" w:ascii="Bahnschrift Light SemiCondensed" w:hAnsi="Bahnschrift Light SemiCondensed"/>
+          <w:b w:val="0"/>
+          <w:bCs w:val="0"/>
+          <w:i w:val="0"/>
+          <w:iCs w:val="0"/>
+          <w:color w:val="auto"/>
+          <w:sz w:val="24"/>
+          <w:szCs w:val="24"/>
+          <w:u w:val="none"/>
+          <w:lang w:val="pt-BR"/>
+        </w:rPr>
+      </w:pPr>
+    </w:p>
+    <w:p>
+      <w:pPr>
+        <w:jc w:val="left"/>
+        <w:rPr>
+          <w:rFonts w:hint="default" w:ascii="Bahnschrift Light SemiCondensed" w:hAnsi="Bahnschrift Light SemiCondensed"/>
+          <w:b/>
+          <w:bCs/>
+          <w:i w:val="0"/>
+          <w:iCs w:val="0"/>
+          <w:color w:val="auto"/>
+          <w:sz w:val="24"/>
+          <w:szCs w:val="24"/>
+          <w:u w:val="none"/>
+          <w:lang w:val="pt-BR"/>
+        </w:rPr>
+      </w:pPr>
+      <w:r>
+        <w:rPr>
+          <w:rFonts w:hint="default" w:ascii="Bahnschrift Light SemiCondensed" w:hAnsi="Bahnschrift Light SemiCondensed"/>
+          <w:b/>
+          <w:bCs/>
+          <w:i w:val="0"/>
+          <w:iCs w:val="0"/>
+          <w:color w:val="auto"/>
+          <w:sz w:val="24"/>
+          <w:szCs w:val="24"/>
+          <w:u w:val="none"/>
+          <w:lang w:val="pt-BR"/>
+        </w:rPr>
+        <w:t xml:space="preserve">SELECT COUNT(*) FROM </w:t>
+      </w:r>
+      <w:r>
+        <w:rPr>
+          <w:rFonts w:hint="default" w:ascii="Bahnschrift Light SemiCondensed" w:hAnsi="Bahnschrift Light SemiCondensed"/>
+          <w:b w:val="0"/>
+          <w:bCs w:val="0"/>
+          <w:i w:val="0"/>
+          <w:iCs w:val="0"/>
+          <w:color w:val="auto"/>
+          <w:sz w:val="24"/>
+          <w:szCs w:val="24"/>
+          <w:u w:val="single"/>
+          <w:lang w:val="pt-BR"/>
+        </w:rPr>
+        <w:t>nome_da_tabela</w:t>
+      </w:r>
+      <w:r>
+        <w:rPr>
+          <w:rFonts w:hint="default" w:ascii="Bahnschrift Light SemiCondensed" w:hAnsi="Bahnschrift Light SemiCondensed"/>
+          <w:b/>
+          <w:bCs/>
+          <w:i w:val="0"/>
+          <w:iCs w:val="0"/>
+          <w:color w:val="auto"/>
+          <w:sz w:val="24"/>
+          <w:szCs w:val="24"/>
+          <w:u w:val="none"/>
+          <w:lang w:val="pt-BR"/>
+        </w:rPr>
+        <w:t>;</w:t>
+      </w:r>
+      <w:r>
+        <w:rPr>
+          <w:rFonts w:hint="default" w:ascii="Bahnschrift Light SemiCondensed" w:hAnsi="Bahnschrift Light SemiCondensed"/>
+          <w:b/>
+          <w:bCs/>
+          <w:i w:val="0"/>
+          <w:iCs w:val="0"/>
+          <w:color w:val="auto"/>
+          <w:sz w:val="24"/>
+          <w:szCs w:val="24"/>
+          <w:u w:val="none"/>
+          <w:lang w:val="pt-BR"/>
+        </w:rPr>
+        <w:tab/>
+      </w:r>
+      <w:r>
+        <w:rPr>
+          <w:rFonts w:hint="default" w:ascii="Bahnschrift Light SemiCondensed" w:hAnsi="Bahnschrift Light SemiCondensed"/>
+          <w:b/>
+          <w:bCs/>
+          <w:i w:val="0"/>
+          <w:iCs w:val="0"/>
+          <w:color w:val="auto"/>
+          <w:sz w:val="24"/>
+          <w:szCs w:val="24"/>
+          <w:u w:val="none"/>
+          <w:lang w:val="pt-BR"/>
+        </w:rPr>
+        <w:tab/>
+      </w:r>
+      <w:r>
+        <w:rPr>
+          <w:rFonts w:hint="default" w:ascii="Bahnschrift Light SemiCondensed" w:hAnsi="Bahnschrift Light SemiCondensed"/>
+          <w:b/>
+          <w:bCs/>
+          <w:i w:val="0"/>
+          <w:iCs w:val="0"/>
+          <w:color w:val="auto"/>
+          <w:sz w:val="24"/>
+          <w:szCs w:val="24"/>
+          <w:u w:val="none"/>
+          <w:lang w:val="pt-BR"/>
+        </w:rPr>
+        <w:tab/>
+      </w:r>
+      <w:r>
+        <w:rPr>
+          <w:rFonts w:hint="default" w:ascii="Bahnschrift Light SemiCondensed" w:hAnsi="Bahnschrift Light SemiCondensed"/>
+          <w:b/>
+          <w:bCs/>
+          <w:i w:val="0"/>
+          <w:iCs w:val="0"/>
+          <w:color w:val="auto"/>
+          <w:sz w:val="24"/>
+          <w:szCs w:val="24"/>
+          <w:u w:val="none"/>
+          <w:lang w:val="pt-BR"/>
+        </w:rPr>
+        <w:tab/>
+      </w:r>
+      <w:r>
+        <w:rPr>
+          <w:rFonts w:hint="default" w:ascii="Bahnschrift Light SemiCondensed" w:hAnsi="Bahnschrift Light SemiCondensed"/>
+          <w:b/>
+          <w:bCs/>
+          <w:i w:val="0"/>
+          <w:iCs w:val="0"/>
+          <w:color w:val="auto"/>
+          <w:sz w:val="24"/>
+          <w:szCs w:val="24"/>
+          <w:u w:val="none"/>
+          <w:lang w:val="pt-BR"/>
+        </w:rPr>
+        <w:t>→</w:t>
+      </w:r>
+    </w:p>
+    <w:p>
+      <w:pPr>
+        <w:jc w:val="left"/>
+        <w:rPr>
+          <w:rFonts w:hint="default" w:ascii="Bahnschrift Light SemiCondensed" w:hAnsi="Bahnschrift Light SemiCondensed"/>
+          <w:b/>
+          <w:bCs/>
+          <w:i w:val="0"/>
+          <w:iCs w:val="0"/>
+          <w:color w:val="auto"/>
+          <w:sz w:val="24"/>
+          <w:szCs w:val="24"/>
+          <w:u w:val="none"/>
+          <w:lang w:val="pt-BR"/>
+        </w:rPr>
+      </w:pPr>
+    </w:p>
+    <w:p>
+      <w:pPr>
+        <w:jc w:val="left"/>
+        <w:rPr>
+          <w:rFonts w:hint="default" w:ascii="Bahnschrift Light SemiCondensed" w:hAnsi="Bahnschrift Light SemiCondensed"/>
+          <w:b w:val="0"/>
+          <w:bCs w:val="0"/>
+          <w:i w:val="0"/>
+          <w:iCs w:val="0"/>
+          <w:color w:val="auto"/>
+          <w:sz w:val="24"/>
+          <w:szCs w:val="24"/>
+          <w:u w:val="none"/>
+          <w:lang w:val="pt-BR"/>
+        </w:rPr>
+      </w:pPr>
+      <w:r>
+        <w:rPr>
+          <w:rFonts w:hint="default" w:ascii="Bahnschrift Light SemiCondensed" w:hAnsi="Bahnschrift Light SemiCondensed"/>
+          <w:b/>
+          <w:bCs/>
+          <w:i w:val="0"/>
+          <w:iCs w:val="0"/>
+          <w:color w:val="auto"/>
+          <w:sz w:val="24"/>
+          <w:szCs w:val="24"/>
+          <w:u w:val="none"/>
+          <w:lang w:val="pt-BR"/>
+        </w:rPr>
+        <w:tab/>
+      </w:r>
+      <w:r>
+        <w:rPr>
+          <w:rFonts w:hint="default" w:ascii="Bahnschrift Light SemiCondensed" w:hAnsi="Bahnschrift Light SemiCondensed"/>
+          <w:b/>
+          <w:bCs/>
+          <w:i w:val="0"/>
+          <w:iCs w:val="0"/>
+          <w:color w:val="auto"/>
+          <w:sz w:val="24"/>
+          <w:szCs w:val="24"/>
+          <w:u w:val="none"/>
+          <w:lang w:val="pt-BR"/>
+        </w:rPr>
+        <w:tab/>
+      </w:r>
+      <w:r>
+        <w:rPr>
+          <w:rFonts w:hint="default" w:ascii="Bahnschrift Light SemiCondensed" w:hAnsi="Bahnschrift Light SemiCondensed"/>
+          <w:b/>
+          <w:bCs/>
+          <w:i w:val="0"/>
+          <w:iCs w:val="0"/>
+          <w:color w:val="auto"/>
+          <w:sz w:val="24"/>
+          <w:szCs w:val="24"/>
+          <w:u w:val="none"/>
+          <w:lang w:val="pt-BR"/>
+        </w:rPr>
+        <w:tab/>
+      </w:r>
+      <w:r>
+        <w:rPr>
+          <w:rFonts w:hint="default" w:ascii="Bahnschrift Light SemiCondensed" w:hAnsi="Bahnschrift Light SemiCondensed"/>
+          <w:b w:val="0"/>
+          <w:bCs w:val="0"/>
+          <w:i w:val="0"/>
+          <w:iCs w:val="0"/>
+          <w:color w:val="auto"/>
+          <w:sz w:val="24"/>
+          <w:szCs w:val="24"/>
+          <w:u w:val="none"/>
+          <w:lang w:val="pt-BR"/>
+        </w:rPr>
+        <w:t>Comando utilizado para verificar quantos registros existem em uma tabela.</w:t>
+      </w:r>
+    </w:p>
+    <w:p>
+      <w:pPr>
+        <w:jc w:val="left"/>
+        <w:rPr>
+          <w:rFonts w:hint="default" w:ascii="Bahnschrift Light SemiCondensed" w:hAnsi="Bahnschrift Light SemiCondensed"/>
+          <w:b/>
+          <w:bCs/>
+          <w:i w:val="0"/>
+          <w:iCs w:val="0"/>
+          <w:color w:val="auto"/>
+          <w:sz w:val="24"/>
+          <w:szCs w:val="24"/>
+          <w:u w:val="none"/>
+          <w:lang w:val="pt-BR"/>
+        </w:rPr>
+      </w:pPr>
+    </w:p>
+    <w:p>
+      <w:pPr>
+        <w:jc w:val="left"/>
+        <w:rPr>
+          <w:rFonts w:hint="default" w:ascii="Bahnschrift Light SemiCondensed" w:hAnsi="Bahnschrift Light SemiCondensed"/>
+          <w:b/>
+          <w:bCs/>
+          <w:i w:val="0"/>
+          <w:iCs w:val="0"/>
+          <w:color w:val="auto"/>
+          <w:sz w:val="24"/>
+          <w:szCs w:val="24"/>
+          <w:u w:val="none"/>
+          <w:lang w:val="pt-BR"/>
+        </w:rPr>
+      </w:pPr>
+    </w:p>
+    <w:p>
+      <w:pPr>
+        <w:jc w:val="left"/>
+        <w:rPr>
+          <w:rFonts w:hint="default" w:ascii="Bahnschrift Light SemiCondensed" w:hAnsi="Bahnschrift Light SemiCondensed"/>
+          <w:b/>
+          <w:bCs/>
+          <w:i w:val="0"/>
+          <w:iCs w:val="0"/>
+          <w:color w:val="auto"/>
+          <w:sz w:val="24"/>
+          <w:szCs w:val="24"/>
+          <w:u w:val="none"/>
+          <w:lang w:val="pt-BR"/>
+        </w:rPr>
+      </w:pPr>
+      <w:r>
+        <w:rPr>
+          <w:rFonts w:hint="default" w:ascii="Bahnschrift Light SemiCondensed" w:hAnsi="Bahnschrift Light SemiCondensed"/>
+          <w:b/>
+          <w:bCs/>
+          <w:i w:val="0"/>
+          <w:iCs w:val="0"/>
+          <w:color w:val="auto"/>
+          <w:sz w:val="24"/>
+          <w:szCs w:val="24"/>
+          <w:u w:val="none"/>
+          <w:lang w:val="pt-BR"/>
+        </w:rPr>
+        <w:t>SELECT MAX(</w:t>
+      </w:r>
+      <w:r>
+        <w:rPr>
+          <w:rFonts w:hint="default" w:ascii="Bahnschrift Light SemiCondensed" w:hAnsi="Bahnschrift Light SemiCondensed"/>
+          <w:b w:val="0"/>
+          <w:bCs w:val="0"/>
+          <w:i w:val="0"/>
+          <w:iCs w:val="0"/>
+          <w:color w:val="auto"/>
+          <w:sz w:val="24"/>
+          <w:szCs w:val="24"/>
+          <w:u w:val="single"/>
+          <w:lang w:val="pt-BR"/>
+        </w:rPr>
+        <w:t>coluna_da_tabela</w:t>
+      </w:r>
+      <w:r>
+        <w:rPr>
+          <w:rFonts w:hint="default" w:ascii="Bahnschrift Light SemiCondensed" w:hAnsi="Bahnschrift Light SemiCondensed"/>
+          <w:b/>
+          <w:bCs/>
+          <w:i w:val="0"/>
+          <w:iCs w:val="0"/>
+          <w:color w:val="auto"/>
+          <w:sz w:val="24"/>
+          <w:szCs w:val="24"/>
+          <w:u w:val="none"/>
+          <w:lang w:val="pt-BR"/>
+        </w:rPr>
+        <w:t xml:space="preserve">) FROM </w:t>
+      </w:r>
+      <w:r>
+        <w:rPr>
+          <w:rFonts w:hint="default" w:ascii="Bahnschrift Light SemiCondensed" w:hAnsi="Bahnschrift Light SemiCondensed"/>
+          <w:b w:val="0"/>
+          <w:bCs w:val="0"/>
+          <w:i w:val="0"/>
+          <w:iCs w:val="0"/>
+          <w:color w:val="auto"/>
+          <w:sz w:val="24"/>
+          <w:szCs w:val="24"/>
+          <w:u w:val="single"/>
+          <w:lang w:val="pt-BR"/>
+        </w:rPr>
+        <w:t>nome_da_tabela</w:t>
+      </w:r>
+      <w:r>
+        <w:rPr>
+          <w:rFonts w:hint="default" w:ascii="Bahnschrift Light SemiCondensed" w:hAnsi="Bahnschrift Light SemiCondensed"/>
+          <w:b/>
+          <w:bCs/>
+          <w:i w:val="0"/>
+          <w:iCs w:val="0"/>
+          <w:color w:val="auto"/>
+          <w:sz w:val="24"/>
+          <w:szCs w:val="24"/>
+          <w:u w:val="none"/>
+          <w:lang w:val="pt-BR"/>
+        </w:rPr>
+        <w:t>;</w:t>
+      </w:r>
+      <w:r>
+        <w:rPr>
+          <w:rFonts w:hint="default" w:ascii="Bahnschrift Light SemiCondensed" w:hAnsi="Bahnschrift Light SemiCondensed"/>
+          <w:b/>
+          <w:bCs/>
+          <w:i w:val="0"/>
+          <w:iCs w:val="0"/>
+          <w:color w:val="auto"/>
+          <w:sz w:val="24"/>
+          <w:szCs w:val="24"/>
+          <w:u w:val="none"/>
+          <w:lang w:val="pt-BR"/>
+        </w:rPr>
+        <w:tab/>
+      </w:r>
+      <w:r>
+        <w:rPr>
+          <w:rFonts w:hint="default" w:ascii="Bahnschrift Light SemiCondensed" w:hAnsi="Bahnschrift Light SemiCondensed"/>
+          <w:b/>
+          <w:bCs/>
+          <w:i w:val="0"/>
+          <w:iCs w:val="0"/>
+          <w:color w:val="auto"/>
+          <w:sz w:val="24"/>
+          <w:szCs w:val="24"/>
+          <w:u w:val="none"/>
+          <w:lang w:val="pt-BR"/>
+        </w:rPr>
+        <w:tab/>
+      </w:r>
+      <w:r>
+        <w:rPr>
+          <w:rFonts w:hint="default" w:ascii="Bahnschrift Light SemiCondensed" w:hAnsi="Bahnschrift Light SemiCondensed"/>
+          <w:b/>
+          <w:bCs/>
+          <w:i w:val="0"/>
+          <w:iCs w:val="0"/>
+          <w:color w:val="auto"/>
+          <w:sz w:val="24"/>
+          <w:szCs w:val="24"/>
+          <w:u w:val="none"/>
+          <w:lang w:val="pt-BR"/>
+        </w:rPr>
+        <w:tab/>
+      </w:r>
+      <w:r>
+        <w:rPr>
+          <w:rFonts w:hint="default" w:ascii="Bahnschrift Light SemiCondensed" w:hAnsi="Bahnschrift Light SemiCondensed"/>
+          <w:b/>
+          <w:bCs/>
+          <w:i w:val="0"/>
+          <w:iCs w:val="0"/>
+          <w:color w:val="auto"/>
+          <w:sz w:val="24"/>
+          <w:szCs w:val="24"/>
+          <w:u w:val="none"/>
+          <w:lang w:val="pt-BR"/>
+        </w:rPr>
+        <w:t>→</w:t>
+      </w:r>
+    </w:p>
+    <w:p>
+      <w:pPr>
+        <w:jc w:val="left"/>
+        <w:rPr>
+          <w:rFonts w:hint="default" w:ascii="Bahnschrift Light SemiCondensed" w:hAnsi="Bahnschrift Light SemiCondensed"/>
+          <w:b/>
+          <w:bCs/>
+          <w:i w:val="0"/>
+          <w:iCs w:val="0"/>
+          <w:color w:val="auto"/>
+          <w:sz w:val="24"/>
+          <w:szCs w:val="24"/>
+          <w:u w:val="none"/>
+          <w:lang w:val="pt-BR"/>
+        </w:rPr>
+      </w:pPr>
+    </w:p>
+    <w:p>
+      <w:pPr>
+        <w:jc w:val="left"/>
+        <w:rPr>
+          <w:rFonts w:hint="default" w:ascii="Bahnschrift Light SemiCondensed" w:hAnsi="Bahnschrift Light SemiCondensed"/>
+          <w:b w:val="0"/>
+          <w:bCs w:val="0"/>
+          <w:i w:val="0"/>
+          <w:iCs w:val="0"/>
+          <w:color w:val="auto"/>
+          <w:sz w:val="24"/>
+          <w:szCs w:val="24"/>
+          <w:u w:val="none"/>
+          <w:lang w:val="pt-BR"/>
+        </w:rPr>
+      </w:pPr>
+      <w:r>
+        <w:rPr>
+          <w:rFonts w:hint="default" w:ascii="Bahnschrift Light SemiCondensed" w:hAnsi="Bahnschrift Light SemiCondensed"/>
+          <w:b/>
+          <w:bCs/>
+          <w:i w:val="0"/>
+          <w:iCs w:val="0"/>
+          <w:color w:val="auto"/>
+          <w:sz w:val="24"/>
+          <w:szCs w:val="24"/>
+          <w:u w:val="none"/>
+          <w:lang w:val="pt-BR"/>
+        </w:rPr>
+        <w:tab/>
+      </w:r>
+      <w:r>
+        <w:rPr>
+          <w:rFonts w:hint="default" w:ascii="Bahnschrift Light SemiCondensed" w:hAnsi="Bahnschrift Light SemiCondensed"/>
+          <w:b/>
+          <w:bCs/>
+          <w:i w:val="0"/>
+          <w:iCs w:val="0"/>
+          <w:color w:val="auto"/>
+          <w:sz w:val="24"/>
+          <w:szCs w:val="24"/>
+          <w:u w:val="none"/>
+          <w:lang w:val="pt-BR"/>
+        </w:rPr>
+        <w:tab/>
+      </w:r>
+      <w:r>
+        <w:rPr>
+          <w:rFonts w:hint="default" w:ascii="Bahnschrift Light SemiCondensed" w:hAnsi="Bahnschrift Light SemiCondensed"/>
+          <w:b w:val="0"/>
+          <w:bCs w:val="0"/>
+          <w:i w:val="0"/>
+          <w:iCs w:val="0"/>
+          <w:color w:val="auto"/>
+          <w:sz w:val="24"/>
+          <w:szCs w:val="24"/>
+          <w:u w:val="none"/>
+          <w:lang w:val="pt-BR"/>
+        </w:rPr>
+        <w:t>Comando utilizado para verificar qual o valor máximo de uma coluna específica da tabela.</w:t>
+      </w:r>
+    </w:p>
+    <w:p>
+      <w:pPr>
+        <w:jc w:val="left"/>
+        <w:rPr>
+          <w:rFonts w:hint="default" w:ascii="Bahnschrift Light SemiCondensed" w:hAnsi="Bahnschrift Light SemiCondensed"/>
+          <w:b w:val="0"/>
+          <w:bCs w:val="0"/>
+          <w:i w:val="0"/>
+          <w:iCs w:val="0"/>
+          <w:color w:val="auto"/>
+          <w:sz w:val="24"/>
+          <w:szCs w:val="24"/>
+          <w:u w:val="none"/>
+          <w:lang w:val="pt-BR"/>
+        </w:rPr>
+      </w:pPr>
+    </w:p>
+    <w:p>
+      <w:pPr>
+        <w:jc w:val="left"/>
+        <w:rPr>
+          <w:rFonts w:hint="default" w:ascii="Bahnschrift Light SemiCondensed" w:hAnsi="Bahnschrift Light SemiCondensed"/>
+          <w:b w:val="0"/>
+          <w:bCs w:val="0"/>
+          <w:i w:val="0"/>
+          <w:iCs w:val="0"/>
+          <w:color w:val="auto"/>
+          <w:sz w:val="24"/>
+          <w:szCs w:val="24"/>
+          <w:u w:val="none"/>
+          <w:lang w:val="pt-BR"/>
+        </w:rPr>
+      </w:pPr>
+    </w:p>
+    <w:p>
+      <w:pPr>
+        <w:jc w:val="left"/>
+        <w:rPr>
+          <w:rFonts w:hint="default" w:ascii="Bahnschrift Light SemiCondensed" w:hAnsi="Bahnschrift Light SemiCondensed"/>
+          <w:b/>
+          <w:bCs/>
+          <w:i w:val="0"/>
+          <w:iCs w:val="0"/>
+          <w:color w:val="auto"/>
+          <w:sz w:val="24"/>
+          <w:szCs w:val="24"/>
+          <w:u w:val="none"/>
+          <w:lang w:val="pt-BR"/>
+        </w:rPr>
+      </w:pPr>
+      <w:r>
+        <w:rPr>
+          <w:rFonts w:hint="default" w:ascii="Bahnschrift Light SemiCondensed" w:hAnsi="Bahnschrift Light SemiCondensed"/>
+          <w:b/>
+          <w:bCs/>
+          <w:i w:val="0"/>
+          <w:iCs w:val="0"/>
+          <w:color w:val="auto"/>
+          <w:sz w:val="24"/>
+          <w:szCs w:val="24"/>
+          <w:u w:val="none"/>
+          <w:lang w:val="pt-BR"/>
+        </w:rPr>
+        <w:t>SELECT MIN(</w:t>
+      </w:r>
+      <w:r>
+        <w:rPr>
+          <w:rFonts w:hint="default" w:ascii="Bahnschrift Light SemiCondensed" w:hAnsi="Bahnschrift Light SemiCondensed"/>
+          <w:b w:val="0"/>
+          <w:bCs w:val="0"/>
+          <w:i w:val="0"/>
+          <w:iCs w:val="0"/>
+          <w:color w:val="auto"/>
+          <w:sz w:val="24"/>
+          <w:szCs w:val="24"/>
+          <w:u w:val="single"/>
+          <w:lang w:val="pt-BR"/>
+        </w:rPr>
+        <w:t>coluna_da_tabela</w:t>
+      </w:r>
+      <w:r>
+        <w:rPr>
+          <w:rFonts w:hint="default" w:ascii="Bahnschrift Light SemiCondensed" w:hAnsi="Bahnschrift Light SemiCondensed"/>
+          <w:b/>
+          <w:bCs/>
+          <w:i w:val="0"/>
+          <w:iCs w:val="0"/>
+          <w:color w:val="auto"/>
+          <w:sz w:val="24"/>
+          <w:szCs w:val="24"/>
+          <w:u w:val="none"/>
+          <w:lang w:val="pt-BR"/>
+        </w:rPr>
+        <w:t xml:space="preserve">) FROM </w:t>
+      </w:r>
+      <w:r>
+        <w:rPr>
+          <w:rFonts w:hint="default" w:ascii="Bahnschrift Light SemiCondensed" w:hAnsi="Bahnschrift Light SemiCondensed"/>
+          <w:b w:val="0"/>
+          <w:bCs w:val="0"/>
+          <w:i w:val="0"/>
+          <w:iCs w:val="0"/>
+          <w:color w:val="auto"/>
+          <w:sz w:val="24"/>
+          <w:szCs w:val="24"/>
+          <w:u w:val="single"/>
+          <w:lang w:val="pt-BR"/>
+        </w:rPr>
+        <w:t>nome_da_tabela</w:t>
+      </w:r>
+      <w:r>
+        <w:rPr>
+          <w:rFonts w:hint="default" w:ascii="Bahnschrift Light SemiCondensed" w:hAnsi="Bahnschrift Light SemiCondensed"/>
+          <w:b/>
+          <w:bCs/>
+          <w:i w:val="0"/>
+          <w:iCs w:val="0"/>
+          <w:color w:val="auto"/>
+          <w:sz w:val="24"/>
+          <w:szCs w:val="24"/>
+          <w:u w:val="none"/>
+          <w:lang w:val="pt-BR"/>
+        </w:rPr>
+        <w:t>;</w:t>
+      </w:r>
+      <w:r>
+        <w:rPr>
+          <w:rFonts w:hint="default" w:ascii="Bahnschrift Light SemiCondensed" w:hAnsi="Bahnschrift Light SemiCondensed"/>
+          <w:b/>
+          <w:bCs/>
+          <w:i w:val="0"/>
+          <w:iCs w:val="0"/>
+          <w:color w:val="auto"/>
+          <w:sz w:val="24"/>
+          <w:szCs w:val="24"/>
+          <w:u w:val="none"/>
+          <w:lang w:val="pt-BR"/>
+        </w:rPr>
+        <w:tab/>
+      </w:r>
+      <w:r>
+        <w:rPr>
+          <w:rFonts w:hint="default" w:ascii="Bahnschrift Light SemiCondensed" w:hAnsi="Bahnschrift Light SemiCondensed"/>
+          <w:b/>
+          <w:bCs/>
+          <w:i w:val="0"/>
+          <w:iCs w:val="0"/>
+          <w:color w:val="auto"/>
+          <w:sz w:val="24"/>
+          <w:szCs w:val="24"/>
+          <w:u w:val="none"/>
+          <w:lang w:val="pt-BR"/>
+        </w:rPr>
+        <w:tab/>
+      </w:r>
+      <w:r>
+        <w:rPr>
+          <w:rFonts w:hint="default" w:ascii="Bahnschrift Light SemiCondensed" w:hAnsi="Bahnschrift Light SemiCondensed"/>
+          <w:b/>
+          <w:bCs/>
+          <w:i w:val="0"/>
+          <w:iCs w:val="0"/>
+          <w:color w:val="auto"/>
+          <w:sz w:val="24"/>
+          <w:szCs w:val="24"/>
+          <w:u w:val="none"/>
+          <w:lang w:val="pt-BR"/>
+        </w:rPr>
+        <w:tab/>
+      </w:r>
+      <w:r>
+        <w:rPr>
+          <w:rFonts w:hint="default" w:ascii="Bahnschrift Light SemiCondensed" w:hAnsi="Bahnschrift Light SemiCondensed"/>
+          <w:b/>
+          <w:bCs/>
+          <w:i w:val="0"/>
+          <w:iCs w:val="0"/>
+          <w:color w:val="auto"/>
+          <w:sz w:val="24"/>
+          <w:szCs w:val="24"/>
+          <w:u w:val="none"/>
+          <w:lang w:val="pt-BR"/>
+        </w:rPr>
+        <w:t>→</w:t>
+      </w:r>
+    </w:p>
+    <w:p>
+      <w:pPr>
+        <w:jc w:val="left"/>
+        <w:rPr>
+          <w:rFonts w:hint="default" w:ascii="Bahnschrift Light SemiCondensed" w:hAnsi="Bahnschrift Light SemiCondensed"/>
+          <w:b/>
+          <w:bCs/>
+          <w:i w:val="0"/>
+          <w:iCs w:val="0"/>
+          <w:color w:val="auto"/>
+          <w:sz w:val="24"/>
+          <w:szCs w:val="24"/>
+          <w:u w:val="none"/>
+          <w:lang w:val="pt-BR"/>
+        </w:rPr>
+      </w:pPr>
+    </w:p>
+    <w:p>
+      <w:pPr>
+        <w:jc w:val="left"/>
+        <w:rPr>
+          <w:rFonts w:hint="default" w:ascii="Bahnschrift Light SemiCondensed" w:hAnsi="Bahnschrift Light SemiCondensed"/>
+          <w:b w:val="0"/>
+          <w:bCs w:val="0"/>
+          <w:i w:val="0"/>
+          <w:iCs w:val="0"/>
+          <w:color w:val="auto"/>
+          <w:sz w:val="24"/>
+          <w:szCs w:val="24"/>
+          <w:u w:val="none"/>
+          <w:lang w:val="pt-BR"/>
+        </w:rPr>
+      </w:pPr>
+      <w:r>
+        <w:rPr>
+          <w:rFonts w:hint="default" w:ascii="Bahnschrift Light SemiCondensed" w:hAnsi="Bahnschrift Light SemiCondensed"/>
+          <w:b/>
+          <w:bCs/>
+          <w:i w:val="0"/>
+          <w:iCs w:val="0"/>
+          <w:color w:val="auto"/>
+          <w:sz w:val="24"/>
+          <w:szCs w:val="24"/>
+          <w:u w:val="none"/>
+          <w:lang w:val="pt-BR"/>
+        </w:rPr>
+        <w:tab/>
+      </w:r>
+      <w:r>
+        <w:rPr>
+          <w:rFonts w:hint="default" w:ascii="Bahnschrift Light SemiCondensed" w:hAnsi="Bahnschrift Light SemiCondensed"/>
+          <w:b/>
+          <w:bCs/>
+          <w:i w:val="0"/>
+          <w:iCs w:val="0"/>
+          <w:color w:val="auto"/>
+          <w:sz w:val="24"/>
+          <w:szCs w:val="24"/>
+          <w:u w:val="none"/>
+          <w:lang w:val="pt-BR"/>
+        </w:rPr>
+        <w:tab/>
+      </w:r>
+      <w:r>
+        <w:rPr>
+          <w:rFonts w:hint="default" w:ascii="Bahnschrift Light SemiCondensed" w:hAnsi="Bahnschrift Light SemiCondensed"/>
+          <w:b w:val="0"/>
+          <w:bCs w:val="0"/>
+          <w:i w:val="0"/>
+          <w:iCs w:val="0"/>
+          <w:color w:val="auto"/>
+          <w:sz w:val="24"/>
+          <w:szCs w:val="24"/>
+          <w:u w:val="none"/>
+          <w:lang w:val="pt-BR"/>
+        </w:rPr>
+        <w:t>Comando utilizado para verificar qual o valor mínimo de uma coluna específica da tabela.</w:t>
+      </w:r>
+    </w:p>
+    <w:p>
+      <w:pPr>
+        <w:jc w:val="left"/>
+        <w:rPr>
+          <w:rFonts w:hint="default" w:ascii="Bahnschrift Light SemiCondensed" w:hAnsi="Bahnschrift Light SemiCondensed"/>
+          <w:b/>
+          <w:bCs/>
+          <w:i w:val="0"/>
+          <w:iCs w:val="0"/>
+          <w:color w:val="auto"/>
+          <w:sz w:val="24"/>
+          <w:szCs w:val="24"/>
+          <w:u w:val="none"/>
+          <w:lang w:val="pt-BR"/>
+        </w:rPr>
+      </w:pPr>
+    </w:p>
+    <w:p>
+      <w:pPr>
+        <w:jc w:val="left"/>
+        <w:rPr>
+          <w:rFonts w:hint="default" w:ascii="Bahnschrift Light SemiCondensed" w:hAnsi="Bahnschrift Light SemiCondensed"/>
+          <w:b/>
+          <w:bCs/>
+          <w:i w:val="0"/>
+          <w:iCs w:val="0"/>
+          <w:color w:val="auto"/>
+          <w:sz w:val="24"/>
+          <w:szCs w:val="24"/>
+          <w:u w:val="none"/>
+          <w:lang w:val="pt-BR"/>
+        </w:rPr>
+      </w:pPr>
+    </w:p>
+    <w:p>
+      <w:pPr>
+        <w:jc w:val="left"/>
+        <w:rPr>
+          <w:rFonts w:hint="default" w:ascii="Bahnschrift Light SemiCondensed" w:hAnsi="Bahnschrift Light SemiCondensed"/>
+          <w:b/>
+          <w:bCs/>
+          <w:i w:val="0"/>
+          <w:iCs w:val="0"/>
+          <w:color w:val="auto"/>
+          <w:sz w:val="24"/>
+          <w:szCs w:val="24"/>
+          <w:u w:val="none"/>
+          <w:lang w:val="pt-BR"/>
+        </w:rPr>
+      </w:pPr>
+      <w:r>
+        <w:rPr>
+          <w:rFonts w:hint="default" w:ascii="Bahnschrift Light SemiCondensed" w:hAnsi="Bahnschrift Light SemiCondensed"/>
+          <w:b/>
+          <w:bCs/>
+          <w:i w:val="0"/>
+          <w:iCs w:val="0"/>
+          <w:color w:val="auto"/>
+          <w:sz w:val="24"/>
+          <w:szCs w:val="24"/>
+          <w:u w:val="none"/>
+          <w:lang w:val="pt-BR"/>
+        </w:rPr>
+        <w:t>SELECT SUM(</w:t>
+      </w:r>
+      <w:r>
+        <w:rPr>
+          <w:rFonts w:hint="default" w:ascii="Bahnschrift Light SemiCondensed" w:hAnsi="Bahnschrift Light SemiCondensed"/>
+          <w:b w:val="0"/>
+          <w:bCs w:val="0"/>
+          <w:i w:val="0"/>
+          <w:iCs w:val="0"/>
+          <w:color w:val="auto"/>
+          <w:sz w:val="24"/>
+          <w:szCs w:val="24"/>
+          <w:u w:val="single"/>
+          <w:lang w:val="pt-BR"/>
+        </w:rPr>
+        <w:t>coluna_da_tabela</w:t>
+      </w:r>
+      <w:r>
+        <w:rPr>
+          <w:rFonts w:hint="default" w:ascii="Bahnschrift Light SemiCondensed" w:hAnsi="Bahnschrift Light SemiCondensed"/>
+          <w:b/>
+          <w:bCs/>
+          <w:i w:val="0"/>
+          <w:iCs w:val="0"/>
+          <w:color w:val="auto"/>
+          <w:sz w:val="24"/>
+          <w:szCs w:val="24"/>
+          <w:u w:val="none"/>
+          <w:lang w:val="pt-BR"/>
+        </w:rPr>
+        <w:t xml:space="preserve">) FROM </w:t>
+      </w:r>
+      <w:r>
+        <w:rPr>
+          <w:rFonts w:hint="default" w:ascii="Bahnschrift Light SemiCondensed" w:hAnsi="Bahnschrift Light SemiCondensed"/>
+          <w:b w:val="0"/>
+          <w:bCs w:val="0"/>
+          <w:i w:val="0"/>
+          <w:iCs w:val="0"/>
+          <w:color w:val="auto"/>
+          <w:sz w:val="24"/>
+          <w:szCs w:val="24"/>
+          <w:u w:val="single"/>
+          <w:lang w:val="pt-BR"/>
+        </w:rPr>
+        <w:t>nome_da_tabela</w:t>
+      </w:r>
+      <w:r>
+        <w:rPr>
+          <w:rFonts w:hint="default" w:ascii="Bahnschrift Light SemiCondensed" w:hAnsi="Bahnschrift Light SemiCondensed"/>
+          <w:b/>
+          <w:bCs/>
+          <w:i w:val="0"/>
+          <w:iCs w:val="0"/>
+          <w:color w:val="auto"/>
+          <w:sz w:val="24"/>
+          <w:szCs w:val="24"/>
+          <w:u w:val="none"/>
+          <w:lang w:val="pt-BR"/>
+        </w:rPr>
+        <w:t>;</w:t>
+      </w:r>
+      <w:r>
+        <w:rPr>
+          <w:rFonts w:hint="default" w:ascii="Bahnschrift Light SemiCondensed" w:hAnsi="Bahnschrift Light SemiCondensed"/>
+          <w:b/>
+          <w:bCs/>
+          <w:i w:val="0"/>
+          <w:iCs w:val="0"/>
+          <w:color w:val="auto"/>
+          <w:sz w:val="24"/>
+          <w:szCs w:val="24"/>
+          <w:u w:val="none"/>
+          <w:lang w:val="pt-BR"/>
+        </w:rPr>
+        <w:tab/>
+      </w:r>
+      <w:r>
+        <w:rPr>
+          <w:rFonts w:hint="default" w:ascii="Bahnschrift Light SemiCondensed" w:hAnsi="Bahnschrift Light SemiCondensed"/>
+          <w:b/>
+          <w:bCs/>
+          <w:i w:val="0"/>
+          <w:iCs w:val="0"/>
+          <w:color w:val="auto"/>
+          <w:sz w:val="24"/>
+          <w:szCs w:val="24"/>
+          <w:u w:val="none"/>
+          <w:lang w:val="pt-BR"/>
+        </w:rPr>
+        <w:tab/>
+      </w:r>
+      <w:r>
+        <w:rPr>
+          <w:rFonts w:hint="default" w:ascii="Bahnschrift Light SemiCondensed" w:hAnsi="Bahnschrift Light SemiCondensed"/>
+          <w:b/>
+          <w:bCs/>
+          <w:i w:val="0"/>
+          <w:iCs w:val="0"/>
+          <w:color w:val="auto"/>
+          <w:sz w:val="24"/>
+          <w:szCs w:val="24"/>
+          <w:u w:val="none"/>
+          <w:lang w:val="pt-BR"/>
+        </w:rPr>
+        <w:tab/>
+      </w:r>
+      <w:r>
+        <w:rPr>
+          <w:rFonts w:hint="default" w:ascii="Bahnschrift Light SemiCondensed" w:hAnsi="Bahnschrift Light SemiCondensed"/>
+          <w:b/>
+          <w:bCs/>
+          <w:i w:val="0"/>
+          <w:iCs w:val="0"/>
+          <w:color w:val="auto"/>
+          <w:sz w:val="24"/>
+          <w:szCs w:val="24"/>
+          <w:u w:val="none"/>
+          <w:lang w:val="pt-BR"/>
+        </w:rPr>
+        <w:t>→</w:t>
+      </w:r>
+    </w:p>
+    <w:p>
+      <w:pPr>
+        <w:jc w:val="left"/>
+        <w:rPr>
+          <w:rFonts w:hint="default" w:ascii="Bahnschrift Light SemiCondensed" w:hAnsi="Bahnschrift Light SemiCondensed"/>
+          <w:b/>
+          <w:bCs/>
+          <w:i w:val="0"/>
+          <w:iCs w:val="0"/>
+          <w:color w:val="auto"/>
+          <w:sz w:val="24"/>
+          <w:szCs w:val="24"/>
+          <w:u w:val="none"/>
+          <w:lang w:val="pt-BR"/>
+        </w:rPr>
+      </w:pPr>
+    </w:p>
+    <w:p>
+      <w:pPr>
+        <w:jc w:val="left"/>
+        <w:rPr>
+          <w:rFonts w:hint="default" w:ascii="Bahnschrift Light SemiCondensed" w:hAnsi="Bahnschrift Light SemiCondensed"/>
+          <w:b w:val="0"/>
+          <w:bCs w:val="0"/>
+          <w:i w:val="0"/>
+          <w:iCs w:val="0"/>
+          <w:color w:val="auto"/>
+          <w:sz w:val="24"/>
+          <w:szCs w:val="24"/>
+          <w:u w:val="none"/>
+          <w:lang w:val="pt-BR"/>
+        </w:rPr>
+      </w:pPr>
+      <w:r>
+        <w:rPr>
+          <w:rFonts w:hint="default" w:ascii="Bahnschrift Light SemiCondensed" w:hAnsi="Bahnschrift Light SemiCondensed"/>
+          <w:b/>
+          <w:bCs/>
+          <w:i w:val="0"/>
+          <w:iCs w:val="0"/>
+          <w:color w:val="auto"/>
+          <w:sz w:val="24"/>
+          <w:szCs w:val="24"/>
+          <w:u w:val="none"/>
+          <w:lang w:val="pt-BR"/>
+        </w:rPr>
+        <w:tab/>
+      </w:r>
+      <w:r>
+        <w:rPr>
+          <w:rFonts w:hint="default" w:ascii="Bahnschrift Light SemiCondensed" w:hAnsi="Bahnschrift Light SemiCondensed"/>
+          <w:b/>
+          <w:bCs/>
+          <w:i w:val="0"/>
+          <w:iCs w:val="0"/>
+          <w:color w:val="auto"/>
+          <w:sz w:val="24"/>
+          <w:szCs w:val="24"/>
+          <w:u w:val="none"/>
+          <w:lang w:val="pt-BR"/>
+        </w:rPr>
+        <w:tab/>
+      </w:r>
+      <w:r>
+        <w:rPr>
+          <w:rFonts w:hint="default" w:ascii="Bahnschrift Light SemiCondensed" w:hAnsi="Bahnschrift Light SemiCondensed"/>
+          <w:b w:val="0"/>
+          <w:bCs w:val="0"/>
+          <w:i w:val="0"/>
+          <w:iCs w:val="0"/>
+          <w:color w:val="auto"/>
+          <w:sz w:val="24"/>
+          <w:szCs w:val="24"/>
+          <w:u w:val="none"/>
+          <w:lang w:val="pt-BR"/>
+        </w:rPr>
+        <w:t>Comando utilizado para somar os valores de uma coluna específica da tabela.</w:t>
+      </w:r>
+    </w:p>
+    <w:p>
+      <w:pPr>
+        <w:jc w:val="left"/>
+        <w:rPr>
+          <w:rFonts w:hint="default" w:ascii="Bahnschrift Light SemiCondensed" w:hAnsi="Bahnschrift Light SemiCondensed"/>
+          <w:b/>
+          <w:bCs/>
+          <w:i w:val="0"/>
+          <w:iCs w:val="0"/>
+          <w:color w:val="auto"/>
+          <w:sz w:val="24"/>
+          <w:szCs w:val="24"/>
+          <w:u w:val="none"/>
+          <w:lang w:val="pt-BR"/>
+        </w:rPr>
+      </w:pPr>
+    </w:p>
+    <w:p>
+      <w:pPr>
+        <w:jc w:val="left"/>
+        <w:rPr>
+          <w:rFonts w:hint="default" w:ascii="Bahnschrift Light SemiCondensed" w:hAnsi="Bahnschrift Light SemiCondensed"/>
+          <w:b/>
+          <w:bCs/>
+          <w:i w:val="0"/>
+          <w:iCs w:val="0"/>
+          <w:color w:val="auto"/>
+          <w:sz w:val="24"/>
+          <w:szCs w:val="24"/>
+          <w:u w:val="none"/>
+          <w:lang w:val="pt-BR"/>
+        </w:rPr>
+      </w:pPr>
+    </w:p>
+    <w:p>
+      <w:pPr>
+        <w:jc w:val="left"/>
+        <w:rPr>
+          <w:rFonts w:hint="default" w:ascii="Bahnschrift Light SemiCondensed" w:hAnsi="Bahnschrift Light SemiCondensed"/>
+          <w:b/>
+          <w:bCs/>
+          <w:i w:val="0"/>
+          <w:iCs w:val="0"/>
+          <w:color w:val="auto"/>
+          <w:sz w:val="24"/>
+          <w:szCs w:val="24"/>
+          <w:u w:val="none"/>
+          <w:lang w:val="pt-BR"/>
+        </w:rPr>
+      </w:pPr>
+      <w:r>
+        <w:rPr>
+          <w:rFonts w:hint="default" w:ascii="Bahnschrift Light SemiCondensed" w:hAnsi="Bahnschrift Light SemiCondensed"/>
+          <w:b/>
+          <w:bCs/>
+          <w:i w:val="0"/>
+          <w:iCs w:val="0"/>
+          <w:color w:val="auto"/>
+          <w:sz w:val="24"/>
+          <w:szCs w:val="24"/>
+          <w:u w:val="none"/>
+          <w:lang w:val="pt-BR"/>
+        </w:rPr>
+        <w:t>SELECT AVG(</w:t>
+      </w:r>
+      <w:r>
+        <w:rPr>
+          <w:rFonts w:hint="default" w:ascii="Bahnschrift Light SemiCondensed" w:hAnsi="Bahnschrift Light SemiCondensed"/>
+          <w:b w:val="0"/>
+          <w:bCs w:val="0"/>
+          <w:i w:val="0"/>
+          <w:iCs w:val="0"/>
+          <w:color w:val="auto"/>
+          <w:sz w:val="24"/>
+          <w:szCs w:val="24"/>
+          <w:u w:val="single"/>
+          <w:lang w:val="pt-BR"/>
+        </w:rPr>
+        <w:t>coluna_da_tabela</w:t>
+      </w:r>
+      <w:r>
+        <w:rPr>
+          <w:rFonts w:hint="default" w:ascii="Bahnschrift Light SemiCondensed" w:hAnsi="Bahnschrift Light SemiCondensed"/>
+          <w:b/>
+          <w:bCs/>
+          <w:i w:val="0"/>
+          <w:iCs w:val="0"/>
+          <w:color w:val="auto"/>
+          <w:sz w:val="24"/>
+          <w:szCs w:val="24"/>
+          <w:u w:val="none"/>
+          <w:lang w:val="pt-BR"/>
+        </w:rPr>
+        <w:t xml:space="preserve">) FROM </w:t>
+      </w:r>
+      <w:r>
+        <w:rPr>
+          <w:rFonts w:hint="default" w:ascii="Bahnschrift Light SemiCondensed" w:hAnsi="Bahnschrift Light SemiCondensed"/>
+          <w:b w:val="0"/>
+          <w:bCs w:val="0"/>
+          <w:i w:val="0"/>
+          <w:iCs w:val="0"/>
+          <w:color w:val="auto"/>
+          <w:sz w:val="24"/>
+          <w:szCs w:val="24"/>
+          <w:u w:val="single"/>
+          <w:lang w:val="pt-BR"/>
+        </w:rPr>
+        <w:t>nome_da_tabela</w:t>
+      </w:r>
+      <w:r>
+        <w:rPr>
+          <w:rFonts w:hint="default" w:ascii="Bahnschrift Light SemiCondensed" w:hAnsi="Bahnschrift Light SemiCondensed"/>
+          <w:b/>
+          <w:bCs/>
+          <w:i w:val="0"/>
+          <w:iCs w:val="0"/>
+          <w:color w:val="auto"/>
+          <w:sz w:val="24"/>
+          <w:szCs w:val="24"/>
+          <w:u w:val="none"/>
+          <w:lang w:val="pt-BR"/>
+        </w:rPr>
+        <w:t>;</w:t>
+      </w:r>
+      <w:r>
+        <w:rPr>
+          <w:rFonts w:hint="default" w:ascii="Bahnschrift Light SemiCondensed" w:hAnsi="Bahnschrift Light SemiCondensed"/>
+          <w:b/>
+          <w:bCs/>
+          <w:i w:val="0"/>
+          <w:iCs w:val="0"/>
+          <w:color w:val="auto"/>
+          <w:sz w:val="24"/>
+          <w:szCs w:val="24"/>
+          <w:u w:val="none"/>
+          <w:lang w:val="pt-BR"/>
+        </w:rPr>
+        <w:tab/>
+      </w:r>
+      <w:r>
+        <w:rPr>
+          <w:rFonts w:hint="default" w:ascii="Bahnschrift Light SemiCondensed" w:hAnsi="Bahnschrift Light SemiCondensed"/>
+          <w:b/>
+          <w:bCs/>
+          <w:i w:val="0"/>
+          <w:iCs w:val="0"/>
+          <w:color w:val="auto"/>
+          <w:sz w:val="24"/>
+          <w:szCs w:val="24"/>
+          <w:u w:val="none"/>
+          <w:lang w:val="pt-BR"/>
+        </w:rPr>
+        <w:tab/>
+      </w:r>
+      <w:r>
+        <w:rPr>
+          <w:rFonts w:hint="default" w:ascii="Bahnschrift Light SemiCondensed" w:hAnsi="Bahnschrift Light SemiCondensed"/>
+          <w:b/>
+          <w:bCs/>
+          <w:i w:val="0"/>
+          <w:iCs w:val="0"/>
+          <w:color w:val="auto"/>
+          <w:sz w:val="24"/>
+          <w:szCs w:val="24"/>
+          <w:u w:val="none"/>
+          <w:lang w:val="pt-BR"/>
+        </w:rPr>
+        <w:tab/>
+      </w:r>
+      <w:r>
+        <w:rPr>
+          <w:rFonts w:hint="default" w:ascii="Bahnschrift Light SemiCondensed" w:hAnsi="Bahnschrift Light SemiCondensed"/>
+          <w:b/>
+          <w:bCs/>
+          <w:i w:val="0"/>
+          <w:iCs w:val="0"/>
+          <w:color w:val="auto"/>
+          <w:sz w:val="24"/>
+          <w:szCs w:val="24"/>
+          <w:u w:val="none"/>
+          <w:lang w:val="pt-BR"/>
+        </w:rPr>
+        <w:t>→</w:t>
+      </w:r>
+    </w:p>
+    <w:p>
+      <w:pPr>
+        <w:jc w:val="left"/>
+        <w:rPr>
+          <w:rFonts w:hint="default" w:ascii="Bahnschrift Light SemiCondensed" w:hAnsi="Bahnschrift Light SemiCondensed"/>
+          <w:b/>
+          <w:bCs/>
+          <w:i w:val="0"/>
+          <w:iCs w:val="0"/>
+          <w:color w:val="auto"/>
+          <w:sz w:val="24"/>
+          <w:szCs w:val="24"/>
+          <w:u w:val="none"/>
+          <w:lang w:val="pt-BR"/>
+        </w:rPr>
+      </w:pPr>
+    </w:p>
+    <w:p>
+      <w:pPr>
+        <w:jc w:val="left"/>
+        <w:rPr>
+          <w:rFonts w:hint="default" w:ascii="Bahnschrift Light SemiCondensed" w:hAnsi="Bahnschrift Light SemiCondensed"/>
+          <w:b w:val="0"/>
+          <w:bCs w:val="0"/>
+          <w:i w:val="0"/>
+          <w:iCs w:val="0"/>
+          <w:color w:val="auto"/>
+          <w:sz w:val="24"/>
+          <w:szCs w:val="24"/>
+          <w:u w:val="none"/>
+          <w:lang w:val="pt-BR"/>
+        </w:rPr>
+      </w:pPr>
+      <w:r>
+        <w:rPr>
+          <w:rFonts w:hint="default" w:ascii="Bahnschrift Light SemiCondensed" w:hAnsi="Bahnschrift Light SemiCondensed"/>
+          <w:b/>
+          <w:bCs/>
+          <w:i w:val="0"/>
+          <w:iCs w:val="0"/>
+          <w:color w:val="auto"/>
+          <w:sz w:val="24"/>
+          <w:szCs w:val="24"/>
+          <w:u w:val="none"/>
+          <w:lang w:val="pt-BR"/>
+        </w:rPr>
+        <w:tab/>
+      </w:r>
+      <w:r>
+        <w:rPr>
+          <w:rFonts w:hint="default" w:ascii="Bahnschrift Light SemiCondensed" w:hAnsi="Bahnschrift Light SemiCondensed"/>
+          <w:b/>
+          <w:bCs/>
+          <w:i w:val="0"/>
+          <w:iCs w:val="0"/>
+          <w:color w:val="auto"/>
+          <w:sz w:val="24"/>
+          <w:szCs w:val="24"/>
+          <w:u w:val="none"/>
+          <w:lang w:val="pt-BR"/>
+        </w:rPr>
+        <w:tab/>
+      </w:r>
+      <w:r>
+        <w:rPr>
+          <w:rFonts w:hint="default" w:ascii="Bahnschrift Light SemiCondensed" w:hAnsi="Bahnschrift Light SemiCondensed"/>
+          <w:b w:val="0"/>
+          <w:bCs w:val="0"/>
+          <w:i w:val="0"/>
+          <w:iCs w:val="0"/>
+          <w:color w:val="auto"/>
+          <w:sz w:val="24"/>
+          <w:szCs w:val="24"/>
+          <w:u w:val="none"/>
+          <w:lang w:val="pt-BR"/>
+        </w:rPr>
+        <w:t>Comando utilizado para tirar a média dos valores de uma coluna específica da tabela.</w:t>
+      </w:r>
+    </w:p>
+    <w:p>
+      <w:pPr>
+        <w:jc w:val="left"/>
+        <w:rPr>
+          <w:rFonts w:hint="default" w:ascii="Bahnschrift Light SemiCondensed" w:hAnsi="Bahnschrift Light SemiCondensed"/>
+          <w:b w:val="0"/>
+          <w:bCs w:val="0"/>
+          <w:i w:val="0"/>
+          <w:iCs w:val="0"/>
+          <w:color w:val="auto"/>
+          <w:sz w:val="24"/>
+          <w:szCs w:val="24"/>
+          <w:u w:val="none"/>
+          <w:lang w:val="pt-BR"/>
+        </w:rPr>
+      </w:pPr>
+    </w:p>
+    <w:p>
+      <w:pPr>
+        <w:jc w:val="left"/>
+        <w:rPr>
+          <w:rFonts w:hint="default" w:ascii="Bahnschrift Light SemiCondensed" w:hAnsi="Bahnschrift Light SemiCondensed" w:eastAsia="SimSun" w:cs="Bahnschrift Light SemiCondensed"/>
+          <w:b w:val="0"/>
+          <w:bCs w:val="0"/>
+          <w:sz w:val="24"/>
+          <w:szCs w:val="24"/>
+          <w:u w:val="single"/>
+          <w:lang w:val="pt-BR"/>
+        </w:rPr>
+      </w:pPr>
+      <w:r>
+        <w:rPr>
+          <w:rFonts w:hint="default" w:ascii="Bahnschrift Light SemiCondensed" w:hAnsi="Bahnschrift Light SemiCondensed" w:eastAsia="SimSun" w:cs="Bahnschrift Light SemiCondensed"/>
+          <w:b w:val="0"/>
+          <w:bCs w:val="0"/>
+          <w:sz w:val="24"/>
+          <w:szCs w:val="24"/>
+        </w:rPr>
+        <w:t xml:space="preserve">SELECT </w:t>
+      </w:r>
+      <w:r>
+        <w:rPr>
+          <w:rFonts w:hint="default" w:ascii="Bahnschrift Light SemiCondensed" w:hAnsi="Bahnschrift Light SemiCondensed" w:eastAsia="SimSun" w:cs="Bahnschrift Light SemiCondensed"/>
+          <w:b w:val="0"/>
+          <w:bCs w:val="0"/>
+          <w:sz w:val="24"/>
+          <w:szCs w:val="24"/>
+          <w:u w:val="single"/>
+          <w:lang w:val="pt-BR"/>
+        </w:rPr>
+        <w:t>coluna_específica</w:t>
+      </w:r>
+      <w:r>
+        <w:rPr>
+          <w:rFonts w:hint="default" w:ascii="Bahnschrift Light SemiCondensed" w:hAnsi="Bahnschrift Light SemiCondensed" w:eastAsia="SimSun" w:cs="Bahnschrift Light SemiCondensed"/>
+          <w:b w:val="0"/>
+          <w:bCs w:val="0"/>
+          <w:sz w:val="24"/>
+          <w:szCs w:val="24"/>
+        </w:rPr>
+        <w:t xml:space="preserve"> FROM </w:t>
+      </w:r>
+      <w:r>
+        <w:rPr>
+          <w:rFonts w:hint="default" w:ascii="Bahnschrift Light SemiCondensed" w:hAnsi="Bahnschrift Light SemiCondensed" w:eastAsia="SimSun" w:cs="Bahnschrift Light SemiCondensed"/>
+          <w:b w:val="0"/>
+          <w:bCs w:val="0"/>
+          <w:sz w:val="24"/>
+          <w:szCs w:val="24"/>
+          <w:lang w:val="pt-BR"/>
+        </w:rPr>
+        <w:t>nome_da_</w:t>
+      </w:r>
+      <w:r>
+        <w:rPr>
+          <w:rFonts w:hint="default" w:ascii="Bahnschrift Light SemiCondensed" w:hAnsi="Bahnschrift Light SemiCondensed" w:eastAsia="SimSun" w:cs="Bahnschrift Light SemiCondensed"/>
+          <w:b w:val="0"/>
+          <w:bCs w:val="0"/>
+          <w:sz w:val="24"/>
+          <w:szCs w:val="24"/>
+          <w:u w:val="single"/>
+          <w:lang w:val="pt-BR"/>
+        </w:rPr>
+        <w:t>tabela</w:t>
+      </w:r>
+    </w:p>
+    <w:p>
+      <w:pPr>
+        <w:jc w:val="left"/>
+        <w:rPr>
+          <w:rFonts w:hint="default" w:ascii="Bahnschrift Light SemiCondensed" w:hAnsi="Bahnschrift Light SemiCondensed" w:eastAsia="SimSun" w:cs="Bahnschrift Light SemiCondensed"/>
+          <w:b w:val="0"/>
+          <w:bCs w:val="0"/>
+          <w:sz w:val="24"/>
+          <w:szCs w:val="24"/>
+          <w:lang w:val="pt-BR"/>
+        </w:rPr>
+      </w:pPr>
+      <w:r>
+        <w:rPr>
+          <w:rFonts w:hint="default" w:ascii="Bahnschrift Light SemiCondensed" w:hAnsi="Bahnschrift Light SemiCondensed" w:eastAsia="SimSun" w:cs="Bahnschrift Light SemiCondensed"/>
+          <w:b/>
+          <w:bCs/>
+          <w:sz w:val="24"/>
+          <w:szCs w:val="24"/>
+        </w:rPr>
+        <w:t>WHERE SUBSTRING(</w:t>
+      </w:r>
+      <w:r>
+        <w:rPr>
+          <w:rFonts w:hint="default" w:ascii="Bahnschrift Light SemiCondensed" w:hAnsi="Bahnschrift Light SemiCondensed" w:eastAsia="SimSun" w:cs="Bahnschrift Light SemiCondensed"/>
+          <w:b w:val="0"/>
+          <w:bCs w:val="0"/>
+          <w:sz w:val="24"/>
+          <w:szCs w:val="24"/>
+          <w:u w:val="single"/>
+          <w:lang w:val="pt-BR"/>
+        </w:rPr>
+        <w:t>coluna_específica</w:t>
+      </w:r>
+      <w:r>
+        <w:rPr>
+          <w:rFonts w:hint="default" w:ascii="Bahnschrift Light SemiCondensed" w:hAnsi="Bahnschrift Light SemiCondensed" w:eastAsia="SimSun" w:cs="Bahnschrift Light SemiCondensed"/>
+          <w:b/>
+          <w:bCs/>
+          <w:sz w:val="24"/>
+          <w:szCs w:val="24"/>
+        </w:rPr>
+        <w:t>, -1) = '</w:t>
+      </w:r>
+      <w:r>
+        <w:rPr>
+          <w:rFonts w:hint="default" w:ascii="Bahnschrift Light SemiCondensed" w:hAnsi="Bahnschrift Light SemiCondensed" w:eastAsia="SimSun" w:cs="Bahnschrift Light SemiCondensed"/>
+          <w:b w:val="0"/>
+          <w:bCs w:val="0"/>
+          <w:sz w:val="24"/>
+          <w:szCs w:val="24"/>
+          <w:u w:val="single"/>
+          <w:lang w:val="pt-BR"/>
+        </w:rPr>
+        <w:t>letra_específica</w:t>
+      </w:r>
+      <w:r>
+        <w:rPr>
+          <w:rFonts w:hint="default" w:ascii="Bahnschrift Light SemiCondensed" w:hAnsi="Bahnschrift Light SemiCondensed" w:eastAsia="SimSun" w:cs="Bahnschrift Light SemiCondensed"/>
+          <w:b/>
+          <w:bCs/>
+          <w:sz w:val="24"/>
+          <w:szCs w:val="24"/>
+        </w:rPr>
+        <w:t>';</w:t>
+      </w:r>
+      <w:r>
+        <w:rPr>
+          <w:rFonts w:hint="default" w:ascii="Bahnschrift Light SemiCondensed" w:hAnsi="Bahnschrift Light SemiCondensed" w:eastAsia="SimSun" w:cs="Bahnschrift Light SemiCondensed"/>
+          <w:b/>
+          <w:bCs/>
+          <w:sz w:val="24"/>
+          <w:szCs w:val="24"/>
+          <w:lang w:val="pt-BR"/>
+        </w:rPr>
+        <w:tab/>
+        <w:t/>
+      </w:r>
+      <w:r>
+        <w:rPr>
+          <w:rFonts w:hint="default" w:ascii="Bahnschrift Light SemiCondensed" w:hAnsi="Bahnschrift Light SemiCondensed" w:eastAsia="SimSun" w:cs="Bahnschrift Light SemiCondensed"/>
+          <w:b/>
+          <w:bCs/>
+          <w:sz w:val="24"/>
+          <w:szCs w:val="24"/>
+          <w:lang w:val="pt-BR"/>
+        </w:rPr>
+        <w:tab/>
+      </w:r>
+      <w:r>
+        <w:rPr>
+          <w:rFonts w:hint="default" w:ascii="Bahnschrift Light SemiCondensed" w:hAnsi="Bahnschrift Light SemiCondensed" w:eastAsia="SimSun" w:cs="Bahnschrift Light SemiCondensed"/>
+          <w:b w:val="0"/>
+          <w:bCs w:val="0"/>
+          <w:sz w:val="24"/>
+          <w:szCs w:val="24"/>
+          <w:lang w:val="pt-BR"/>
+        </w:rPr>
+        <w:t>→</w:t>
+      </w:r>
+    </w:p>
+    <w:p>
+      <w:pPr>
+        <w:jc w:val="left"/>
+        <w:rPr>
+          <w:rFonts w:hint="default" w:ascii="Bahnschrift Light SemiCondensed" w:hAnsi="Bahnschrift Light SemiCondensed" w:eastAsia="SimSun" w:cs="Bahnschrift Light SemiCondensed"/>
+          <w:b w:val="0"/>
+          <w:bCs w:val="0"/>
+          <w:sz w:val="24"/>
+          <w:szCs w:val="24"/>
+          <w:lang w:val="pt-BR"/>
+        </w:rPr>
+      </w:pPr>
+    </w:p>
+    <w:p>
+      <w:pPr>
+        <w:jc w:val="left"/>
+        <w:rPr>
+          <w:rFonts w:hint="default" w:ascii="Bahnschrift Light SemiCondensed" w:hAnsi="Bahnschrift Light SemiCondensed" w:eastAsia="SimSun" w:cs="Bahnschrift Light SemiCondensed"/>
+          <w:b w:val="0"/>
+          <w:bCs w:val="0"/>
+          <w:sz w:val="24"/>
+          <w:szCs w:val="24"/>
+          <w:lang w:val="pt-BR"/>
+        </w:rPr>
+      </w:pPr>
+      <w:r>
+        <w:rPr>
+          <w:rFonts w:hint="default" w:ascii="Bahnschrift Light SemiCondensed" w:hAnsi="Bahnschrift Light SemiCondensed" w:eastAsia="SimSun" w:cs="Bahnschrift Light SemiCondensed"/>
+          <w:b w:val="0"/>
+          <w:bCs w:val="0"/>
+          <w:sz w:val="24"/>
+          <w:szCs w:val="24"/>
+          <w:lang w:val="pt-BR"/>
+        </w:rPr>
+        <w:tab/>
+        <w:t/>
+      </w:r>
+      <w:r>
+        <w:rPr>
+          <w:rFonts w:hint="default" w:ascii="Bahnschrift Light SemiCondensed" w:hAnsi="Bahnschrift Light SemiCondensed" w:eastAsia="SimSun" w:cs="Bahnschrift Light SemiCondensed"/>
+          <w:b w:val="0"/>
+          <w:bCs w:val="0"/>
+          <w:sz w:val="24"/>
+          <w:szCs w:val="24"/>
+          <w:lang w:val="pt-BR"/>
+        </w:rPr>
+        <w:tab/>
+        <w:t>Comando utilizado para consultar dados onde suas primeiras instâncias terminam com uma letra específica.</w:t>
+      </w:r>
       <w:bookmarkStart w:id="0" w:name="_GoBack"/>
       <w:bookmarkEnd w:id="0"/>
-    </w:p>
-    <w:p>
-      <w:pPr>
-        <w:jc w:val="left"/>
-        <w:rPr>
-          <w:rFonts w:hint="default" w:ascii="Bahnschrift Light SemiCondensed" w:hAnsi="Bahnschrift Light SemiCondensed"/>
-          <w:b w:val="0"/>
-          <w:bCs w:val="0"/>
-          <w:i w:val="0"/>
-          <w:iCs w:val="0"/>
-          <w:color w:val="auto"/>
-          <w:sz w:val="24"/>
-          <w:szCs w:val="24"/>
-          <w:u w:val="none"/>
-          <w:lang w:val="pt-BR"/>
-        </w:rPr>
-      </w:pPr>
-    </w:p>
-    <w:p>
-      <w:pPr>
-        <w:jc w:val="left"/>
-        <w:rPr>
-          <w:rFonts w:hint="default" w:ascii="Bahnschrift Light SemiCondensed" w:hAnsi="Bahnschrift Light SemiCondensed"/>
-          <w:b w:val="0"/>
-          <w:bCs w:val="0"/>
-          <w:i w:val="0"/>
-          <w:iCs w:val="0"/>
-          <w:color w:val="auto"/>
-          <w:sz w:val="24"/>
-          <w:szCs w:val="24"/>
-          <w:u w:val="none"/>
-          <w:lang w:val="pt-BR"/>
-        </w:rPr>
-      </w:pPr>
-    </w:p>
-    <w:p>
-      <w:pPr>
-        <w:jc w:val="left"/>
-        <w:rPr>
-          <w:rFonts w:hint="default" w:ascii="Bahnschrift Light SemiCondensed" w:hAnsi="Bahnschrift Light SemiCondensed"/>
-          <w:b/>
-          <w:bCs/>
-          <w:i w:val="0"/>
-          <w:iCs w:val="0"/>
-          <w:color w:val="auto"/>
-          <w:sz w:val="24"/>
-          <w:szCs w:val="24"/>
-          <w:u w:val="none"/>
-          <w:lang w:val="pt-BR"/>
-        </w:rPr>
-      </w:pPr>
-      <w:r>
-        <w:rPr>
-          <w:rFonts w:hint="default" w:ascii="Bahnschrift Light SemiCondensed" w:hAnsi="Bahnschrift Light SemiCondensed"/>
-          <w:b/>
-          <w:bCs/>
-          <w:i w:val="0"/>
-          <w:iCs w:val="0"/>
-          <w:color w:val="auto"/>
-          <w:sz w:val="24"/>
-          <w:szCs w:val="24"/>
-          <w:u w:val="none"/>
-          <w:lang w:val="pt-BR"/>
-        </w:rPr>
-        <w:t xml:space="preserve">SELECT * FROM </w:t>
-      </w:r>
-      <w:r>
-        <w:rPr>
-          <w:rFonts w:hint="default" w:ascii="Bahnschrift Light SemiCondensed" w:hAnsi="Bahnschrift Light SemiCondensed"/>
-          <w:b w:val="0"/>
-          <w:bCs w:val="0"/>
-          <w:i w:val="0"/>
-          <w:iCs w:val="0"/>
-          <w:color w:val="auto"/>
-          <w:sz w:val="24"/>
-          <w:szCs w:val="24"/>
-          <w:u w:val="single"/>
-          <w:lang w:val="pt-BR"/>
-        </w:rPr>
-        <w:t>nome_da_tabela</w:t>
-      </w:r>
-    </w:p>
-    <w:p>
-      <w:pPr>
-        <w:jc w:val="left"/>
-        <w:rPr>
-          <w:rFonts w:hint="default" w:ascii="Bahnschrift Light SemiCondensed" w:hAnsi="Bahnschrift Light SemiCondensed"/>
-          <w:b w:val="0"/>
-          <w:bCs w:val="0"/>
-          <w:i w:val="0"/>
-          <w:iCs w:val="0"/>
-          <w:color w:val="auto"/>
-          <w:sz w:val="24"/>
-          <w:szCs w:val="24"/>
-          <w:u w:val="none"/>
-          <w:lang w:val="pt-BR"/>
-        </w:rPr>
-      </w:pPr>
-      <w:r>
-        <w:rPr>
-          <w:rFonts w:hint="default" w:ascii="Bahnschrift Light SemiCondensed" w:hAnsi="Bahnschrift Light SemiCondensed"/>
-          <w:b/>
-          <w:bCs/>
-          <w:i w:val="0"/>
-          <w:iCs w:val="0"/>
-          <w:color w:val="auto"/>
-          <w:sz w:val="24"/>
-          <w:szCs w:val="24"/>
-          <w:u w:val="none"/>
-          <w:lang w:val="pt-BR"/>
-        </w:rPr>
-        <w:t xml:space="preserve">WHERE </w:t>
-      </w:r>
-      <w:r>
-        <w:rPr>
-          <w:rFonts w:hint="default" w:ascii="Bahnschrift Light SemiCondensed" w:hAnsi="Bahnschrift Light SemiCondensed"/>
-          <w:b w:val="0"/>
-          <w:bCs w:val="0"/>
-          <w:i w:val="0"/>
-          <w:iCs w:val="0"/>
-          <w:color w:val="auto"/>
-          <w:sz w:val="24"/>
-          <w:szCs w:val="24"/>
-          <w:u w:val="single"/>
-          <w:lang w:val="pt-BR"/>
-        </w:rPr>
-        <w:t>coluna_da_tabela</w:t>
-      </w:r>
-      <w:r>
-        <w:rPr>
-          <w:rFonts w:hint="default" w:ascii="Bahnschrift Light SemiCondensed" w:hAnsi="Bahnschrift Light SemiCondensed"/>
-          <w:b w:val="0"/>
-          <w:bCs w:val="0"/>
-          <w:i w:val="0"/>
-          <w:iCs w:val="0"/>
-          <w:color w:val="auto"/>
-          <w:sz w:val="24"/>
-          <w:szCs w:val="24"/>
-          <w:u w:val="none"/>
-          <w:lang w:val="pt-BR"/>
-        </w:rPr>
-        <w:t xml:space="preserve"> </w:t>
-      </w:r>
-      <w:r>
-        <w:rPr>
-          <w:rFonts w:hint="default" w:ascii="Bahnschrift Light SemiCondensed" w:hAnsi="Bahnschrift Light SemiCondensed"/>
-          <w:b/>
-          <w:bCs/>
-          <w:i w:val="0"/>
-          <w:iCs w:val="0"/>
-          <w:color w:val="auto"/>
-          <w:sz w:val="24"/>
-          <w:szCs w:val="24"/>
-          <w:u w:val="none"/>
-          <w:lang w:val="pt-BR"/>
-        </w:rPr>
-        <w:t xml:space="preserve">LIKE </w:t>
-      </w:r>
-      <w:r>
-        <w:rPr>
-          <w:rFonts w:hint="default" w:ascii="Bahnschrift Light SemiCondensed" w:hAnsi="Bahnschrift Light SemiCondensed"/>
-          <w:b w:val="0"/>
-          <w:bCs w:val="0"/>
-          <w:i w:val="0"/>
-          <w:iCs w:val="0"/>
-          <w:color w:val="auto"/>
-          <w:sz w:val="24"/>
-          <w:szCs w:val="24"/>
-          <w:u w:val="single"/>
-          <w:lang w:val="pt-BR"/>
-        </w:rPr>
-        <w:t>‘letras(intervalo de letras)letras%’</w:t>
-      </w:r>
-      <w:r>
-        <w:rPr>
-          <w:rFonts w:hint="default" w:ascii="Bahnschrift Light SemiCondensed" w:hAnsi="Bahnschrift Light SemiCondensed"/>
-          <w:b w:val="0"/>
-          <w:bCs w:val="0"/>
-          <w:i w:val="0"/>
-          <w:iCs w:val="0"/>
-          <w:color w:val="auto"/>
-          <w:sz w:val="24"/>
-          <w:szCs w:val="24"/>
-          <w:u w:val="none"/>
-          <w:lang w:val="pt-BR"/>
-        </w:rPr>
-        <w:t xml:space="preserve"> </w:t>
-      </w:r>
-      <w:r>
-        <w:rPr>
-          <w:rFonts w:hint="default" w:ascii="Bahnschrift Light SemiCondensed" w:hAnsi="Bahnschrift Light SemiCondensed"/>
-          <w:b/>
-          <w:bCs/>
-          <w:i w:val="0"/>
-          <w:iCs w:val="0"/>
-          <w:color w:val="auto"/>
-          <w:sz w:val="24"/>
-          <w:szCs w:val="24"/>
-          <w:u w:val="none"/>
-          <w:lang w:val="pt-BR"/>
-        </w:rPr>
-        <w:t>;</w:t>
-      </w:r>
-      <w:r>
-        <w:rPr>
-          <w:rFonts w:hint="default" w:ascii="Bahnschrift Light SemiCondensed" w:hAnsi="Bahnschrift Light SemiCondensed"/>
-          <w:b w:val="0"/>
-          <w:bCs w:val="0"/>
-          <w:i w:val="0"/>
-          <w:iCs w:val="0"/>
-          <w:color w:val="auto"/>
-          <w:sz w:val="24"/>
-          <w:szCs w:val="24"/>
-          <w:u w:val="none"/>
-          <w:lang w:val="pt-BR"/>
-        </w:rPr>
-        <w:tab/>
-      </w:r>
-      <w:r>
-        <w:rPr>
-          <w:rFonts w:hint="default" w:ascii="Bahnschrift Light SemiCondensed" w:hAnsi="Bahnschrift Light SemiCondensed"/>
-          <w:b w:val="0"/>
-          <w:bCs w:val="0"/>
-          <w:i w:val="0"/>
-          <w:iCs w:val="0"/>
-          <w:color w:val="auto"/>
-          <w:sz w:val="24"/>
-          <w:szCs w:val="24"/>
-          <w:u w:val="none"/>
-          <w:lang w:val="pt-BR"/>
-        </w:rPr>
-        <w:tab/>
-      </w:r>
-      <w:r>
-        <w:rPr>
-          <w:rFonts w:hint="default" w:ascii="Bahnschrift Light SemiCondensed" w:hAnsi="Bahnschrift Light SemiCondensed"/>
-          <w:b w:val="0"/>
-          <w:bCs w:val="0"/>
-          <w:i w:val="0"/>
-          <w:iCs w:val="0"/>
-          <w:color w:val="auto"/>
-          <w:sz w:val="24"/>
-          <w:szCs w:val="24"/>
-          <w:u w:val="none"/>
-          <w:lang w:val="pt-BR"/>
-        </w:rPr>
-        <w:tab/>
-      </w:r>
-      <w:r>
-        <w:rPr>
-          <w:rFonts w:hint="default" w:ascii="Bahnschrift Light SemiCondensed" w:hAnsi="Bahnschrift Light SemiCondensed"/>
-          <w:b w:val="0"/>
-          <w:bCs w:val="0"/>
-          <w:i w:val="0"/>
-          <w:iCs w:val="0"/>
-          <w:color w:val="auto"/>
-          <w:sz w:val="24"/>
-          <w:szCs w:val="24"/>
-          <w:u w:val="none"/>
-          <w:lang w:val="pt-BR"/>
-        </w:rPr>
-        <w:tab/>
-      </w:r>
-      <w:r>
-        <w:rPr>
-          <w:rFonts w:hint="default" w:ascii="Bahnschrift Light SemiCondensed" w:hAnsi="Bahnschrift Light SemiCondensed"/>
-          <w:b w:val="0"/>
-          <w:bCs w:val="0"/>
-          <w:i w:val="0"/>
-          <w:iCs w:val="0"/>
-          <w:color w:val="auto"/>
-          <w:sz w:val="24"/>
-          <w:szCs w:val="24"/>
-          <w:u w:val="none"/>
-          <w:lang w:val="pt-BR"/>
-        </w:rPr>
-        <w:tab/>
-      </w:r>
-      <w:r>
-        <w:rPr>
-          <w:rFonts w:hint="default" w:ascii="Bahnschrift Light SemiCondensed" w:hAnsi="Bahnschrift Light SemiCondensed"/>
-          <w:b w:val="0"/>
-          <w:bCs w:val="0"/>
-          <w:i w:val="0"/>
-          <w:iCs w:val="0"/>
-          <w:color w:val="auto"/>
-          <w:sz w:val="24"/>
-          <w:szCs w:val="24"/>
-          <w:u w:val="none"/>
-          <w:lang w:val="pt-BR"/>
-        </w:rPr>
-        <w:t>→</w:t>
-      </w:r>
-    </w:p>
-    <w:p>
-      <w:pPr>
-        <w:jc w:val="left"/>
-        <w:rPr>
-          <w:rFonts w:hint="default" w:ascii="Bahnschrift Light SemiCondensed" w:hAnsi="Bahnschrift Light SemiCondensed"/>
-          <w:b w:val="0"/>
-          <w:bCs w:val="0"/>
-          <w:i w:val="0"/>
-          <w:iCs w:val="0"/>
-          <w:color w:val="auto"/>
-          <w:sz w:val="24"/>
-          <w:szCs w:val="24"/>
-          <w:u w:val="none"/>
-          <w:lang w:val="pt-BR"/>
-        </w:rPr>
-      </w:pPr>
-    </w:p>
-    <w:p>
-      <w:pPr>
-        <w:jc w:val="left"/>
-        <w:rPr>
-          <w:rFonts w:hint="default" w:ascii="Bahnschrift Light SemiCondensed" w:hAnsi="Bahnschrift Light SemiCondensed"/>
-          <w:b w:val="0"/>
-          <w:bCs w:val="0"/>
-          <w:i w:val="0"/>
-          <w:iCs w:val="0"/>
-          <w:color w:val="auto"/>
-          <w:sz w:val="24"/>
-          <w:szCs w:val="24"/>
-          <w:u w:val="none"/>
-          <w:lang w:val="pt-BR"/>
-        </w:rPr>
-      </w:pPr>
-    </w:p>
-    <w:p>
-      <w:pPr>
-        <w:jc w:val="left"/>
-        <w:rPr>
-          <w:rFonts w:hint="default" w:ascii="Bahnschrift Light SemiCondensed" w:hAnsi="Bahnschrift Light SemiCondensed"/>
-          <w:b w:val="0"/>
-          <w:bCs w:val="0"/>
-          <w:i w:val="0"/>
-          <w:iCs w:val="0"/>
-          <w:color w:val="auto"/>
-          <w:sz w:val="24"/>
-          <w:szCs w:val="24"/>
-          <w:u w:val="none"/>
-          <w:lang w:val="pt-BR"/>
-        </w:rPr>
-      </w:pPr>
-      <w:r>
-        <w:rPr>
-          <w:rFonts w:hint="default" w:ascii="Bahnschrift Light SemiCondensed" w:hAnsi="Bahnschrift Light SemiCondensed"/>
-          <w:b w:val="0"/>
-          <w:bCs w:val="0"/>
-          <w:i w:val="0"/>
-          <w:iCs w:val="0"/>
-          <w:color w:val="auto"/>
-          <w:sz w:val="24"/>
-          <w:szCs w:val="24"/>
-          <w:u w:val="none"/>
-          <w:lang w:val="pt-BR"/>
-        </w:rPr>
-        <w:tab/>
-      </w:r>
-      <w:r>
-        <w:rPr>
-          <w:rFonts w:hint="default" w:ascii="Bahnschrift Light SemiCondensed" w:hAnsi="Bahnschrift Light SemiCondensed"/>
-          <w:b w:val="0"/>
-          <w:bCs w:val="0"/>
-          <w:i w:val="0"/>
-          <w:iCs w:val="0"/>
-          <w:color w:val="auto"/>
-          <w:sz w:val="24"/>
-          <w:szCs w:val="24"/>
-          <w:u w:val="none"/>
-          <w:lang w:val="pt-BR"/>
-        </w:rPr>
-        <w:tab/>
-      </w:r>
-      <w:r>
-        <w:rPr>
-          <w:rFonts w:hint="default" w:ascii="Bahnschrift Light SemiCondensed" w:hAnsi="Bahnschrift Light SemiCondensed"/>
-          <w:b w:val="0"/>
-          <w:bCs w:val="0"/>
-          <w:i w:val="0"/>
-          <w:iCs w:val="0"/>
-          <w:color w:val="auto"/>
-          <w:sz w:val="24"/>
-          <w:szCs w:val="24"/>
-          <w:u w:val="none"/>
-          <w:lang w:val="pt-BR"/>
-        </w:rPr>
-        <w:t>Comando utilizado para fazer uma consulta na tabela de dados de uma coluna específica que tenham letras específicas no começo, um intervalo de letras e após outra letra ou um conjunto de letras específicos.</w:t>
-      </w:r>
-    </w:p>
-    <w:p>
-      <w:pPr>
-        <w:jc w:val="left"/>
-        <w:rPr>
-          <w:rFonts w:hint="default" w:ascii="Bahnschrift Light SemiCondensed" w:hAnsi="Bahnschrift Light SemiCondensed"/>
-          <w:b w:val="0"/>
-          <w:bCs w:val="0"/>
-          <w:i w:val="0"/>
-          <w:iCs w:val="0"/>
-          <w:color w:val="auto"/>
-          <w:sz w:val="24"/>
-          <w:szCs w:val="24"/>
-          <w:u w:val="none"/>
-          <w:lang w:val="pt-BR"/>
-        </w:rPr>
-      </w:pPr>
-    </w:p>
-    <w:p>
-      <w:pPr>
-        <w:jc w:val="left"/>
-        <w:rPr>
-          <w:rFonts w:hint="default" w:ascii="Bahnschrift Light SemiCondensed" w:hAnsi="Bahnschrift Light SemiCondensed"/>
-          <w:b w:val="0"/>
-          <w:bCs w:val="0"/>
-          <w:i w:val="0"/>
-          <w:iCs w:val="0"/>
-          <w:color w:val="auto"/>
-          <w:sz w:val="24"/>
-          <w:szCs w:val="24"/>
-          <w:u w:val="none"/>
-          <w:lang w:val="pt-BR"/>
-        </w:rPr>
-      </w:pPr>
-    </w:p>
-    <w:p>
-      <w:pPr>
-        <w:jc w:val="left"/>
-        <w:rPr>
-          <w:rFonts w:hint="default" w:ascii="Bahnschrift Light SemiCondensed" w:hAnsi="Bahnschrift Light SemiCondensed"/>
-          <w:b/>
-          <w:bCs/>
-          <w:i w:val="0"/>
-          <w:iCs w:val="0"/>
-          <w:color w:val="auto"/>
-          <w:sz w:val="24"/>
-          <w:szCs w:val="24"/>
-          <w:u w:val="none"/>
-          <w:lang w:val="pt-BR"/>
-        </w:rPr>
-      </w:pPr>
-      <w:r>
-        <w:rPr>
-          <w:rFonts w:hint="default" w:ascii="Bahnschrift Light SemiCondensed" w:hAnsi="Bahnschrift Light SemiCondensed"/>
-          <w:b/>
-          <w:bCs/>
-          <w:i w:val="0"/>
-          <w:iCs w:val="0"/>
-          <w:color w:val="auto"/>
-          <w:sz w:val="24"/>
-          <w:szCs w:val="24"/>
-          <w:u w:val="none"/>
-          <w:lang w:val="pt-BR"/>
-        </w:rPr>
-        <w:t xml:space="preserve">SELECT DISTINCT </w:t>
-      </w:r>
-      <w:r>
-        <w:rPr>
-          <w:rFonts w:hint="default" w:ascii="Bahnschrift Light SemiCondensed" w:hAnsi="Bahnschrift Light SemiCondensed"/>
-          <w:b w:val="0"/>
-          <w:bCs w:val="0"/>
-          <w:i w:val="0"/>
-          <w:iCs w:val="0"/>
-          <w:color w:val="auto"/>
-          <w:sz w:val="24"/>
-          <w:szCs w:val="24"/>
-          <w:u w:val="single"/>
-          <w:lang w:val="pt-BR"/>
-        </w:rPr>
-        <w:t>coluna_da_tabela</w:t>
-      </w:r>
-      <w:r>
-        <w:rPr>
-          <w:rFonts w:hint="default" w:ascii="Bahnschrift Light SemiCondensed" w:hAnsi="Bahnschrift Light SemiCondensed"/>
-          <w:b/>
-          <w:bCs/>
-          <w:i w:val="0"/>
-          <w:iCs w:val="0"/>
-          <w:color w:val="auto"/>
-          <w:sz w:val="24"/>
-          <w:szCs w:val="24"/>
-          <w:u w:val="none"/>
-          <w:lang w:val="pt-BR"/>
-        </w:rPr>
-        <w:t xml:space="preserve"> FROM gafanhotos</w:t>
-      </w:r>
-    </w:p>
-    <w:p>
-      <w:pPr>
-        <w:jc w:val="left"/>
-        <w:rPr>
-          <w:rFonts w:hint="default" w:ascii="Bahnschrift Light SemiCondensed" w:hAnsi="Bahnschrift Light SemiCondensed"/>
-          <w:b/>
-          <w:bCs/>
-          <w:i w:val="0"/>
-          <w:iCs w:val="0"/>
-          <w:color w:val="auto"/>
-          <w:sz w:val="24"/>
-          <w:szCs w:val="24"/>
-          <w:u w:val="none"/>
-          <w:lang w:val="pt-BR"/>
-        </w:rPr>
-      </w:pPr>
-      <w:r>
-        <w:rPr>
-          <w:rFonts w:hint="default" w:ascii="Bahnschrift Light SemiCondensed" w:hAnsi="Bahnschrift Light SemiCondensed"/>
-          <w:b/>
-          <w:bCs/>
-          <w:i w:val="0"/>
-          <w:iCs w:val="0"/>
-          <w:color w:val="auto"/>
-          <w:sz w:val="24"/>
-          <w:szCs w:val="24"/>
-          <w:u w:val="none"/>
-          <w:lang w:val="pt-BR"/>
-        </w:rPr>
-        <w:t xml:space="preserve">ORDER BY </w:t>
-      </w:r>
-      <w:r>
-        <w:rPr>
-          <w:rFonts w:hint="default" w:ascii="Bahnschrift Light SemiCondensed" w:hAnsi="Bahnschrift Light SemiCondensed"/>
-          <w:b w:val="0"/>
-          <w:bCs w:val="0"/>
-          <w:i w:val="0"/>
-          <w:iCs w:val="0"/>
-          <w:color w:val="auto"/>
-          <w:sz w:val="24"/>
-          <w:szCs w:val="24"/>
-          <w:u w:val="single"/>
-          <w:lang w:val="pt-BR"/>
-        </w:rPr>
-        <w:t>coluna_da_tabela</w:t>
-      </w:r>
-      <w:r>
-        <w:rPr>
-          <w:rFonts w:hint="default" w:ascii="Bahnschrift Light SemiCondensed" w:hAnsi="Bahnschrift Light SemiCondensed"/>
-          <w:b/>
-          <w:bCs/>
-          <w:i w:val="0"/>
-          <w:iCs w:val="0"/>
-          <w:color w:val="auto"/>
-          <w:sz w:val="24"/>
-          <w:szCs w:val="24"/>
-          <w:u w:val="none"/>
-          <w:lang w:val="pt-BR"/>
-        </w:rPr>
-        <w:t>;</w:t>
-      </w:r>
-      <w:r>
-        <w:rPr>
-          <w:rFonts w:hint="default" w:ascii="Bahnschrift Light SemiCondensed" w:hAnsi="Bahnschrift Light SemiCondensed"/>
-          <w:b/>
-          <w:bCs/>
-          <w:i w:val="0"/>
-          <w:iCs w:val="0"/>
-          <w:color w:val="auto"/>
-          <w:sz w:val="24"/>
-          <w:szCs w:val="24"/>
-          <w:u w:val="none"/>
-          <w:lang w:val="pt-BR"/>
-        </w:rPr>
-        <w:tab/>
-      </w:r>
-      <w:r>
-        <w:rPr>
-          <w:rFonts w:hint="default" w:ascii="Bahnschrift Light SemiCondensed" w:hAnsi="Bahnschrift Light SemiCondensed"/>
-          <w:b/>
-          <w:bCs/>
-          <w:i w:val="0"/>
-          <w:iCs w:val="0"/>
-          <w:color w:val="auto"/>
-          <w:sz w:val="24"/>
-          <w:szCs w:val="24"/>
-          <w:u w:val="none"/>
-          <w:lang w:val="pt-BR"/>
-        </w:rPr>
-        <w:tab/>
-      </w:r>
-      <w:r>
-        <w:rPr>
-          <w:rFonts w:hint="default" w:ascii="Bahnschrift Light SemiCondensed" w:hAnsi="Bahnschrift Light SemiCondensed"/>
-          <w:b/>
-          <w:bCs/>
-          <w:i w:val="0"/>
-          <w:iCs w:val="0"/>
-          <w:color w:val="auto"/>
-          <w:sz w:val="24"/>
-          <w:szCs w:val="24"/>
-          <w:u w:val="none"/>
-          <w:lang w:val="pt-BR"/>
-        </w:rPr>
-        <w:tab/>
-      </w:r>
-      <w:r>
-        <w:rPr>
-          <w:rFonts w:hint="default" w:ascii="Bahnschrift Light SemiCondensed" w:hAnsi="Bahnschrift Light SemiCondensed"/>
-          <w:b/>
-          <w:bCs/>
-          <w:i w:val="0"/>
-          <w:iCs w:val="0"/>
-          <w:color w:val="auto"/>
-          <w:sz w:val="24"/>
-          <w:szCs w:val="24"/>
-          <w:u w:val="none"/>
-          <w:lang w:val="pt-BR"/>
-        </w:rPr>
-        <w:tab/>
-      </w:r>
-      <w:r>
-        <w:rPr>
-          <w:rFonts w:hint="default" w:ascii="Bahnschrift Light SemiCondensed" w:hAnsi="Bahnschrift Light SemiCondensed"/>
-          <w:b/>
-          <w:bCs/>
-          <w:i w:val="0"/>
-          <w:iCs w:val="0"/>
-          <w:color w:val="auto"/>
-          <w:sz w:val="24"/>
-          <w:szCs w:val="24"/>
-          <w:u w:val="none"/>
-          <w:lang w:val="pt-BR"/>
-        </w:rPr>
-        <w:t>→</w:t>
-      </w:r>
-    </w:p>
-    <w:p>
-      <w:pPr>
-        <w:jc w:val="left"/>
-        <w:rPr>
-          <w:rFonts w:hint="default" w:ascii="Bahnschrift Light SemiCondensed" w:hAnsi="Bahnschrift Light SemiCondensed"/>
-          <w:b/>
-          <w:bCs/>
-          <w:i w:val="0"/>
-          <w:iCs w:val="0"/>
-          <w:color w:val="auto"/>
-          <w:sz w:val="24"/>
-          <w:szCs w:val="24"/>
-          <w:u w:val="none"/>
-          <w:lang w:val="pt-BR"/>
-        </w:rPr>
-      </w:pPr>
-    </w:p>
-    <w:p>
-      <w:pPr>
-        <w:jc w:val="left"/>
-        <w:rPr>
-          <w:rFonts w:hint="default" w:ascii="Bahnschrift Light SemiCondensed" w:hAnsi="Bahnschrift Light SemiCondensed"/>
-          <w:b/>
-          <w:bCs/>
-          <w:i w:val="0"/>
-          <w:iCs w:val="0"/>
-          <w:color w:val="auto"/>
-          <w:sz w:val="24"/>
-          <w:szCs w:val="24"/>
-          <w:u w:val="none"/>
-          <w:lang w:val="pt-BR"/>
-        </w:rPr>
-      </w:pPr>
-    </w:p>
-    <w:p>
-      <w:pPr>
-        <w:jc w:val="left"/>
-        <w:rPr>
-          <w:rFonts w:hint="default" w:ascii="Bahnschrift Light SemiCondensed" w:hAnsi="Bahnschrift Light SemiCondensed"/>
-          <w:b w:val="0"/>
-          <w:bCs w:val="0"/>
-          <w:i w:val="0"/>
-          <w:iCs w:val="0"/>
-          <w:color w:val="auto"/>
-          <w:sz w:val="24"/>
-          <w:szCs w:val="24"/>
-          <w:u w:val="none"/>
-          <w:lang w:val="pt-BR"/>
-        </w:rPr>
-      </w:pPr>
-      <w:r>
-        <w:rPr>
-          <w:rFonts w:hint="default" w:ascii="Bahnschrift Light SemiCondensed" w:hAnsi="Bahnschrift Light SemiCondensed"/>
-          <w:b/>
-          <w:bCs/>
-          <w:i w:val="0"/>
-          <w:iCs w:val="0"/>
-          <w:color w:val="auto"/>
-          <w:sz w:val="24"/>
-          <w:szCs w:val="24"/>
-          <w:u w:val="none"/>
-          <w:lang w:val="pt-BR"/>
-        </w:rPr>
-        <w:tab/>
-      </w:r>
-      <w:r>
-        <w:rPr>
-          <w:rFonts w:hint="default" w:ascii="Bahnschrift Light SemiCondensed" w:hAnsi="Bahnschrift Light SemiCondensed"/>
-          <w:b/>
-          <w:bCs/>
-          <w:i w:val="0"/>
-          <w:iCs w:val="0"/>
-          <w:color w:val="auto"/>
-          <w:sz w:val="24"/>
-          <w:szCs w:val="24"/>
-          <w:u w:val="none"/>
-          <w:lang w:val="pt-BR"/>
-        </w:rPr>
-        <w:tab/>
-      </w:r>
-      <w:r>
-        <w:rPr>
-          <w:rFonts w:hint="default" w:ascii="Bahnschrift Light SemiCondensed" w:hAnsi="Bahnschrift Light SemiCondensed"/>
-          <w:b/>
-          <w:bCs/>
-          <w:i w:val="0"/>
-          <w:iCs w:val="0"/>
-          <w:color w:val="auto"/>
-          <w:sz w:val="24"/>
-          <w:szCs w:val="24"/>
-          <w:u w:val="none"/>
-          <w:lang w:val="pt-BR"/>
-        </w:rPr>
-        <w:tab/>
-      </w:r>
-      <w:r>
-        <w:rPr>
-          <w:rFonts w:hint="default" w:ascii="Bahnschrift Light SemiCondensed" w:hAnsi="Bahnschrift Light SemiCondensed"/>
-          <w:b w:val="0"/>
-          <w:bCs w:val="0"/>
-          <w:i w:val="0"/>
-          <w:iCs w:val="0"/>
-          <w:color w:val="auto"/>
-          <w:sz w:val="24"/>
-          <w:szCs w:val="24"/>
-          <w:u w:val="none"/>
-          <w:lang w:val="pt-BR"/>
-        </w:rPr>
-        <w:t>Comando utilizado para verificar cada único de colunas específicas em uma tabela.</w:t>
-      </w:r>
-    </w:p>
-    <w:p>
-      <w:pPr>
-        <w:jc w:val="left"/>
-        <w:rPr>
-          <w:rFonts w:hint="default" w:ascii="Bahnschrift Light SemiCondensed" w:hAnsi="Bahnschrift Light SemiCondensed"/>
-          <w:b w:val="0"/>
-          <w:bCs w:val="0"/>
-          <w:i w:val="0"/>
-          <w:iCs w:val="0"/>
-          <w:color w:val="auto"/>
-          <w:sz w:val="24"/>
-          <w:szCs w:val="24"/>
-          <w:u w:val="none"/>
-          <w:lang w:val="pt-BR"/>
-        </w:rPr>
-      </w:pPr>
-    </w:p>
-    <w:p>
-      <w:pPr>
-        <w:jc w:val="left"/>
-        <w:rPr>
-          <w:rFonts w:hint="default" w:ascii="Bahnschrift Light SemiCondensed" w:hAnsi="Bahnschrift Light SemiCondensed"/>
-          <w:b w:val="0"/>
-          <w:bCs w:val="0"/>
-          <w:i w:val="0"/>
-          <w:iCs w:val="0"/>
-          <w:color w:val="auto"/>
-          <w:sz w:val="24"/>
-          <w:szCs w:val="24"/>
-          <w:u w:val="none"/>
-          <w:lang w:val="pt-BR"/>
-        </w:rPr>
-      </w:pPr>
-    </w:p>
-    <w:p>
-      <w:pPr>
-        <w:jc w:val="left"/>
-        <w:rPr>
-          <w:rFonts w:hint="default" w:ascii="Bahnschrift Light SemiCondensed" w:hAnsi="Bahnschrift Light SemiCondensed"/>
-          <w:b/>
-          <w:bCs/>
-          <w:i w:val="0"/>
-          <w:iCs w:val="0"/>
-          <w:color w:val="auto"/>
-          <w:sz w:val="24"/>
-          <w:szCs w:val="24"/>
-          <w:u w:val="none"/>
-          <w:lang w:val="pt-BR"/>
-        </w:rPr>
-      </w:pPr>
-      <w:r>
-        <w:rPr>
-          <w:rFonts w:hint="default" w:ascii="Bahnschrift Light SemiCondensed" w:hAnsi="Bahnschrift Light SemiCondensed"/>
-          <w:b/>
-          <w:bCs/>
-          <w:i w:val="0"/>
-          <w:iCs w:val="0"/>
-          <w:color w:val="auto"/>
-          <w:sz w:val="24"/>
-          <w:szCs w:val="24"/>
-          <w:u w:val="none"/>
-          <w:lang w:val="pt-BR"/>
-        </w:rPr>
-        <w:t xml:space="preserve">SELECT COUNT(*) FROM </w:t>
-      </w:r>
-      <w:r>
-        <w:rPr>
-          <w:rFonts w:hint="default" w:ascii="Bahnschrift Light SemiCondensed" w:hAnsi="Bahnschrift Light SemiCondensed"/>
-          <w:b w:val="0"/>
-          <w:bCs w:val="0"/>
-          <w:i w:val="0"/>
-          <w:iCs w:val="0"/>
-          <w:color w:val="auto"/>
-          <w:sz w:val="24"/>
-          <w:szCs w:val="24"/>
-          <w:u w:val="single"/>
-          <w:lang w:val="pt-BR"/>
-        </w:rPr>
-        <w:t>nome_da_tabela</w:t>
-      </w:r>
-      <w:r>
-        <w:rPr>
-          <w:rFonts w:hint="default" w:ascii="Bahnschrift Light SemiCondensed" w:hAnsi="Bahnschrift Light SemiCondensed"/>
-          <w:b/>
-          <w:bCs/>
-          <w:i w:val="0"/>
-          <w:iCs w:val="0"/>
-          <w:color w:val="auto"/>
-          <w:sz w:val="24"/>
-          <w:szCs w:val="24"/>
-          <w:u w:val="none"/>
-          <w:lang w:val="pt-BR"/>
-        </w:rPr>
-        <w:t>;</w:t>
-      </w:r>
-      <w:r>
-        <w:rPr>
-          <w:rFonts w:hint="default" w:ascii="Bahnschrift Light SemiCondensed" w:hAnsi="Bahnschrift Light SemiCondensed"/>
-          <w:b/>
-          <w:bCs/>
-          <w:i w:val="0"/>
-          <w:iCs w:val="0"/>
-          <w:color w:val="auto"/>
-          <w:sz w:val="24"/>
-          <w:szCs w:val="24"/>
-          <w:u w:val="none"/>
-          <w:lang w:val="pt-BR"/>
-        </w:rPr>
-        <w:tab/>
-      </w:r>
-      <w:r>
-        <w:rPr>
-          <w:rFonts w:hint="default" w:ascii="Bahnschrift Light SemiCondensed" w:hAnsi="Bahnschrift Light SemiCondensed"/>
-          <w:b/>
-          <w:bCs/>
-          <w:i w:val="0"/>
-          <w:iCs w:val="0"/>
-          <w:color w:val="auto"/>
-          <w:sz w:val="24"/>
-          <w:szCs w:val="24"/>
-          <w:u w:val="none"/>
-          <w:lang w:val="pt-BR"/>
-        </w:rPr>
-        <w:tab/>
-      </w:r>
-      <w:r>
-        <w:rPr>
-          <w:rFonts w:hint="default" w:ascii="Bahnschrift Light SemiCondensed" w:hAnsi="Bahnschrift Light SemiCondensed"/>
-          <w:b/>
-          <w:bCs/>
-          <w:i w:val="0"/>
-          <w:iCs w:val="0"/>
-          <w:color w:val="auto"/>
-          <w:sz w:val="24"/>
-          <w:szCs w:val="24"/>
-          <w:u w:val="none"/>
-          <w:lang w:val="pt-BR"/>
-        </w:rPr>
-        <w:tab/>
-      </w:r>
-      <w:r>
-        <w:rPr>
-          <w:rFonts w:hint="default" w:ascii="Bahnschrift Light SemiCondensed" w:hAnsi="Bahnschrift Light SemiCondensed"/>
-          <w:b/>
-          <w:bCs/>
-          <w:i w:val="0"/>
-          <w:iCs w:val="0"/>
-          <w:color w:val="auto"/>
-          <w:sz w:val="24"/>
-          <w:szCs w:val="24"/>
-          <w:u w:val="none"/>
-          <w:lang w:val="pt-BR"/>
-        </w:rPr>
-        <w:tab/>
-      </w:r>
-      <w:r>
-        <w:rPr>
-          <w:rFonts w:hint="default" w:ascii="Bahnschrift Light SemiCondensed" w:hAnsi="Bahnschrift Light SemiCondensed"/>
-          <w:b/>
-          <w:bCs/>
-          <w:i w:val="0"/>
-          <w:iCs w:val="0"/>
-          <w:color w:val="auto"/>
-          <w:sz w:val="24"/>
-          <w:szCs w:val="24"/>
-          <w:u w:val="none"/>
-          <w:lang w:val="pt-BR"/>
-        </w:rPr>
-        <w:t>→</w:t>
-      </w:r>
-    </w:p>
-    <w:p>
-      <w:pPr>
-        <w:jc w:val="left"/>
-        <w:rPr>
-          <w:rFonts w:hint="default" w:ascii="Bahnschrift Light SemiCondensed" w:hAnsi="Bahnschrift Light SemiCondensed"/>
-          <w:b/>
-          <w:bCs/>
-          <w:i w:val="0"/>
-          <w:iCs w:val="0"/>
-          <w:color w:val="auto"/>
-          <w:sz w:val="24"/>
-          <w:szCs w:val="24"/>
-          <w:u w:val="none"/>
-          <w:lang w:val="pt-BR"/>
-        </w:rPr>
-      </w:pPr>
-    </w:p>
-    <w:p>
-      <w:pPr>
-        <w:jc w:val="left"/>
-        <w:rPr>
-          <w:rFonts w:hint="default" w:ascii="Bahnschrift Light SemiCondensed" w:hAnsi="Bahnschrift Light SemiCondensed"/>
-          <w:b w:val="0"/>
-          <w:bCs w:val="0"/>
-          <w:i w:val="0"/>
-          <w:iCs w:val="0"/>
-          <w:color w:val="auto"/>
-          <w:sz w:val="24"/>
-          <w:szCs w:val="24"/>
-          <w:u w:val="none"/>
-          <w:lang w:val="pt-BR"/>
-        </w:rPr>
-      </w:pPr>
-      <w:r>
-        <w:rPr>
-          <w:rFonts w:hint="default" w:ascii="Bahnschrift Light SemiCondensed" w:hAnsi="Bahnschrift Light SemiCondensed"/>
-          <w:b/>
-          <w:bCs/>
-          <w:i w:val="0"/>
-          <w:iCs w:val="0"/>
-          <w:color w:val="auto"/>
-          <w:sz w:val="24"/>
-          <w:szCs w:val="24"/>
-          <w:u w:val="none"/>
-          <w:lang w:val="pt-BR"/>
-        </w:rPr>
-        <w:tab/>
-      </w:r>
-      <w:r>
-        <w:rPr>
-          <w:rFonts w:hint="default" w:ascii="Bahnschrift Light SemiCondensed" w:hAnsi="Bahnschrift Light SemiCondensed"/>
-          <w:b/>
-          <w:bCs/>
-          <w:i w:val="0"/>
-          <w:iCs w:val="0"/>
-          <w:color w:val="auto"/>
-          <w:sz w:val="24"/>
-          <w:szCs w:val="24"/>
-          <w:u w:val="none"/>
-          <w:lang w:val="pt-BR"/>
-        </w:rPr>
-        <w:tab/>
-      </w:r>
-      <w:r>
-        <w:rPr>
-          <w:rFonts w:hint="default" w:ascii="Bahnschrift Light SemiCondensed" w:hAnsi="Bahnschrift Light SemiCondensed"/>
-          <w:b/>
-          <w:bCs/>
-          <w:i w:val="0"/>
-          <w:iCs w:val="0"/>
-          <w:color w:val="auto"/>
-          <w:sz w:val="24"/>
-          <w:szCs w:val="24"/>
-          <w:u w:val="none"/>
-          <w:lang w:val="pt-BR"/>
-        </w:rPr>
-        <w:tab/>
-      </w:r>
-      <w:r>
-        <w:rPr>
-          <w:rFonts w:hint="default" w:ascii="Bahnschrift Light SemiCondensed" w:hAnsi="Bahnschrift Light SemiCondensed"/>
-          <w:b w:val="0"/>
-          <w:bCs w:val="0"/>
-          <w:i w:val="0"/>
-          <w:iCs w:val="0"/>
-          <w:color w:val="auto"/>
-          <w:sz w:val="24"/>
-          <w:szCs w:val="24"/>
-          <w:u w:val="none"/>
-          <w:lang w:val="pt-BR"/>
-        </w:rPr>
-        <w:t>Comando utilizado para verificar quantos registros existem em uma tabela.</w:t>
-      </w:r>
-    </w:p>
-    <w:p>
-      <w:pPr>
-        <w:jc w:val="left"/>
-        <w:rPr>
-          <w:rFonts w:hint="default" w:ascii="Bahnschrift Light SemiCondensed" w:hAnsi="Bahnschrift Light SemiCondensed"/>
-          <w:b/>
-          <w:bCs/>
-          <w:i w:val="0"/>
-          <w:iCs w:val="0"/>
-          <w:color w:val="auto"/>
-          <w:sz w:val="24"/>
-          <w:szCs w:val="24"/>
-          <w:u w:val="none"/>
-          <w:lang w:val="pt-BR"/>
-        </w:rPr>
-      </w:pPr>
-    </w:p>
-    <w:p>
-      <w:pPr>
-        <w:jc w:val="left"/>
-        <w:rPr>
-          <w:rFonts w:hint="default" w:ascii="Bahnschrift Light SemiCondensed" w:hAnsi="Bahnschrift Light SemiCondensed"/>
-          <w:b/>
-          <w:bCs/>
-          <w:i w:val="0"/>
-          <w:iCs w:val="0"/>
-          <w:color w:val="auto"/>
-          <w:sz w:val="24"/>
-          <w:szCs w:val="24"/>
-          <w:u w:val="none"/>
-          <w:lang w:val="pt-BR"/>
-        </w:rPr>
-      </w:pPr>
-    </w:p>
-    <w:p>
-      <w:pPr>
-        <w:jc w:val="left"/>
-        <w:rPr>
-          <w:rFonts w:hint="default" w:ascii="Bahnschrift Light SemiCondensed" w:hAnsi="Bahnschrift Light SemiCondensed"/>
-          <w:b/>
-          <w:bCs/>
-          <w:i w:val="0"/>
-          <w:iCs w:val="0"/>
-          <w:color w:val="auto"/>
-          <w:sz w:val="24"/>
-          <w:szCs w:val="24"/>
-          <w:u w:val="none"/>
-          <w:lang w:val="pt-BR"/>
-        </w:rPr>
-      </w:pPr>
-      <w:r>
-        <w:rPr>
-          <w:rFonts w:hint="default" w:ascii="Bahnschrift Light SemiCondensed" w:hAnsi="Bahnschrift Light SemiCondensed"/>
-          <w:b/>
-          <w:bCs/>
-          <w:i w:val="0"/>
-          <w:iCs w:val="0"/>
-          <w:color w:val="auto"/>
-          <w:sz w:val="24"/>
-          <w:szCs w:val="24"/>
-          <w:u w:val="none"/>
-          <w:lang w:val="pt-BR"/>
-        </w:rPr>
-        <w:t>SELECT MAX(</w:t>
-      </w:r>
-      <w:r>
-        <w:rPr>
-          <w:rFonts w:hint="default" w:ascii="Bahnschrift Light SemiCondensed" w:hAnsi="Bahnschrift Light SemiCondensed"/>
-          <w:b w:val="0"/>
-          <w:bCs w:val="0"/>
-          <w:i w:val="0"/>
-          <w:iCs w:val="0"/>
-          <w:color w:val="auto"/>
-          <w:sz w:val="24"/>
-          <w:szCs w:val="24"/>
-          <w:u w:val="single"/>
-          <w:lang w:val="pt-BR"/>
-        </w:rPr>
-        <w:t>coluna_da_tabela</w:t>
-      </w:r>
-      <w:r>
-        <w:rPr>
-          <w:rFonts w:hint="default" w:ascii="Bahnschrift Light SemiCondensed" w:hAnsi="Bahnschrift Light SemiCondensed"/>
-          <w:b/>
-          <w:bCs/>
-          <w:i w:val="0"/>
-          <w:iCs w:val="0"/>
-          <w:color w:val="auto"/>
-          <w:sz w:val="24"/>
-          <w:szCs w:val="24"/>
-          <w:u w:val="none"/>
-          <w:lang w:val="pt-BR"/>
-        </w:rPr>
-        <w:t xml:space="preserve">) FROM </w:t>
-      </w:r>
-      <w:r>
-        <w:rPr>
-          <w:rFonts w:hint="default" w:ascii="Bahnschrift Light SemiCondensed" w:hAnsi="Bahnschrift Light SemiCondensed"/>
-          <w:b w:val="0"/>
-          <w:bCs w:val="0"/>
-          <w:i w:val="0"/>
-          <w:iCs w:val="0"/>
-          <w:color w:val="auto"/>
-          <w:sz w:val="24"/>
-          <w:szCs w:val="24"/>
-          <w:u w:val="single"/>
-          <w:lang w:val="pt-BR"/>
-        </w:rPr>
-        <w:t>nome_da_tabela</w:t>
-      </w:r>
-      <w:r>
-        <w:rPr>
-          <w:rFonts w:hint="default" w:ascii="Bahnschrift Light SemiCondensed" w:hAnsi="Bahnschrift Light SemiCondensed"/>
-          <w:b/>
-          <w:bCs/>
-          <w:i w:val="0"/>
-          <w:iCs w:val="0"/>
-          <w:color w:val="auto"/>
-          <w:sz w:val="24"/>
-          <w:szCs w:val="24"/>
-          <w:u w:val="none"/>
-          <w:lang w:val="pt-BR"/>
-        </w:rPr>
-        <w:t>;</w:t>
-      </w:r>
-      <w:r>
-        <w:rPr>
-          <w:rFonts w:hint="default" w:ascii="Bahnschrift Light SemiCondensed" w:hAnsi="Bahnschrift Light SemiCondensed"/>
-          <w:b/>
-          <w:bCs/>
-          <w:i w:val="0"/>
-          <w:iCs w:val="0"/>
-          <w:color w:val="auto"/>
-          <w:sz w:val="24"/>
-          <w:szCs w:val="24"/>
-          <w:u w:val="none"/>
-          <w:lang w:val="pt-BR"/>
-        </w:rPr>
-        <w:tab/>
-      </w:r>
-      <w:r>
-        <w:rPr>
-          <w:rFonts w:hint="default" w:ascii="Bahnschrift Light SemiCondensed" w:hAnsi="Bahnschrift Light SemiCondensed"/>
-          <w:b/>
-          <w:bCs/>
-          <w:i w:val="0"/>
-          <w:iCs w:val="0"/>
-          <w:color w:val="auto"/>
-          <w:sz w:val="24"/>
-          <w:szCs w:val="24"/>
-          <w:u w:val="none"/>
-          <w:lang w:val="pt-BR"/>
-        </w:rPr>
-        <w:tab/>
-      </w:r>
-      <w:r>
-        <w:rPr>
-          <w:rFonts w:hint="default" w:ascii="Bahnschrift Light SemiCondensed" w:hAnsi="Bahnschrift Light SemiCondensed"/>
-          <w:b/>
-          <w:bCs/>
-          <w:i w:val="0"/>
-          <w:iCs w:val="0"/>
-          <w:color w:val="auto"/>
-          <w:sz w:val="24"/>
-          <w:szCs w:val="24"/>
-          <w:u w:val="none"/>
-          <w:lang w:val="pt-BR"/>
-        </w:rPr>
-        <w:tab/>
-      </w:r>
-      <w:r>
-        <w:rPr>
-          <w:rFonts w:hint="default" w:ascii="Bahnschrift Light SemiCondensed" w:hAnsi="Bahnschrift Light SemiCondensed"/>
-          <w:b/>
-          <w:bCs/>
-          <w:i w:val="0"/>
-          <w:iCs w:val="0"/>
-          <w:color w:val="auto"/>
-          <w:sz w:val="24"/>
-          <w:szCs w:val="24"/>
-          <w:u w:val="none"/>
-          <w:lang w:val="pt-BR"/>
-        </w:rPr>
-        <w:t>→</w:t>
-      </w:r>
-    </w:p>
-    <w:p>
-      <w:pPr>
-        <w:jc w:val="left"/>
-        <w:rPr>
-          <w:rFonts w:hint="default" w:ascii="Bahnschrift Light SemiCondensed" w:hAnsi="Bahnschrift Light SemiCondensed"/>
-          <w:b/>
-          <w:bCs/>
-          <w:i w:val="0"/>
-          <w:iCs w:val="0"/>
-          <w:color w:val="auto"/>
-          <w:sz w:val="24"/>
-          <w:szCs w:val="24"/>
-          <w:u w:val="none"/>
-          <w:lang w:val="pt-BR"/>
-        </w:rPr>
-      </w:pPr>
-    </w:p>
-    <w:p>
-      <w:pPr>
-        <w:jc w:val="left"/>
-        <w:rPr>
-          <w:rFonts w:hint="default" w:ascii="Bahnschrift Light SemiCondensed" w:hAnsi="Bahnschrift Light SemiCondensed"/>
-          <w:b w:val="0"/>
-          <w:bCs w:val="0"/>
-          <w:i w:val="0"/>
-          <w:iCs w:val="0"/>
-          <w:color w:val="auto"/>
-          <w:sz w:val="24"/>
-          <w:szCs w:val="24"/>
-          <w:u w:val="none"/>
-          <w:lang w:val="pt-BR"/>
-        </w:rPr>
-      </w:pPr>
-      <w:r>
-        <w:rPr>
-          <w:rFonts w:hint="default" w:ascii="Bahnschrift Light SemiCondensed" w:hAnsi="Bahnschrift Light SemiCondensed"/>
-          <w:b/>
-          <w:bCs/>
-          <w:i w:val="0"/>
-          <w:iCs w:val="0"/>
-          <w:color w:val="auto"/>
-          <w:sz w:val="24"/>
-          <w:szCs w:val="24"/>
-          <w:u w:val="none"/>
-          <w:lang w:val="pt-BR"/>
-        </w:rPr>
-        <w:tab/>
-      </w:r>
-      <w:r>
-        <w:rPr>
-          <w:rFonts w:hint="default" w:ascii="Bahnschrift Light SemiCondensed" w:hAnsi="Bahnschrift Light SemiCondensed"/>
-          <w:b/>
-          <w:bCs/>
-          <w:i w:val="0"/>
-          <w:iCs w:val="0"/>
-          <w:color w:val="auto"/>
-          <w:sz w:val="24"/>
-          <w:szCs w:val="24"/>
-          <w:u w:val="none"/>
-          <w:lang w:val="pt-BR"/>
-        </w:rPr>
-        <w:tab/>
-      </w:r>
-      <w:r>
-        <w:rPr>
-          <w:rFonts w:hint="default" w:ascii="Bahnschrift Light SemiCondensed" w:hAnsi="Bahnschrift Light SemiCondensed"/>
-          <w:b w:val="0"/>
-          <w:bCs w:val="0"/>
-          <w:i w:val="0"/>
-          <w:iCs w:val="0"/>
-          <w:color w:val="auto"/>
-          <w:sz w:val="24"/>
-          <w:szCs w:val="24"/>
-          <w:u w:val="none"/>
-          <w:lang w:val="pt-BR"/>
-        </w:rPr>
-        <w:t>Comando utilizado para verificar qual o valor máximo de uma coluna específica da tabela.</w:t>
-      </w:r>
-    </w:p>
-    <w:p>
-      <w:pPr>
-        <w:jc w:val="left"/>
-        <w:rPr>
-          <w:rFonts w:hint="default" w:ascii="Bahnschrift Light SemiCondensed" w:hAnsi="Bahnschrift Light SemiCondensed"/>
-          <w:b w:val="0"/>
-          <w:bCs w:val="0"/>
-          <w:i w:val="0"/>
-          <w:iCs w:val="0"/>
-          <w:color w:val="auto"/>
-          <w:sz w:val="24"/>
-          <w:szCs w:val="24"/>
-          <w:u w:val="none"/>
-          <w:lang w:val="pt-BR"/>
-        </w:rPr>
-      </w:pPr>
-    </w:p>
-    <w:p>
-      <w:pPr>
-        <w:jc w:val="left"/>
-        <w:rPr>
-          <w:rFonts w:hint="default" w:ascii="Bahnschrift Light SemiCondensed" w:hAnsi="Bahnschrift Light SemiCondensed"/>
-          <w:b w:val="0"/>
-          <w:bCs w:val="0"/>
-          <w:i w:val="0"/>
-          <w:iCs w:val="0"/>
-          <w:color w:val="auto"/>
-          <w:sz w:val="24"/>
-          <w:szCs w:val="24"/>
-          <w:u w:val="none"/>
-          <w:lang w:val="pt-BR"/>
-        </w:rPr>
-      </w:pPr>
-    </w:p>
-    <w:p>
-      <w:pPr>
-        <w:jc w:val="left"/>
-        <w:rPr>
-          <w:rFonts w:hint="default" w:ascii="Bahnschrift Light SemiCondensed" w:hAnsi="Bahnschrift Light SemiCondensed"/>
-          <w:b/>
-          <w:bCs/>
-          <w:i w:val="0"/>
-          <w:iCs w:val="0"/>
-          <w:color w:val="auto"/>
-          <w:sz w:val="24"/>
-          <w:szCs w:val="24"/>
-          <w:u w:val="none"/>
-          <w:lang w:val="pt-BR"/>
-        </w:rPr>
-      </w:pPr>
-      <w:r>
-        <w:rPr>
-          <w:rFonts w:hint="default" w:ascii="Bahnschrift Light SemiCondensed" w:hAnsi="Bahnschrift Light SemiCondensed"/>
-          <w:b/>
-          <w:bCs/>
-          <w:i w:val="0"/>
-          <w:iCs w:val="0"/>
-          <w:color w:val="auto"/>
-          <w:sz w:val="24"/>
-          <w:szCs w:val="24"/>
-          <w:u w:val="none"/>
-          <w:lang w:val="pt-BR"/>
-        </w:rPr>
-        <w:t>SELECT MIN(</w:t>
-      </w:r>
-      <w:r>
-        <w:rPr>
-          <w:rFonts w:hint="default" w:ascii="Bahnschrift Light SemiCondensed" w:hAnsi="Bahnschrift Light SemiCondensed"/>
-          <w:b w:val="0"/>
-          <w:bCs w:val="0"/>
-          <w:i w:val="0"/>
-          <w:iCs w:val="0"/>
-          <w:color w:val="auto"/>
-          <w:sz w:val="24"/>
-          <w:szCs w:val="24"/>
-          <w:u w:val="single"/>
-          <w:lang w:val="pt-BR"/>
-        </w:rPr>
-        <w:t>coluna_da_tabela</w:t>
-      </w:r>
-      <w:r>
-        <w:rPr>
-          <w:rFonts w:hint="default" w:ascii="Bahnschrift Light SemiCondensed" w:hAnsi="Bahnschrift Light SemiCondensed"/>
-          <w:b/>
-          <w:bCs/>
-          <w:i w:val="0"/>
-          <w:iCs w:val="0"/>
-          <w:color w:val="auto"/>
-          <w:sz w:val="24"/>
-          <w:szCs w:val="24"/>
-          <w:u w:val="none"/>
-          <w:lang w:val="pt-BR"/>
-        </w:rPr>
-        <w:t xml:space="preserve">) FROM </w:t>
-      </w:r>
-      <w:r>
-        <w:rPr>
-          <w:rFonts w:hint="default" w:ascii="Bahnschrift Light SemiCondensed" w:hAnsi="Bahnschrift Light SemiCondensed"/>
-          <w:b w:val="0"/>
-          <w:bCs w:val="0"/>
-          <w:i w:val="0"/>
-          <w:iCs w:val="0"/>
-          <w:color w:val="auto"/>
-          <w:sz w:val="24"/>
-          <w:szCs w:val="24"/>
-          <w:u w:val="single"/>
-          <w:lang w:val="pt-BR"/>
-        </w:rPr>
-        <w:t>nome_da_tabela</w:t>
-      </w:r>
-      <w:r>
-        <w:rPr>
-          <w:rFonts w:hint="default" w:ascii="Bahnschrift Light SemiCondensed" w:hAnsi="Bahnschrift Light SemiCondensed"/>
-          <w:b/>
-          <w:bCs/>
-          <w:i w:val="0"/>
-          <w:iCs w:val="0"/>
-          <w:color w:val="auto"/>
-          <w:sz w:val="24"/>
-          <w:szCs w:val="24"/>
-          <w:u w:val="none"/>
-          <w:lang w:val="pt-BR"/>
-        </w:rPr>
-        <w:t>;</w:t>
-      </w:r>
-      <w:r>
-        <w:rPr>
-          <w:rFonts w:hint="default" w:ascii="Bahnschrift Light SemiCondensed" w:hAnsi="Bahnschrift Light SemiCondensed"/>
-          <w:b/>
-          <w:bCs/>
-          <w:i w:val="0"/>
-          <w:iCs w:val="0"/>
-          <w:color w:val="auto"/>
-          <w:sz w:val="24"/>
-          <w:szCs w:val="24"/>
-          <w:u w:val="none"/>
-          <w:lang w:val="pt-BR"/>
-        </w:rPr>
-        <w:tab/>
-      </w:r>
-      <w:r>
-        <w:rPr>
-          <w:rFonts w:hint="default" w:ascii="Bahnschrift Light SemiCondensed" w:hAnsi="Bahnschrift Light SemiCondensed"/>
-          <w:b/>
-          <w:bCs/>
-          <w:i w:val="0"/>
-          <w:iCs w:val="0"/>
-          <w:color w:val="auto"/>
-          <w:sz w:val="24"/>
-          <w:szCs w:val="24"/>
-          <w:u w:val="none"/>
-          <w:lang w:val="pt-BR"/>
-        </w:rPr>
-        <w:tab/>
-      </w:r>
-      <w:r>
-        <w:rPr>
-          <w:rFonts w:hint="default" w:ascii="Bahnschrift Light SemiCondensed" w:hAnsi="Bahnschrift Light SemiCondensed"/>
-          <w:b/>
-          <w:bCs/>
-          <w:i w:val="0"/>
-          <w:iCs w:val="0"/>
-          <w:color w:val="auto"/>
-          <w:sz w:val="24"/>
-          <w:szCs w:val="24"/>
-          <w:u w:val="none"/>
-          <w:lang w:val="pt-BR"/>
-        </w:rPr>
-        <w:tab/>
-      </w:r>
-      <w:r>
-        <w:rPr>
-          <w:rFonts w:hint="default" w:ascii="Bahnschrift Light SemiCondensed" w:hAnsi="Bahnschrift Light SemiCondensed"/>
-          <w:b/>
-          <w:bCs/>
-          <w:i w:val="0"/>
-          <w:iCs w:val="0"/>
-          <w:color w:val="auto"/>
-          <w:sz w:val="24"/>
-          <w:szCs w:val="24"/>
-          <w:u w:val="none"/>
-          <w:lang w:val="pt-BR"/>
-        </w:rPr>
-        <w:t>→</w:t>
-      </w:r>
-    </w:p>
-    <w:p>
-      <w:pPr>
-        <w:jc w:val="left"/>
-        <w:rPr>
-          <w:rFonts w:hint="default" w:ascii="Bahnschrift Light SemiCondensed" w:hAnsi="Bahnschrift Light SemiCondensed"/>
-          <w:b/>
-          <w:bCs/>
-          <w:i w:val="0"/>
-          <w:iCs w:val="0"/>
-          <w:color w:val="auto"/>
-          <w:sz w:val="24"/>
-          <w:szCs w:val="24"/>
-          <w:u w:val="none"/>
-          <w:lang w:val="pt-BR"/>
-        </w:rPr>
-      </w:pPr>
-    </w:p>
-    <w:p>
-      <w:pPr>
-        <w:jc w:val="left"/>
-        <w:rPr>
-          <w:rFonts w:hint="default" w:ascii="Bahnschrift Light SemiCondensed" w:hAnsi="Bahnschrift Light SemiCondensed"/>
-          <w:b w:val="0"/>
-          <w:bCs w:val="0"/>
-          <w:i w:val="0"/>
-          <w:iCs w:val="0"/>
-          <w:color w:val="auto"/>
-          <w:sz w:val="24"/>
-          <w:szCs w:val="24"/>
-          <w:u w:val="none"/>
-          <w:lang w:val="pt-BR"/>
-        </w:rPr>
-      </w:pPr>
-      <w:r>
-        <w:rPr>
-          <w:rFonts w:hint="default" w:ascii="Bahnschrift Light SemiCondensed" w:hAnsi="Bahnschrift Light SemiCondensed"/>
-          <w:b/>
-          <w:bCs/>
-          <w:i w:val="0"/>
-          <w:iCs w:val="0"/>
-          <w:color w:val="auto"/>
-          <w:sz w:val="24"/>
-          <w:szCs w:val="24"/>
-          <w:u w:val="none"/>
-          <w:lang w:val="pt-BR"/>
-        </w:rPr>
-        <w:tab/>
-      </w:r>
-      <w:r>
-        <w:rPr>
-          <w:rFonts w:hint="default" w:ascii="Bahnschrift Light SemiCondensed" w:hAnsi="Bahnschrift Light SemiCondensed"/>
-          <w:b/>
-          <w:bCs/>
-          <w:i w:val="0"/>
-          <w:iCs w:val="0"/>
-          <w:color w:val="auto"/>
-          <w:sz w:val="24"/>
-          <w:szCs w:val="24"/>
-          <w:u w:val="none"/>
-          <w:lang w:val="pt-BR"/>
-        </w:rPr>
-        <w:tab/>
-      </w:r>
-      <w:r>
-        <w:rPr>
-          <w:rFonts w:hint="default" w:ascii="Bahnschrift Light SemiCondensed" w:hAnsi="Bahnschrift Light SemiCondensed"/>
-          <w:b w:val="0"/>
-          <w:bCs w:val="0"/>
-          <w:i w:val="0"/>
-          <w:iCs w:val="0"/>
-          <w:color w:val="auto"/>
-          <w:sz w:val="24"/>
-          <w:szCs w:val="24"/>
-          <w:u w:val="none"/>
-          <w:lang w:val="pt-BR"/>
-        </w:rPr>
-        <w:t>Comando utilizado para verificar qual o valor mínimo de uma coluna específica da tabela.</w:t>
-      </w:r>
-    </w:p>
-    <w:p>
-      <w:pPr>
-        <w:jc w:val="left"/>
-        <w:rPr>
-          <w:rFonts w:hint="default" w:ascii="Bahnschrift Light SemiCondensed" w:hAnsi="Bahnschrift Light SemiCondensed"/>
-          <w:b/>
-          <w:bCs/>
-          <w:i w:val="0"/>
-          <w:iCs w:val="0"/>
-          <w:color w:val="auto"/>
-          <w:sz w:val="24"/>
-          <w:szCs w:val="24"/>
-          <w:u w:val="none"/>
-          <w:lang w:val="pt-BR"/>
-        </w:rPr>
-      </w:pPr>
-    </w:p>
-    <w:p>
-      <w:pPr>
-        <w:jc w:val="left"/>
-        <w:rPr>
-          <w:rFonts w:hint="default" w:ascii="Bahnschrift Light SemiCondensed" w:hAnsi="Bahnschrift Light SemiCondensed"/>
-          <w:b/>
-          <w:bCs/>
-          <w:i w:val="0"/>
-          <w:iCs w:val="0"/>
-          <w:color w:val="auto"/>
-          <w:sz w:val="24"/>
-          <w:szCs w:val="24"/>
-          <w:u w:val="none"/>
-          <w:lang w:val="pt-BR"/>
-        </w:rPr>
-      </w:pPr>
-    </w:p>
-    <w:p>
-      <w:pPr>
-        <w:jc w:val="left"/>
-        <w:rPr>
-          <w:rFonts w:hint="default" w:ascii="Bahnschrift Light SemiCondensed" w:hAnsi="Bahnschrift Light SemiCondensed"/>
-          <w:b/>
-          <w:bCs/>
-          <w:i w:val="0"/>
-          <w:iCs w:val="0"/>
-          <w:color w:val="auto"/>
-          <w:sz w:val="24"/>
-          <w:szCs w:val="24"/>
-          <w:u w:val="none"/>
-          <w:lang w:val="pt-BR"/>
-        </w:rPr>
-      </w:pPr>
-      <w:r>
-        <w:rPr>
-          <w:rFonts w:hint="default" w:ascii="Bahnschrift Light SemiCondensed" w:hAnsi="Bahnschrift Light SemiCondensed"/>
-          <w:b/>
-          <w:bCs/>
-          <w:i w:val="0"/>
-          <w:iCs w:val="0"/>
-          <w:color w:val="auto"/>
-          <w:sz w:val="24"/>
-          <w:szCs w:val="24"/>
-          <w:u w:val="none"/>
-          <w:lang w:val="pt-BR"/>
-        </w:rPr>
-        <w:t>SELECT SUM(</w:t>
-      </w:r>
-      <w:r>
-        <w:rPr>
-          <w:rFonts w:hint="default" w:ascii="Bahnschrift Light SemiCondensed" w:hAnsi="Bahnschrift Light SemiCondensed"/>
-          <w:b w:val="0"/>
-          <w:bCs w:val="0"/>
-          <w:i w:val="0"/>
-          <w:iCs w:val="0"/>
-          <w:color w:val="auto"/>
-          <w:sz w:val="24"/>
-          <w:szCs w:val="24"/>
-          <w:u w:val="single"/>
-          <w:lang w:val="pt-BR"/>
-        </w:rPr>
-        <w:t>coluna_da_tabela</w:t>
-      </w:r>
-      <w:r>
-        <w:rPr>
-          <w:rFonts w:hint="default" w:ascii="Bahnschrift Light SemiCondensed" w:hAnsi="Bahnschrift Light SemiCondensed"/>
-          <w:b/>
-          <w:bCs/>
-          <w:i w:val="0"/>
-          <w:iCs w:val="0"/>
-          <w:color w:val="auto"/>
-          <w:sz w:val="24"/>
-          <w:szCs w:val="24"/>
-          <w:u w:val="none"/>
-          <w:lang w:val="pt-BR"/>
-        </w:rPr>
-        <w:t xml:space="preserve">) FROM </w:t>
-      </w:r>
-      <w:r>
-        <w:rPr>
-          <w:rFonts w:hint="default" w:ascii="Bahnschrift Light SemiCondensed" w:hAnsi="Bahnschrift Light SemiCondensed"/>
-          <w:b w:val="0"/>
-          <w:bCs w:val="0"/>
-          <w:i w:val="0"/>
-          <w:iCs w:val="0"/>
-          <w:color w:val="auto"/>
-          <w:sz w:val="24"/>
-          <w:szCs w:val="24"/>
-          <w:u w:val="single"/>
-          <w:lang w:val="pt-BR"/>
-        </w:rPr>
-        <w:t>nome_da_tabela</w:t>
-      </w:r>
-      <w:r>
-        <w:rPr>
-          <w:rFonts w:hint="default" w:ascii="Bahnschrift Light SemiCondensed" w:hAnsi="Bahnschrift Light SemiCondensed"/>
-          <w:b/>
-          <w:bCs/>
-          <w:i w:val="0"/>
-          <w:iCs w:val="0"/>
-          <w:color w:val="auto"/>
-          <w:sz w:val="24"/>
-          <w:szCs w:val="24"/>
-          <w:u w:val="none"/>
-          <w:lang w:val="pt-BR"/>
-        </w:rPr>
-        <w:t>;</w:t>
-      </w:r>
-      <w:r>
-        <w:rPr>
-          <w:rFonts w:hint="default" w:ascii="Bahnschrift Light SemiCondensed" w:hAnsi="Bahnschrift Light SemiCondensed"/>
-          <w:b/>
-          <w:bCs/>
-          <w:i w:val="0"/>
-          <w:iCs w:val="0"/>
-          <w:color w:val="auto"/>
-          <w:sz w:val="24"/>
-          <w:szCs w:val="24"/>
-          <w:u w:val="none"/>
-          <w:lang w:val="pt-BR"/>
-        </w:rPr>
-        <w:tab/>
-      </w:r>
-      <w:r>
-        <w:rPr>
-          <w:rFonts w:hint="default" w:ascii="Bahnschrift Light SemiCondensed" w:hAnsi="Bahnschrift Light SemiCondensed"/>
-          <w:b/>
-          <w:bCs/>
-          <w:i w:val="0"/>
-          <w:iCs w:val="0"/>
-          <w:color w:val="auto"/>
-          <w:sz w:val="24"/>
-          <w:szCs w:val="24"/>
-          <w:u w:val="none"/>
-          <w:lang w:val="pt-BR"/>
-        </w:rPr>
-        <w:tab/>
-      </w:r>
-      <w:r>
-        <w:rPr>
-          <w:rFonts w:hint="default" w:ascii="Bahnschrift Light SemiCondensed" w:hAnsi="Bahnschrift Light SemiCondensed"/>
-          <w:b/>
-          <w:bCs/>
-          <w:i w:val="0"/>
-          <w:iCs w:val="0"/>
-          <w:color w:val="auto"/>
-          <w:sz w:val="24"/>
-          <w:szCs w:val="24"/>
-          <w:u w:val="none"/>
-          <w:lang w:val="pt-BR"/>
-        </w:rPr>
-        <w:tab/>
-      </w:r>
-      <w:r>
-        <w:rPr>
-          <w:rFonts w:hint="default" w:ascii="Bahnschrift Light SemiCondensed" w:hAnsi="Bahnschrift Light SemiCondensed"/>
-          <w:b/>
-          <w:bCs/>
-          <w:i w:val="0"/>
-          <w:iCs w:val="0"/>
-          <w:color w:val="auto"/>
-          <w:sz w:val="24"/>
-          <w:szCs w:val="24"/>
-          <w:u w:val="none"/>
-          <w:lang w:val="pt-BR"/>
-        </w:rPr>
-        <w:t>→</w:t>
-      </w:r>
-    </w:p>
-    <w:p>
-      <w:pPr>
-        <w:jc w:val="left"/>
-        <w:rPr>
-          <w:rFonts w:hint="default" w:ascii="Bahnschrift Light SemiCondensed" w:hAnsi="Bahnschrift Light SemiCondensed"/>
-          <w:b/>
-          <w:bCs/>
-          <w:i w:val="0"/>
-          <w:iCs w:val="0"/>
-          <w:color w:val="auto"/>
-          <w:sz w:val="24"/>
-          <w:szCs w:val="24"/>
-          <w:u w:val="none"/>
-          <w:lang w:val="pt-BR"/>
-        </w:rPr>
-      </w:pPr>
-    </w:p>
-    <w:p>
-      <w:pPr>
-        <w:jc w:val="left"/>
-        <w:rPr>
-          <w:rFonts w:hint="default" w:ascii="Bahnschrift Light SemiCondensed" w:hAnsi="Bahnschrift Light SemiCondensed"/>
-          <w:b w:val="0"/>
-          <w:bCs w:val="0"/>
-          <w:i w:val="0"/>
-          <w:iCs w:val="0"/>
-          <w:color w:val="auto"/>
-          <w:sz w:val="24"/>
-          <w:szCs w:val="24"/>
-          <w:u w:val="none"/>
-          <w:lang w:val="pt-BR"/>
-        </w:rPr>
-      </w:pPr>
-      <w:r>
-        <w:rPr>
-          <w:rFonts w:hint="default" w:ascii="Bahnschrift Light SemiCondensed" w:hAnsi="Bahnschrift Light SemiCondensed"/>
-          <w:b/>
-          <w:bCs/>
-          <w:i w:val="0"/>
-          <w:iCs w:val="0"/>
-          <w:color w:val="auto"/>
-          <w:sz w:val="24"/>
-          <w:szCs w:val="24"/>
-          <w:u w:val="none"/>
-          <w:lang w:val="pt-BR"/>
-        </w:rPr>
-        <w:tab/>
-      </w:r>
-      <w:r>
-        <w:rPr>
-          <w:rFonts w:hint="default" w:ascii="Bahnschrift Light SemiCondensed" w:hAnsi="Bahnschrift Light SemiCondensed"/>
-          <w:b/>
-          <w:bCs/>
-          <w:i w:val="0"/>
-          <w:iCs w:val="0"/>
-          <w:color w:val="auto"/>
-          <w:sz w:val="24"/>
-          <w:szCs w:val="24"/>
-          <w:u w:val="none"/>
-          <w:lang w:val="pt-BR"/>
-        </w:rPr>
-        <w:tab/>
-      </w:r>
-      <w:r>
-        <w:rPr>
-          <w:rFonts w:hint="default" w:ascii="Bahnschrift Light SemiCondensed" w:hAnsi="Bahnschrift Light SemiCondensed"/>
-          <w:b w:val="0"/>
-          <w:bCs w:val="0"/>
-          <w:i w:val="0"/>
-          <w:iCs w:val="0"/>
-          <w:color w:val="auto"/>
-          <w:sz w:val="24"/>
-          <w:szCs w:val="24"/>
-          <w:u w:val="none"/>
-          <w:lang w:val="pt-BR"/>
-        </w:rPr>
-        <w:t>Comando utilizado para somar os valores de uma coluna específica da tabela.</w:t>
-      </w:r>
-    </w:p>
-    <w:p>
-      <w:pPr>
-        <w:jc w:val="left"/>
-        <w:rPr>
-          <w:rFonts w:hint="default" w:ascii="Bahnschrift Light SemiCondensed" w:hAnsi="Bahnschrift Light SemiCondensed"/>
-          <w:b/>
-          <w:bCs/>
-          <w:i w:val="0"/>
-          <w:iCs w:val="0"/>
-          <w:color w:val="auto"/>
-          <w:sz w:val="24"/>
-          <w:szCs w:val="24"/>
-          <w:u w:val="none"/>
-          <w:lang w:val="pt-BR"/>
-        </w:rPr>
-      </w:pPr>
-    </w:p>
-    <w:p>
-      <w:pPr>
-        <w:jc w:val="left"/>
-        <w:rPr>
-          <w:rFonts w:hint="default" w:ascii="Bahnschrift Light SemiCondensed" w:hAnsi="Bahnschrift Light SemiCondensed"/>
-          <w:b/>
-          <w:bCs/>
-          <w:i w:val="0"/>
-          <w:iCs w:val="0"/>
-          <w:color w:val="auto"/>
-          <w:sz w:val="24"/>
-          <w:szCs w:val="24"/>
-          <w:u w:val="none"/>
-          <w:lang w:val="pt-BR"/>
-        </w:rPr>
-      </w:pPr>
-    </w:p>
-    <w:p>
-      <w:pPr>
-        <w:jc w:val="left"/>
-        <w:rPr>
-          <w:rFonts w:hint="default" w:ascii="Bahnschrift Light SemiCondensed" w:hAnsi="Bahnschrift Light SemiCondensed"/>
-          <w:b/>
-          <w:bCs/>
-          <w:i w:val="0"/>
-          <w:iCs w:val="0"/>
-          <w:color w:val="auto"/>
-          <w:sz w:val="24"/>
-          <w:szCs w:val="24"/>
-          <w:u w:val="none"/>
-          <w:lang w:val="pt-BR"/>
-        </w:rPr>
-      </w:pPr>
-      <w:r>
-        <w:rPr>
-          <w:rFonts w:hint="default" w:ascii="Bahnschrift Light SemiCondensed" w:hAnsi="Bahnschrift Light SemiCondensed"/>
-          <w:b/>
-          <w:bCs/>
-          <w:i w:val="0"/>
-          <w:iCs w:val="0"/>
-          <w:color w:val="auto"/>
-          <w:sz w:val="24"/>
-          <w:szCs w:val="24"/>
-          <w:u w:val="none"/>
-          <w:lang w:val="pt-BR"/>
-        </w:rPr>
-        <w:t>SELECT AVG(</w:t>
-      </w:r>
-      <w:r>
-        <w:rPr>
-          <w:rFonts w:hint="default" w:ascii="Bahnschrift Light SemiCondensed" w:hAnsi="Bahnschrift Light SemiCondensed"/>
-          <w:b w:val="0"/>
-          <w:bCs w:val="0"/>
-          <w:i w:val="0"/>
-          <w:iCs w:val="0"/>
-          <w:color w:val="auto"/>
-          <w:sz w:val="24"/>
-          <w:szCs w:val="24"/>
-          <w:u w:val="single"/>
-          <w:lang w:val="pt-BR"/>
-        </w:rPr>
-        <w:t>coluna_da_tabela</w:t>
-      </w:r>
-      <w:r>
-        <w:rPr>
-          <w:rFonts w:hint="default" w:ascii="Bahnschrift Light SemiCondensed" w:hAnsi="Bahnschrift Light SemiCondensed"/>
-          <w:b/>
-          <w:bCs/>
-          <w:i w:val="0"/>
-          <w:iCs w:val="0"/>
-          <w:color w:val="auto"/>
-          <w:sz w:val="24"/>
-          <w:szCs w:val="24"/>
-          <w:u w:val="none"/>
-          <w:lang w:val="pt-BR"/>
-        </w:rPr>
-        <w:t xml:space="preserve">) FROM </w:t>
-      </w:r>
-      <w:r>
-        <w:rPr>
-          <w:rFonts w:hint="default" w:ascii="Bahnschrift Light SemiCondensed" w:hAnsi="Bahnschrift Light SemiCondensed"/>
-          <w:b w:val="0"/>
-          <w:bCs w:val="0"/>
-          <w:i w:val="0"/>
-          <w:iCs w:val="0"/>
-          <w:color w:val="auto"/>
-          <w:sz w:val="24"/>
-          <w:szCs w:val="24"/>
-          <w:u w:val="single"/>
-          <w:lang w:val="pt-BR"/>
-        </w:rPr>
-        <w:t>nome_da_tabela</w:t>
-      </w:r>
-      <w:r>
-        <w:rPr>
-          <w:rFonts w:hint="default" w:ascii="Bahnschrift Light SemiCondensed" w:hAnsi="Bahnschrift Light SemiCondensed"/>
-          <w:b/>
-          <w:bCs/>
-          <w:i w:val="0"/>
-          <w:iCs w:val="0"/>
-          <w:color w:val="auto"/>
-          <w:sz w:val="24"/>
-          <w:szCs w:val="24"/>
-          <w:u w:val="none"/>
-          <w:lang w:val="pt-BR"/>
-        </w:rPr>
-        <w:t>;</w:t>
-      </w:r>
-      <w:r>
-        <w:rPr>
-          <w:rFonts w:hint="default" w:ascii="Bahnschrift Light SemiCondensed" w:hAnsi="Bahnschrift Light SemiCondensed"/>
-          <w:b/>
-          <w:bCs/>
-          <w:i w:val="0"/>
-          <w:iCs w:val="0"/>
-          <w:color w:val="auto"/>
-          <w:sz w:val="24"/>
-          <w:szCs w:val="24"/>
-          <w:u w:val="none"/>
-          <w:lang w:val="pt-BR"/>
-        </w:rPr>
-        <w:tab/>
-      </w:r>
-      <w:r>
-        <w:rPr>
-          <w:rFonts w:hint="default" w:ascii="Bahnschrift Light SemiCondensed" w:hAnsi="Bahnschrift Light SemiCondensed"/>
-          <w:b/>
-          <w:bCs/>
-          <w:i w:val="0"/>
-          <w:iCs w:val="0"/>
-          <w:color w:val="auto"/>
-          <w:sz w:val="24"/>
-          <w:szCs w:val="24"/>
-          <w:u w:val="none"/>
-          <w:lang w:val="pt-BR"/>
-        </w:rPr>
-        <w:tab/>
-      </w:r>
-      <w:r>
-        <w:rPr>
-          <w:rFonts w:hint="default" w:ascii="Bahnschrift Light SemiCondensed" w:hAnsi="Bahnschrift Light SemiCondensed"/>
-          <w:b/>
-          <w:bCs/>
-          <w:i w:val="0"/>
-          <w:iCs w:val="0"/>
-          <w:color w:val="auto"/>
-          <w:sz w:val="24"/>
-          <w:szCs w:val="24"/>
-          <w:u w:val="none"/>
-          <w:lang w:val="pt-BR"/>
-        </w:rPr>
-        <w:tab/>
-      </w:r>
-      <w:r>
-        <w:rPr>
-          <w:rFonts w:hint="default" w:ascii="Bahnschrift Light SemiCondensed" w:hAnsi="Bahnschrift Light SemiCondensed"/>
-          <w:b/>
-          <w:bCs/>
-          <w:i w:val="0"/>
-          <w:iCs w:val="0"/>
-          <w:color w:val="auto"/>
-          <w:sz w:val="24"/>
-          <w:szCs w:val="24"/>
-          <w:u w:val="none"/>
-          <w:lang w:val="pt-BR"/>
-        </w:rPr>
-        <w:t>→</w:t>
-      </w:r>
-    </w:p>
-    <w:p>
-      <w:pPr>
-        <w:jc w:val="left"/>
-        <w:rPr>
-          <w:rFonts w:hint="default" w:ascii="Bahnschrift Light SemiCondensed" w:hAnsi="Bahnschrift Light SemiCondensed"/>
-          <w:b/>
-          <w:bCs/>
-          <w:i w:val="0"/>
-          <w:iCs w:val="0"/>
-          <w:color w:val="auto"/>
-          <w:sz w:val="24"/>
-          <w:szCs w:val="24"/>
-          <w:u w:val="none"/>
-          <w:lang w:val="pt-BR"/>
-        </w:rPr>
-      </w:pPr>
-    </w:p>
-    <w:p>
-      <w:pPr>
-        <w:jc w:val="left"/>
-        <w:rPr>
-          <w:rFonts w:hint="default" w:ascii="Bahnschrift Light SemiCondensed" w:hAnsi="Bahnschrift Light SemiCondensed"/>
-          <w:b w:val="0"/>
-          <w:bCs w:val="0"/>
-          <w:i w:val="0"/>
-          <w:iCs w:val="0"/>
-          <w:color w:val="auto"/>
-          <w:sz w:val="24"/>
-          <w:szCs w:val="24"/>
-          <w:u w:val="none"/>
-          <w:lang w:val="pt-BR"/>
-        </w:rPr>
-      </w:pPr>
-      <w:r>
-        <w:rPr>
-          <w:rFonts w:hint="default" w:ascii="Bahnschrift Light SemiCondensed" w:hAnsi="Bahnschrift Light SemiCondensed"/>
-          <w:b/>
-          <w:bCs/>
-          <w:i w:val="0"/>
-          <w:iCs w:val="0"/>
-          <w:color w:val="auto"/>
-          <w:sz w:val="24"/>
-          <w:szCs w:val="24"/>
-          <w:u w:val="none"/>
-          <w:lang w:val="pt-BR"/>
-        </w:rPr>
-        <w:tab/>
-      </w:r>
-      <w:r>
-        <w:rPr>
-          <w:rFonts w:hint="default" w:ascii="Bahnschrift Light SemiCondensed" w:hAnsi="Bahnschrift Light SemiCondensed"/>
-          <w:b/>
-          <w:bCs/>
-          <w:i w:val="0"/>
-          <w:iCs w:val="0"/>
-          <w:color w:val="auto"/>
-          <w:sz w:val="24"/>
-          <w:szCs w:val="24"/>
-          <w:u w:val="none"/>
-          <w:lang w:val="pt-BR"/>
-        </w:rPr>
-        <w:tab/>
-      </w:r>
-      <w:r>
-        <w:rPr>
-          <w:rFonts w:hint="default" w:ascii="Bahnschrift Light SemiCondensed" w:hAnsi="Bahnschrift Light SemiCondensed"/>
-          <w:b w:val="0"/>
-          <w:bCs w:val="0"/>
-          <w:i w:val="0"/>
-          <w:iCs w:val="0"/>
-          <w:color w:val="auto"/>
-          <w:sz w:val="24"/>
-          <w:szCs w:val="24"/>
-          <w:u w:val="none"/>
-          <w:lang w:val="pt-BR"/>
-        </w:rPr>
-        <w:t>Comando utilizado para tirar a média dos valores de uma coluna específica da tabela.</w:t>
-      </w:r>
     </w:p>
     <w:p>
       <w:pPr>
@@ -19875,7 +20112,7 @@
   <w:docDefaults>
     <w:rPrDefault>
       <w:rPr>
-        <w:rFonts w:asciiTheme="minorHAnsi" w:hAnsiTheme="minorHAnsi" w:eastAsiaTheme="minorEastAsia" w:cstheme="minorBidi"/>
+        <w:rFonts w:ascii="Times New Roman" w:hAnsi="Times New Roman" w:eastAsia="SimSun" w:cs="Times New Roman"/>
       </w:rPr>
     </w:rPrDefault>
     <w:pPrDefault/>

</xml_diff>

<commit_message>
Curso em Vídeo - Aula 13'
</commit_message>
<xml_diff>
--- a/Curso de Banco de Dados Curso em Vídeo/Comandos MySQL.docx
+++ b/Curso de Banco de Dados Curso em Vídeo/Comandos MySQL.docx
@@ -19947,11 +19947,32 @@
           <w:sz w:val="24"/>
           <w:szCs w:val="24"/>
         </w:rPr>
-        <w:t>WHERE SUBSTRING(</w:t>
+        <w:t>WHERE SUBSTRING</w:t>
       </w:r>
       <w:r>
         <w:rPr>
           <w:rFonts w:hint="default" w:ascii="Bahnschrift Light SemiCondensed" w:hAnsi="Bahnschrift Light SemiCondensed" w:eastAsia="SimSun" w:cs="Bahnschrift Light SemiCondensed"/>
+          <w:b/>
+          <w:bCs/>
+          <w:sz w:val="24"/>
+          <w:szCs w:val="24"/>
+          <w:lang w:val="pt-BR"/>
+        </w:rPr>
+        <w:t>_INDEX</w:t>
+      </w:r>
+      <w:r>
+        <w:rPr>
+          <w:rFonts w:hint="default" w:ascii="Bahnschrift Light SemiCondensed" w:hAnsi="Bahnschrift Light SemiCondensed" w:eastAsia="SimSun" w:cs="Bahnschrift Light SemiCondensed"/>
+          <w:b/>
+          <w:bCs/>
+          <w:sz w:val="24"/>
+          <w:szCs w:val="24"/>
+        </w:rPr>
+        <w:t>(</w:t>
+      </w:r>
+      <w:r>
+        <w:rPr>
+          <w:rFonts w:hint="default" w:ascii="Bahnschrift Light SemiCondensed" w:hAnsi="Bahnschrift Light SemiCondensed" w:eastAsia="SimSun" w:cs="Bahnschrift Light SemiCondensed"/>
           <w:b w:val="0"/>
           <w:bCs w:val="0"/>
           <w:sz w:val="24"/>
@@ -19969,124 +19990,1945 @@
           <w:sz w:val="24"/>
           <w:szCs w:val="24"/>
         </w:rPr>
-        <w:t>, -1) = '</w:t>
+        <w:t xml:space="preserve">, </w:t>
       </w:r>
       <w:r>
         <w:rPr>
           <w:rFonts w:hint="default" w:ascii="Bahnschrift Light SemiCondensed" w:hAnsi="Bahnschrift Light SemiCondensed" w:eastAsia="SimSun" w:cs="Bahnschrift Light SemiCondensed"/>
-          <w:b w:val="0"/>
-          <w:bCs w:val="0"/>
-          <w:sz w:val="24"/>
-          <w:szCs w:val="24"/>
-          <w:u w:val="single"/>
-          <w:lang w:val="pt-BR"/>
-        </w:rPr>
-        <w:t>letra_específica</w:t>
-      </w:r>
-      <w:r>
-        <w:rPr>
-          <w:rFonts w:hint="default" w:ascii="Bahnschrift Light SemiCondensed" w:hAnsi="Bahnschrift Light SemiCondensed" w:eastAsia="SimSun" w:cs="Bahnschrift Light SemiCondensed"/>
-          <w:b/>
-          <w:bCs/>
-          <w:sz w:val="24"/>
-          <w:szCs w:val="24"/>
-        </w:rPr>
-        <w:t>';</w:t>
-      </w:r>
-      <w:r>
-        <w:rPr>
-          <w:rFonts w:hint="default" w:ascii="Bahnschrift Light SemiCondensed" w:hAnsi="Bahnschrift Light SemiCondensed" w:eastAsia="SimSun" w:cs="Bahnschrift Light SemiCondensed"/>
-          <w:b/>
-          <w:bCs/>
-          <w:sz w:val="24"/>
-          <w:szCs w:val="24"/>
-          <w:lang w:val="pt-BR"/>
-        </w:rPr>
-        <w:tab/>
-        <w:t/>
-      </w:r>
-      <w:r>
-        <w:rPr>
-          <w:rFonts w:hint="default" w:ascii="Bahnschrift Light SemiCondensed" w:hAnsi="Bahnschrift Light SemiCondensed" w:eastAsia="SimSun" w:cs="Bahnschrift Light SemiCondensed"/>
-          <w:b/>
-          <w:bCs/>
-          <w:sz w:val="24"/>
-          <w:szCs w:val="24"/>
-          <w:lang w:val="pt-BR"/>
-        </w:rPr>
-        <w:tab/>
-      </w:r>
-      <w:r>
-        <w:rPr>
-          <w:rFonts w:hint="default" w:ascii="Bahnschrift Light SemiCondensed" w:hAnsi="Bahnschrift Light SemiCondensed" w:eastAsia="SimSun" w:cs="Bahnschrift Light SemiCondensed"/>
-          <w:b w:val="0"/>
-          <w:bCs w:val="0"/>
-          <w:sz w:val="24"/>
-          <w:szCs w:val="24"/>
-          <w:lang w:val="pt-BR"/>
-        </w:rPr>
-        <w:t>→</w:t>
-      </w:r>
-    </w:p>
-    <w:p>
-      <w:pPr>
-        <w:jc w:val="left"/>
-        <w:rPr>
-          <w:rFonts w:hint="default" w:ascii="Bahnschrift Light SemiCondensed" w:hAnsi="Bahnschrift Light SemiCondensed" w:eastAsia="SimSun" w:cs="Bahnschrift Light SemiCondensed"/>
-          <w:b w:val="0"/>
-          <w:bCs w:val="0"/>
-          <w:sz w:val="24"/>
-          <w:szCs w:val="24"/>
-          <w:lang w:val="pt-BR"/>
-        </w:rPr>
-      </w:pPr>
-    </w:p>
-    <w:p>
-      <w:pPr>
-        <w:jc w:val="left"/>
-        <w:rPr>
-          <w:rFonts w:hint="default" w:ascii="Bahnschrift Light SemiCondensed" w:hAnsi="Bahnschrift Light SemiCondensed" w:eastAsia="SimSun" w:cs="Bahnschrift Light SemiCondensed"/>
-          <w:b w:val="0"/>
-          <w:bCs w:val="0"/>
-          <w:sz w:val="24"/>
-          <w:szCs w:val="24"/>
-          <w:lang w:val="pt-BR"/>
-        </w:rPr>
-      </w:pPr>
-      <w:r>
-        <w:rPr>
-          <w:rFonts w:hint="default" w:ascii="Bahnschrift Light SemiCondensed" w:hAnsi="Bahnschrift Light SemiCondensed" w:eastAsia="SimSun" w:cs="Bahnschrift Light SemiCondensed"/>
-          <w:b w:val="0"/>
-          <w:bCs w:val="0"/>
-          <w:sz w:val="24"/>
-          <w:szCs w:val="24"/>
-          <w:lang w:val="pt-BR"/>
-        </w:rPr>
-        <w:tab/>
-        <w:t/>
-      </w:r>
-      <w:r>
-        <w:rPr>
-          <w:rFonts w:hint="default" w:ascii="Bahnschrift Light SemiCondensed" w:hAnsi="Bahnschrift Light SemiCondensed" w:eastAsia="SimSun" w:cs="Bahnschrift Light SemiCondensed"/>
-          <w:b w:val="0"/>
-          <w:bCs w:val="0"/>
-          <w:sz w:val="24"/>
-          <w:szCs w:val="24"/>
-          <w:lang w:val="pt-BR"/>
-        </w:rPr>
-        <w:tab/>
-        <w:t>Comando utilizado para consultar dados onde suas primeiras instâncias terminam com uma letra específica.</w:t>
+          <w:b/>
+          <w:bCs/>
+          <w:sz w:val="24"/>
+          <w:szCs w:val="24"/>
+          <w:lang w:val="pt-BR"/>
+        </w:rPr>
+        <w:t xml:space="preserve"> ‘ </w:t>
       </w:r>
       <w:bookmarkStart w:id="0" w:name="_GoBack"/>
       <w:bookmarkEnd w:id="0"/>
-    </w:p>
-    <w:p>
-      <w:pPr>
-        <w:jc w:val="left"/>
-        <w:rPr>
-          <w:rFonts w:hint="default" w:ascii="Bahnschrift Light SemiCondensed" w:hAnsi="Bahnschrift Light SemiCondensed"/>
-          <w:b/>
-          <w:bCs/>
+      <w:r>
+        <w:rPr>
+          <w:rFonts w:hint="default" w:ascii="Bahnschrift Light SemiCondensed" w:hAnsi="Bahnschrift Light SemiCondensed" w:eastAsia="SimSun" w:cs="Bahnschrift Light SemiCondensed"/>
+          <w:b/>
+          <w:bCs/>
+          <w:sz w:val="24"/>
+          <w:szCs w:val="24"/>
+          <w:lang w:val="pt-BR"/>
+        </w:rPr>
+        <w:t xml:space="preserve"> ’,  </w:t>
+      </w:r>
+      <w:r>
+        <w:rPr>
+          <w:rFonts w:hint="default" w:ascii="Bahnschrift Light SemiCondensed" w:hAnsi="Bahnschrift Light SemiCondensed" w:eastAsia="SimSun" w:cs="Bahnschrift Light SemiCondensed"/>
+          <w:b/>
+          <w:bCs/>
+          <w:sz w:val="24"/>
+          <w:szCs w:val="24"/>
+        </w:rPr>
+        <w:t xml:space="preserve">1) = </w:t>
+      </w:r>
+      <w:r>
+        <w:rPr>
+          <w:rFonts w:hint="default" w:ascii="Bahnschrift Light SemiCondensed" w:hAnsi="Bahnschrift Light SemiCondensed" w:eastAsia="SimSun" w:cs="Bahnschrift Light SemiCondensed"/>
+          <w:b/>
+          <w:bCs/>
+          <w:sz w:val="24"/>
+          <w:szCs w:val="24"/>
+          <w:lang w:val="pt-BR"/>
+        </w:rPr>
+        <w:t xml:space="preserve">LIKE </w:t>
+      </w:r>
+      <w:r>
+        <w:rPr>
+          <w:rFonts w:hint="default" w:ascii="Bahnschrift Light SemiCondensed" w:hAnsi="Bahnschrift Light SemiCondensed" w:eastAsia="SimSun" w:cs="Bahnschrift Light SemiCondensed"/>
+          <w:b/>
+          <w:bCs/>
+          <w:sz w:val="24"/>
+          <w:szCs w:val="24"/>
+        </w:rPr>
+        <w:t>'</w:t>
+      </w:r>
+      <w:r>
+        <w:rPr>
+          <w:rFonts w:hint="default" w:ascii="Bahnschrift Light SemiCondensed" w:hAnsi="Bahnschrift Light SemiCondensed" w:eastAsia="SimSun" w:cs="Bahnschrift Light SemiCondensed"/>
+          <w:b/>
+          <w:bCs/>
+          <w:sz w:val="24"/>
+          <w:szCs w:val="24"/>
+          <w:lang w:val="pt-BR"/>
+        </w:rPr>
+        <w:t>%</w:t>
+      </w:r>
+      <w:r>
+        <w:rPr>
+          <w:rFonts w:hint="default" w:ascii="Bahnschrift Light SemiCondensed" w:hAnsi="Bahnschrift Light SemiCondensed" w:eastAsia="SimSun" w:cs="Bahnschrift Light SemiCondensed"/>
+          <w:b w:val="0"/>
+          <w:bCs w:val="0"/>
+          <w:sz w:val="24"/>
+          <w:szCs w:val="24"/>
+          <w:u w:val="single"/>
+          <w:lang w:val="pt-BR"/>
+        </w:rPr>
+        <w:t>letra_específica</w:t>
+      </w:r>
+      <w:r>
+        <w:rPr>
+          <w:rFonts w:hint="default" w:ascii="Bahnschrift Light SemiCondensed" w:hAnsi="Bahnschrift Light SemiCondensed" w:eastAsia="SimSun" w:cs="Bahnschrift Light SemiCondensed"/>
+          <w:b/>
+          <w:bCs/>
+          <w:sz w:val="24"/>
+          <w:szCs w:val="24"/>
+        </w:rPr>
+        <w:t>';</w:t>
+      </w:r>
+      <w:r>
+        <w:rPr>
+          <w:rFonts w:hint="default" w:ascii="Bahnschrift Light SemiCondensed" w:hAnsi="Bahnschrift Light SemiCondensed" w:eastAsia="SimSun" w:cs="Bahnschrift Light SemiCondensed"/>
+          <w:b/>
+          <w:bCs/>
+          <w:sz w:val="24"/>
+          <w:szCs w:val="24"/>
+          <w:lang w:val="pt-BR"/>
+        </w:rPr>
+        <w:tab/>
+      </w:r>
+      <w:r>
+        <w:rPr>
+          <w:rFonts w:hint="default" w:ascii="Bahnschrift Light SemiCondensed" w:hAnsi="Bahnschrift Light SemiCondensed" w:eastAsia="SimSun" w:cs="Bahnschrift Light SemiCondensed"/>
+          <w:b/>
+          <w:bCs/>
+          <w:sz w:val="24"/>
+          <w:szCs w:val="24"/>
+          <w:lang w:val="pt-BR"/>
+        </w:rPr>
+        <w:tab/>
+      </w:r>
+      <w:r>
+        <w:rPr>
+          <w:rFonts w:hint="default" w:ascii="Bahnschrift Light SemiCondensed" w:hAnsi="Bahnschrift Light SemiCondensed" w:eastAsia="SimSun" w:cs="Bahnschrift Light SemiCondensed"/>
+          <w:b w:val="0"/>
+          <w:bCs w:val="0"/>
+          <w:sz w:val="24"/>
+          <w:szCs w:val="24"/>
+          <w:lang w:val="pt-BR"/>
+        </w:rPr>
+        <w:t>→</w:t>
+      </w:r>
+    </w:p>
+    <w:p>
+      <w:pPr>
+        <w:jc w:val="left"/>
+        <w:rPr>
+          <w:rFonts w:hint="default" w:ascii="Bahnschrift Light SemiCondensed" w:hAnsi="Bahnschrift Light SemiCondensed" w:eastAsia="SimSun" w:cs="Bahnschrift Light SemiCondensed"/>
+          <w:b w:val="0"/>
+          <w:bCs w:val="0"/>
+          <w:sz w:val="24"/>
+          <w:szCs w:val="24"/>
+          <w:lang w:val="pt-BR"/>
+        </w:rPr>
+      </w:pPr>
+    </w:p>
+    <w:p>
+      <w:pPr>
+        <w:jc w:val="left"/>
+        <w:rPr>
+          <w:rFonts w:hint="default" w:ascii="Bahnschrift Light SemiCondensed" w:hAnsi="Bahnschrift Light SemiCondensed" w:eastAsia="SimSun" w:cs="Bahnschrift Light SemiCondensed"/>
+          <w:b w:val="0"/>
+          <w:bCs w:val="0"/>
+          <w:sz w:val="24"/>
+          <w:szCs w:val="24"/>
+          <w:lang w:val="pt-BR"/>
+        </w:rPr>
+      </w:pPr>
+      <w:r>
+        <w:rPr>
+          <w:rFonts w:hint="default" w:ascii="Bahnschrift Light SemiCondensed" w:hAnsi="Bahnschrift Light SemiCondensed" w:eastAsia="SimSun" w:cs="Bahnschrift Light SemiCondensed"/>
+          <w:b w:val="0"/>
+          <w:bCs w:val="0"/>
+          <w:sz w:val="24"/>
+          <w:szCs w:val="24"/>
+          <w:lang w:val="pt-BR"/>
+        </w:rPr>
+        <w:tab/>
+      </w:r>
+      <w:r>
+        <w:rPr>
+          <w:rFonts w:hint="default" w:ascii="Bahnschrift Light SemiCondensed" w:hAnsi="Bahnschrift Light SemiCondensed" w:eastAsia="SimSun" w:cs="Bahnschrift Light SemiCondensed"/>
+          <w:b w:val="0"/>
+          <w:bCs w:val="0"/>
+          <w:sz w:val="24"/>
+          <w:szCs w:val="24"/>
+          <w:lang w:val="pt-BR"/>
+        </w:rPr>
+        <w:tab/>
+      </w:r>
+      <w:r>
+        <w:rPr>
+          <w:rFonts w:hint="default" w:ascii="Bahnschrift Light SemiCondensed" w:hAnsi="Bahnschrift Light SemiCondensed" w:eastAsia="SimSun" w:cs="Bahnschrift Light SemiCondensed"/>
+          <w:b w:val="0"/>
+          <w:bCs w:val="0"/>
+          <w:sz w:val="24"/>
+          <w:szCs w:val="24"/>
+          <w:lang w:val="pt-BR"/>
+        </w:rPr>
+        <w:t>Comando utilizado para consultar dados onde suas primeiras instâncias terminam com uma letra específica.</w:t>
+      </w:r>
+    </w:p>
+    <w:p>
+      <w:pPr>
+        <w:jc w:val="left"/>
+        <w:rPr>
+          <w:rFonts w:hint="default" w:ascii="Bahnschrift Light SemiCondensed" w:hAnsi="Bahnschrift Light SemiCondensed" w:eastAsia="SimSun" w:cs="Bahnschrift Light SemiCondensed"/>
+          <w:b w:val="0"/>
+          <w:bCs w:val="0"/>
+          <w:sz w:val="24"/>
+          <w:szCs w:val="24"/>
+          <w:lang w:val="pt-BR"/>
+        </w:rPr>
+      </w:pPr>
+    </w:p>
+    <w:p>
+      <w:pPr>
+        <w:jc w:val="left"/>
+        <w:rPr>
+          <w:rFonts w:hint="default" w:ascii="Bahnschrift Light SemiCondensed" w:hAnsi="Bahnschrift Light SemiCondensed" w:eastAsia="SimSun" w:cs="Bahnschrift Light SemiCondensed"/>
+          <w:b w:val="0"/>
+          <w:bCs w:val="0"/>
+          <w:sz w:val="24"/>
+          <w:szCs w:val="24"/>
+          <w:lang w:val="pt-BR"/>
+        </w:rPr>
+      </w:pPr>
+    </w:p>
+    <w:p>
+      <w:pPr>
+        <w:spacing w:beforeLines="0" w:afterLines="0"/>
+        <w:jc w:val="left"/>
+        <w:rPr>
+          <w:rFonts w:hint="default" w:ascii="Bahnschrift Light SemiCondensed" w:hAnsi="Bahnschrift Light SemiCondensed" w:cs="Bahnschrift Light SemiCondensed"/>
+          <w:color w:val="auto"/>
+          <w:sz w:val="24"/>
+          <w:szCs w:val="36"/>
+          <w:lang w:val="pt-BR"/>
+        </w:rPr>
+      </w:pPr>
+      <w:r>
+        <w:rPr>
+          <w:rFonts w:hint="default" w:ascii="Bahnschrift Light SemiCondensed" w:hAnsi="Bahnschrift Light SemiCondensed" w:cs="Bahnschrift Light SemiCondensed"/>
+          <w:b/>
+          <w:color w:val="auto"/>
+          <w:sz w:val="24"/>
+          <w:szCs w:val="36"/>
+        </w:rPr>
+        <w:t>SELECT</w:t>
+      </w:r>
+      <w:r>
+        <w:rPr>
+          <w:rFonts w:hint="default" w:ascii="Bahnschrift Light SemiCondensed" w:hAnsi="Bahnschrift Light SemiCondensed" w:cs="Bahnschrift Light SemiCondensed"/>
+          <w:b/>
+          <w:color w:val="auto"/>
+          <w:sz w:val="24"/>
+          <w:szCs w:val="36"/>
+          <w:lang w:val="pt-BR"/>
+        </w:rPr>
+        <w:t xml:space="preserve"> </w:t>
+      </w:r>
+      <w:r>
+        <w:rPr>
+          <w:rFonts w:hint="default" w:ascii="Bahnschrift Light SemiCondensed" w:hAnsi="Bahnschrift Light SemiCondensed" w:cs="Bahnschrift Light SemiCondensed"/>
+          <w:color w:val="auto"/>
+          <w:sz w:val="24"/>
+          <w:szCs w:val="36"/>
+        </w:rPr>
+        <w:t xml:space="preserve"> </w:t>
+      </w:r>
+      <w:r>
+        <w:rPr>
+          <w:rFonts w:hint="default" w:ascii="Bahnschrift Light SemiCondensed" w:hAnsi="Bahnschrift Light SemiCondensed" w:cs="Bahnschrift Light SemiCondensed"/>
+          <w:b/>
+          <w:color w:val="auto"/>
+          <w:sz w:val="24"/>
+          <w:szCs w:val="36"/>
+        </w:rPr>
+        <w:t>TIMESTAMPDIFF</w:t>
+      </w:r>
+      <w:r>
+        <w:rPr>
+          <w:rFonts w:hint="default" w:ascii="Bahnschrift Light SemiCondensed" w:hAnsi="Bahnschrift Light SemiCondensed" w:cs="Bahnschrift Light SemiCondensed"/>
+          <w:color w:val="auto"/>
+          <w:sz w:val="24"/>
+          <w:szCs w:val="36"/>
+        </w:rPr>
+        <w:t>(</w:t>
+      </w:r>
+      <w:r>
+        <w:rPr>
+          <w:rFonts w:hint="default" w:ascii="Bahnschrift Light SemiCondensed" w:hAnsi="Bahnschrift Light SemiCondensed" w:cs="Bahnschrift Light SemiCondensed"/>
+          <w:b/>
+          <w:color w:val="auto"/>
+          <w:sz w:val="24"/>
+          <w:szCs w:val="36"/>
+        </w:rPr>
+        <w:t>YEAR</w:t>
+      </w:r>
+      <w:r>
+        <w:rPr>
+          <w:rFonts w:hint="default" w:ascii="Bahnschrift Light SemiCondensed" w:hAnsi="Bahnschrift Light SemiCondensed" w:cs="Bahnschrift Light SemiCondensed"/>
+          <w:color w:val="auto"/>
+          <w:sz w:val="24"/>
+          <w:szCs w:val="36"/>
+        </w:rPr>
+        <w:t xml:space="preserve">, </w:t>
+      </w:r>
+      <w:r>
+        <w:rPr>
+          <w:rFonts w:hint="default" w:ascii="Bahnschrift Light SemiCondensed" w:hAnsi="Bahnschrift Light SemiCondensed" w:cs="Bahnschrift Light SemiCondensed"/>
+          <w:color w:val="auto"/>
+          <w:sz w:val="24"/>
+          <w:szCs w:val="36"/>
+          <w:u w:val="single"/>
+          <w:lang w:val="pt-BR"/>
+        </w:rPr>
+        <w:t>coluna_com_as_datas</w:t>
+      </w:r>
+      <w:r>
+        <w:rPr>
+          <w:rFonts w:hint="default" w:ascii="Bahnschrift Light SemiCondensed" w:hAnsi="Bahnschrift Light SemiCondensed" w:cs="Bahnschrift Light SemiCondensed"/>
+          <w:color w:val="auto"/>
+          <w:sz w:val="24"/>
+          <w:szCs w:val="36"/>
+        </w:rPr>
+        <w:t xml:space="preserve">, </w:t>
+      </w:r>
+      <w:r>
+        <w:rPr>
+          <w:rFonts w:hint="default" w:ascii="Bahnschrift Light SemiCondensed" w:hAnsi="Bahnschrift Light SemiCondensed" w:cs="Bahnschrift Light SemiCondensed"/>
+          <w:b/>
+          <w:color w:val="auto"/>
+          <w:sz w:val="24"/>
+          <w:szCs w:val="36"/>
+        </w:rPr>
+        <w:t>CURDATE</w:t>
+      </w:r>
+      <w:r>
+        <w:rPr>
+          <w:rFonts w:hint="default" w:ascii="Bahnschrift Light SemiCondensed" w:hAnsi="Bahnschrift Light SemiCondensed" w:cs="Bahnschrift Light SemiCondensed"/>
+          <w:color w:val="auto"/>
+          <w:sz w:val="24"/>
+          <w:szCs w:val="36"/>
+        </w:rPr>
+        <w:t xml:space="preserve">()) </w:t>
+      </w:r>
+      <w:r>
+        <w:rPr>
+          <w:rFonts w:hint="default" w:ascii="Bahnschrift Light SemiCondensed" w:hAnsi="Bahnschrift Light SemiCondensed" w:cs="Bahnschrift Light SemiCondensed"/>
+          <w:b/>
+          <w:color w:val="auto"/>
+          <w:sz w:val="24"/>
+          <w:szCs w:val="36"/>
+        </w:rPr>
+        <w:t>AS</w:t>
+      </w:r>
+      <w:r>
+        <w:rPr>
+          <w:rFonts w:hint="default" w:ascii="Bahnschrift Light SemiCondensed" w:hAnsi="Bahnschrift Light SemiCondensed" w:cs="Bahnschrift Light SemiCondensed"/>
+          <w:color w:val="auto"/>
+          <w:sz w:val="24"/>
+          <w:szCs w:val="36"/>
+        </w:rPr>
+        <w:t xml:space="preserve"> idade </w:t>
+      </w:r>
+      <w:r>
+        <w:rPr>
+          <w:rFonts w:hint="default" w:ascii="Bahnschrift Light SemiCondensed" w:hAnsi="Bahnschrift Light SemiCondensed" w:cs="Bahnschrift Light SemiCondensed"/>
+          <w:b/>
+          <w:color w:val="auto"/>
+          <w:sz w:val="24"/>
+          <w:szCs w:val="36"/>
+        </w:rPr>
+        <w:t>FROM</w:t>
+      </w:r>
+      <w:r>
+        <w:rPr>
+          <w:rFonts w:hint="default" w:ascii="Bahnschrift Light SemiCondensed" w:hAnsi="Bahnschrift Light SemiCondensed" w:cs="Bahnschrift Light SemiCondensed"/>
+          <w:color w:val="auto"/>
+          <w:sz w:val="24"/>
+          <w:szCs w:val="36"/>
+        </w:rPr>
+        <w:t xml:space="preserve"> </w:t>
+      </w:r>
+      <w:r>
+        <w:rPr>
+          <w:rFonts w:hint="default" w:ascii="Bahnschrift Light SemiCondensed" w:hAnsi="Bahnschrift Light SemiCondensed" w:cs="Bahnschrift Light SemiCondensed"/>
+          <w:color w:val="auto"/>
+          <w:sz w:val="24"/>
+          <w:szCs w:val="36"/>
+          <w:u w:val="single"/>
+          <w:lang w:val="pt-BR"/>
+        </w:rPr>
+        <w:t>nome_da_tabela</w:t>
+      </w:r>
+      <w:r>
+        <w:rPr>
+          <w:rFonts w:hint="default" w:ascii="Bahnschrift Light SemiCondensed" w:hAnsi="Bahnschrift Light SemiCondensed" w:cs="Bahnschrift Light SemiCondensed"/>
+          <w:color w:val="auto"/>
+          <w:sz w:val="24"/>
+          <w:szCs w:val="36"/>
+        </w:rPr>
+        <w:t>;</w:t>
+      </w:r>
+      <w:r>
+        <w:rPr>
+          <w:rFonts w:hint="default" w:ascii="Bahnschrift Light SemiCondensed" w:hAnsi="Bahnschrift Light SemiCondensed" w:cs="Bahnschrift Light SemiCondensed"/>
+          <w:color w:val="auto"/>
+          <w:sz w:val="24"/>
+          <w:szCs w:val="36"/>
+          <w:lang w:val="pt-BR"/>
+        </w:rPr>
+        <w:tab/>
+        <w:t/>
+      </w:r>
+      <w:r>
+        <w:rPr>
+          <w:rFonts w:hint="default" w:ascii="Bahnschrift Light SemiCondensed" w:hAnsi="Bahnschrift Light SemiCondensed" w:cs="Bahnschrift Light SemiCondensed"/>
+          <w:color w:val="auto"/>
+          <w:sz w:val="24"/>
+          <w:szCs w:val="36"/>
+          <w:lang w:val="pt-BR"/>
+        </w:rPr>
+        <w:tab/>
+        <w:t/>
+      </w:r>
+      <w:r>
+        <w:rPr>
+          <w:rFonts w:hint="default" w:ascii="Bahnschrift Light SemiCondensed" w:hAnsi="Bahnschrift Light SemiCondensed" w:cs="Bahnschrift Light SemiCondensed"/>
+          <w:color w:val="auto"/>
+          <w:sz w:val="24"/>
+          <w:szCs w:val="36"/>
+          <w:lang w:val="pt-BR"/>
+        </w:rPr>
+        <w:tab/>
+        <w:t>→</w:t>
+      </w:r>
+    </w:p>
+    <w:p>
+      <w:pPr>
+        <w:spacing w:beforeLines="0" w:afterLines="0"/>
+        <w:jc w:val="left"/>
+        <w:rPr>
+          <w:rFonts w:hint="default" w:ascii="Bahnschrift Light SemiCondensed" w:hAnsi="Bahnschrift Light SemiCondensed" w:cs="Bahnschrift Light SemiCondensed"/>
+          <w:color w:val="auto"/>
+          <w:sz w:val="24"/>
+          <w:szCs w:val="36"/>
+          <w:lang w:val="pt-BR"/>
+        </w:rPr>
+      </w:pPr>
+    </w:p>
+    <w:p>
+      <w:pPr>
+        <w:spacing w:beforeLines="0" w:afterLines="0"/>
+        <w:jc w:val="left"/>
+        <w:rPr>
+          <w:rFonts w:hint="default" w:ascii="Bahnschrift Light SemiCondensed" w:hAnsi="Bahnschrift Light SemiCondensed" w:cs="Bahnschrift Light SemiCondensed"/>
+          <w:color w:val="auto"/>
+          <w:sz w:val="24"/>
+          <w:szCs w:val="36"/>
+          <w:lang w:val="pt-BR"/>
+        </w:rPr>
+      </w:pPr>
+      <w:r>
+        <w:rPr>
+          <w:rFonts w:hint="default" w:ascii="Bahnschrift Light SemiCondensed" w:hAnsi="Bahnschrift Light SemiCondensed" w:cs="Bahnschrift Light SemiCondensed"/>
+          <w:color w:val="auto"/>
+          <w:sz w:val="24"/>
+          <w:szCs w:val="36"/>
+          <w:lang w:val="pt-BR"/>
+        </w:rPr>
+        <w:tab/>
+        <w:t/>
+      </w:r>
+      <w:r>
+        <w:rPr>
+          <w:rFonts w:hint="default" w:ascii="Bahnschrift Light SemiCondensed" w:hAnsi="Bahnschrift Light SemiCondensed" w:cs="Bahnschrift Light SemiCondensed"/>
+          <w:color w:val="auto"/>
+          <w:sz w:val="24"/>
+          <w:szCs w:val="36"/>
+          <w:lang w:val="pt-BR"/>
+        </w:rPr>
+        <w:tab/>
+        <w:t>Comando utilizado para verificar a idade de uma pessoa.</w:t>
+      </w:r>
+    </w:p>
+    <w:p>
+      <w:pPr>
+        <w:jc w:val="left"/>
+        <w:rPr>
+          <w:rFonts w:hint="default" w:ascii="Bahnschrift Light SemiCondensed" w:hAnsi="Bahnschrift Light SemiCondensed"/>
+          <w:b/>
+          <w:bCs/>
+          <w:i w:val="0"/>
+          <w:iCs w:val="0"/>
+          <w:color w:val="auto"/>
+          <w:sz w:val="24"/>
+          <w:szCs w:val="24"/>
+          <w:u w:val="none"/>
+          <w:lang w:val="pt-BR"/>
+        </w:rPr>
+      </w:pPr>
+    </w:p>
+    <w:p>
+      <w:pPr>
+        <w:jc w:val="left"/>
+        <w:rPr>
+          <w:rFonts w:hint="default" w:ascii="Bahnschrift Light SemiCondensed" w:hAnsi="Bahnschrift Light SemiCondensed"/>
+          <w:b/>
+          <w:bCs/>
+          <w:i w:val="0"/>
+          <w:iCs w:val="0"/>
+          <w:color w:val="auto"/>
+          <w:sz w:val="24"/>
+          <w:szCs w:val="24"/>
+          <w:u w:val="none"/>
+          <w:lang w:val="pt-BR"/>
+        </w:rPr>
+      </w:pPr>
+    </w:p>
+    <w:p>
+      <w:pPr>
+        <w:jc w:val="left"/>
+        <w:rPr>
+          <w:rFonts w:hint="default" w:ascii="Bahnschrift Light SemiCondensed" w:hAnsi="Bahnschrift Light SemiCondensed"/>
+          <w:b w:val="0"/>
+          <w:bCs w:val="0"/>
+          <w:i w:val="0"/>
+          <w:iCs w:val="0"/>
+          <w:color w:val="auto"/>
+          <w:sz w:val="24"/>
+          <w:szCs w:val="24"/>
+          <w:u w:val="single"/>
+          <w:lang w:val="pt-BR"/>
+        </w:rPr>
+      </w:pPr>
+      <w:r>
+        <w:rPr>
+          <w:rFonts w:hint="default" w:ascii="Bahnschrift Light SemiCondensed" w:hAnsi="Bahnschrift Light SemiCondensed"/>
+          <w:b/>
+          <w:bCs/>
+          <w:i w:val="0"/>
+          <w:iCs w:val="0"/>
+          <w:color w:val="auto"/>
+          <w:sz w:val="24"/>
+          <w:szCs w:val="24"/>
+          <w:u w:val="none"/>
+          <w:lang w:val="pt-BR"/>
+        </w:rPr>
+        <w:t xml:space="preserve">SELECT </w:t>
+      </w:r>
+      <w:r>
+        <w:rPr>
+          <w:rFonts w:hint="default" w:ascii="Bahnschrift Light SemiCondensed" w:hAnsi="Bahnschrift Light SemiCondensed"/>
+          <w:b w:val="0"/>
+          <w:bCs w:val="0"/>
+          <w:i w:val="0"/>
+          <w:iCs w:val="0"/>
+          <w:color w:val="auto"/>
+          <w:sz w:val="24"/>
+          <w:szCs w:val="24"/>
+          <w:u w:val="single"/>
+          <w:lang w:val="pt-BR"/>
+        </w:rPr>
+        <w:t>primeira_coluna_específica</w:t>
+      </w:r>
+      <w:r>
+        <w:rPr>
+          <w:rFonts w:hint="default" w:ascii="Bahnschrift Light SemiCondensed" w:hAnsi="Bahnschrift Light SemiCondensed"/>
+          <w:b w:val="0"/>
+          <w:bCs w:val="0"/>
+          <w:i w:val="0"/>
+          <w:iCs w:val="0"/>
+          <w:color w:val="auto"/>
+          <w:sz w:val="24"/>
+          <w:szCs w:val="24"/>
+          <w:u w:val="none"/>
+          <w:lang w:val="pt-BR"/>
+        </w:rPr>
+        <w:t xml:space="preserve">, </w:t>
+      </w:r>
+      <w:r>
+        <w:rPr>
+          <w:rFonts w:hint="default" w:ascii="Bahnschrift Light SemiCondensed" w:hAnsi="Bahnschrift Light SemiCondensed"/>
+          <w:b/>
+          <w:bCs/>
+          <w:i w:val="0"/>
+          <w:iCs w:val="0"/>
+          <w:color w:val="auto"/>
+          <w:sz w:val="24"/>
+          <w:szCs w:val="24"/>
+          <w:u w:val="none"/>
+          <w:lang w:val="pt-BR"/>
+        </w:rPr>
+        <w:t>COUNT(*)</w:t>
+      </w:r>
+      <w:r>
+        <w:rPr>
+          <w:rFonts w:hint="default" w:ascii="Bahnschrift Light SemiCondensed" w:hAnsi="Bahnschrift Light SemiCondensed"/>
+          <w:b w:val="0"/>
+          <w:bCs w:val="0"/>
+          <w:i w:val="0"/>
+          <w:iCs w:val="0"/>
+          <w:color w:val="auto"/>
+          <w:sz w:val="24"/>
+          <w:szCs w:val="24"/>
+          <w:u w:val="none"/>
+          <w:lang w:val="pt-BR"/>
+        </w:rPr>
+        <w:t xml:space="preserve"> from </w:t>
+      </w:r>
+      <w:r>
+        <w:rPr>
+          <w:rFonts w:hint="default" w:ascii="Bahnschrift Light SemiCondensed" w:hAnsi="Bahnschrift Light SemiCondensed"/>
+          <w:b w:val="0"/>
+          <w:bCs w:val="0"/>
+          <w:i w:val="0"/>
+          <w:iCs w:val="0"/>
+          <w:color w:val="auto"/>
+          <w:sz w:val="24"/>
+          <w:szCs w:val="24"/>
+          <w:u w:val="single"/>
+          <w:lang w:val="pt-BR"/>
+        </w:rPr>
+        <w:t>nome_da_tabela</w:t>
+      </w:r>
+    </w:p>
+    <w:p>
+      <w:pPr>
+        <w:jc w:val="left"/>
+        <w:rPr>
+          <w:rFonts w:hint="default" w:ascii="Bahnschrift Light SemiCondensed" w:hAnsi="Bahnschrift Light SemiCondensed"/>
+          <w:b w:val="0"/>
+          <w:bCs w:val="0"/>
+          <w:i w:val="0"/>
+          <w:iCs w:val="0"/>
+          <w:color w:val="auto"/>
+          <w:sz w:val="24"/>
+          <w:szCs w:val="24"/>
+          <w:u w:val="single"/>
+          <w:lang w:val="pt-BR"/>
+        </w:rPr>
+      </w:pPr>
+      <w:r>
+        <w:rPr>
+          <w:rFonts w:hint="default" w:ascii="Bahnschrift Light SemiCondensed" w:hAnsi="Bahnschrift Light SemiCondensed"/>
+          <w:b/>
+          <w:bCs/>
+          <w:i w:val="0"/>
+          <w:iCs w:val="0"/>
+          <w:color w:val="auto"/>
+          <w:sz w:val="24"/>
+          <w:szCs w:val="24"/>
+          <w:u w:val="none"/>
+          <w:lang w:val="pt-BR"/>
+        </w:rPr>
+        <w:t xml:space="preserve">GROUP BY </w:t>
+      </w:r>
+      <w:r>
+        <w:rPr>
+          <w:rFonts w:hint="default" w:ascii="Bahnschrift Light SemiCondensed" w:hAnsi="Bahnschrift Light SemiCondensed"/>
+          <w:b w:val="0"/>
+          <w:bCs w:val="0"/>
+          <w:i w:val="0"/>
+          <w:iCs w:val="0"/>
+          <w:color w:val="auto"/>
+          <w:sz w:val="24"/>
+          <w:szCs w:val="24"/>
+          <w:u w:val="single"/>
+          <w:lang w:val="pt-BR"/>
+        </w:rPr>
+        <w:t>segunda_coluna_específica</w:t>
+      </w:r>
+    </w:p>
+    <w:p>
+      <w:pPr>
+        <w:jc w:val="left"/>
+        <w:rPr>
+          <w:rFonts w:hint="default" w:ascii="Bahnschrift Light SemiCondensed" w:hAnsi="Bahnschrift Light SemiCondensed"/>
+          <w:b w:val="0"/>
+          <w:bCs w:val="0"/>
+          <w:i w:val="0"/>
+          <w:iCs w:val="0"/>
+          <w:color w:val="auto"/>
+          <w:sz w:val="24"/>
+          <w:szCs w:val="24"/>
+          <w:u w:val="none"/>
+          <w:lang w:val="pt-BR"/>
+        </w:rPr>
+      </w:pPr>
+      <w:r>
+        <w:rPr>
+          <w:rFonts w:hint="default" w:ascii="Bahnschrift Light SemiCondensed" w:hAnsi="Bahnschrift Light SemiCondensed"/>
+          <w:b/>
+          <w:bCs/>
+          <w:i w:val="0"/>
+          <w:iCs w:val="0"/>
+          <w:color w:val="auto"/>
+          <w:sz w:val="24"/>
+          <w:szCs w:val="24"/>
+          <w:u w:val="none"/>
+          <w:lang w:val="pt-BR"/>
+        </w:rPr>
+        <w:t xml:space="preserve">ORDER BY </w:t>
+      </w:r>
+      <w:r>
+        <w:rPr>
+          <w:rFonts w:hint="default" w:ascii="Bahnschrift Light SemiCondensed" w:hAnsi="Bahnschrift Light SemiCondensed"/>
+          <w:b w:val="0"/>
+          <w:bCs w:val="0"/>
+          <w:i w:val="0"/>
+          <w:iCs w:val="0"/>
+          <w:color w:val="auto"/>
+          <w:sz w:val="24"/>
+          <w:szCs w:val="24"/>
+          <w:u w:val="single"/>
+          <w:lang w:val="pt-BR"/>
+        </w:rPr>
+        <w:t>pk(Primary Key)</w:t>
+      </w:r>
+      <w:r>
+        <w:rPr>
+          <w:rFonts w:hint="default" w:ascii="Bahnschrift Light SemiCondensed" w:hAnsi="Bahnschrift Light SemiCondensed"/>
+          <w:b/>
+          <w:bCs/>
+          <w:i w:val="0"/>
+          <w:iCs w:val="0"/>
+          <w:color w:val="auto"/>
+          <w:sz w:val="24"/>
+          <w:szCs w:val="24"/>
+          <w:u w:val="none"/>
+          <w:lang w:val="pt-BR"/>
+        </w:rPr>
+        <w:t>;</w:t>
+      </w:r>
+      <w:r>
+        <w:rPr>
+          <w:rFonts w:hint="default" w:ascii="Bahnschrift Light SemiCondensed" w:hAnsi="Bahnschrift Light SemiCondensed"/>
+          <w:b w:val="0"/>
+          <w:bCs w:val="0"/>
+          <w:i w:val="0"/>
+          <w:iCs w:val="0"/>
+          <w:color w:val="auto"/>
+          <w:sz w:val="24"/>
+          <w:szCs w:val="24"/>
+          <w:u w:val="none"/>
+          <w:lang w:val="pt-BR"/>
+        </w:rPr>
+        <w:tab/>
+        <w:t/>
+      </w:r>
+      <w:r>
+        <w:rPr>
+          <w:rFonts w:hint="default" w:ascii="Bahnschrift Light SemiCondensed" w:hAnsi="Bahnschrift Light SemiCondensed"/>
+          <w:b w:val="0"/>
+          <w:bCs w:val="0"/>
+          <w:i w:val="0"/>
+          <w:iCs w:val="0"/>
+          <w:color w:val="auto"/>
+          <w:sz w:val="24"/>
+          <w:szCs w:val="24"/>
+          <w:u w:val="none"/>
+          <w:lang w:val="pt-BR"/>
+        </w:rPr>
+        <w:tab/>
+        <w:t/>
+      </w:r>
+      <w:r>
+        <w:rPr>
+          <w:rFonts w:hint="default" w:ascii="Bahnschrift Light SemiCondensed" w:hAnsi="Bahnschrift Light SemiCondensed"/>
+          <w:b w:val="0"/>
+          <w:bCs w:val="0"/>
+          <w:i w:val="0"/>
+          <w:iCs w:val="0"/>
+          <w:color w:val="auto"/>
+          <w:sz w:val="24"/>
+          <w:szCs w:val="24"/>
+          <w:u w:val="none"/>
+          <w:lang w:val="pt-BR"/>
+        </w:rPr>
+        <w:tab/>
+        <w:t>→</w:t>
+      </w:r>
+      <w:r>
+        <w:rPr>
+          <w:rFonts w:hint="default" w:ascii="Bahnschrift Light SemiCondensed" w:hAnsi="Bahnschrift Light SemiCondensed"/>
+          <w:b w:val="0"/>
+          <w:bCs w:val="0"/>
+          <w:i w:val="0"/>
+          <w:iCs w:val="0"/>
+          <w:color w:val="auto"/>
+          <w:sz w:val="24"/>
+          <w:szCs w:val="24"/>
+          <w:u w:val="none"/>
+          <w:lang w:val="pt-BR"/>
+        </w:rPr>
+        <w:tab/>
+        <w:t/>
+      </w:r>
+      <w:r>
+        <w:rPr>
+          <w:rFonts w:hint="default" w:ascii="Bahnschrift Light SemiCondensed" w:hAnsi="Bahnschrift Light SemiCondensed"/>
+          <w:b w:val="0"/>
+          <w:bCs w:val="0"/>
+          <w:i w:val="0"/>
+          <w:iCs w:val="0"/>
+          <w:color w:val="auto"/>
+          <w:sz w:val="24"/>
+          <w:szCs w:val="24"/>
+          <w:u w:val="none"/>
+          <w:lang w:val="pt-BR"/>
+        </w:rPr>
+        <w:tab/>
+      </w:r>
+    </w:p>
+    <w:p>
+      <w:pPr>
+        <w:jc w:val="left"/>
+        <w:rPr>
+          <w:rFonts w:hint="default" w:ascii="Bahnschrift Light SemiCondensed" w:hAnsi="Bahnschrift Light SemiCondensed"/>
+          <w:b w:val="0"/>
+          <w:bCs w:val="0"/>
+          <w:i w:val="0"/>
+          <w:iCs w:val="0"/>
+          <w:color w:val="auto"/>
+          <w:sz w:val="24"/>
+          <w:szCs w:val="24"/>
+          <w:u w:val="none"/>
+          <w:lang w:val="pt-BR"/>
+        </w:rPr>
+      </w:pPr>
+    </w:p>
+    <w:p>
+      <w:pPr>
+        <w:jc w:val="left"/>
+        <w:rPr>
+          <w:rFonts w:hint="default" w:ascii="Bahnschrift Light SemiCondensed" w:hAnsi="Bahnschrift Light SemiCondensed"/>
+          <w:b w:val="0"/>
+          <w:bCs w:val="0"/>
+          <w:i w:val="0"/>
+          <w:iCs w:val="0"/>
+          <w:color w:val="auto"/>
+          <w:sz w:val="24"/>
+          <w:szCs w:val="24"/>
+          <w:u w:val="none"/>
+          <w:lang w:val="pt-BR"/>
+        </w:rPr>
+      </w:pPr>
+      <w:r>
+        <w:rPr>
+          <w:rFonts w:hint="default" w:ascii="Bahnschrift Light SemiCondensed" w:hAnsi="Bahnschrift Light SemiCondensed"/>
+          <w:b w:val="0"/>
+          <w:bCs w:val="0"/>
+          <w:i w:val="0"/>
+          <w:iCs w:val="0"/>
+          <w:color w:val="auto"/>
+          <w:sz w:val="24"/>
+          <w:szCs w:val="24"/>
+          <w:u w:val="none"/>
+          <w:lang w:val="pt-BR"/>
+        </w:rPr>
+        <w:tab/>
+        <w:t/>
+      </w:r>
+      <w:r>
+        <w:rPr>
+          <w:rFonts w:hint="default" w:ascii="Bahnschrift Light SemiCondensed" w:hAnsi="Bahnschrift Light SemiCondensed"/>
+          <w:b w:val="0"/>
+          <w:bCs w:val="0"/>
+          <w:i w:val="0"/>
+          <w:iCs w:val="0"/>
+          <w:color w:val="auto"/>
+          <w:sz w:val="24"/>
+          <w:szCs w:val="24"/>
+          <w:u w:val="none"/>
+          <w:lang w:val="pt-BR"/>
+        </w:rPr>
+        <w:tab/>
+        <w:t/>
+      </w:r>
+      <w:r>
+        <w:rPr>
+          <w:rFonts w:hint="default" w:ascii="Bahnschrift Light SemiCondensed" w:hAnsi="Bahnschrift Light SemiCondensed"/>
+          <w:b w:val="0"/>
+          <w:bCs w:val="0"/>
+          <w:i w:val="0"/>
+          <w:iCs w:val="0"/>
+          <w:color w:val="auto"/>
+          <w:sz w:val="24"/>
+          <w:szCs w:val="24"/>
+          <w:u w:val="none"/>
+          <w:lang w:val="pt-BR"/>
+        </w:rPr>
+        <w:tab/>
+        <w:t>Comando utilizado para verificar o total de registros de uma coluna específica na tabela, ordenando pelo número identificador “id”.</w:t>
+      </w:r>
+    </w:p>
+    <w:p>
+      <w:pPr>
+        <w:jc w:val="left"/>
+        <w:rPr>
+          <w:rFonts w:hint="default" w:ascii="Bahnschrift Light SemiCondensed" w:hAnsi="Bahnschrift Light SemiCondensed"/>
+          <w:b w:val="0"/>
+          <w:bCs w:val="0"/>
+          <w:i w:val="0"/>
+          <w:iCs w:val="0"/>
+          <w:color w:val="auto"/>
+          <w:sz w:val="24"/>
+          <w:szCs w:val="24"/>
+          <w:u w:val="none"/>
+          <w:lang w:val="pt-BR"/>
+        </w:rPr>
+      </w:pPr>
+    </w:p>
+    <w:p>
+      <w:pPr>
+        <w:jc w:val="left"/>
+        <w:rPr>
+          <w:rFonts w:hint="default" w:ascii="Bahnschrift Light SemiCondensed" w:hAnsi="Bahnschrift Light SemiCondensed"/>
+          <w:b w:val="0"/>
+          <w:bCs w:val="0"/>
+          <w:i w:val="0"/>
+          <w:iCs w:val="0"/>
+          <w:color w:val="auto"/>
+          <w:sz w:val="24"/>
+          <w:szCs w:val="24"/>
+          <w:u w:val="none"/>
+          <w:lang w:val="pt-BR"/>
+        </w:rPr>
+      </w:pPr>
+    </w:p>
+    <w:p>
+      <w:pPr>
+        <w:jc w:val="left"/>
+        <w:rPr>
+          <w:rFonts w:hint="default" w:ascii="Bahnschrift Light SemiCondensed" w:hAnsi="Bahnschrift Light SemiCondensed"/>
+          <w:b w:val="0"/>
+          <w:bCs w:val="0"/>
+          <w:i w:val="0"/>
+          <w:iCs w:val="0"/>
+          <w:color w:val="auto"/>
+          <w:sz w:val="24"/>
+          <w:szCs w:val="24"/>
+          <w:u w:val="single"/>
+          <w:lang w:val="pt-BR"/>
+        </w:rPr>
+      </w:pPr>
+      <w:r>
+        <w:rPr>
+          <w:rFonts w:hint="default" w:ascii="Bahnschrift Light SemiCondensed" w:hAnsi="Bahnschrift Light SemiCondensed"/>
+          <w:b/>
+          <w:bCs/>
+          <w:i w:val="0"/>
+          <w:iCs w:val="0"/>
+          <w:color w:val="auto"/>
+          <w:sz w:val="24"/>
+          <w:szCs w:val="24"/>
+          <w:u w:val="none"/>
+          <w:lang w:val="pt-BR"/>
+        </w:rPr>
+        <w:t xml:space="preserve">SELECT </w:t>
+      </w:r>
+      <w:r>
+        <w:rPr>
+          <w:rFonts w:hint="default" w:ascii="Bahnschrift Light SemiCondensed" w:hAnsi="Bahnschrift Light SemiCondensed"/>
+          <w:b w:val="0"/>
+          <w:bCs w:val="0"/>
+          <w:i w:val="0"/>
+          <w:iCs w:val="0"/>
+          <w:color w:val="auto"/>
+          <w:sz w:val="24"/>
+          <w:szCs w:val="24"/>
+          <w:u w:val="single"/>
+          <w:lang w:val="pt-BR"/>
+        </w:rPr>
+        <w:t>coluna_específica</w:t>
+      </w:r>
+      <w:r>
+        <w:rPr>
+          <w:rFonts w:hint="default" w:ascii="Bahnschrift Light SemiCondensed" w:hAnsi="Bahnschrift Light SemiCondensed"/>
+          <w:b w:val="0"/>
+          <w:bCs w:val="0"/>
+          <w:i w:val="0"/>
+          <w:iCs w:val="0"/>
+          <w:color w:val="auto"/>
+          <w:sz w:val="24"/>
+          <w:szCs w:val="24"/>
+          <w:u w:val="none"/>
+          <w:lang w:val="pt-BR"/>
+        </w:rPr>
+        <w:t xml:space="preserve">, </w:t>
+      </w:r>
+      <w:r>
+        <w:rPr>
+          <w:rFonts w:hint="default" w:ascii="Bahnschrift Light SemiCondensed" w:hAnsi="Bahnschrift Light SemiCondensed"/>
+          <w:b/>
+          <w:bCs/>
+          <w:i w:val="0"/>
+          <w:iCs w:val="0"/>
+          <w:color w:val="auto"/>
+          <w:sz w:val="24"/>
+          <w:szCs w:val="24"/>
+          <w:u w:val="none"/>
+          <w:lang w:val="pt-BR"/>
+        </w:rPr>
+        <w:t>COUNT(*)</w:t>
+      </w:r>
+      <w:r>
+        <w:rPr>
+          <w:rFonts w:hint="default" w:ascii="Bahnschrift Light SemiCondensed" w:hAnsi="Bahnschrift Light SemiCondensed"/>
+          <w:b w:val="0"/>
+          <w:bCs w:val="0"/>
+          <w:i w:val="0"/>
+          <w:iCs w:val="0"/>
+          <w:color w:val="auto"/>
+          <w:sz w:val="24"/>
+          <w:szCs w:val="24"/>
+          <w:u w:val="none"/>
+          <w:lang w:val="pt-BR"/>
+        </w:rPr>
+        <w:t xml:space="preserve"> from </w:t>
+      </w:r>
+      <w:r>
+        <w:rPr>
+          <w:rFonts w:hint="default" w:ascii="Bahnschrift Light SemiCondensed" w:hAnsi="Bahnschrift Light SemiCondensed"/>
+          <w:b w:val="0"/>
+          <w:bCs w:val="0"/>
+          <w:i w:val="0"/>
+          <w:iCs w:val="0"/>
+          <w:color w:val="auto"/>
+          <w:sz w:val="24"/>
+          <w:szCs w:val="24"/>
+          <w:u w:val="single"/>
+          <w:lang w:val="pt-BR"/>
+        </w:rPr>
+        <w:t>nome_da_tabela</w:t>
+      </w:r>
+    </w:p>
+    <w:p>
+      <w:pPr>
+        <w:jc w:val="left"/>
+        <w:rPr>
+          <w:rFonts w:hint="default" w:ascii="Bahnschrift Light SemiCondensed" w:hAnsi="Bahnschrift Light SemiCondensed"/>
+          <w:b/>
+          <w:bCs/>
+          <w:i w:val="0"/>
+          <w:iCs w:val="0"/>
+          <w:color w:val="auto"/>
+          <w:sz w:val="24"/>
+          <w:szCs w:val="24"/>
+          <w:u w:val="none"/>
+          <w:lang w:val="pt-BR"/>
+        </w:rPr>
+      </w:pPr>
+      <w:r>
+        <w:rPr>
+          <w:rFonts w:hint="default" w:ascii="Bahnschrift Light SemiCondensed" w:hAnsi="Bahnschrift Light SemiCondensed"/>
+          <w:b/>
+          <w:bCs/>
+          <w:i w:val="0"/>
+          <w:iCs w:val="0"/>
+          <w:color w:val="auto"/>
+          <w:sz w:val="24"/>
+          <w:szCs w:val="24"/>
+          <w:u w:val="none"/>
+          <w:lang w:val="pt-BR"/>
+        </w:rPr>
+        <w:t xml:space="preserve">GROUP BY </w:t>
+      </w:r>
+      <w:r>
+        <w:rPr>
+          <w:rFonts w:hint="default" w:ascii="Bahnschrift Light SemiCondensed" w:hAnsi="Bahnschrift Light SemiCondensed"/>
+          <w:b w:val="0"/>
+          <w:bCs w:val="0"/>
+          <w:i w:val="0"/>
+          <w:iCs w:val="0"/>
+          <w:color w:val="auto"/>
+          <w:sz w:val="24"/>
+          <w:szCs w:val="24"/>
+          <w:u w:val="single"/>
+          <w:lang w:val="pt-BR"/>
+        </w:rPr>
+        <w:t>coluna_específica</w:t>
+      </w:r>
+      <w:r>
+        <w:rPr>
+          <w:rFonts w:hint="default" w:ascii="Bahnschrift Light SemiCondensed" w:hAnsi="Bahnschrift Light SemiCondensed"/>
+          <w:b/>
+          <w:bCs/>
+          <w:i w:val="0"/>
+          <w:iCs w:val="0"/>
+          <w:color w:val="auto"/>
+          <w:sz w:val="24"/>
+          <w:szCs w:val="24"/>
+          <w:u w:val="none"/>
+          <w:lang w:val="pt-BR"/>
+        </w:rPr>
+        <w:t>;</w:t>
+      </w:r>
+    </w:p>
+    <w:p>
+      <w:pPr>
+        <w:jc w:val="left"/>
+        <w:rPr>
+          <w:rFonts w:hint="default" w:ascii="Bahnschrift Light SemiCondensed" w:hAnsi="Bahnschrift Light SemiCondensed"/>
+          <w:b w:val="0"/>
+          <w:bCs w:val="0"/>
+          <w:i w:val="0"/>
+          <w:iCs w:val="0"/>
+          <w:color w:val="auto"/>
+          <w:sz w:val="24"/>
+          <w:szCs w:val="24"/>
+          <w:u w:val="none"/>
+          <w:lang w:val="pt-BR"/>
+        </w:rPr>
+      </w:pPr>
+      <w:r>
+        <w:rPr>
+          <w:rFonts w:hint="default" w:ascii="Bahnschrift Light SemiCondensed" w:hAnsi="Bahnschrift Light SemiCondensed"/>
+          <w:b/>
+          <w:bCs/>
+          <w:i w:val="0"/>
+          <w:iCs w:val="0"/>
+          <w:color w:val="auto"/>
+          <w:sz w:val="24"/>
+          <w:szCs w:val="24"/>
+          <w:u w:val="none"/>
+          <w:lang w:val="pt-BR"/>
+        </w:rPr>
+        <w:t xml:space="preserve">HAVING </w:t>
+      </w:r>
+      <w:r>
+        <w:rPr>
+          <w:rFonts w:hint="default" w:ascii="Bahnschrift Light SemiCondensed" w:hAnsi="Bahnschrift Light SemiCondensed"/>
+          <w:b w:val="0"/>
+          <w:bCs w:val="0"/>
+          <w:i w:val="0"/>
+          <w:iCs w:val="0"/>
+          <w:color w:val="auto"/>
+          <w:sz w:val="24"/>
+          <w:szCs w:val="24"/>
+          <w:u w:val="single"/>
+          <w:lang w:val="pt-BR"/>
+        </w:rPr>
+        <w:t>coluna_específica</w:t>
+      </w:r>
+      <w:r>
+        <w:rPr>
+          <w:rFonts w:hint="default" w:ascii="Bahnschrift Light SemiCondensed" w:hAnsi="Bahnschrift Light SemiCondensed"/>
+          <w:b w:val="0"/>
+          <w:bCs w:val="0"/>
+          <w:i w:val="0"/>
+          <w:iCs w:val="0"/>
+          <w:color w:val="auto"/>
+          <w:sz w:val="24"/>
+          <w:szCs w:val="24"/>
+          <w:u w:val="none"/>
+          <w:lang w:val="pt-BR"/>
+        </w:rPr>
+        <w:t xml:space="preserve"> </w:t>
+      </w:r>
+      <w:r>
+        <w:rPr>
+          <w:rFonts w:hint="default" w:ascii="Bahnschrift Light SemiCondensed" w:hAnsi="Bahnschrift Light SemiCondensed"/>
+          <w:b w:val="0"/>
+          <w:bCs w:val="0"/>
+          <w:i w:val="0"/>
+          <w:iCs w:val="0"/>
+          <w:color w:val="auto"/>
+          <w:sz w:val="24"/>
+          <w:szCs w:val="24"/>
+          <w:u w:val="single"/>
+          <w:lang w:val="pt-BR"/>
+        </w:rPr>
+        <w:t>condição</w:t>
+      </w:r>
+      <w:r>
+        <w:rPr>
+          <w:rFonts w:hint="default" w:ascii="Bahnschrift Light SemiCondensed" w:hAnsi="Bahnschrift Light SemiCondensed"/>
+          <w:b w:val="0"/>
+          <w:bCs w:val="0"/>
+          <w:i w:val="0"/>
+          <w:iCs w:val="0"/>
+          <w:color w:val="auto"/>
+          <w:sz w:val="24"/>
+          <w:szCs w:val="24"/>
+          <w:u w:val="none"/>
+          <w:lang w:val="pt-BR"/>
+        </w:rPr>
+        <w:t xml:space="preserve"> </w:t>
+      </w:r>
+      <w:r>
+        <w:rPr>
+          <w:rFonts w:hint="default" w:ascii="Bahnschrift Light SemiCondensed" w:hAnsi="Bahnschrift Light SemiCondensed"/>
+          <w:b w:val="0"/>
+          <w:bCs w:val="0"/>
+          <w:i w:val="0"/>
+          <w:iCs w:val="0"/>
+          <w:color w:val="auto"/>
+          <w:sz w:val="24"/>
+          <w:szCs w:val="24"/>
+          <w:u w:val="none"/>
+          <w:lang w:val="pt-BR"/>
+        </w:rPr>
+        <w:tab/>
+        <w:t/>
+      </w:r>
+      <w:r>
+        <w:rPr>
+          <w:rFonts w:hint="default" w:ascii="Bahnschrift Light SemiCondensed" w:hAnsi="Bahnschrift Light SemiCondensed"/>
+          <w:b w:val="0"/>
+          <w:bCs w:val="0"/>
+          <w:i w:val="0"/>
+          <w:iCs w:val="0"/>
+          <w:color w:val="auto"/>
+          <w:sz w:val="24"/>
+          <w:szCs w:val="24"/>
+          <w:u w:val="none"/>
+          <w:lang w:val="pt-BR"/>
+        </w:rPr>
+        <w:tab/>
+        <w:t/>
+      </w:r>
+      <w:r>
+        <w:rPr>
+          <w:rFonts w:hint="default" w:ascii="Bahnschrift Light SemiCondensed" w:hAnsi="Bahnschrift Light SemiCondensed"/>
+          <w:b w:val="0"/>
+          <w:bCs w:val="0"/>
+          <w:i w:val="0"/>
+          <w:iCs w:val="0"/>
+          <w:color w:val="auto"/>
+          <w:sz w:val="24"/>
+          <w:szCs w:val="24"/>
+          <w:u w:val="none"/>
+          <w:lang w:val="pt-BR"/>
+        </w:rPr>
+        <w:tab/>
+        <w:t>→</w:t>
+      </w:r>
+      <w:r>
+        <w:rPr>
+          <w:rFonts w:hint="default" w:ascii="Bahnschrift Light SemiCondensed" w:hAnsi="Bahnschrift Light SemiCondensed"/>
+          <w:b w:val="0"/>
+          <w:bCs w:val="0"/>
+          <w:i w:val="0"/>
+          <w:iCs w:val="0"/>
+          <w:color w:val="auto"/>
+          <w:sz w:val="24"/>
+          <w:szCs w:val="24"/>
+          <w:u w:val="none"/>
+          <w:lang w:val="pt-BR"/>
+        </w:rPr>
+        <w:tab/>
+      </w:r>
+      <w:r>
+        <w:rPr>
+          <w:rFonts w:hint="default" w:ascii="Bahnschrift Light SemiCondensed" w:hAnsi="Bahnschrift Light SemiCondensed"/>
+          <w:b w:val="0"/>
+          <w:bCs w:val="0"/>
+          <w:i w:val="0"/>
+          <w:iCs w:val="0"/>
+          <w:color w:val="auto"/>
+          <w:sz w:val="24"/>
+          <w:szCs w:val="24"/>
+          <w:u w:val="none"/>
+          <w:lang w:val="pt-BR"/>
+        </w:rPr>
+        <w:tab/>
+      </w:r>
+    </w:p>
+    <w:p>
+      <w:pPr>
+        <w:jc w:val="left"/>
+        <w:rPr>
+          <w:rFonts w:hint="default" w:ascii="Bahnschrift Light SemiCondensed" w:hAnsi="Bahnschrift Light SemiCondensed"/>
+          <w:b w:val="0"/>
+          <w:bCs w:val="0"/>
+          <w:i w:val="0"/>
+          <w:iCs w:val="0"/>
+          <w:color w:val="auto"/>
+          <w:sz w:val="24"/>
+          <w:szCs w:val="24"/>
+          <w:u w:val="none"/>
+          <w:lang w:val="pt-BR"/>
+        </w:rPr>
+      </w:pPr>
+    </w:p>
+    <w:p>
+      <w:pPr>
+        <w:jc w:val="left"/>
+        <w:rPr>
+          <w:rFonts w:hint="default" w:ascii="Bahnschrift Light SemiCondensed" w:hAnsi="Bahnschrift Light SemiCondensed"/>
+          <w:b w:val="0"/>
+          <w:bCs w:val="0"/>
+          <w:i w:val="0"/>
+          <w:iCs w:val="0"/>
+          <w:color w:val="auto"/>
+          <w:sz w:val="24"/>
+          <w:szCs w:val="24"/>
+          <w:u w:val="none"/>
+          <w:lang w:val="pt-BR"/>
+        </w:rPr>
+      </w:pPr>
+      <w:r>
+        <w:rPr>
+          <w:rFonts w:hint="default" w:ascii="Bahnschrift Light SemiCondensed" w:hAnsi="Bahnschrift Light SemiCondensed"/>
+          <w:b w:val="0"/>
+          <w:bCs w:val="0"/>
+          <w:i w:val="0"/>
+          <w:iCs w:val="0"/>
+          <w:color w:val="auto"/>
+          <w:sz w:val="24"/>
+          <w:szCs w:val="24"/>
+          <w:u w:val="none"/>
+          <w:lang w:val="pt-BR"/>
+        </w:rPr>
+        <w:tab/>
+      </w:r>
+      <w:r>
+        <w:rPr>
+          <w:rFonts w:hint="default" w:ascii="Bahnschrift Light SemiCondensed" w:hAnsi="Bahnschrift Light SemiCondensed"/>
+          <w:b w:val="0"/>
+          <w:bCs w:val="0"/>
+          <w:i w:val="0"/>
+          <w:iCs w:val="0"/>
+          <w:color w:val="auto"/>
+          <w:sz w:val="24"/>
+          <w:szCs w:val="24"/>
+          <w:u w:val="none"/>
+          <w:lang w:val="pt-BR"/>
+        </w:rPr>
+        <w:tab/>
+      </w:r>
+      <w:r>
+        <w:rPr>
+          <w:rFonts w:hint="default" w:ascii="Bahnschrift Light SemiCondensed" w:hAnsi="Bahnschrift Light SemiCondensed"/>
+          <w:b w:val="0"/>
+          <w:bCs w:val="0"/>
+          <w:i w:val="0"/>
+          <w:iCs w:val="0"/>
+          <w:color w:val="auto"/>
+          <w:sz w:val="24"/>
+          <w:szCs w:val="24"/>
+          <w:u w:val="none"/>
+          <w:lang w:val="pt-BR"/>
+        </w:rPr>
+        <w:tab/>
+      </w:r>
+      <w:r>
+        <w:rPr>
+          <w:rFonts w:hint="default" w:ascii="Bahnschrift Light SemiCondensed" w:hAnsi="Bahnschrift Light SemiCondensed"/>
+          <w:b w:val="0"/>
+          <w:bCs w:val="0"/>
+          <w:i w:val="0"/>
+          <w:iCs w:val="0"/>
+          <w:color w:val="auto"/>
+          <w:sz w:val="24"/>
+          <w:szCs w:val="24"/>
+          <w:u w:val="none"/>
+          <w:lang w:val="pt-BR"/>
+        </w:rPr>
+        <w:t>Comando utilizado para verificar o total de registros de uma coluna específica na tabela através de uma condição, ordenando pelo número identificador “id”.</w:t>
+      </w:r>
+    </w:p>
+    <w:p>
+      <w:pPr>
+        <w:jc w:val="left"/>
+        <w:rPr>
+          <w:rFonts w:hint="default" w:ascii="Bahnschrift Light SemiCondensed" w:hAnsi="Bahnschrift Light SemiCondensed"/>
+          <w:b w:val="0"/>
+          <w:bCs w:val="0"/>
+          <w:i w:val="0"/>
+          <w:iCs w:val="0"/>
+          <w:color w:val="auto"/>
+          <w:sz w:val="24"/>
+          <w:szCs w:val="24"/>
+          <w:u w:val="single"/>
+          <w:lang w:val="pt-BR"/>
+        </w:rPr>
+      </w:pPr>
+      <w:r>
+        <w:rPr>
+          <w:rFonts w:hint="default" w:ascii="Bahnschrift Light SemiCondensed" w:hAnsi="Bahnschrift Light SemiCondensed"/>
+          <w:b/>
+          <w:bCs/>
+          <w:i w:val="0"/>
+          <w:iCs w:val="0"/>
+          <w:color w:val="auto"/>
+          <w:sz w:val="24"/>
+          <w:szCs w:val="24"/>
+          <w:u w:val="none"/>
+          <w:lang w:val="pt-BR"/>
+        </w:rPr>
+        <w:t xml:space="preserve">SELECT </w:t>
+      </w:r>
+      <w:r>
+        <w:rPr>
+          <w:rFonts w:hint="default" w:ascii="Bahnschrift Light SemiCondensed" w:hAnsi="Bahnschrift Light SemiCondensed"/>
+          <w:b w:val="0"/>
+          <w:bCs w:val="0"/>
+          <w:i w:val="0"/>
+          <w:iCs w:val="0"/>
+          <w:color w:val="auto"/>
+          <w:sz w:val="24"/>
+          <w:szCs w:val="24"/>
+          <w:u w:val="single"/>
+          <w:lang w:val="pt-BR"/>
+        </w:rPr>
+        <w:t>coluna_específica</w:t>
+      </w:r>
+      <w:r>
+        <w:rPr>
+          <w:rFonts w:hint="default" w:ascii="Bahnschrift Light SemiCondensed" w:hAnsi="Bahnschrift Light SemiCondensed"/>
+          <w:b w:val="0"/>
+          <w:bCs w:val="0"/>
+          <w:i w:val="0"/>
+          <w:iCs w:val="0"/>
+          <w:color w:val="auto"/>
+          <w:sz w:val="24"/>
+          <w:szCs w:val="24"/>
+          <w:u w:val="none"/>
+          <w:lang w:val="pt-BR"/>
+        </w:rPr>
+        <w:t xml:space="preserve">, </w:t>
+      </w:r>
+      <w:r>
+        <w:rPr>
+          <w:rFonts w:hint="default" w:ascii="Bahnschrift Light SemiCondensed" w:hAnsi="Bahnschrift Light SemiCondensed"/>
+          <w:b/>
+          <w:bCs/>
+          <w:i w:val="0"/>
+          <w:iCs w:val="0"/>
+          <w:color w:val="auto"/>
+          <w:sz w:val="24"/>
+          <w:szCs w:val="24"/>
+          <w:u w:val="none"/>
+          <w:lang w:val="pt-BR"/>
+        </w:rPr>
+        <w:t>COUNT(*)</w:t>
+      </w:r>
+      <w:r>
+        <w:rPr>
+          <w:rFonts w:hint="default" w:ascii="Bahnschrift Light SemiCondensed" w:hAnsi="Bahnschrift Light SemiCondensed"/>
+          <w:b w:val="0"/>
+          <w:bCs w:val="0"/>
+          <w:i w:val="0"/>
+          <w:iCs w:val="0"/>
+          <w:color w:val="auto"/>
+          <w:sz w:val="24"/>
+          <w:szCs w:val="24"/>
+          <w:u w:val="none"/>
+          <w:lang w:val="pt-BR"/>
+        </w:rPr>
+        <w:t xml:space="preserve"> from </w:t>
+      </w:r>
+      <w:r>
+        <w:rPr>
+          <w:rFonts w:hint="default" w:ascii="Bahnschrift Light SemiCondensed" w:hAnsi="Bahnschrift Light SemiCondensed"/>
+          <w:b w:val="0"/>
+          <w:bCs w:val="0"/>
+          <w:i w:val="0"/>
+          <w:iCs w:val="0"/>
+          <w:color w:val="auto"/>
+          <w:sz w:val="24"/>
+          <w:szCs w:val="24"/>
+          <w:u w:val="single"/>
+          <w:lang w:val="pt-BR"/>
+        </w:rPr>
+        <w:t>nome_da_tabela</w:t>
+      </w:r>
+    </w:p>
+    <w:p>
+      <w:pPr>
+        <w:jc w:val="left"/>
+        <w:rPr>
+          <w:rFonts w:hint="default" w:ascii="Bahnschrift Light SemiCondensed" w:hAnsi="Bahnschrift Light SemiCondensed"/>
+          <w:b/>
+          <w:bCs/>
+          <w:i w:val="0"/>
+          <w:iCs w:val="0"/>
+          <w:color w:val="auto"/>
+          <w:sz w:val="24"/>
+          <w:szCs w:val="24"/>
+          <w:u w:val="single"/>
+          <w:lang w:val="pt-BR"/>
+        </w:rPr>
+      </w:pPr>
+      <w:r>
+        <w:rPr>
+          <w:rFonts w:hint="default" w:ascii="Bahnschrift Light SemiCondensed" w:hAnsi="Bahnschrift Light SemiCondensed"/>
+          <w:b/>
+          <w:bCs/>
+          <w:i w:val="0"/>
+          <w:iCs w:val="0"/>
+          <w:color w:val="auto"/>
+          <w:sz w:val="24"/>
+          <w:szCs w:val="24"/>
+          <w:u w:val="none"/>
+          <w:lang w:val="pt-BR"/>
+        </w:rPr>
+        <w:t xml:space="preserve">WHERE </w:t>
+      </w:r>
+      <w:r>
+        <w:rPr>
+          <w:rFonts w:hint="default" w:ascii="Bahnschrift Light SemiCondensed" w:hAnsi="Bahnschrift Light SemiCondensed"/>
+          <w:b w:val="0"/>
+          <w:bCs w:val="0"/>
+          <w:i w:val="0"/>
+          <w:iCs w:val="0"/>
+          <w:color w:val="auto"/>
+          <w:sz w:val="24"/>
+          <w:szCs w:val="24"/>
+          <w:u w:val="single"/>
+          <w:lang w:val="pt-BR"/>
+        </w:rPr>
+        <w:t>segunda_coluna_específica</w:t>
+      </w:r>
+      <w:r>
+        <w:rPr>
+          <w:rFonts w:hint="default" w:ascii="Bahnschrift Light SemiCondensed" w:hAnsi="Bahnschrift Light SemiCondensed"/>
+          <w:b w:val="0"/>
+          <w:bCs w:val="0"/>
+          <w:i w:val="0"/>
+          <w:iCs w:val="0"/>
+          <w:color w:val="auto"/>
+          <w:sz w:val="24"/>
+          <w:szCs w:val="24"/>
+          <w:u w:val="none"/>
+          <w:lang w:val="pt-BR"/>
+        </w:rPr>
+        <w:t xml:space="preserve"> </w:t>
+      </w:r>
+      <w:r>
+        <w:rPr>
+          <w:rFonts w:hint="default" w:ascii="Bahnschrift Light SemiCondensed" w:hAnsi="Bahnschrift Light SemiCondensed"/>
+          <w:b w:val="0"/>
+          <w:bCs w:val="0"/>
+          <w:i w:val="0"/>
+          <w:iCs w:val="0"/>
+          <w:color w:val="auto"/>
+          <w:sz w:val="24"/>
+          <w:szCs w:val="24"/>
+          <w:u w:val="single"/>
+          <w:lang w:val="pt-BR"/>
+        </w:rPr>
+        <w:t>condição</w:t>
+      </w:r>
+    </w:p>
+    <w:p>
+      <w:pPr>
+        <w:jc w:val="left"/>
+        <w:rPr>
+          <w:rFonts w:hint="default" w:ascii="Bahnschrift Light SemiCondensed" w:hAnsi="Bahnschrift Light SemiCondensed"/>
+          <w:b/>
+          <w:bCs/>
+          <w:i w:val="0"/>
+          <w:iCs w:val="0"/>
+          <w:color w:val="auto"/>
+          <w:sz w:val="24"/>
+          <w:szCs w:val="24"/>
+          <w:u w:val="none"/>
+          <w:lang w:val="pt-BR"/>
+        </w:rPr>
+      </w:pPr>
+      <w:r>
+        <w:rPr>
+          <w:rFonts w:hint="default" w:ascii="Bahnschrift Light SemiCondensed" w:hAnsi="Bahnschrift Light SemiCondensed"/>
+          <w:b/>
+          <w:bCs/>
+          <w:i w:val="0"/>
+          <w:iCs w:val="0"/>
+          <w:color w:val="auto"/>
+          <w:sz w:val="24"/>
+          <w:szCs w:val="24"/>
+          <w:u w:val="none"/>
+          <w:lang w:val="pt-BR"/>
+        </w:rPr>
+        <w:t xml:space="preserve">GROUP BY </w:t>
+      </w:r>
+      <w:r>
+        <w:rPr>
+          <w:rFonts w:hint="default" w:ascii="Bahnschrift Light SemiCondensed" w:hAnsi="Bahnschrift Light SemiCondensed"/>
+          <w:b w:val="0"/>
+          <w:bCs w:val="0"/>
+          <w:i w:val="0"/>
+          <w:iCs w:val="0"/>
+          <w:color w:val="auto"/>
+          <w:sz w:val="24"/>
+          <w:szCs w:val="24"/>
+          <w:u w:val="single"/>
+          <w:lang w:val="pt-BR"/>
+        </w:rPr>
+        <w:t>coluna_específica</w:t>
+      </w:r>
+      <w:r>
+        <w:rPr>
+          <w:rFonts w:hint="default" w:ascii="Bahnschrift Light SemiCondensed" w:hAnsi="Bahnschrift Light SemiCondensed"/>
+          <w:b/>
+          <w:bCs/>
+          <w:i w:val="0"/>
+          <w:iCs w:val="0"/>
+          <w:color w:val="auto"/>
+          <w:sz w:val="24"/>
+          <w:szCs w:val="24"/>
+          <w:u w:val="none"/>
+          <w:lang w:val="pt-BR"/>
+        </w:rPr>
+        <w:t>;</w:t>
+      </w:r>
+    </w:p>
+    <w:p>
+      <w:pPr>
+        <w:jc w:val="left"/>
+        <w:rPr>
+          <w:rFonts w:hint="default" w:ascii="Bahnschrift Light SemiCondensed" w:hAnsi="Bahnschrift Light SemiCondensed"/>
+          <w:b w:val="0"/>
+          <w:bCs w:val="0"/>
+          <w:i w:val="0"/>
+          <w:iCs w:val="0"/>
+          <w:color w:val="auto"/>
+          <w:sz w:val="24"/>
+          <w:szCs w:val="24"/>
+          <w:u w:val="none"/>
+          <w:lang w:val="pt-BR"/>
+        </w:rPr>
+      </w:pPr>
+      <w:r>
+        <w:rPr>
+          <w:rFonts w:hint="default" w:ascii="Bahnschrift Light SemiCondensed" w:hAnsi="Bahnschrift Light SemiCondensed"/>
+          <w:b/>
+          <w:bCs/>
+          <w:i w:val="0"/>
+          <w:iCs w:val="0"/>
+          <w:color w:val="auto"/>
+          <w:sz w:val="24"/>
+          <w:szCs w:val="24"/>
+          <w:u w:val="none"/>
+          <w:lang w:val="pt-BR"/>
+        </w:rPr>
+        <w:t xml:space="preserve">HAVING </w:t>
+      </w:r>
+      <w:r>
+        <w:rPr>
+          <w:rFonts w:hint="default" w:ascii="Bahnschrift Light SemiCondensed" w:hAnsi="Bahnschrift Light SemiCondensed"/>
+          <w:b w:val="0"/>
+          <w:bCs w:val="0"/>
+          <w:i w:val="0"/>
+          <w:iCs w:val="0"/>
+          <w:color w:val="auto"/>
+          <w:sz w:val="24"/>
+          <w:szCs w:val="24"/>
+          <w:u w:val="single"/>
+          <w:lang w:val="pt-BR"/>
+        </w:rPr>
+        <w:t>coluna_específica</w:t>
+      </w:r>
+      <w:r>
+        <w:rPr>
+          <w:rFonts w:hint="default" w:ascii="Bahnschrift Light SemiCondensed" w:hAnsi="Bahnschrift Light SemiCondensed"/>
+          <w:b w:val="0"/>
+          <w:bCs w:val="0"/>
+          <w:i w:val="0"/>
+          <w:iCs w:val="0"/>
+          <w:color w:val="auto"/>
+          <w:sz w:val="24"/>
+          <w:szCs w:val="24"/>
+          <w:u w:val="none"/>
+          <w:lang w:val="pt-BR"/>
+        </w:rPr>
+        <w:t xml:space="preserve"> </w:t>
+      </w:r>
+      <w:r>
+        <w:rPr>
+          <w:rFonts w:hint="default" w:ascii="Bahnschrift Light SemiCondensed" w:hAnsi="Bahnschrift Light SemiCondensed"/>
+          <w:b w:val="0"/>
+          <w:bCs w:val="0"/>
+          <w:i w:val="0"/>
+          <w:iCs w:val="0"/>
+          <w:color w:val="auto"/>
+          <w:sz w:val="24"/>
+          <w:szCs w:val="24"/>
+          <w:u w:val="single"/>
+          <w:lang w:val="pt-BR"/>
+        </w:rPr>
+        <w:t>condição</w:t>
+      </w:r>
+      <w:r>
+        <w:rPr>
+          <w:rFonts w:hint="default" w:ascii="Bahnschrift Light SemiCondensed" w:hAnsi="Bahnschrift Light SemiCondensed"/>
+          <w:b w:val="0"/>
+          <w:bCs w:val="0"/>
+          <w:i w:val="0"/>
+          <w:iCs w:val="0"/>
+          <w:color w:val="auto"/>
+          <w:sz w:val="24"/>
+          <w:szCs w:val="24"/>
+          <w:u w:val="none"/>
+          <w:lang w:val="pt-BR"/>
+        </w:rPr>
+        <w:t xml:space="preserve"> </w:t>
+      </w:r>
+      <w:r>
+        <w:rPr>
+          <w:rFonts w:hint="default" w:ascii="Bahnschrift Light SemiCondensed" w:hAnsi="Bahnschrift Light SemiCondensed"/>
+          <w:b/>
+          <w:bCs/>
+          <w:i w:val="0"/>
+          <w:iCs w:val="0"/>
+          <w:color w:val="auto"/>
+          <w:sz w:val="24"/>
+          <w:szCs w:val="24"/>
+          <w:u w:val="none"/>
+          <w:lang w:val="pt-BR"/>
+        </w:rPr>
+        <w:t>( SELECT AVG(</w:t>
+      </w:r>
+      <w:r>
+        <w:rPr>
+          <w:rFonts w:hint="default" w:ascii="Bahnschrift Light SemiCondensed" w:hAnsi="Bahnschrift Light SemiCondensed"/>
+          <w:b w:val="0"/>
+          <w:bCs w:val="0"/>
+          <w:i w:val="0"/>
+          <w:iCs w:val="0"/>
+          <w:color w:val="auto"/>
+          <w:sz w:val="24"/>
+          <w:szCs w:val="24"/>
+          <w:u w:val="single"/>
+          <w:lang w:val="pt-BR"/>
+        </w:rPr>
+        <w:t>coluna_específica</w:t>
+      </w:r>
+      <w:r>
+        <w:rPr>
+          <w:rFonts w:hint="default" w:ascii="Bahnschrift Light SemiCondensed" w:hAnsi="Bahnschrift Light SemiCondensed"/>
+          <w:b/>
+          <w:bCs/>
+          <w:i w:val="0"/>
+          <w:iCs w:val="0"/>
+          <w:color w:val="auto"/>
+          <w:sz w:val="24"/>
+          <w:szCs w:val="24"/>
+          <w:u w:val="none"/>
+          <w:lang w:val="pt-BR"/>
+        </w:rPr>
+        <w:t xml:space="preserve">) FROM </w:t>
+      </w:r>
+      <w:r>
+        <w:rPr>
+          <w:rFonts w:hint="default" w:ascii="Bahnschrift Light SemiCondensed" w:hAnsi="Bahnschrift Light SemiCondensed"/>
+          <w:b w:val="0"/>
+          <w:bCs w:val="0"/>
+          <w:i w:val="0"/>
+          <w:iCs w:val="0"/>
+          <w:color w:val="auto"/>
+          <w:sz w:val="24"/>
+          <w:szCs w:val="24"/>
+          <w:u w:val="single"/>
+          <w:lang w:val="pt-BR"/>
+        </w:rPr>
+        <w:t>nome_da_tabela</w:t>
+      </w:r>
+      <w:r>
+        <w:rPr>
+          <w:rFonts w:hint="default" w:ascii="Bahnschrift Light SemiCondensed" w:hAnsi="Bahnschrift Light SemiCondensed"/>
+          <w:b/>
+          <w:bCs/>
+          <w:i w:val="0"/>
+          <w:iCs w:val="0"/>
+          <w:color w:val="auto"/>
+          <w:sz w:val="24"/>
+          <w:szCs w:val="24"/>
+          <w:u w:val="none"/>
+          <w:lang w:val="pt-BR"/>
+        </w:rPr>
+        <w:t>);</w:t>
+      </w:r>
+      <w:r>
+        <w:rPr>
+          <w:rFonts w:hint="default" w:ascii="Bahnschrift Light SemiCondensed" w:hAnsi="Bahnschrift Light SemiCondensed"/>
+          <w:b w:val="0"/>
+          <w:bCs w:val="0"/>
+          <w:i w:val="0"/>
+          <w:iCs w:val="0"/>
+          <w:color w:val="auto"/>
+          <w:sz w:val="24"/>
+          <w:szCs w:val="24"/>
+          <w:u w:val="none"/>
+          <w:lang w:val="pt-BR"/>
+        </w:rPr>
+        <w:t xml:space="preserve"> </w:t>
+      </w:r>
+      <w:r>
+        <w:rPr>
+          <w:rFonts w:hint="default" w:ascii="Bahnschrift Light SemiCondensed" w:hAnsi="Bahnschrift Light SemiCondensed"/>
+          <w:b w:val="0"/>
+          <w:bCs w:val="0"/>
+          <w:i w:val="0"/>
+          <w:iCs w:val="0"/>
+          <w:color w:val="auto"/>
+          <w:sz w:val="24"/>
+          <w:szCs w:val="24"/>
+          <w:u w:val="none"/>
+          <w:lang w:val="pt-BR"/>
+        </w:rPr>
+        <w:tab/>
+      </w:r>
+      <w:r>
+        <w:rPr>
+          <w:rFonts w:hint="default" w:ascii="Bahnschrift Light SemiCondensed" w:hAnsi="Bahnschrift Light SemiCondensed"/>
+          <w:b w:val="0"/>
+          <w:bCs w:val="0"/>
+          <w:i w:val="0"/>
+          <w:iCs w:val="0"/>
+          <w:color w:val="auto"/>
+          <w:sz w:val="24"/>
+          <w:szCs w:val="24"/>
+          <w:u w:val="none"/>
+          <w:lang w:val="pt-BR"/>
+        </w:rPr>
+        <w:tab/>
+      </w:r>
+      <w:r>
+        <w:rPr>
+          <w:rFonts w:hint="default" w:ascii="Bahnschrift Light SemiCondensed" w:hAnsi="Bahnschrift Light SemiCondensed"/>
+          <w:b w:val="0"/>
+          <w:bCs w:val="0"/>
+          <w:i w:val="0"/>
+          <w:iCs w:val="0"/>
+          <w:color w:val="auto"/>
+          <w:sz w:val="24"/>
+          <w:szCs w:val="24"/>
+          <w:u w:val="none"/>
+          <w:lang w:val="pt-BR"/>
+        </w:rPr>
+        <w:tab/>
+      </w:r>
+      <w:r>
+        <w:rPr>
+          <w:rFonts w:hint="default" w:ascii="Bahnschrift Light SemiCondensed" w:hAnsi="Bahnschrift Light SemiCondensed"/>
+          <w:b w:val="0"/>
+          <w:bCs w:val="0"/>
+          <w:i w:val="0"/>
+          <w:iCs w:val="0"/>
+          <w:color w:val="auto"/>
+          <w:sz w:val="24"/>
+          <w:szCs w:val="24"/>
+          <w:u w:val="none"/>
+          <w:lang w:val="pt-BR"/>
+        </w:rPr>
+        <w:tab/>
+      </w:r>
+      <w:r>
+        <w:rPr>
+          <w:rFonts w:hint="default" w:ascii="Bahnschrift Light SemiCondensed" w:hAnsi="Bahnschrift Light SemiCondensed"/>
+          <w:b w:val="0"/>
+          <w:bCs w:val="0"/>
+          <w:i w:val="0"/>
+          <w:iCs w:val="0"/>
+          <w:color w:val="auto"/>
+          <w:sz w:val="24"/>
+          <w:szCs w:val="24"/>
+          <w:u w:val="none"/>
+          <w:lang w:val="pt-BR"/>
+        </w:rPr>
+        <w:t>→</w:t>
+      </w:r>
+    </w:p>
+    <w:p>
+      <w:pPr>
+        <w:jc w:val="left"/>
+        <w:rPr>
+          <w:rFonts w:hint="default" w:ascii="Bahnschrift Light SemiCondensed" w:hAnsi="Bahnschrift Light SemiCondensed"/>
+          <w:b w:val="0"/>
+          <w:bCs w:val="0"/>
+          <w:i w:val="0"/>
+          <w:iCs w:val="0"/>
+          <w:color w:val="auto"/>
+          <w:sz w:val="24"/>
+          <w:szCs w:val="24"/>
+          <w:u w:val="none"/>
+          <w:lang w:val="pt-BR"/>
+        </w:rPr>
+      </w:pPr>
+    </w:p>
+    <w:p>
+      <w:pPr>
+        <w:jc w:val="left"/>
+        <w:rPr>
+          <w:rFonts w:hint="default" w:ascii="Bahnschrift Light SemiCondensed" w:hAnsi="Bahnschrift Light SemiCondensed"/>
+          <w:b w:val="0"/>
+          <w:bCs w:val="0"/>
+          <w:i w:val="0"/>
+          <w:iCs w:val="0"/>
+          <w:color w:val="auto"/>
+          <w:sz w:val="24"/>
+          <w:szCs w:val="24"/>
+          <w:u w:val="none"/>
+          <w:lang w:val="pt-BR"/>
+        </w:rPr>
+      </w:pPr>
+      <w:r>
+        <w:rPr>
+          <w:rFonts w:hint="default" w:ascii="Bahnschrift Light SemiCondensed" w:hAnsi="Bahnschrift Light SemiCondensed"/>
+          <w:b w:val="0"/>
+          <w:bCs w:val="0"/>
+          <w:i w:val="0"/>
+          <w:iCs w:val="0"/>
+          <w:color w:val="auto"/>
+          <w:sz w:val="24"/>
+          <w:szCs w:val="24"/>
+          <w:u w:val="none"/>
+          <w:lang w:val="pt-BR"/>
+        </w:rPr>
+        <w:tab/>
+        <w:t/>
+      </w:r>
+      <w:r>
+        <w:rPr>
+          <w:rFonts w:hint="default" w:ascii="Bahnschrift Light SemiCondensed" w:hAnsi="Bahnschrift Light SemiCondensed"/>
+          <w:b w:val="0"/>
+          <w:bCs w:val="0"/>
+          <w:i w:val="0"/>
+          <w:iCs w:val="0"/>
+          <w:color w:val="auto"/>
+          <w:sz w:val="24"/>
+          <w:szCs w:val="24"/>
+          <w:u w:val="none"/>
+          <w:lang w:val="pt-BR"/>
+        </w:rPr>
+        <w:tab/>
+        <w:t>Comando utilizado para verificar em uma tabela o total de registros de uma coluna específica, a partir do sinal de condição de outra coluna específica, agrupando os registros com todos os dados da primeira coluna mencionada, filtrando os registros quando os dados estiverem acima da média de dados da coluna mencionada.</w:t>
+      </w:r>
+    </w:p>
+    <w:p>
+      <w:pPr>
+        <w:jc w:val="left"/>
+        <w:rPr>
+          <w:rFonts w:hint="default" w:ascii="Bahnschrift Light SemiCondensed" w:hAnsi="Bahnschrift Light SemiCondensed"/>
+          <w:b w:val="0"/>
+          <w:bCs w:val="0"/>
+          <w:i w:val="0"/>
+          <w:iCs w:val="0"/>
+          <w:color w:val="auto"/>
+          <w:sz w:val="24"/>
+          <w:szCs w:val="24"/>
+          <w:u w:val="none"/>
+          <w:lang w:val="pt-BR"/>
+        </w:rPr>
+      </w:pPr>
+    </w:p>
+    <w:p>
+      <w:pPr>
+        <w:jc w:val="left"/>
+        <w:rPr>
+          <w:rFonts w:hint="default" w:ascii="Bahnschrift Light SemiCondensed" w:hAnsi="Bahnschrift Light SemiCondensed"/>
+          <w:b w:val="0"/>
+          <w:bCs w:val="0"/>
           <w:i w:val="0"/>
           <w:iCs w:val="0"/>
           <w:color w:val="auto"/>

</xml_diff>

<commit_message>
Geek University - Aula 54
</commit_message>
<xml_diff>
--- a/Curso de Banco de Dados Curso em Vídeo/Comandos MySQL.docx
+++ b/Curso de Banco de Dados Curso em Vídeo/Comandos MySQL.docx
@@ -20968,7 +20968,7 @@
     </w:p>
     <w:p>
       <w:pPr>
-        <w:jc w:val="left"/>
+        <w:bidi w:val="0"/>
         <w:rPr>
           <w:rFonts w:hint="default" w:ascii="Bahnschrift Light SemiCondensed" w:hAnsi="Bahnschrift Light SemiCondensed"/>
           <w:b w:val="0"/>
@@ -22023,6 +22023,2943 @@
           <w:sz w:val="24"/>
           <w:szCs w:val="24"/>
           <w:u w:val="none"/>
+          <w:lang w:val="pt-BR"/>
+        </w:rPr>
+      </w:pPr>
+      <w:r>
+        <w:rPr>
+          <w:rFonts w:hint="default" w:ascii="Bahnschrift Light SemiCondensed" w:hAnsi="Bahnschrift Light SemiCondensed"/>
+          <w:b/>
+          <w:bCs/>
+          <w:i w:val="0"/>
+          <w:iCs w:val="0"/>
+          <w:color w:val="auto"/>
+          <w:sz w:val="24"/>
+          <w:szCs w:val="24"/>
+          <w:u w:val="none"/>
+          <w:lang w:val="pt-BR"/>
+        </w:rPr>
+        <w:t xml:space="preserve">GRANT ALL PRIVILEGES </w:t>
+      </w:r>
+      <w:r>
+        <w:rPr>
+          <w:rFonts w:hint="default" w:ascii="Bahnschrift Light SemiCondensed" w:hAnsi="Bahnschrift Light SemiCondensed"/>
+          <w:b/>
+          <w:bCs/>
+          <w:i w:val="0"/>
+          <w:iCs w:val="0"/>
+          <w:color w:val="auto"/>
+          <w:sz w:val="24"/>
+          <w:szCs w:val="24"/>
+          <w:u w:val="none"/>
+          <w:lang w:val="pt-BR"/>
+        </w:rPr>
+        <w:tab/>
+        <w:t/>
+      </w:r>
+      <w:r>
+        <w:rPr>
+          <w:rFonts w:hint="default" w:ascii="Bahnschrift Light SemiCondensed" w:hAnsi="Bahnschrift Light SemiCondensed"/>
+          <w:b/>
+          <w:bCs/>
+          <w:i w:val="0"/>
+          <w:iCs w:val="0"/>
+          <w:color w:val="auto"/>
+          <w:sz w:val="24"/>
+          <w:szCs w:val="24"/>
+          <w:u w:val="none"/>
+          <w:lang w:val="pt-BR"/>
+        </w:rPr>
+        <w:tab/>
+      </w:r>
+      <w:r>
+        <w:rPr>
+          <w:rFonts w:hint="default" w:ascii="Bahnschrift Light SemiCondensed" w:hAnsi="Bahnschrift Light SemiCondensed"/>
+          <w:b w:val="0"/>
+          <w:bCs w:val="0"/>
+          <w:i w:val="0"/>
+          <w:iCs w:val="0"/>
+          <w:color w:val="auto"/>
+          <w:sz w:val="24"/>
+          <w:szCs w:val="24"/>
+          <w:u w:val="none"/>
+          <w:lang w:val="pt-BR"/>
+        </w:rPr>
+        <w:t>→</w:t>
+      </w:r>
+      <w:r>
+        <w:rPr>
+          <w:rFonts w:hint="default" w:ascii="Bahnschrift Light SemiCondensed" w:hAnsi="Bahnschrift Light SemiCondensed"/>
+          <w:b w:val="0"/>
+          <w:bCs w:val="0"/>
+          <w:i w:val="0"/>
+          <w:iCs w:val="0"/>
+          <w:color w:val="auto"/>
+          <w:sz w:val="24"/>
+          <w:szCs w:val="24"/>
+          <w:u w:val="none"/>
+          <w:lang w:val="pt-BR"/>
+        </w:rPr>
+        <w:tab/>
+        <w:t/>
+      </w:r>
+      <w:r>
+        <w:rPr>
+          <w:rFonts w:hint="default" w:ascii="Bahnschrift Light SemiCondensed" w:hAnsi="Bahnschrift Light SemiCondensed"/>
+          <w:b w:val="0"/>
+          <w:bCs w:val="0"/>
+          <w:i w:val="0"/>
+          <w:iCs w:val="0"/>
+          <w:color w:val="auto"/>
+          <w:sz w:val="24"/>
+          <w:szCs w:val="24"/>
+          <w:u w:val="none"/>
+          <w:lang w:val="pt-BR"/>
+        </w:rPr>
+        <w:tab/>
+        <w:t xml:space="preserve">Comando utilizado para gerar </w:t>
+      </w:r>
+    </w:p>
+    <w:p>
+      <w:pPr>
+        <w:jc w:val="left"/>
+        <w:rPr>
+          <w:rFonts w:hint="default" w:ascii="Bahnschrift Light SemiCondensed" w:hAnsi="Bahnschrift Light SemiCondensed"/>
+          <w:b w:val="0"/>
+          <w:bCs w:val="0"/>
+          <w:i w:val="0"/>
+          <w:iCs w:val="0"/>
+          <w:color w:val="auto"/>
+          <w:sz w:val="24"/>
+          <w:szCs w:val="24"/>
+          <w:u w:val="none"/>
+          <w:lang w:val="pt-BR"/>
+        </w:rPr>
+      </w:pPr>
+    </w:p>
+    <w:p>
+      <w:pPr>
+        <w:jc w:val="left"/>
+        <w:rPr>
+          <w:rFonts w:hint="default" w:ascii="Bahnschrift Light SemiCondensed" w:hAnsi="Bahnschrift Light SemiCondensed"/>
+          <w:b w:val="0"/>
+          <w:bCs w:val="0"/>
+          <w:i w:val="0"/>
+          <w:iCs w:val="0"/>
+          <w:color w:val="auto"/>
+          <w:sz w:val="24"/>
+          <w:szCs w:val="24"/>
+          <w:u w:val="none"/>
+          <w:lang w:val="pt-BR"/>
+        </w:rPr>
+      </w:pPr>
+      <w:r>
+        <w:rPr>
+          <w:rFonts w:hint="default" w:ascii="Bahnschrift Light SemiCondensed" w:hAnsi="Bahnschrift Light SemiCondensed"/>
+          <w:b w:val="0"/>
+          <w:bCs w:val="0"/>
+          <w:i w:val="0"/>
+          <w:iCs w:val="0"/>
+          <w:color w:val="auto"/>
+          <w:sz w:val="24"/>
+          <w:szCs w:val="24"/>
+          <w:u w:val="none"/>
+          <w:lang w:val="pt-BR"/>
+        </w:rPr>
+        <w:t>permissão total  de um usuário.</w:t>
+      </w:r>
+    </w:p>
+    <w:p>
+      <w:pPr>
+        <w:jc w:val="left"/>
+        <w:rPr>
+          <w:rFonts w:hint="default" w:ascii="Bahnschrift Light SemiCondensed" w:hAnsi="Bahnschrift Light SemiCondensed"/>
+          <w:b w:val="0"/>
+          <w:bCs w:val="0"/>
+          <w:i w:val="0"/>
+          <w:iCs w:val="0"/>
+          <w:color w:val="auto"/>
+          <w:sz w:val="24"/>
+          <w:szCs w:val="24"/>
+          <w:u w:val="none"/>
+          <w:lang w:val="pt-BR"/>
+        </w:rPr>
+      </w:pPr>
+    </w:p>
+    <w:p>
+      <w:pPr>
+        <w:jc w:val="left"/>
+        <w:rPr>
+          <w:rFonts w:hint="default" w:ascii="Bahnschrift Light SemiCondensed" w:hAnsi="Bahnschrift Light SemiCondensed"/>
+          <w:b w:val="0"/>
+          <w:bCs w:val="0"/>
+          <w:i w:val="0"/>
+          <w:iCs w:val="0"/>
+          <w:color w:val="auto"/>
+          <w:sz w:val="24"/>
+          <w:szCs w:val="24"/>
+          <w:u w:val="none"/>
+          <w:lang w:val="pt-BR"/>
+        </w:rPr>
+      </w:pPr>
+      <w:r>
+        <w:rPr>
+          <w:rFonts w:hint="default" w:ascii="Bahnschrift Light SemiCondensed" w:hAnsi="Bahnschrift Light SemiCondensed"/>
+          <w:b/>
+          <w:bCs/>
+          <w:i w:val="0"/>
+          <w:iCs w:val="0"/>
+          <w:color w:val="auto"/>
+          <w:sz w:val="24"/>
+          <w:szCs w:val="24"/>
+          <w:u w:val="none"/>
+          <w:lang w:val="pt-BR"/>
+        </w:rPr>
+        <w:t xml:space="preserve">GRANT </w:t>
+      </w:r>
+      <w:r>
+        <w:rPr>
+          <w:rFonts w:hint="default" w:ascii="Bahnschrift Light SemiCondensed" w:hAnsi="Bahnschrift Light SemiCondensed"/>
+          <w:b w:val="0"/>
+          <w:bCs w:val="0"/>
+          <w:i w:val="0"/>
+          <w:iCs w:val="0"/>
+          <w:color w:val="auto"/>
+          <w:sz w:val="24"/>
+          <w:szCs w:val="24"/>
+          <w:u w:val="single"/>
+          <w:lang w:val="pt-BR"/>
+        </w:rPr>
+        <w:t>tipo_de_permissão</w:t>
+      </w:r>
+      <w:r>
+        <w:rPr>
+          <w:rFonts w:hint="default" w:ascii="Bahnschrift Light SemiCondensed" w:hAnsi="Bahnschrift Light SemiCondensed"/>
+          <w:b/>
+          <w:bCs/>
+          <w:i w:val="0"/>
+          <w:iCs w:val="0"/>
+          <w:color w:val="auto"/>
+          <w:sz w:val="24"/>
+          <w:szCs w:val="24"/>
+          <w:u w:val="none"/>
+          <w:lang w:val="pt-BR"/>
+        </w:rPr>
+        <w:t xml:space="preserve">, </w:t>
+      </w:r>
+      <w:r>
+        <w:rPr>
+          <w:rFonts w:hint="default" w:ascii="Bahnschrift Light SemiCondensed" w:hAnsi="Bahnschrift Light SemiCondensed"/>
+          <w:b w:val="0"/>
+          <w:bCs w:val="0"/>
+          <w:i w:val="0"/>
+          <w:iCs w:val="0"/>
+          <w:color w:val="auto"/>
+          <w:sz w:val="24"/>
+          <w:szCs w:val="24"/>
+          <w:u w:val="single"/>
+          <w:lang w:val="pt-BR"/>
+        </w:rPr>
+        <w:t>tipo_de_permissão</w:t>
+      </w:r>
+      <w:r>
+        <w:rPr>
+          <w:rFonts w:hint="default" w:ascii="Bahnschrift Light SemiCondensed" w:hAnsi="Bahnschrift Light SemiCondensed"/>
+          <w:b w:val="0"/>
+          <w:bCs w:val="0"/>
+          <w:i w:val="0"/>
+          <w:iCs w:val="0"/>
+          <w:color w:val="auto"/>
+          <w:sz w:val="24"/>
+          <w:szCs w:val="24"/>
+          <w:u w:val="none"/>
+          <w:lang w:val="pt-BR"/>
+        </w:rPr>
+        <w:t xml:space="preserve"> </w:t>
+      </w:r>
+      <w:r>
+        <w:rPr>
+          <w:rFonts w:hint="default" w:ascii="Bahnschrift Light SemiCondensed" w:hAnsi="Bahnschrift Light SemiCondensed"/>
+          <w:b/>
+          <w:bCs/>
+          <w:i w:val="0"/>
+          <w:iCs w:val="0"/>
+          <w:color w:val="auto"/>
+          <w:sz w:val="24"/>
+          <w:szCs w:val="24"/>
+          <w:u w:val="none"/>
+          <w:lang w:val="pt-BR"/>
+        </w:rPr>
+        <w:t xml:space="preserve">ON </w:t>
+      </w:r>
+      <w:r>
+        <w:rPr>
+          <w:rFonts w:hint="default" w:ascii="Bahnschrift Light SemiCondensed" w:hAnsi="Bahnschrift Light SemiCondensed"/>
+          <w:b w:val="0"/>
+          <w:bCs w:val="0"/>
+          <w:i w:val="0"/>
+          <w:iCs w:val="0"/>
+          <w:color w:val="auto"/>
+          <w:sz w:val="24"/>
+          <w:szCs w:val="24"/>
+          <w:u w:val="single"/>
+          <w:lang w:val="pt-BR"/>
+        </w:rPr>
+        <w:t>nome_do_banco de_dados</w:t>
+      </w:r>
+      <w:r>
+        <w:rPr>
+          <w:rFonts w:hint="default" w:ascii="Bahnschrift Light SemiCondensed" w:hAnsi="Bahnschrift Light SemiCondensed"/>
+          <w:b/>
+          <w:bCs/>
+          <w:i w:val="0"/>
+          <w:iCs w:val="0"/>
+          <w:color w:val="auto"/>
+          <w:sz w:val="24"/>
+          <w:szCs w:val="24"/>
+          <w:u w:val="none"/>
+          <w:lang w:val="pt-BR"/>
+        </w:rPr>
+        <w:t>.* TO ‘</w:t>
+      </w:r>
+      <w:r>
+        <w:rPr>
+          <w:rFonts w:hint="default" w:ascii="Bahnschrift Light SemiCondensed" w:hAnsi="Bahnschrift Light SemiCondensed"/>
+          <w:b w:val="0"/>
+          <w:bCs w:val="0"/>
+          <w:i w:val="0"/>
+          <w:iCs w:val="0"/>
+          <w:color w:val="auto"/>
+          <w:sz w:val="24"/>
+          <w:szCs w:val="24"/>
+          <w:u w:val="single"/>
+          <w:lang w:val="pt-BR"/>
+        </w:rPr>
+        <w:t>nome_do_usuário</w:t>
+      </w:r>
+      <w:r>
+        <w:rPr>
+          <w:rFonts w:hint="default" w:ascii="Bahnschrift Light SemiCondensed" w:hAnsi="Bahnschrift Light SemiCondensed"/>
+          <w:b/>
+          <w:bCs/>
+          <w:i w:val="0"/>
+          <w:iCs w:val="0"/>
+          <w:color w:val="auto"/>
+          <w:sz w:val="24"/>
+          <w:szCs w:val="24"/>
+          <w:u w:val="none"/>
+          <w:lang w:val="pt-BR"/>
+        </w:rPr>
+        <w:t>’@’</w:t>
+      </w:r>
+      <w:r>
+        <w:rPr>
+          <w:rFonts w:hint="default" w:ascii="Bahnschrift Light SemiCondensed" w:hAnsi="Bahnschrift Light SemiCondensed"/>
+          <w:b w:val="0"/>
+          <w:bCs w:val="0"/>
+          <w:i w:val="0"/>
+          <w:iCs w:val="0"/>
+          <w:color w:val="auto"/>
+          <w:sz w:val="24"/>
+          <w:szCs w:val="24"/>
+          <w:u w:val="single"/>
+          <w:lang w:val="pt-BR"/>
+        </w:rPr>
+        <w:t>ip_do_usuário</w:t>
+      </w:r>
+      <w:r>
+        <w:rPr>
+          <w:rFonts w:hint="default" w:ascii="Bahnschrift Light SemiCondensed" w:hAnsi="Bahnschrift Light SemiCondensed"/>
+          <w:b/>
+          <w:bCs/>
+          <w:i w:val="0"/>
+          <w:iCs w:val="0"/>
+          <w:color w:val="auto"/>
+          <w:sz w:val="24"/>
+          <w:szCs w:val="24"/>
+          <w:u w:val="none"/>
+          <w:lang w:val="pt-BR"/>
+        </w:rPr>
+        <w:t>’;</w:t>
+      </w:r>
+      <w:r>
+        <w:rPr>
+          <w:rFonts w:hint="default" w:ascii="Bahnschrift Light SemiCondensed" w:hAnsi="Bahnschrift Light SemiCondensed"/>
+          <w:b w:val="0"/>
+          <w:bCs w:val="0"/>
+          <w:i w:val="0"/>
+          <w:iCs w:val="0"/>
+          <w:color w:val="auto"/>
+          <w:sz w:val="24"/>
+          <w:szCs w:val="24"/>
+          <w:u w:val="none"/>
+          <w:lang w:val="pt-BR"/>
+        </w:rPr>
+        <w:tab/>
+        <w:t/>
+      </w:r>
+      <w:r>
+        <w:rPr>
+          <w:rFonts w:hint="default" w:ascii="Bahnschrift Light SemiCondensed" w:hAnsi="Bahnschrift Light SemiCondensed"/>
+          <w:b w:val="0"/>
+          <w:bCs w:val="0"/>
+          <w:i w:val="0"/>
+          <w:iCs w:val="0"/>
+          <w:color w:val="auto"/>
+          <w:sz w:val="24"/>
+          <w:szCs w:val="24"/>
+          <w:u w:val="none"/>
+          <w:lang w:val="pt-BR"/>
+        </w:rPr>
+        <w:tab/>
+        <w:t>→</w:t>
+      </w:r>
+    </w:p>
+    <w:p>
+      <w:pPr>
+        <w:jc w:val="left"/>
+        <w:rPr>
+          <w:rFonts w:hint="default" w:ascii="Bahnschrift Light SemiCondensed" w:hAnsi="Bahnschrift Light SemiCondensed"/>
+          <w:b w:val="0"/>
+          <w:bCs w:val="0"/>
+          <w:i w:val="0"/>
+          <w:iCs w:val="0"/>
+          <w:color w:val="auto"/>
+          <w:sz w:val="24"/>
+          <w:szCs w:val="24"/>
+          <w:u w:val="none"/>
+          <w:lang w:val="pt-BR"/>
+        </w:rPr>
+      </w:pPr>
+    </w:p>
+    <w:p>
+      <w:pPr>
+        <w:jc w:val="left"/>
+        <w:rPr>
+          <w:rFonts w:hint="default" w:ascii="Bahnschrift Light SemiCondensed" w:hAnsi="Bahnschrift Light SemiCondensed"/>
+          <w:b w:val="0"/>
+          <w:bCs w:val="0"/>
+          <w:i w:val="0"/>
+          <w:iCs w:val="0"/>
+          <w:color w:val="auto"/>
+          <w:sz w:val="24"/>
+          <w:szCs w:val="24"/>
+          <w:u w:val="none"/>
+          <w:lang w:val="pt-BR"/>
+        </w:rPr>
+      </w:pPr>
+      <w:r>
+        <w:rPr>
+          <w:rFonts w:hint="default" w:ascii="Bahnschrift Light SemiCondensed" w:hAnsi="Bahnschrift Light SemiCondensed"/>
+          <w:b w:val="0"/>
+          <w:bCs w:val="0"/>
+          <w:i w:val="0"/>
+          <w:iCs w:val="0"/>
+          <w:color w:val="auto"/>
+          <w:sz w:val="24"/>
+          <w:szCs w:val="24"/>
+          <w:u w:val="none"/>
+          <w:lang w:val="pt-BR"/>
+        </w:rPr>
+        <w:tab/>
+        <w:t>Comando utilizado para dar permissões específicas a um usuário.</w:t>
+      </w:r>
+    </w:p>
+    <w:p>
+      <w:pPr>
+        <w:jc w:val="left"/>
+        <w:rPr>
+          <w:rFonts w:hint="default" w:ascii="Bahnschrift Light SemiCondensed" w:hAnsi="Bahnschrift Light SemiCondensed"/>
+          <w:b w:val="0"/>
+          <w:bCs w:val="0"/>
+          <w:i w:val="0"/>
+          <w:iCs w:val="0"/>
+          <w:color w:val="auto"/>
+          <w:sz w:val="24"/>
+          <w:szCs w:val="24"/>
+          <w:u w:val="none"/>
+          <w:lang w:val="pt-BR"/>
+        </w:rPr>
+      </w:pPr>
+    </w:p>
+    <w:p>
+      <w:pPr>
+        <w:jc w:val="left"/>
+        <w:rPr>
+          <w:rFonts w:hint="default" w:ascii="Bahnschrift Light SemiCondensed" w:hAnsi="Bahnschrift Light SemiCondensed"/>
+          <w:b w:val="0"/>
+          <w:bCs w:val="0"/>
+          <w:i w:val="0"/>
+          <w:iCs w:val="0"/>
+          <w:color w:val="auto"/>
+          <w:sz w:val="24"/>
+          <w:szCs w:val="24"/>
+          <w:u w:val="none"/>
+          <w:lang w:val="pt-BR"/>
+        </w:rPr>
+      </w:pPr>
+    </w:p>
+    <w:p>
+      <w:pPr>
+        <w:jc w:val="left"/>
+        <w:rPr>
+          <w:rFonts w:hint="default" w:ascii="Bahnschrift Light SemiCondensed" w:hAnsi="Bahnschrift Light SemiCondensed"/>
+          <w:b w:val="0"/>
+          <w:bCs w:val="0"/>
+          <w:i w:val="0"/>
+          <w:iCs w:val="0"/>
+          <w:color w:val="auto"/>
+          <w:sz w:val="24"/>
+          <w:szCs w:val="24"/>
+          <w:u w:val="none"/>
+          <w:lang w:val="pt-BR"/>
+        </w:rPr>
+      </w:pPr>
+      <w:r>
+        <w:rPr>
+          <w:rFonts w:hint="default" w:ascii="Bahnschrift Light SemiCondensed" w:hAnsi="Bahnschrift Light SemiCondensed"/>
+          <w:b/>
+          <w:bCs/>
+          <w:i w:val="0"/>
+          <w:iCs w:val="0"/>
+          <w:color w:val="auto"/>
+          <w:sz w:val="24"/>
+          <w:szCs w:val="24"/>
+          <w:u w:val="none"/>
+          <w:lang w:val="pt-BR"/>
+        </w:rPr>
+        <w:t>REVOKE ALL PRIVILEGES</w:t>
+      </w:r>
+      <w:r>
+        <w:rPr>
+          <w:rFonts w:hint="default" w:ascii="Bahnschrift Light SemiCondensed" w:hAnsi="Bahnschrift Light SemiCondensed"/>
+          <w:b/>
+          <w:bCs/>
+          <w:i w:val="0"/>
+          <w:iCs w:val="0"/>
+          <w:color w:val="auto"/>
+          <w:sz w:val="24"/>
+          <w:szCs w:val="24"/>
+          <w:u w:val="none"/>
+          <w:lang w:val="pt-BR"/>
+        </w:rPr>
+        <w:tab/>
+        <w:t/>
+      </w:r>
+      <w:r>
+        <w:rPr>
+          <w:rFonts w:hint="default" w:ascii="Bahnschrift Light SemiCondensed" w:hAnsi="Bahnschrift Light SemiCondensed"/>
+          <w:b/>
+          <w:bCs/>
+          <w:i w:val="0"/>
+          <w:iCs w:val="0"/>
+          <w:color w:val="auto"/>
+          <w:sz w:val="24"/>
+          <w:szCs w:val="24"/>
+          <w:u w:val="none"/>
+          <w:lang w:val="pt-BR"/>
+        </w:rPr>
+        <w:tab/>
+      </w:r>
+      <w:r>
+        <w:rPr>
+          <w:rFonts w:hint="default" w:ascii="Bahnschrift Light SemiCondensed" w:hAnsi="Bahnschrift Light SemiCondensed"/>
+          <w:b w:val="0"/>
+          <w:bCs w:val="0"/>
+          <w:i w:val="0"/>
+          <w:iCs w:val="0"/>
+          <w:color w:val="auto"/>
+          <w:sz w:val="24"/>
+          <w:szCs w:val="24"/>
+          <w:u w:val="none"/>
+          <w:lang w:val="pt-BR"/>
+        </w:rPr>
+        <w:t>→</w:t>
+      </w:r>
+      <w:r>
+        <w:rPr>
+          <w:rFonts w:hint="default" w:ascii="Bahnschrift Light SemiCondensed" w:hAnsi="Bahnschrift Light SemiCondensed"/>
+          <w:b w:val="0"/>
+          <w:bCs w:val="0"/>
+          <w:i w:val="0"/>
+          <w:iCs w:val="0"/>
+          <w:color w:val="auto"/>
+          <w:sz w:val="24"/>
+          <w:szCs w:val="24"/>
+          <w:u w:val="none"/>
+          <w:lang w:val="pt-BR"/>
+        </w:rPr>
+        <w:tab/>
+        <w:t/>
+      </w:r>
+      <w:r>
+        <w:rPr>
+          <w:rFonts w:hint="default" w:ascii="Bahnschrift Light SemiCondensed" w:hAnsi="Bahnschrift Light SemiCondensed"/>
+          <w:b w:val="0"/>
+          <w:bCs w:val="0"/>
+          <w:i w:val="0"/>
+          <w:iCs w:val="0"/>
+          <w:color w:val="auto"/>
+          <w:sz w:val="24"/>
+          <w:szCs w:val="24"/>
+          <w:u w:val="none"/>
+          <w:lang w:val="pt-BR"/>
+        </w:rPr>
+        <w:tab/>
+        <w:t xml:space="preserve">Comando utilizado para </w:t>
+      </w:r>
+    </w:p>
+    <w:p>
+      <w:pPr>
+        <w:jc w:val="left"/>
+        <w:rPr>
+          <w:rFonts w:hint="default" w:ascii="Bahnschrift Light SemiCondensed" w:hAnsi="Bahnschrift Light SemiCondensed"/>
+          <w:b w:val="0"/>
+          <w:bCs w:val="0"/>
+          <w:i w:val="0"/>
+          <w:iCs w:val="0"/>
+          <w:color w:val="auto"/>
+          <w:sz w:val="24"/>
+          <w:szCs w:val="24"/>
+          <w:u w:val="none"/>
+          <w:lang w:val="pt-BR"/>
+        </w:rPr>
+      </w:pPr>
+    </w:p>
+    <w:p>
+      <w:pPr>
+        <w:jc w:val="left"/>
+        <w:rPr>
+          <w:rFonts w:hint="default" w:ascii="Bahnschrift Light SemiCondensed" w:hAnsi="Bahnschrift Light SemiCondensed"/>
+          <w:b w:val="0"/>
+          <w:bCs w:val="0"/>
+          <w:i w:val="0"/>
+          <w:iCs w:val="0"/>
+          <w:color w:val="auto"/>
+          <w:sz w:val="24"/>
+          <w:szCs w:val="24"/>
+          <w:u w:val="none"/>
+          <w:lang w:val="pt-BR"/>
+        </w:rPr>
+      </w:pPr>
+      <w:r>
+        <w:rPr>
+          <w:rFonts w:hint="default" w:ascii="Bahnschrift Light SemiCondensed" w:hAnsi="Bahnschrift Light SemiCondensed"/>
+          <w:b w:val="0"/>
+          <w:bCs w:val="0"/>
+          <w:i w:val="0"/>
+          <w:iCs w:val="0"/>
+          <w:color w:val="auto"/>
+          <w:sz w:val="24"/>
+          <w:szCs w:val="24"/>
+          <w:u w:val="none"/>
+          <w:lang w:val="pt-BR"/>
+        </w:rPr>
+        <w:t>revogar as permissões totais de um usuário.</w:t>
+      </w:r>
+    </w:p>
+    <w:p>
+      <w:pPr>
+        <w:jc w:val="left"/>
+        <w:rPr>
+          <w:rFonts w:hint="default" w:ascii="Bahnschrift Light SemiCondensed" w:hAnsi="Bahnschrift Light SemiCondensed"/>
+          <w:b w:val="0"/>
+          <w:bCs w:val="0"/>
+          <w:i w:val="0"/>
+          <w:iCs w:val="0"/>
+          <w:color w:val="auto"/>
+          <w:sz w:val="24"/>
+          <w:szCs w:val="24"/>
+          <w:u w:val="none"/>
+          <w:lang w:val="pt-BR"/>
+        </w:rPr>
+      </w:pPr>
+    </w:p>
+    <w:p>
+      <w:pPr>
+        <w:jc w:val="left"/>
+        <w:rPr>
+          <w:rFonts w:hint="default" w:ascii="Bahnschrift Light SemiCondensed" w:hAnsi="Bahnschrift Light SemiCondensed"/>
+          <w:b w:val="0"/>
+          <w:bCs w:val="0"/>
+          <w:i w:val="0"/>
+          <w:iCs w:val="0"/>
+          <w:color w:val="auto"/>
+          <w:sz w:val="24"/>
+          <w:szCs w:val="24"/>
+          <w:u w:val="none"/>
+          <w:lang w:val="pt-BR"/>
+        </w:rPr>
+      </w:pPr>
+    </w:p>
+    <w:p>
+      <w:pPr>
+        <w:jc w:val="left"/>
+        <w:rPr>
+          <w:rFonts w:hint="default" w:ascii="Bahnschrift Light SemiCondensed" w:hAnsi="Bahnschrift Light SemiCondensed"/>
+          <w:b w:val="0"/>
+          <w:bCs w:val="0"/>
+          <w:i w:val="0"/>
+          <w:iCs w:val="0"/>
+          <w:color w:val="auto"/>
+          <w:sz w:val="24"/>
+          <w:szCs w:val="24"/>
+          <w:u w:val="none"/>
+          <w:lang w:val="pt-BR"/>
+        </w:rPr>
+      </w:pPr>
+      <w:r>
+        <w:rPr>
+          <w:rFonts w:hint="default" w:ascii="Bahnschrift Light SemiCondensed" w:hAnsi="Bahnschrift Light SemiCondensed"/>
+          <w:b/>
+          <w:bCs/>
+          <w:i w:val="0"/>
+          <w:iCs w:val="0"/>
+          <w:color w:val="auto"/>
+          <w:sz w:val="24"/>
+          <w:szCs w:val="24"/>
+          <w:u w:val="none"/>
+          <w:lang w:val="pt-BR"/>
+        </w:rPr>
+        <w:t xml:space="preserve">REVOKE </w:t>
+      </w:r>
+      <w:r>
+        <w:rPr>
+          <w:rFonts w:hint="default" w:ascii="Bahnschrift Light SemiCondensed" w:hAnsi="Bahnschrift Light SemiCondensed"/>
+          <w:b w:val="0"/>
+          <w:bCs w:val="0"/>
+          <w:i w:val="0"/>
+          <w:iCs w:val="0"/>
+          <w:color w:val="auto"/>
+          <w:sz w:val="24"/>
+          <w:szCs w:val="24"/>
+          <w:u w:val="single"/>
+          <w:lang w:val="pt-BR"/>
+        </w:rPr>
+        <w:t>tipo_de_permissão</w:t>
+      </w:r>
+      <w:r>
+        <w:rPr>
+          <w:rFonts w:hint="default" w:ascii="Bahnschrift Light SemiCondensed" w:hAnsi="Bahnschrift Light SemiCondensed"/>
+          <w:b/>
+          <w:bCs/>
+          <w:i w:val="0"/>
+          <w:iCs w:val="0"/>
+          <w:color w:val="auto"/>
+          <w:sz w:val="24"/>
+          <w:szCs w:val="24"/>
+          <w:u w:val="none"/>
+          <w:lang w:val="pt-BR"/>
+        </w:rPr>
+        <w:t xml:space="preserve">, </w:t>
+      </w:r>
+      <w:r>
+        <w:rPr>
+          <w:rFonts w:hint="default" w:ascii="Bahnschrift Light SemiCondensed" w:hAnsi="Bahnschrift Light SemiCondensed"/>
+          <w:b w:val="0"/>
+          <w:bCs w:val="0"/>
+          <w:i w:val="0"/>
+          <w:iCs w:val="0"/>
+          <w:color w:val="auto"/>
+          <w:sz w:val="24"/>
+          <w:szCs w:val="24"/>
+          <w:u w:val="single"/>
+          <w:lang w:val="pt-BR"/>
+        </w:rPr>
+        <w:t>tipo_de_permissão</w:t>
+      </w:r>
+      <w:r>
+        <w:rPr>
+          <w:rFonts w:hint="default" w:ascii="Bahnschrift Light SemiCondensed" w:hAnsi="Bahnschrift Light SemiCondensed"/>
+          <w:b w:val="0"/>
+          <w:bCs w:val="0"/>
+          <w:i w:val="0"/>
+          <w:iCs w:val="0"/>
+          <w:color w:val="auto"/>
+          <w:sz w:val="24"/>
+          <w:szCs w:val="24"/>
+          <w:u w:val="none"/>
+          <w:lang w:val="pt-BR"/>
+        </w:rPr>
+        <w:t xml:space="preserve"> </w:t>
+      </w:r>
+      <w:r>
+        <w:rPr>
+          <w:rFonts w:hint="default" w:ascii="Bahnschrift Light SemiCondensed" w:hAnsi="Bahnschrift Light SemiCondensed"/>
+          <w:b/>
+          <w:bCs/>
+          <w:i w:val="0"/>
+          <w:iCs w:val="0"/>
+          <w:color w:val="auto"/>
+          <w:sz w:val="24"/>
+          <w:szCs w:val="24"/>
+          <w:u w:val="none"/>
+          <w:lang w:val="pt-BR"/>
+        </w:rPr>
+        <w:t xml:space="preserve">ON </w:t>
+      </w:r>
+      <w:r>
+        <w:rPr>
+          <w:rFonts w:hint="default" w:ascii="Bahnschrift Light SemiCondensed" w:hAnsi="Bahnschrift Light SemiCondensed"/>
+          <w:b w:val="0"/>
+          <w:bCs w:val="0"/>
+          <w:i w:val="0"/>
+          <w:iCs w:val="0"/>
+          <w:color w:val="auto"/>
+          <w:sz w:val="24"/>
+          <w:szCs w:val="24"/>
+          <w:u w:val="single"/>
+          <w:lang w:val="pt-BR"/>
+        </w:rPr>
+        <w:t>nome_do_banco de_dados</w:t>
+      </w:r>
+      <w:r>
+        <w:rPr>
+          <w:rFonts w:hint="default" w:ascii="Bahnschrift Light SemiCondensed" w:hAnsi="Bahnschrift Light SemiCondensed"/>
+          <w:b/>
+          <w:bCs/>
+          <w:i w:val="0"/>
+          <w:iCs w:val="0"/>
+          <w:color w:val="auto"/>
+          <w:sz w:val="24"/>
+          <w:szCs w:val="24"/>
+          <w:u w:val="none"/>
+          <w:lang w:val="pt-BR"/>
+        </w:rPr>
+        <w:t>.* TO ‘</w:t>
+      </w:r>
+      <w:r>
+        <w:rPr>
+          <w:rFonts w:hint="default" w:ascii="Bahnschrift Light SemiCondensed" w:hAnsi="Bahnschrift Light SemiCondensed"/>
+          <w:b w:val="0"/>
+          <w:bCs w:val="0"/>
+          <w:i w:val="0"/>
+          <w:iCs w:val="0"/>
+          <w:color w:val="auto"/>
+          <w:sz w:val="24"/>
+          <w:szCs w:val="24"/>
+          <w:u w:val="single"/>
+          <w:lang w:val="pt-BR"/>
+        </w:rPr>
+        <w:t>nome_do_usuário</w:t>
+      </w:r>
+      <w:r>
+        <w:rPr>
+          <w:rFonts w:hint="default" w:ascii="Bahnschrift Light SemiCondensed" w:hAnsi="Bahnschrift Light SemiCondensed"/>
+          <w:b/>
+          <w:bCs/>
+          <w:i w:val="0"/>
+          <w:iCs w:val="0"/>
+          <w:color w:val="auto"/>
+          <w:sz w:val="24"/>
+          <w:szCs w:val="24"/>
+          <w:u w:val="none"/>
+          <w:lang w:val="pt-BR"/>
+        </w:rPr>
+        <w:t>’@’</w:t>
+      </w:r>
+      <w:r>
+        <w:rPr>
+          <w:rFonts w:hint="default" w:ascii="Bahnschrift Light SemiCondensed" w:hAnsi="Bahnschrift Light SemiCondensed"/>
+          <w:b w:val="0"/>
+          <w:bCs w:val="0"/>
+          <w:i w:val="0"/>
+          <w:iCs w:val="0"/>
+          <w:color w:val="auto"/>
+          <w:sz w:val="24"/>
+          <w:szCs w:val="24"/>
+          <w:u w:val="single"/>
+          <w:lang w:val="pt-BR"/>
+        </w:rPr>
+        <w:t>ip_do_usuário</w:t>
+      </w:r>
+      <w:r>
+        <w:rPr>
+          <w:rFonts w:hint="default" w:ascii="Bahnschrift Light SemiCondensed" w:hAnsi="Bahnschrift Light SemiCondensed"/>
+          <w:b/>
+          <w:bCs/>
+          <w:i w:val="0"/>
+          <w:iCs w:val="0"/>
+          <w:color w:val="auto"/>
+          <w:sz w:val="24"/>
+          <w:szCs w:val="24"/>
+          <w:u w:val="none"/>
+          <w:lang w:val="pt-BR"/>
+        </w:rPr>
+        <w:t>’;</w:t>
+      </w:r>
+      <w:r>
+        <w:rPr>
+          <w:rFonts w:hint="default" w:ascii="Bahnschrift Light SemiCondensed" w:hAnsi="Bahnschrift Light SemiCondensed"/>
+          <w:b w:val="0"/>
+          <w:bCs w:val="0"/>
+          <w:i w:val="0"/>
+          <w:iCs w:val="0"/>
+          <w:color w:val="auto"/>
+          <w:sz w:val="24"/>
+          <w:szCs w:val="24"/>
+          <w:u w:val="none"/>
+          <w:lang w:val="pt-BR"/>
+        </w:rPr>
+        <w:tab/>
+      </w:r>
+      <w:r>
+        <w:rPr>
+          <w:rFonts w:hint="default" w:ascii="Bahnschrift Light SemiCondensed" w:hAnsi="Bahnschrift Light SemiCondensed"/>
+          <w:b w:val="0"/>
+          <w:bCs w:val="0"/>
+          <w:i w:val="0"/>
+          <w:iCs w:val="0"/>
+          <w:color w:val="auto"/>
+          <w:sz w:val="24"/>
+          <w:szCs w:val="24"/>
+          <w:u w:val="none"/>
+          <w:lang w:val="pt-BR"/>
+        </w:rPr>
+        <w:tab/>
+      </w:r>
+      <w:r>
+        <w:rPr>
+          <w:rFonts w:hint="default" w:ascii="Bahnschrift Light SemiCondensed" w:hAnsi="Bahnschrift Light SemiCondensed"/>
+          <w:b w:val="0"/>
+          <w:bCs w:val="0"/>
+          <w:i w:val="0"/>
+          <w:iCs w:val="0"/>
+          <w:color w:val="auto"/>
+          <w:sz w:val="24"/>
+          <w:szCs w:val="24"/>
+          <w:u w:val="none"/>
+          <w:lang w:val="pt-BR"/>
+        </w:rPr>
+        <w:t>→</w:t>
+      </w:r>
+    </w:p>
+    <w:p>
+      <w:pPr>
+        <w:jc w:val="left"/>
+        <w:rPr>
+          <w:rFonts w:hint="default" w:ascii="Bahnschrift Light SemiCondensed" w:hAnsi="Bahnschrift Light SemiCondensed"/>
+          <w:b w:val="0"/>
+          <w:bCs w:val="0"/>
+          <w:i w:val="0"/>
+          <w:iCs w:val="0"/>
+          <w:color w:val="auto"/>
+          <w:sz w:val="24"/>
+          <w:szCs w:val="24"/>
+          <w:u w:val="none"/>
+          <w:lang w:val="pt-BR"/>
+        </w:rPr>
+      </w:pPr>
+    </w:p>
+    <w:p>
+      <w:pPr>
+        <w:jc w:val="left"/>
+        <w:rPr>
+          <w:rFonts w:hint="default" w:ascii="Bahnschrift Light SemiCondensed" w:hAnsi="Bahnschrift Light SemiCondensed"/>
+          <w:b w:val="0"/>
+          <w:bCs w:val="0"/>
+          <w:i w:val="0"/>
+          <w:iCs w:val="0"/>
+          <w:color w:val="auto"/>
+          <w:sz w:val="24"/>
+          <w:szCs w:val="24"/>
+          <w:u w:val="none"/>
+          <w:lang w:val="pt-BR"/>
+        </w:rPr>
+      </w:pPr>
+      <w:r>
+        <w:rPr>
+          <w:rFonts w:hint="default" w:ascii="Bahnschrift Light SemiCondensed" w:hAnsi="Bahnschrift Light SemiCondensed"/>
+          <w:b w:val="0"/>
+          <w:bCs w:val="0"/>
+          <w:i w:val="0"/>
+          <w:iCs w:val="0"/>
+          <w:color w:val="auto"/>
+          <w:sz w:val="24"/>
+          <w:szCs w:val="24"/>
+          <w:u w:val="none"/>
+          <w:lang w:val="pt-BR"/>
+        </w:rPr>
+        <w:tab/>
+        <w:t/>
+      </w:r>
+      <w:r>
+        <w:rPr>
+          <w:rFonts w:hint="default" w:ascii="Bahnschrift Light SemiCondensed" w:hAnsi="Bahnschrift Light SemiCondensed"/>
+          <w:b w:val="0"/>
+          <w:bCs w:val="0"/>
+          <w:i w:val="0"/>
+          <w:iCs w:val="0"/>
+          <w:color w:val="auto"/>
+          <w:sz w:val="24"/>
+          <w:szCs w:val="24"/>
+          <w:u w:val="none"/>
+          <w:lang w:val="pt-BR"/>
+        </w:rPr>
+        <w:tab/>
+        <w:t>Comando utilizado para revogar permissões específicas de um usuário.</w:t>
+      </w:r>
+    </w:p>
+    <w:p>
+      <w:pPr>
+        <w:jc w:val="left"/>
+        <w:rPr>
+          <w:rFonts w:hint="default" w:ascii="Bahnschrift Light SemiCondensed" w:hAnsi="Bahnschrift Light SemiCondensed"/>
+          <w:b w:val="0"/>
+          <w:bCs w:val="0"/>
+          <w:i w:val="0"/>
+          <w:iCs w:val="0"/>
+          <w:color w:val="auto"/>
+          <w:sz w:val="24"/>
+          <w:szCs w:val="24"/>
+          <w:u w:val="none"/>
+          <w:lang w:val="pt-BR"/>
+        </w:rPr>
+      </w:pPr>
+    </w:p>
+    <w:p>
+      <w:pPr>
+        <w:jc w:val="left"/>
+        <w:rPr>
+          <w:rFonts w:hint="default" w:ascii="Bahnschrift Light SemiCondensed" w:hAnsi="Bahnschrift Light SemiCondensed"/>
+          <w:b w:val="0"/>
+          <w:bCs w:val="0"/>
+          <w:i w:val="0"/>
+          <w:iCs w:val="0"/>
+          <w:color w:val="auto"/>
+          <w:sz w:val="24"/>
+          <w:szCs w:val="24"/>
+          <w:u w:val="none"/>
+          <w:lang w:val="pt-BR"/>
+        </w:rPr>
+      </w:pPr>
+    </w:p>
+    <w:p>
+      <w:pPr>
+        <w:jc w:val="left"/>
+        <w:rPr>
+          <w:rFonts w:hint="default" w:ascii="Bahnschrift Light SemiCondensed" w:hAnsi="Bahnschrift Light SemiCondensed"/>
+          <w:b w:val="0"/>
+          <w:bCs w:val="0"/>
+          <w:i w:val="0"/>
+          <w:iCs w:val="0"/>
+          <w:color w:val="auto"/>
+          <w:sz w:val="24"/>
+          <w:szCs w:val="24"/>
+          <w:u w:val="none"/>
+          <w:lang w:val="pt-BR"/>
+        </w:rPr>
+      </w:pPr>
+      <w:r>
+        <w:rPr>
+          <w:rFonts w:hint="default" w:ascii="Bahnschrift Light SemiCondensed" w:hAnsi="Bahnschrift Light SemiCondensed"/>
+          <w:b/>
+          <w:bCs/>
+          <w:i w:val="0"/>
+          <w:iCs w:val="0"/>
+          <w:color w:val="auto"/>
+          <w:sz w:val="24"/>
+          <w:szCs w:val="24"/>
+          <w:u w:val="none"/>
+          <w:lang w:val="pt-BR"/>
+        </w:rPr>
+        <w:t>SHOW GRANTS FOR ‘</w:t>
+      </w:r>
+      <w:r>
+        <w:rPr>
+          <w:rFonts w:hint="default" w:ascii="Bahnschrift Light SemiCondensed" w:hAnsi="Bahnschrift Light SemiCondensed"/>
+          <w:b w:val="0"/>
+          <w:bCs w:val="0"/>
+          <w:i w:val="0"/>
+          <w:iCs w:val="0"/>
+          <w:color w:val="auto"/>
+          <w:sz w:val="24"/>
+          <w:szCs w:val="24"/>
+          <w:u w:val="single"/>
+          <w:lang w:val="pt-BR"/>
+        </w:rPr>
+        <w:t>nome_do_usuário</w:t>
+      </w:r>
+      <w:r>
+        <w:rPr>
+          <w:rFonts w:hint="default" w:ascii="Bahnschrift Light SemiCondensed" w:hAnsi="Bahnschrift Light SemiCondensed"/>
+          <w:b/>
+          <w:bCs/>
+          <w:i w:val="0"/>
+          <w:iCs w:val="0"/>
+          <w:color w:val="auto"/>
+          <w:sz w:val="24"/>
+          <w:szCs w:val="24"/>
+          <w:u w:val="none"/>
+          <w:lang w:val="pt-BR"/>
+        </w:rPr>
+        <w:t>’@’</w:t>
+      </w:r>
+      <w:r>
+        <w:rPr>
+          <w:rFonts w:hint="default" w:ascii="Bahnschrift Light SemiCondensed" w:hAnsi="Bahnschrift Light SemiCondensed"/>
+          <w:b w:val="0"/>
+          <w:bCs w:val="0"/>
+          <w:i w:val="0"/>
+          <w:iCs w:val="0"/>
+          <w:color w:val="auto"/>
+          <w:sz w:val="24"/>
+          <w:szCs w:val="24"/>
+          <w:u w:val="single"/>
+          <w:lang w:val="pt-BR"/>
+        </w:rPr>
+        <w:t>ip_do_usuário</w:t>
+      </w:r>
+      <w:r>
+        <w:rPr>
+          <w:rFonts w:hint="default" w:ascii="Bahnschrift Light SemiCondensed" w:hAnsi="Bahnschrift Light SemiCondensed"/>
+          <w:b/>
+          <w:bCs/>
+          <w:i w:val="0"/>
+          <w:iCs w:val="0"/>
+          <w:color w:val="auto"/>
+          <w:sz w:val="24"/>
+          <w:szCs w:val="24"/>
+          <w:u w:val="none"/>
+          <w:lang w:val="pt-BR"/>
+        </w:rPr>
+        <w:t>’;</w:t>
+      </w:r>
+      <w:r>
+        <w:rPr>
+          <w:rFonts w:hint="default" w:ascii="Bahnschrift Light SemiCondensed" w:hAnsi="Bahnschrift Light SemiCondensed"/>
+          <w:b/>
+          <w:bCs/>
+          <w:i w:val="0"/>
+          <w:iCs w:val="0"/>
+          <w:color w:val="auto"/>
+          <w:sz w:val="24"/>
+          <w:szCs w:val="24"/>
+          <w:u w:val="none"/>
+          <w:lang w:val="pt-BR"/>
+        </w:rPr>
+        <w:tab/>
+        <w:t/>
+      </w:r>
+      <w:r>
+        <w:rPr>
+          <w:rFonts w:hint="default" w:ascii="Bahnschrift Light SemiCondensed" w:hAnsi="Bahnschrift Light SemiCondensed"/>
+          <w:b/>
+          <w:bCs/>
+          <w:i w:val="0"/>
+          <w:iCs w:val="0"/>
+          <w:color w:val="auto"/>
+          <w:sz w:val="24"/>
+          <w:szCs w:val="24"/>
+          <w:u w:val="none"/>
+          <w:lang w:val="pt-BR"/>
+        </w:rPr>
+        <w:tab/>
+      </w:r>
+      <w:r>
+        <w:rPr>
+          <w:rFonts w:hint="default" w:ascii="Bahnschrift Light SemiCondensed" w:hAnsi="Bahnschrift Light SemiCondensed"/>
+          <w:b w:val="0"/>
+          <w:bCs w:val="0"/>
+          <w:i w:val="0"/>
+          <w:iCs w:val="0"/>
+          <w:color w:val="auto"/>
+          <w:sz w:val="24"/>
+          <w:szCs w:val="24"/>
+          <w:u w:val="none"/>
+          <w:lang w:val="pt-BR"/>
+        </w:rPr>
+        <w:t>→</w:t>
+      </w:r>
+    </w:p>
+    <w:p>
+      <w:pPr>
+        <w:jc w:val="left"/>
+        <w:rPr>
+          <w:rFonts w:hint="default" w:ascii="Bahnschrift Light SemiCondensed" w:hAnsi="Bahnschrift Light SemiCondensed"/>
+          <w:b w:val="0"/>
+          <w:bCs w:val="0"/>
+          <w:i w:val="0"/>
+          <w:iCs w:val="0"/>
+          <w:color w:val="auto"/>
+          <w:sz w:val="24"/>
+          <w:szCs w:val="24"/>
+          <w:u w:val="none"/>
+          <w:lang w:val="pt-BR"/>
+        </w:rPr>
+      </w:pPr>
+      <w:r>
+        <w:rPr>
+          <w:rFonts w:hint="default" w:ascii="Bahnschrift Light SemiCondensed" w:hAnsi="Bahnschrift Light SemiCondensed"/>
+          <w:b w:val="0"/>
+          <w:bCs w:val="0"/>
+          <w:i w:val="0"/>
+          <w:iCs w:val="0"/>
+          <w:color w:val="auto"/>
+          <w:sz w:val="24"/>
+          <w:szCs w:val="24"/>
+          <w:u w:val="none"/>
+          <w:lang w:val="pt-BR"/>
+        </w:rPr>
+        <w:tab/>
+      </w:r>
+    </w:p>
+    <w:p>
+      <w:pPr>
+        <w:jc w:val="left"/>
+        <w:rPr>
+          <w:rFonts w:hint="default" w:ascii="Bahnschrift Light SemiCondensed" w:hAnsi="Bahnschrift Light SemiCondensed"/>
+          <w:b w:val="0"/>
+          <w:bCs w:val="0"/>
+          <w:i w:val="0"/>
+          <w:iCs w:val="0"/>
+          <w:color w:val="auto"/>
+          <w:sz w:val="24"/>
+          <w:szCs w:val="24"/>
+          <w:u w:val="none"/>
+          <w:lang w:val="pt-BR"/>
+        </w:rPr>
+      </w:pPr>
+      <w:r>
+        <w:rPr>
+          <w:rFonts w:hint="default" w:ascii="Bahnschrift Light SemiCondensed" w:hAnsi="Bahnschrift Light SemiCondensed"/>
+          <w:b w:val="0"/>
+          <w:bCs w:val="0"/>
+          <w:i w:val="0"/>
+          <w:iCs w:val="0"/>
+          <w:color w:val="auto"/>
+          <w:sz w:val="24"/>
+          <w:szCs w:val="24"/>
+          <w:u w:val="none"/>
+          <w:lang w:val="pt-BR"/>
+        </w:rPr>
+        <w:tab/>
+        <w:t>Comando utilizado para verificar as permissões de um usuário específico.</w:t>
+      </w:r>
+    </w:p>
+    <w:p>
+      <w:pPr>
+        <w:jc w:val="left"/>
+        <w:rPr>
+          <w:rFonts w:hint="default" w:ascii="Bahnschrift Light SemiCondensed" w:hAnsi="Bahnschrift Light SemiCondensed"/>
+          <w:b w:val="0"/>
+          <w:bCs w:val="0"/>
+          <w:i w:val="0"/>
+          <w:iCs w:val="0"/>
+          <w:color w:val="auto"/>
+          <w:sz w:val="24"/>
+          <w:szCs w:val="24"/>
+          <w:u w:val="none"/>
+          <w:lang w:val="pt-BR"/>
+        </w:rPr>
+      </w:pPr>
+    </w:p>
+    <w:p>
+      <w:pPr>
+        <w:jc w:val="left"/>
+        <w:rPr>
+          <w:rFonts w:hint="default" w:ascii="Bahnschrift Light SemiCondensed" w:hAnsi="Bahnschrift Light SemiCondensed"/>
+          <w:b w:val="0"/>
+          <w:bCs w:val="0"/>
+          <w:i w:val="0"/>
+          <w:iCs w:val="0"/>
+          <w:color w:val="auto"/>
+          <w:sz w:val="24"/>
+          <w:szCs w:val="24"/>
+          <w:u w:val="none"/>
+          <w:lang w:val="pt-BR"/>
+        </w:rPr>
+      </w:pPr>
+    </w:p>
+    <w:p>
+      <w:pPr>
+        <w:jc w:val="left"/>
+        <w:rPr>
+          <w:rFonts w:hint="default" w:ascii="Bahnschrift Light SemiCondensed" w:hAnsi="Bahnschrift Light SemiCondensed"/>
+          <w:b w:val="0"/>
+          <w:bCs w:val="0"/>
+          <w:i w:val="0"/>
+          <w:iCs w:val="0"/>
+          <w:color w:val="auto"/>
+          <w:sz w:val="24"/>
+          <w:szCs w:val="24"/>
+          <w:u w:val="none"/>
+          <w:lang w:val="pt-BR"/>
+        </w:rPr>
+      </w:pPr>
+      <w:r>
+        <w:rPr>
+          <w:rFonts w:hint="default" w:ascii="Bahnschrift Light SemiCondensed" w:hAnsi="Bahnschrift Light SemiCondensed"/>
+          <w:b/>
+          <w:bCs/>
+          <w:i w:val="0"/>
+          <w:iCs w:val="0"/>
+          <w:color w:val="auto"/>
+          <w:sz w:val="24"/>
+          <w:szCs w:val="24"/>
+          <w:u w:val="none"/>
+          <w:lang w:val="pt-BR"/>
+        </w:rPr>
+        <w:t>FLUSH ALL PRIVILEGES</w:t>
+      </w:r>
+      <w:r>
+        <w:rPr>
+          <w:rFonts w:hint="default" w:ascii="Bahnschrift Light SemiCondensed" w:hAnsi="Bahnschrift Light SemiCondensed"/>
+          <w:b/>
+          <w:bCs/>
+          <w:i w:val="0"/>
+          <w:iCs w:val="0"/>
+          <w:color w:val="auto"/>
+          <w:sz w:val="24"/>
+          <w:szCs w:val="24"/>
+          <w:u w:val="none"/>
+          <w:lang w:val="pt-BR"/>
+        </w:rPr>
+        <w:tab/>
+        <w:t/>
+      </w:r>
+      <w:r>
+        <w:rPr>
+          <w:rFonts w:hint="default" w:ascii="Bahnschrift Light SemiCondensed" w:hAnsi="Bahnschrift Light SemiCondensed"/>
+          <w:b/>
+          <w:bCs/>
+          <w:i w:val="0"/>
+          <w:iCs w:val="0"/>
+          <w:color w:val="auto"/>
+          <w:sz w:val="24"/>
+          <w:szCs w:val="24"/>
+          <w:u w:val="none"/>
+          <w:lang w:val="pt-BR"/>
+        </w:rPr>
+        <w:tab/>
+      </w:r>
+      <w:r>
+        <w:rPr>
+          <w:rFonts w:hint="default" w:ascii="Bahnschrift Light SemiCondensed" w:hAnsi="Bahnschrift Light SemiCondensed"/>
+          <w:b w:val="0"/>
+          <w:bCs w:val="0"/>
+          <w:i w:val="0"/>
+          <w:iCs w:val="0"/>
+          <w:color w:val="auto"/>
+          <w:sz w:val="24"/>
+          <w:szCs w:val="24"/>
+          <w:u w:val="none"/>
+          <w:lang w:val="pt-BR"/>
+        </w:rPr>
+        <w:t>→</w:t>
+      </w:r>
+      <w:r>
+        <w:rPr>
+          <w:rFonts w:hint="default" w:ascii="Bahnschrift Light SemiCondensed" w:hAnsi="Bahnschrift Light SemiCondensed"/>
+          <w:b w:val="0"/>
+          <w:bCs w:val="0"/>
+          <w:i w:val="0"/>
+          <w:iCs w:val="0"/>
+          <w:color w:val="auto"/>
+          <w:sz w:val="24"/>
+          <w:szCs w:val="24"/>
+          <w:u w:val="none"/>
+          <w:lang w:val="pt-BR"/>
+        </w:rPr>
+        <w:tab/>
+        <w:t/>
+      </w:r>
+      <w:r>
+        <w:rPr>
+          <w:rFonts w:hint="default" w:ascii="Bahnschrift Light SemiCondensed" w:hAnsi="Bahnschrift Light SemiCondensed"/>
+          <w:b w:val="0"/>
+          <w:bCs w:val="0"/>
+          <w:i w:val="0"/>
+          <w:iCs w:val="0"/>
+          <w:color w:val="auto"/>
+          <w:sz w:val="24"/>
+          <w:szCs w:val="24"/>
+          <w:u w:val="none"/>
+          <w:lang w:val="pt-BR"/>
+        </w:rPr>
+        <w:tab/>
+        <w:t xml:space="preserve">Comando utilizado para </w:t>
+      </w:r>
+    </w:p>
+    <w:p>
+      <w:pPr>
+        <w:jc w:val="left"/>
+        <w:rPr>
+          <w:rFonts w:hint="default" w:ascii="Bahnschrift Light SemiCondensed" w:hAnsi="Bahnschrift Light SemiCondensed"/>
+          <w:b w:val="0"/>
+          <w:bCs w:val="0"/>
+          <w:i w:val="0"/>
+          <w:iCs w:val="0"/>
+          <w:color w:val="auto"/>
+          <w:sz w:val="24"/>
+          <w:szCs w:val="24"/>
+          <w:u w:val="none"/>
+          <w:lang w:val="pt-BR"/>
+        </w:rPr>
+      </w:pPr>
+    </w:p>
+    <w:p>
+      <w:pPr>
+        <w:jc w:val="left"/>
+        <w:rPr>
+          <w:rFonts w:hint="default" w:ascii="Bahnschrift Light SemiCondensed" w:hAnsi="Bahnschrift Light SemiCondensed"/>
+          <w:b w:val="0"/>
+          <w:bCs w:val="0"/>
+          <w:i w:val="0"/>
+          <w:iCs w:val="0"/>
+          <w:color w:val="auto"/>
+          <w:sz w:val="24"/>
+          <w:szCs w:val="24"/>
+          <w:u w:val="none"/>
+          <w:lang w:val="pt-BR"/>
+        </w:rPr>
+      </w:pPr>
+      <w:r>
+        <w:rPr>
+          <w:rFonts w:hint="default" w:ascii="Bahnschrift Light SemiCondensed" w:hAnsi="Bahnschrift Light SemiCondensed"/>
+          <w:b w:val="0"/>
+          <w:bCs w:val="0"/>
+          <w:i w:val="0"/>
+          <w:iCs w:val="0"/>
+          <w:color w:val="auto"/>
+          <w:sz w:val="24"/>
+          <w:szCs w:val="24"/>
+          <w:u w:val="none"/>
+          <w:lang w:val="pt-BR"/>
+        </w:rPr>
+        <w:t>atualizar os privilégios após alterações.</w:t>
+      </w:r>
+    </w:p>
+    <w:p>
+      <w:pPr>
+        <w:jc w:val="left"/>
+        <w:rPr>
+          <w:rFonts w:hint="default" w:ascii="Bahnschrift Light SemiCondensed" w:hAnsi="Bahnschrift Light SemiCondensed"/>
+          <w:b w:val="0"/>
+          <w:bCs w:val="0"/>
+          <w:i w:val="0"/>
+          <w:iCs w:val="0"/>
+          <w:color w:val="auto"/>
+          <w:sz w:val="24"/>
+          <w:szCs w:val="24"/>
+          <w:u w:val="none"/>
+          <w:lang w:val="pt-BR"/>
+        </w:rPr>
+      </w:pPr>
+    </w:p>
+    <w:p>
+      <w:pPr>
+        <w:jc w:val="left"/>
+        <w:rPr>
+          <w:rFonts w:hint="default" w:ascii="Bahnschrift Light SemiCondensed" w:hAnsi="Bahnschrift Light SemiCondensed"/>
+          <w:b w:val="0"/>
+          <w:bCs w:val="0"/>
+          <w:i w:val="0"/>
+          <w:iCs w:val="0"/>
+          <w:color w:val="auto"/>
+          <w:sz w:val="24"/>
+          <w:szCs w:val="24"/>
+          <w:u w:val="none"/>
+          <w:lang w:val="pt-BR"/>
+        </w:rPr>
+      </w:pPr>
+      <w:r>
+        <w:rPr>
+          <w:rFonts w:hint="default" w:ascii="Bahnschrift Light SemiCondensed" w:hAnsi="Bahnschrift Light SemiCondensed"/>
+          <w:b/>
+          <w:bCs/>
+          <w:i w:val="0"/>
+          <w:iCs w:val="0"/>
+          <w:color w:val="auto"/>
+          <w:sz w:val="24"/>
+          <w:szCs w:val="24"/>
+          <w:u w:val="none"/>
+          <w:lang w:val="pt-BR"/>
+        </w:rPr>
+        <w:t>START TRANSACTION</w:t>
+      </w:r>
+      <w:r>
+        <w:rPr>
+          <w:rFonts w:hint="default" w:ascii="Bahnschrift Light SemiCondensed" w:hAnsi="Bahnschrift Light SemiCondensed"/>
+          <w:b/>
+          <w:bCs/>
+          <w:i w:val="0"/>
+          <w:iCs w:val="0"/>
+          <w:color w:val="auto"/>
+          <w:sz w:val="24"/>
+          <w:szCs w:val="24"/>
+          <w:u w:val="none"/>
+          <w:lang w:val="pt-BR"/>
+        </w:rPr>
+        <w:tab/>
+        <w:t/>
+      </w:r>
+      <w:r>
+        <w:rPr>
+          <w:rFonts w:hint="default" w:ascii="Bahnschrift Light SemiCondensed" w:hAnsi="Bahnschrift Light SemiCondensed"/>
+          <w:b/>
+          <w:bCs/>
+          <w:i w:val="0"/>
+          <w:iCs w:val="0"/>
+          <w:color w:val="auto"/>
+          <w:sz w:val="24"/>
+          <w:szCs w:val="24"/>
+          <w:u w:val="none"/>
+          <w:lang w:val="pt-BR"/>
+        </w:rPr>
+        <w:tab/>
+      </w:r>
+      <w:r>
+        <w:rPr>
+          <w:rFonts w:hint="default" w:ascii="Bahnschrift Light SemiCondensed" w:hAnsi="Bahnschrift Light SemiCondensed"/>
+          <w:b w:val="0"/>
+          <w:bCs w:val="0"/>
+          <w:i w:val="0"/>
+          <w:iCs w:val="0"/>
+          <w:color w:val="auto"/>
+          <w:sz w:val="24"/>
+          <w:szCs w:val="24"/>
+          <w:u w:val="none"/>
+          <w:lang w:val="pt-BR"/>
+        </w:rPr>
+        <w:t>→</w:t>
+      </w:r>
+      <w:r>
+        <w:rPr>
+          <w:rFonts w:hint="default" w:ascii="Bahnschrift Light SemiCondensed" w:hAnsi="Bahnschrift Light SemiCondensed"/>
+          <w:b w:val="0"/>
+          <w:bCs w:val="0"/>
+          <w:i w:val="0"/>
+          <w:iCs w:val="0"/>
+          <w:color w:val="auto"/>
+          <w:sz w:val="24"/>
+          <w:szCs w:val="24"/>
+          <w:u w:val="none"/>
+          <w:lang w:val="pt-BR"/>
+        </w:rPr>
+        <w:tab/>
+        <w:t/>
+      </w:r>
+      <w:r>
+        <w:rPr>
+          <w:rFonts w:hint="default" w:ascii="Bahnschrift Light SemiCondensed" w:hAnsi="Bahnschrift Light SemiCondensed"/>
+          <w:b w:val="0"/>
+          <w:bCs w:val="0"/>
+          <w:i w:val="0"/>
+          <w:iCs w:val="0"/>
+          <w:color w:val="auto"/>
+          <w:sz w:val="24"/>
+          <w:szCs w:val="24"/>
+          <w:u w:val="none"/>
+          <w:lang w:val="pt-BR"/>
+        </w:rPr>
+        <w:tab/>
+        <w:t xml:space="preserve">Comando utilizado para iniciar </w:t>
+      </w:r>
+    </w:p>
+    <w:p>
+      <w:pPr>
+        <w:jc w:val="left"/>
+        <w:rPr>
+          <w:rFonts w:hint="default" w:ascii="Bahnschrift Light SemiCondensed" w:hAnsi="Bahnschrift Light SemiCondensed"/>
+          <w:b w:val="0"/>
+          <w:bCs w:val="0"/>
+          <w:i w:val="0"/>
+          <w:iCs w:val="0"/>
+          <w:color w:val="auto"/>
+          <w:sz w:val="24"/>
+          <w:szCs w:val="24"/>
+          <w:u w:val="none"/>
+          <w:lang w:val="pt-BR"/>
+        </w:rPr>
+      </w:pPr>
+    </w:p>
+    <w:p>
+      <w:pPr>
+        <w:jc w:val="left"/>
+        <w:rPr>
+          <w:rFonts w:hint="default" w:ascii="Bahnschrift Light SemiCondensed" w:hAnsi="Bahnschrift Light SemiCondensed"/>
+          <w:b w:val="0"/>
+          <w:bCs w:val="0"/>
+          <w:i w:val="0"/>
+          <w:iCs w:val="0"/>
+          <w:color w:val="auto"/>
+          <w:sz w:val="24"/>
+          <w:szCs w:val="24"/>
+          <w:u w:val="none"/>
+          <w:lang w:val="pt-BR"/>
+        </w:rPr>
+      </w:pPr>
+      <w:r>
+        <w:rPr>
+          <w:rFonts w:hint="default" w:ascii="Bahnschrift Light SemiCondensed" w:hAnsi="Bahnschrift Light SemiCondensed"/>
+          <w:b w:val="0"/>
+          <w:bCs w:val="0"/>
+          <w:i w:val="0"/>
+          <w:iCs w:val="0"/>
+          <w:color w:val="auto"/>
+          <w:sz w:val="24"/>
+          <w:szCs w:val="24"/>
+          <w:u w:val="none"/>
+          <w:lang w:val="pt-BR"/>
+        </w:rPr>
+        <w:t>uma transação.</w:t>
+      </w:r>
+    </w:p>
+    <w:p>
+      <w:pPr>
+        <w:jc w:val="left"/>
+        <w:rPr>
+          <w:rFonts w:hint="default" w:ascii="Bahnschrift Light SemiCondensed" w:hAnsi="Bahnschrift Light SemiCondensed"/>
+          <w:b w:val="0"/>
+          <w:bCs w:val="0"/>
+          <w:i w:val="0"/>
+          <w:iCs w:val="0"/>
+          <w:color w:val="auto"/>
+          <w:sz w:val="24"/>
+          <w:szCs w:val="24"/>
+          <w:u w:val="none"/>
+          <w:lang w:val="pt-BR"/>
+        </w:rPr>
+      </w:pPr>
+    </w:p>
+    <w:p>
+      <w:pPr>
+        <w:jc w:val="left"/>
+        <w:rPr>
+          <w:rFonts w:hint="default" w:ascii="Bahnschrift Light SemiCondensed" w:hAnsi="Bahnschrift Light SemiCondensed"/>
+          <w:b w:val="0"/>
+          <w:bCs w:val="0"/>
+          <w:i w:val="0"/>
+          <w:iCs w:val="0"/>
+          <w:color w:val="auto"/>
+          <w:sz w:val="24"/>
+          <w:szCs w:val="24"/>
+          <w:u w:val="none"/>
+          <w:lang w:val="pt-BR"/>
+        </w:rPr>
+      </w:pPr>
+    </w:p>
+    <w:p>
+      <w:pPr>
+        <w:spacing w:beforeLines="0" w:afterLines="0"/>
+        <w:jc w:val="left"/>
+        <w:rPr>
+          <w:rFonts w:hint="default" w:ascii="Bahnschrift Light SemiCondensed" w:hAnsi="Bahnschrift Light SemiCondensed" w:cs="Bahnschrift Light SemiCondensed"/>
+          <w:color w:val="auto"/>
+          <w:sz w:val="24"/>
+          <w:szCs w:val="36"/>
+          <w:lang w:val="pt-BR"/>
+        </w:rPr>
+      </w:pPr>
+      <w:r>
+        <w:rPr>
+          <w:rFonts w:hint="default" w:ascii="Bahnschrift Light SemiCondensed" w:hAnsi="Bahnschrift Light SemiCondensed" w:cs="Bahnschrift Light SemiCondensed"/>
+          <w:b/>
+          <w:color w:val="auto"/>
+          <w:sz w:val="24"/>
+          <w:szCs w:val="36"/>
+        </w:rPr>
+        <w:t>START</w:t>
+      </w:r>
+      <w:r>
+        <w:rPr>
+          <w:rFonts w:hint="default" w:ascii="Bahnschrift Light SemiCondensed" w:hAnsi="Bahnschrift Light SemiCondensed" w:cs="Bahnschrift Light SemiCondensed"/>
+          <w:color w:val="auto"/>
+          <w:sz w:val="24"/>
+          <w:szCs w:val="36"/>
+        </w:rPr>
+        <w:t xml:space="preserve"> </w:t>
+      </w:r>
+      <w:r>
+        <w:rPr>
+          <w:rFonts w:hint="default" w:ascii="Bahnschrift Light SemiCondensed" w:hAnsi="Bahnschrift Light SemiCondensed" w:cs="Bahnschrift Light SemiCondensed"/>
+          <w:b/>
+          <w:color w:val="auto"/>
+          <w:sz w:val="24"/>
+          <w:szCs w:val="36"/>
+        </w:rPr>
+        <w:t>TRANSACTION</w:t>
+      </w:r>
+      <w:r>
+        <w:rPr>
+          <w:rFonts w:hint="default" w:ascii="Bahnschrift Light SemiCondensed" w:hAnsi="Bahnschrift Light SemiCondensed" w:cs="Bahnschrift Light SemiCondensed"/>
+          <w:color w:val="auto"/>
+          <w:sz w:val="24"/>
+          <w:szCs w:val="36"/>
+        </w:rPr>
+        <w:t>;</w:t>
+      </w:r>
+    </w:p>
+    <w:p>
+      <w:pPr>
+        <w:spacing w:beforeLines="0" w:afterLines="0"/>
+        <w:jc w:val="left"/>
+        <w:rPr>
+          <w:rFonts w:hint="default" w:ascii="Bahnschrift Light SemiCondensed" w:hAnsi="Bahnschrift Light SemiCondensed" w:cs="Bahnschrift Light SemiCondensed"/>
+          <w:color w:val="auto"/>
+          <w:sz w:val="24"/>
+          <w:szCs w:val="36"/>
+          <w:u w:val="single"/>
+          <w:lang w:val="pt-BR"/>
+        </w:rPr>
+      </w:pPr>
+      <w:r>
+        <w:rPr>
+          <w:rFonts w:hint="default" w:ascii="Bahnschrift Light SemiCondensed" w:hAnsi="Bahnschrift Light SemiCondensed" w:cs="Bahnschrift Light SemiCondensed"/>
+          <w:color w:val="auto"/>
+          <w:sz w:val="24"/>
+          <w:szCs w:val="36"/>
+        </w:rPr>
+        <w:tab/>
+      </w:r>
+      <w:r>
+        <w:rPr>
+          <w:rFonts w:hint="default" w:ascii="Bahnschrift Light SemiCondensed" w:hAnsi="Bahnschrift Light SemiCondensed" w:cs="Bahnschrift Light SemiCondensed"/>
+          <w:b w:val="0"/>
+          <w:bCs/>
+          <w:color w:val="auto"/>
+          <w:sz w:val="24"/>
+          <w:szCs w:val="36"/>
+        </w:rPr>
+        <w:t>INSERT INTO</w:t>
+      </w:r>
+      <w:r>
+        <w:rPr>
+          <w:rFonts w:hint="default" w:ascii="Bahnschrift Light SemiCondensed" w:hAnsi="Bahnschrift Light SemiCondensed" w:cs="Bahnschrift Light SemiCondensed"/>
+          <w:color w:val="auto"/>
+          <w:sz w:val="24"/>
+          <w:szCs w:val="36"/>
+        </w:rPr>
+        <w:t xml:space="preserve"> </w:t>
+      </w:r>
+      <w:r>
+        <w:rPr>
+          <w:rFonts w:hint="default" w:ascii="Bahnschrift Light SemiCondensed" w:hAnsi="Bahnschrift Light SemiCondensed" w:cs="Bahnschrift Light SemiCondensed"/>
+          <w:color w:val="auto"/>
+          <w:sz w:val="24"/>
+          <w:szCs w:val="36"/>
+          <w:u w:val="single"/>
+          <w:lang w:val="pt-BR"/>
+        </w:rPr>
+        <w:t>nome_da_tabela</w:t>
+      </w:r>
+    </w:p>
+    <w:p>
+      <w:pPr>
+        <w:spacing w:beforeLines="0" w:afterLines="0"/>
+        <w:jc w:val="left"/>
+        <w:rPr>
+          <w:rFonts w:hint="default" w:ascii="Bahnschrift Light SemiCondensed" w:hAnsi="Bahnschrift Light SemiCondensed" w:cs="Bahnschrift Light SemiCondensed"/>
+          <w:color w:val="auto"/>
+          <w:sz w:val="24"/>
+          <w:szCs w:val="36"/>
+        </w:rPr>
+      </w:pPr>
+      <w:r>
+        <w:rPr>
+          <w:rFonts w:hint="default" w:ascii="Bahnschrift Light SemiCondensed" w:hAnsi="Bahnschrift Light SemiCondensed" w:cs="Bahnschrift Light SemiCondensed"/>
+          <w:color w:val="auto"/>
+          <w:sz w:val="24"/>
+          <w:szCs w:val="36"/>
+        </w:rPr>
+        <w:tab/>
+      </w:r>
+      <w:r>
+        <w:rPr>
+          <w:rFonts w:hint="default" w:ascii="Bahnschrift Light SemiCondensed" w:hAnsi="Bahnschrift Light SemiCondensed" w:cs="Bahnschrift Light SemiCondensed"/>
+          <w:color w:val="auto"/>
+          <w:sz w:val="24"/>
+          <w:szCs w:val="36"/>
+        </w:rPr>
+        <w:t>(</w:t>
+      </w:r>
+      <w:r>
+        <w:rPr>
+          <w:rFonts w:hint="default" w:ascii="Bahnschrift Light SemiCondensed" w:hAnsi="Bahnschrift Light SemiCondensed" w:cs="Bahnschrift Light SemiCondensed"/>
+          <w:color w:val="auto"/>
+          <w:sz w:val="24"/>
+          <w:szCs w:val="36"/>
+          <w:u w:val="single"/>
+          <w:lang w:val="pt-BR"/>
+        </w:rPr>
+        <w:t>coluna_da_tabela</w:t>
+      </w:r>
+      <w:r>
+        <w:rPr>
+          <w:rFonts w:hint="default" w:ascii="Bahnschrift Light SemiCondensed" w:hAnsi="Bahnschrift Light SemiCondensed" w:cs="Bahnschrift Light SemiCondensed"/>
+          <w:color w:val="auto"/>
+          <w:sz w:val="24"/>
+          <w:szCs w:val="36"/>
+        </w:rPr>
+        <w:t xml:space="preserve">) </w:t>
+      </w:r>
+    </w:p>
+    <w:p>
+      <w:pPr>
+        <w:spacing w:beforeLines="0" w:afterLines="0"/>
+        <w:jc w:val="left"/>
+        <w:rPr>
+          <w:rFonts w:hint="default" w:ascii="Bahnschrift Light SemiCondensed" w:hAnsi="Bahnschrift Light SemiCondensed" w:cs="Bahnschrift Light SemiCondensed"/>
+          <w:color w:val="auto"/>
+          <w:sz w:val="24"/>
+          <w:szCs w:val="36"/>
+        </w:rPr>
+      </w:pPr>
+      <w:r>
+        <w:rPr>
+          <w:rFonts w:hint="default" w:ascii="Bahnschrift Light SemiCondensed" w:hAnsi="Bahnschrift Light SemiCondensed" w:cs="Bahnschrift Light SemiCondensed"/>
+          <w:color w:val="auto"/>
+          <w:sz w:val="24"/>
+          <w:szCs w:val="36"/>
+        </w:rPr>
+        <w:tab/>
+      </w:r>
+      <w:r>
+        <w:rPr>
+          <w:rFonts w:hint="default" w:ascii="Bahnschrift Light SemiCondensed" w:hAnsi="Bahnschrift Light SemiCondensed" w:cs="Bahnschrift Light SemiCondensed"/>
+          <w:b w:val="0"/>
+          <w:bCs/>
+          <w:color w:val="auto"/>
+          <w:sz w:val="24"/>
+          <w:szCs w:val="36"/>
+        </w:rPr>
+        <w:t xml:space="preserve">VALUES </w:t>
+      </w:r>
+    </w:p>
+    <w:p>
+      <w:pPr>
+        <w:spacing w:beforeLines="0" w:afterLines="0"/>
+        <w:jc w:val="left"/>
+        <w:rPr>
+          <w:rFonts w:hint="default" w:ascii="Bahnschrift Light SemiCondensed" w:hAnsi="Bahnschrift Light SemiCondensed" w:cs="Bahnschrift Light SemiCondensed"/>
+          <w:color w:val="auto"/>
+          <w:sz w:val="24"/>
+          <w:szCs w:val="36"/>
+        </w:rPr>
+      </w:pPr>
+      <w:r>
+        <w:rPr>
+          <w:rFonts w:hint="default" w:ascii="Bahnschrift Light SemiCondensed" w:hAnsi="Bahnschrift Light SemiCondensed" w:cs="Bahnschrift Light SemiCondensed"/>
+          <w:color w:val="auto"/>
+          <w:sz w:val="24"/>
+          <w:szCs w:val="36"/>
+        </w:rPr>
+        <w:tab/>
+      </w:r>
+      <w:r>
+        <w:rPr>
+          <w:rFonts w:hint="default" w:ascii="Bahnschrift Light SemiCondensed" w:hAnsi="Bahnschrift Light SemiCondensed" w:cs="Bahnschrift Light SemiCondensed"/>
+          <w:color w:val="auto"/>
+          <w:sz w:val="24"/>
+          <w:szCs w:val="36"/>
+        </w:rPr>
+        <w:t>('</w:t>
+      </w:r>
+      <w:r>
+        <w:rPr>
+          <w:rFonts w:hint="default" w:ascii="Bahnschrift Light SemiCondensed" w:hAnsi="Bahnschrift Light SemiCondensed" w:cs="Bahnschrift Light SemiCondensed"/>
+          <w:color w:val="auto"/>
+          <w:sz w:val="24"/>
+          <w:szCs w:val="36"/>
+          <w:u w:val="single"/>
+          <w:lang w:val="pt-BR"/>
+        </w:rPr>
+        <w:t>dado</w:t>
+      </w:r>
+      <w:r>
+        <w:rPr>
+          <w:rFonts w:hint="default" w:ascii="Bahnschrift Light SemiCondensed" w:hAnsi="Bahnschrift Light SemiCondensed" w:cs="Bahnschrift Light SemiCondensed"/>
+          <w:color w:val="auto"/>
+          <w:sz w:val="24"/>
+          <w:szCs w:val="36"/>
+        </w:rPr>
+        <w:t>');</w:t>
+      </w:r>
+    </w:p>
+    <w:p>
+      <w:pPr>
+        <w:spacing w:beforeLines="0" w:afterLines="0"/>
+        <w:jc w:val="left"/>
+        <w:rPr>
+          <w:rFonts w:hint="default" w:ascii="Bahnschrift Light SemiCondensed" w:hAnsi="Bahnschrift Light SemiCondensed" w:cs="Bahnschrift Light SemiCondensed"/>
+          <w:i/>
+          <w:color w:val="auto"/>
+          <w:sz w:val="24"/>
+          <w:szCs w:val="36"/>
+        </w:rPr>
+      </w:pPr>
+    </w:p>
+    <w:p>
+      <w:pPr>
+        <w:spacing w:beforeLines="0" w:afterLines="0"/>
+        <w:jc w:val="left"/>
+        <w:rPr>
+          <w:rFonts w:hint="default" w:ascii="Bahnschrift Light SemiCondensed" w:hAnsi="Bahnschrift Light SemiCondensed" w:cs="Bahnschrift Light SemiCondensed"/>
+          <w:b w:val="0"/>
+          <w:bCs/>
+          <w:color w:val="auto"/>
+          <w:sz w:val="24"/>
+          <w:szCs w:val="36"/>
+        </w:rPr>
+      </w:pPr>
+      <w:r>
+        <w:rPr>
+          <w:rFonts w:hint="default" w:ascii="Bahnschrift Light SemiCondensed" w:hAnsi="Bahnschrift Light SemiCondensed" w:cs="Bahnschrift Light SemiCondensed"/>
+          <w:b w:val="0"/>
+          <w:bCs/>
+          <w:color w:val="auto"/>
+          <w:sz w:val="24"/>
+          <w:szCs w:val="36"/>
+        </w:rPr>
+        <w:t>COMMIT;</w:t>
+      </w:r>
+    </w:p>
+    <w:p>
+      <w:pPr>
+        <w:spacing w:beforeLines="0" w:afterLines="0"/>
+        <w:jc w:val="left"/>
+        <w:rPr>
+          <w:rFonts w:hint="default" w:ascii="Bahnschrift Light SemiCondensed" w:hAnsi="Bahnschrift Light SemiCondensed" w:cs="Bahnschrift Light SemiCondensed"/>
+          <w:i/>
+          <w:color w:val="auto"/>
+          <w:sz w:val="24"/>
+          <w:szCs w:val="36"/>
+        </w:rPr>
+      </w:pPr>
+    </w:p>
+    <w:p>
+      <w:pPr>
+        <w:spacing w:beforeLines="0" w:afterLines="0"/>
+        <w:jc w:val="left"/>
+        <w:rPr>
+          <w:rFonts w:hint="default" w:ascii="Bahnschrift Light SemiCondensed" w:hAnsi="Bahnschrift Light SemiCondensed" w:cs="Bahnschrift Light SemiCondensed"/>
+          <w:color w:val="auto"/>
+          <w:sz w:val="24"/>
+          <w:szCs w:val="36"/>
+          <w:lang w:val="pt-BR"/>
+        </w:rPr>
+      </w:pPr>
+      <w:r>
+        <w:rPr>
+          <w:rFonts w:hint="default" w:ascii="Bahnschrift Light SemiCondensed" w:hAnsi="Bahnschrift Light SemiCondensed" w:cs="Bahnschrift Light SemiCondensed"/>
+          <w:b w:val="0"/>
+          <w:bCs/>
+          <w:color w:val="auto"/>
+          <w:sz w:val="24"/>
+          <w:szCs w:val="36"/>
+        </w:rPr>
+        <w:t>ROLLBACK;</w:t>
+      </w:r>
+      <w:r>
+        <w:rPr>
+          <w:rFonts w:hint="default" w:ascii="Bahnschrift Light SemiCondensed" w:hAnsi="Bahnschrift Light SemiCondensed" w:cs="Bahnschrift Light SemiCondensed"/>
+          <w:b w:val="0"/>
+          <w:bCs/>
+          <w:color w:val="auto"/>
+          <w:sz w:val="24"/>
+          <w:szCs w:val="36"/>
+          <w:lang w:val="pt-BR"/>
+        </w:rPr>
+        <w:tab/>
+      </w:r>
+      <w:r>
+        <w:rPr>
+          <w:rFonts w:hint="default" w:ascii="Bahnschrift Light SemiCondensed" w:hAnsi="Bahnschrift Light SemiCondensed" w:cs="Bahnschrift Light SemiCondensed"/>
+          <w:color w:val="auto"/>
+          <w:sz w:val="24"/>
+          <w:szCs w:val="36"/>
+          <w:lang w:val="pt-BR"/>
+        </w:rPr>
+        <w:tab/>
+        <w:t/>
+      </w:r>
+      <w:r>
+        <w:rPr>
+          <w:rFonts w:hint="default" w:ascii="Bahnschrift Light SemiCondensed" w:hAnsi="Bahnschrift Light SemiCondensed" w:cs="Bahnschrift Light SemiCondensed"/>
+          <w:color w:val="auto"/>
+          <w:sz w:val="24"/>
+          <w:szCs w:val="36"/>
+          <w:lang w:val="pt-BR"/>
+        </w:rPr>
+        <w:tab/>
+        <w:t>→</w:t>
+      </w:r>
+      <w:r>
+        <w:rPr>
+          <w:rFonts w:hint="default" w:ascii="Bahnschrift Light SemiCondensed" w:hAnsi="Bahnschrift Light SemiCondensed" w:cs="Bahnschrift Light SemiCondensed"/>
+          <w:color w:val="auto"/>
+          <w:sz w:val="24"/>
+          <w:szCs w:val="36"/>
+          <w:lang w:val="pt-BR"/>
+        </w:rPr>
+        <w:tab/>
+        <w:t/>
+      </w:r>
+      <w:r>
+        <w:rPr>
+          <w:rFonts w:hint="default" w:ascii="Bahnschrift Light SemiCondensed" w:hAnsi="Bahnschrift Light SemiCondensed" w:cs="Bahnschrift Light SemiCondensed"/>
+          <w:color w:val="auto"/>
+          <w:sz w:val="24"/>
+          <w:szCs w:val="36"/>
+          <w:lang w:val="pt-BR"/>
+        </w:rPr>
+        <w:tab/>
+        <w:t xml:space="preserve">Comando utilizado para iniciar uma </w:t>
+      </w:r>
+    </w:p>
+    <w:p>
+      <w:pPr>
+        <w:spacing w:beforeLines="0" w:afterLines="0"/>
+        <w:jc w:val="left"/>
+        <w:rPr>
+          <w:rFonts w:hint="default" w:ascii="Bahnschrift Light SemiCondensed" w:hAnsi="Bahnschrift Light SemiCondensed" w:cs="Bahnschrift Light SemiCondensed"/>
+          <w:color w:val="auto"/>
+          <w:sz w:val="24"/>
+          <w:szCs w:val="36"/>
+          <w:lang w:val="pt-BR"/>
+        </w:rPr>
+      </w:pPr>
+    </w:p>
+    <w:p>
+      <w:pPr>
+        <w:spacing w:beforeLines="0" w:afterLines="0"/>
+        <w:jc w:val="left"/>
+        <w:rPr>
+          <w:rFonts w:hint="default" w:ascii="Bahnschrift Light SemiCondensed" w:hAnsi="Bahnschrift Light SemiCondensed" w:cs="Bahnschrift Light SemiCondensed"/>
+          <w:color w:val="auto"/>
+          <w:sz w:val="24"/>
+          <w:szCs w:val="36"/>
+          <w:lang w:val="pt-BR"/>
+        </w:rPr>
+      </w:pPr>
+      <w:r>
+        <w:rPr>
+          <w:rFonts w:hint="default" w:ascii="Bahnschrift Light SemiCondensed" w:hAnsi="Bahnschrift Light SemiCondensed" w:cs="Bahnschrift Light SemiCondensed"/>
+          <w:color w:val="auto"/>
+          <w:sz w:val="24"/>
+          <w:szCs w:val="36"/>
+          <w:lang w:val="pt-BR"/>
+        </w:rPr>
+        <w:t>transação.</w:t>
+      </w:r>
+    </w:p>
+    <w:p>
+      <w:pPr>
+        <w:spacing w:beforeLines="0" w:afterLines="0"/>
+        <w:jc w:val="left"/>
+        <w:rPr>
+          <w:rFonts w:hint="default" w:ascii="Bahnschrift Light SemiCondensed" w:hAnsi="Bahnschrift Light SemiCondensed" w:cs="Bahnschrift Light SemiCondensed"/>
+          <w:color w:val="auto"/>
+          <w:sz w:val="24"/>
+          <w:szCs w:val="36"/>
+          <w:lang w:val="pt-BR"/>
+        </w:rPr>
+      </w:pPr>
+    </w:p>
+    <w:p>
+      <w:pPr>
+        <w:spacing w:beforeLines="0" w:afterLines="0"/>
+        <w:jc w:val="left"/>
+        <w:rPr>
+          <w:rFonts w:hint="default" w:ascii="Bahnschrift Light SemiCondensed" w:hAnsi="Bahnschrift Light SemiCondensed" w:cs="Bahnschrift Light SemiCondensed"/>
+          <w:b/>
+          <w:bCs/>
+          <w:color w:val="auto"/>
+          <w:sz w:val="24"/>
+          <w:szCs w:val="36"/>
+          <w:lang w:val="pt-BR"/>
+        </w:rPr>
+      </w:pPr>
+    </w:p>
+    <w:p>
+      <w:pPr>
+        <w:spacing w:beforeLines="0" w:afterLines="0"/>
+        <w:jc w:val="left"/>
+        <w:rPr>
+          <w:rFonts w:hint="default" w:ascii="Bahnschrift Light SemiCondensed" w:hAnsi="Bahnschrift Light SemiCondensed" w:cs="Bahnschrift Light SemiCondensed"/>
+          <w:b w:val="0"/>
+          <w:bCs/>
+          <w:color w:val="auto"/>
+          <w:sz w:val="24"/>
+          <w:szCs w:val="36"/>
+          <w:lang w:val="pt-BR"/>
+        </w:rPr>
+      </w:pPr>
+      <w:r>
+        <w:rPr>
+          <w:rFonts w:hint="default" w:ascii="Bahnschrift Light SemiCondensed" w:hAnsi="Bahnschrift Light SemiCondensed" w:cs="Bahnschrift Light SemiCondensed"/>
+          <w:b w:val="0"/>
+          <w:bCs/>
+          <w:color w:val="auto"/>
+          <w:sz w:val="24"/>
+          <w:szCs w:val="36"/>
+        </w:rPr>
+        <w:t>START TRANSACTION;</w:t>
+      </w:r>
+    </w:p>
+    <w:p>
+      <w:pPr>
+        <w:spacing w:beforeLines="0" w:afterLines="0"/>
+        <w:jc w:val="left"/>
+        <w:rPr>
+          <w:rFonts w:hint="default" w:ascii="Bahnschrift Light SemiCondensed" w:hAnsi="Bahnschrift Light SemiCondensed" w:cs="Bahnschrift Light SemiCondensed"/>
+          <w:color w:val="auto"/>
+          <w:sz w:val="24"/>
+          <w:szCs w:val="36"/>
+          <w:u w:val="single"/>
+          <w:lang w:val="pt-BR"/>
+        </w:rPr>
+      </w:pPr>
+      <w:r>
+        <w:rPr>
+          <w:rFonts w:hint="default" w:ascii="Bahnschrift Light SemiCondensed" w:hAnsi="Bahnschrift Light SemiCondensed" w:cs="Bahnschrift Light SemiCondensed"/>
+          <w:color w:val="auto"/>
+          <w:sz w:val="24"/>
+          <w:szCs w:val="36"/>
+        </w:rPr>
+        <w:tab/>
+      </w:r>
+      <w:r>
+        <w:rPr>
+          <w:rFonts w:hint="default" w:ascii="Bahnschrift Light SemiCondensed" w:hAnsi="Bahnschrift Light SemiCondensed" w:cs="Bahnschrift Light SemiCondensed"/>
+          <w:b w:val="0"/>
+          <w:bCs/>
+          <w:color w:val="auto"/>
+          <w:sz w:val="24"/>
+          <w:szCs w:val="36"/>
+        </w:rPr>
+        <w:t>INSERT INTO</w:t>
+      </w:r>
+      <w:r>
+        <w:rPr>
+          <w:rFonts w:hint="default" w:ascii="Bahnschrift Light SemiCondensed" w:hAnsi="Bahnschrift Light SemiCondensed" w:cs="Bahnschrift Light SemiCondensed"/>
+          <w:color w:val="auto"/>
+          <w:sz w:val="24"/>
+          <w:szCs w:val="36"/>
+        </w:rPr>
+        <w:t xml:space="preserve"> </w:t>
+      </w:r>
+      <w:r>
+        <w:rPr>
+          <w:rFonts w:hint="default" w:ascii="Bahnschrift Light SemiCondensed" w:hAnsi="Bahnschrift Light SemiCondensed" w:cs="Bahnschrift Light SemiCondensed"/>
+          <w:color w:val="auto"/>
+          <w:sz w:val="24"/>
+          <w:szCs w:val="36"/>
+          <w:u w:val="single"/>
+          <w:lang w:val="pt-BR"/>
+        </w:rPr>
+        <w:t>nome_da_tabela</w:t>
+      </w:r>
+    </w:p>
+    <w:p>
+      <w:pPr>
+        <w:spacing w:beforeLines="0" w:afterLines="0"/>
+        <w:jc w:val="left"/>
+        <w:rPr>
+          <w:rFonts w:hint="default" w:ascii="Bahnschrift Light SemiCondensed" w:hAnsi="Bahnschrift Light SemiCondensed" w:cs="Bahnschrift Light SemiCondensed"/>
+          <w:color w:val="auto"/>
+          <w:sz w:val="24"/>
+          <w:szCs w:val="36"/>
+        </w:rPr>
+      </w:pPr>
+      <w:r>
+        <w:rPr>
+          <w:rFonts w:hint="default" w:ascii="Bahnschrift Light SemiCondensed" w:hAnsi="Bahnschrift Light SemiCondensed" w:cs="Bahnschrift Light SemiCondensed"/>
+          <w:color w:val="auto"/>
+          <w:sz w:val="24"/>
+          <w:szCs w:val="36"/>
+        </w:rPr>
+        <w:tab/>
+      </w:r>
+      <w:r>
+        <w:rPr>
+          <w:rFonts w:hint="default" w:ascii="Bahnschrift Light SemiCondensed" w:hAnsi="Bahnschrift Light SemiCondensed" w:cs="Bahnschrift Light SemiCondensed"/>
+          <w:color w:val="auto"/>
+          <w:sz w:val="24"/>
+          <w:szCs w:val="36"/>
+        </w:rPr>
+        <w:t>(</w:t>
+      </w:r>
+      <w:r>
+        <w:rPr>
+          <w:rFonts w:hint="default" w:ascii="Bahnschrift Light SemiCondensed" w:hAnsi="Bahnschrift Light SemiCondensed" w:cs="Bahnschrift Light SemiCondensed"/>
+          <w:color w:val="auto"/>
+          <w:sz w:val="24"/>
+          <w:szCs w:val="36"/>
+          <w:u w:val="single"/>
+          <w:lang w:val="pt-BR"/>
+        </w:rPr>
+        <w:t>coluna_da_tabela</w:t>
+      </w:r>
+      <w:r>
+        <w:rPr>
+          <w:rFonts w:hint="default" w:ascii="Bahnschrift Light SemiCondensed" w:hAnsi="Bahnschrift Light SemiCondensed" w:cs="Bahnschrift Light SemiCondensed"/>
+          <w:color w:val="auto"/>
+          <w:sz w:val="24"/>
+          <w:szCs w:val="36"/>
+        </w:rPr>
+        <w:t xml:space="preserve">) </w:t>
+      </w:r>
+    </w:p>
+    <w:p>
+      <w:pPr>
+        <w:spacing w:beforeLines="0" w:afterLines="0"/>
+        <w:jc w:val="left"/>
+        <w:rPr>
+          <w:rFonts w:hint="default" w:ascii="Bahnschrift Light SemiCondensed" w:hAnsi="Bahnschrift Light SemiCondensed" w:cs="Bahnschrift Light SemiCondensed"/>
+          <w:color w:val="auto"/>
+          <w:sz w:val="24"/>
+          <w:szCs w:val="36"/>
+        </w:rPr>
+      </w:pPr>
+      <w:r>
+        <w:rPr>
+          <w:rFonts w:hint="default" w:ascii="Bahnschrift Light SemiCondensed" w:hAnsi="Bahnschrift Light SemiCondensed" w:cs="Bahnschrift Light SemiCondensed"/>
+          <w:color w:val="auto"/>
+          <w:sz w:val="24"/>
+          <w:szCs w:val="36"/>
+        </w:rPr>
+        <w:tab/>
+      </w:r>
+      <w:r>
+        <w:rPr>
+          <w:rFonts w:hint="default" w:ascii="Bahnschrift Light SemiCondensed" w:hAnsi="Bahnschrift Light SemiCondensed" w:cs="Bahnschrift Light SemiCondensed"/>
+          <w:b w:val="0"/>
+          <w:bCs/>
+          <w:color w:val="auto"/>
+          <w:sz w:val="24"/>
+          <w:szCs w:val="36"/>
+        </w:rPr>
+        <w:t xml:space="preserve">VALUES </w:t>
+      </w:r>
+    </w:p>
+    <w:p>
+      <w:pPr>
+        <w:spacing w:beforeLines="0" w:afterLines="0"/>
+        <w:jc w:val="left"/>
+        <w:rPr>
+          <w:rFonts w:hint="default" w:ascii="Bahnschrift Light SemiCondensed" w:hAnsi="Bahnschrift Light SemiCondensed" w:cs="Bahnschrift Light SemiCondensed"/>
+          <w:color w:val="auto"/>
+          <w:sz w:val="24"/>
+          <w:szCs w:val="36"/>
+        </w:rPr>
+      </w:pPr>
+      <w:r>
+        <w:rPr>
+          <w:rFonts w:hint="default" w:ascii="Bahnschrift Light SemiCondensed" w:hAnsi="Bahnschrift Light SemiCondensed" w:cs="Bahnschrift Light SemiCondensed"/>
+          <w:color w:val="auto"/>
+          <w:sz w:val="24"/>
+          <w:szCs w:val="36"/>
+        </w:rPr>
+        <w:tab/>
+      </w:r>
+      <w:r>
+        <w:rPr>
+          <w:rFonts w:hint="default" w:ascii="Bahnschrift Light SemiCondensed" w:hAnsi="Bahnschrift Light SemiCondensed" w:cs="Bahnschrift Light SemiCondensed"/>
+          <w:color w:val="auto"/>
+          <w:sz w:val="24"/>
+          <w:szCs w:val="36"/>
+        </w:rPr>
+        <w:t>('</w:t>
+      </w:r>
+      <w:r>
+        <w:rPr>
+          <w:rFonts w:hint="default" w:ascii="Bahnschrift Light SemiCondensed" w:hAnsi="Bahnschrift Light SemiCondensed" w:cs="Bahnschrift Light SemiCondensed"/>
+          <w:color w:val="auto"/>
+          <w:sz w:val="24"/>
+          <w:szCs w:val="36"/>
+          <w:u w:val="single"/>
+          <w:lang w:val="pt-BR"/>
+        </w:rPr>
+        <w:t>dado</w:t>
+      </w:r>
+      <w:r>
+        <w:rPr>
+          <w:rFonts w:hint="default" w:ascii="Bahnschrift Light SemiCondensed" w:hAnsi="Bahnschrift Light SemiCondensed" w:cs="Bahnschrift Light SemiCondensed"/>
+          <w:color w:val="auto"/>
+          <w:sz w:val="24"/>
+          <w:szCs w:val="36"/>
+        </w:rPr>
+        <w:t>');</w:t>
+      </w:r>
+    </w:p>
+    <w:p>
+      <w:pPr>
+        <w:spacing w:beforeLines="0" w:afterLines="0"/>
+        <w:jc w:val="left"/>
+        <w:rPr>
+          <w:rFonts w:hint="default" w:ascii="Bahnschrift Light SemiCondensed" w:hAnsi="Bahnschrift Light SemiCondensed" w:cs="Bahnschrift Light SemiCondensed"/>
+          <w:i/>
+          <w:color w:val="auto"/>
+          <w:sz w:val="24"/>
+          <w:szCs w:val="36"/>
+        </w:rPr>
+      </w:pPr>
+    </w:p>
+    <w:p>
+      <w:pPr>
+        <w:spacing w:beforeLines="0" w:afterLines="0"/>
+        <w:jc w:val="left"/>
+        <w:rPr>
+          <w:rFonts w:hint="default" w:ascii="Bahnschrift Light SemiCondensed" w:hAnsi="Bahnschrift Light SemiCondensed" w:cs="Bahnschrift Light SemiCondensed"/>
+          <w:b/>
+          <w:bCs w:val="0"/>
+          <w:color w:val="auto"/>
+          <w:sz w:val="24"/>
+          <w:szCs w:val="36"/>
+        </w:rPr>
+      </w:pPr>
+      <w:r>
+        <w:rPr>
+          <w:rFonts w:hint="default" w:ascii="Bahnschrift Light SemiCondensed" w:hAnsi="Bahnschrift Light SemiCondensed" w:cs="Bahnschrift Light SemiCondensed"/>
+          <w:b/>
+          <w:bCs w:val="0"/>
+          <w:color w:val="auto"/>
+          <w:sz w:val="24"/>
+          <w:szCs w:val="36"/>
+        </w:rPr>
+        <w:t>COMMIT;</w:t>
+      </w:r>
+    </w:p>
+    <w:p>
+      <w:pPr>
+        <w:spacing w:beforeLines="0" w:afterLines="0"/>
+        <w:jc w:val="left"/>
+        <w:rPr>
+          <w:rFonts w:hint="default" w:ascii="Bahnschrift Light SemiCondensed" w:hAnsi="Bahnschrift Light SemiCondensed" w:cs="Bahnschrift Light SemiCondensed"/>
+          <w:i/>
+          <w:color w:val="auto"/>
+          <w:sz w:val="24"/>
+          <w:szCs w:val="36"/>
+        </w:rPr>
+      </w:pPr>
+    </w:p>
+    <w:p>
+      <w:pPr>
+        <w:spacing w:beforeLines="0" w:afterLines="0"/>
+        <w:jc w:val="left"/>
+        <w:rPr>
+          <w:rFonts w:hint="default" w:ascii="Bahnschrift Light SemiCondensed" w:hAnsi="Bahnschrift Light SemiCondensed" w:cs="Bahnschrift Light SemiCondensed"/>
+          <w:color w:val="auto"/>
+          <w:sz w:val="24"/>
+          <w:szCs w:val="36"/>
+          <w:lang w:val="pt-BR"/>
+        </w:rPr>
+      </w:pPr>
+      <w:r>
+        <w:rPr>
+          <w:rFonts w:hint="default" w:ascii="Bahnschrift Light SemiCondensed" w:hAnsi="Bahnschrift Light SemiCondensed" w:cs="Bahnschrift Light SemiCondensed"/>
+          <w:b w:val="0"/>
+          <w:bCs/>
+          <w:color w:val="auto"/>
+          <w:sz w:val="24"/>
+          <w:szCs w:val="36"/>
+        </w:rPr>
+        <w:t>ROLLBACK;</w:t>
+      </w:r>
+      <w:r>
+        <w:rPr>
+          <w:rFonts w:hint="default" w:ascii="Bahnschrift Light SemiCondensed" w:hAnsi="Bahnschrift Light SemiCondensed" w:cs="Bahnschrift Light SemiCondensed"/>
+          <w:b w:val="0"/>
+          <w:bCs/>
+          <w:color w:val="auto"/>
+          <w:sz w:val="24"/>
+          <w:szCs w:val="36"/>
+          <w:lang w:val="pt-BR"/>
+        </w:rPr>
+        <w:tab/>
+      </w:r>
+      <w:r>
+        <w:rPr>
+          <w:rFonts w:hint="default" w:ascii="Bahnschrift Light SemiCondensed" w:hAnsi="Bahnschrift Light SemiCondensed" w:cs="Bahnschrift Light SemiCondensed"/>
+          <w:color w:val="auto"/>
+          <w:sz w:val="24"/>
+          <w:szCs w:val="36"/>
+          <w:lang w:val="pt-BR"/>
+        </w:rPr>
+        <w:tab/>
+      </w:r>
+      <w:r>
+        <w:rPr>
+          <w:rFonts w:hint="default" w:ascii="Bahnschrift Light SemiCondensed" w:hAnsi="Bahnschrift Light SemiCondensed" w:cs="Bahnschrift Light SemiCondensed"/>
+          <w:color w:val="auto"/>
+          <w:sz w:val="24"/>
+          <w:szCs w:val="36"/>
+          <w:lang w:val="pt-BR"/>
+        </w:rPr>
+        <w:tab/>
+      </w:r>
+      <w:r>
+        <w:rPr>
+          <w:rFonts w:hint="default" w:ascii="Bahnschrift Light SemiCondensed" w:hAnsi="Bahnschrift Light SemiCondensed" w:cs="Bahnschrift Light SemiCondensed"/>
+          <w:color w:val="auto"/>
+          <w:sz w:val="24"/>
+          <w:szCs w:val="36"/>
+          <w:lang w:val="pt-BR"/>
+        </w:rPr>
+        <w:t>→</w:t>
+      </w:r>
+      <w:r>
+        <w:rPr>
+          <w:rFonts w:hint="default" w:ascii="Bahnschrift Light SemiCondensed" w:hAnsi="Bahnschrift Light SemiCondensed" w:cs="Bahnschrift Light SemiCondensed"/>
+          <w:color w:val="auto"/>
+          <w:sz w:val="24"/>
+          <w:szCs w:val="36"/>
+          <w:lang w:val="pt-BR"/>
+        </w:rPr>
+        <w:tab/>
+      </w:r>
+      <w:r>
+        <w:rPr>
+          <w:rFonts w:hint="default" w:ascii="Bahnschrift Light SemiCondensed" w:hAnsi="Bahnschrift Light SemiCondensed" w:cs="Bahnschrift Light SemiCondensed"/>
+          <w:color w:val="auto"/>
+          <w:sz w:val="24"/>
+          <w:szCs w:val="36"/>
+          <w:lang w:val="pt-BR"/>
+        </w:rPr>
+        <w:tab/>
+      </w:r>
+      <w:r>
+        <w:rPr>
+          <w:rFonts w:hint="default" w:ascii="Bahnschrift Light SemiCondensed" w:hAnsi="Bahnschrift Light SemiCondensed" w:cs="Bahnschrift Light SemiCondensed"/>
+          <w:color w:val="auto"/>
+          <w:sz w:val="24"/>
+          <w:szCs w:val="36"/>
+          <w:lang w:val="pt-BR"/>
+        </w:rPr>
+        <w:t xml:space="preserve">Comando utilizado para confirmar </w:t>
+      </w:r>
+    </w:p>
+    <w:p>
+      <w:pPr>
+        <w:spacing w:beforeLines="0" w:afterLines="0"/>
+        <w:jc w:val="left"/>
+        <w:rPr>
+          <w:rFonts w:hint="default" w:ascii="Bahnschrift Light SemiCondensed" w:hAnsi="Bahnschrift Light SemiCondensed" w:cs="Bahnschrift Light SemiCondensed"/>
+          <w:color w:val="auto"/>
+          <w:sz w:val="24"/>
+          <w:szCs w:val="36"/>
+          <w:lang w:val="pt-BR"/>
+        </w:rPr>
+      </w:pPr>
+    </w:p>
+    <w:p>
+      <w:pPr>
+        <w:spacing w:beforeLines="0" w:afterLines="0"/>
+        <w:jc w:val="left"/>
+        <w:rPr>
+          <w:rFonts w:hint="default" w:ascii="Bahnschrift Light SemiCondensed" w:hAnsi="Bahnschrift Light SemiCondensed" w:cs="Bahnschrift Light SemiCondensed"/>
+          <w:color w:val="auto"/>
+          <w:sz w:val="24"/>
+          <w:szCs w:val="36"/>
+          <w:lang w:val="pt-BR"/>
+        </w:rPr>
+      </w:pPr>
+      <w:r>
+        <w:rPr>
+          <w:rFonts w:hint="default" w:ascii="Bahnschrift Light SemiCondensed" w:hAnsi="Bahnschrift Light SemiCondensed" w:cs="Bahnschrift Light SemiCondensed"/>
+          <w:color w:val="auto"/>
+          <w:sz w:val="24"/>
+          <w:szCs w:val="36"/>
+          <w:lang w:val="pt-BR"/>
+        </w:rPr>
+        <w:t>uma transação.</w:t>
+      </w:r>
+    </w:p>
+    <w:p>
+      <w:pPr>
+        <w:spacing w:beforeLines="0" w:afterLines="0"/>
+        <w:jc w:val="left"/>
+        <w:rPr>
+          <w:rFonts w:hint="default" w:ascii="Bahnschrift Light SemiCondensed" w:hAnsi="Bahnschrift Light SemiCondensed" w:cs="Bahnschrift Light SemiCondensed"/>
+          <w:b/>
+          <w:bCs/>
+          <w:color w:val="auto"/>
+          <w:sz w:val="24"/>
+          <w:szCs w:val="36"/>
+          <w:lang w:val="pt-BR"/>
+        </w:rPr>
+      </w:pPr>
+    </w:p>
+    <w:p>
+      <w:pPr>
+        <w:spacing w:beforeLines="0" w:afterLines="0"/>
+        <w:jc w:val="left"/>
+        <w:rPr>
+          <w:rFonts w:hint="default" w:ascii="Bahnschrift Light SemiCondensed" w:hAnsi="Bahnschrift Light SemiCondensed" w:cs="Bahnschrift Light SemiCondensed"/>
+          <w:b/>
+          <w:bCs/>
+          <w:color w:val="auto"/>
+          <w:sz w:val="24"/>
+          <w:szCs w:val="36"/>
+          <w:lang w:val="pt-BR"/>
+        </w:rPr>
+      </w:pPr>
+    </w:p>
+    <w:p>
+      <w:pPr>
+        <w:spacing w:beforeLines="0" w:afterLines="0"/>
+        <w:jc w:val="left"/>
+        <w:rPr>
+          <w:rFonts w:hint="default" w:ascii="Bahnschrift Light SemiCondensed" w:hAnsi="Bahnschrift Light SemiCondensed" w:cs="Bahnschrift Light SemiCondensed"/>
+          <w:b w:val="0"/>
+          <w:bCs/>
+          <w:color w:val="auto"/>
+          <w:sz w:val="24"/>
+          <w:szCs w:val="36"/>
+          <w:lang w:val="pt-BR"/>
+        </w:rPr>
+      </w:pPr>
+      <w:r>
+        <w:rPr>
+          <w:rFonts w:hint="default" w:ascii="Bahnschrift Light SemiCondensed" w:hAnsi="Bahnschrift Light SemiCondensed" w:cs="Bahnschrift Light SemiCondensed"/>
+          <w:b w:val="0"/>
+          <w:bCs/>
+          <w:color w:val="auto"/>
+          <w:sz w:val="24"/>
+          <w:szCs w:val="36"/>
+        </w:rPr>
+        <w:t>START TRANSACTION;</w:t>
+      </w:r>
+    </w:p>
+    <w:p>
+      <w:pPr>
+        <w:spacing w:beforeLines="0" w:afterLines="0"/>
+        <w:jc w:val="left"/>
+        <w:rPr>
+          <w:rFonts w:hint="default" w:ascii="Bahnschrift Light SemiCondensed" w:hAnsi="Bahnschrift Light SemiCondensed" w:cs="Bahnschrift Light SemiCondensed"/>
+          <w:color w:val="auto"/>
+          <w:sz w:val="24"/>
+          <w:szCs w:val="36"/>
+          <w:u w:val="single"/>
+          <w:lang w:val="pt-BR"/>
+        </w:rPr>
+      </w:pPr>
+      <w:r>
+        <w:rPr>
+          <w:rFonts w:hint="default" w:ascii="Bahnschrift Light SemiCondensed" w:hAnsi="Bahnschrift Light SemiCondensed" w:cs="Bahnschrift Light SemiCondensed"/>
+          <w:color w:val="auto"/>
+          <w:sz w:val="24"/>
+          <w:szCs w:val="36"/>
+        </w:rPr>
+        <w:tab/>
+      </w:r>
+      <w:r>
+        <w:rPr>
+          <w:rFonts w:hint="default" w:ascii="Bahnschrift Light SemiCondensed" w:hAnsi="Bahnschrift Light SemiCondensed" w:cs="Bahnschrift Light SemiCondensed"/>
+          <w:b w:val="0"/>
+          <w:bCs/>
+          <w:color w:val="auto"/>
+          <w:sz w:val="24"/>
+          <w:szCs w:val="36"/>
+        </w:rPr>
+        <w:t>INSERT INTO</w:t>
+      </w:r>
+      <w:r>
+        <w:rPr>
+          <w:rFonts w:hint="default" w:ascii="Bahnschrift Light SemiCondensed" w:hAnsi="Bahnschrift Light SemiCondensed" w:cs="Bahnschrift Light SemiCondensed"/>
+          <w:color w:val="auto"/>
+          <w:sz w:val="24"/>
+          <w:szCs w:val="36"/>
+        </w:rPr>
+        <w:t xml:space="preserve"> </w:t>
+      </w:r>
+      <w:r>
+        <w:rPr>
+          <w:rFonts w:hint="default" w:ascii="Bahnschrift Light SemiCondensed" w:hAnsi="Bahnschrift Light SemiCondensed" w:cs="Bahnschrift Light SemiCondensed"/>
+          <w:color w:val="auto"/>
+          <w:sz w:val="24"/>
+          <w:szCs w:val="36"/>
+          <w:u w:val="single"/>
+          <w:lang w:val="pt-BR"/>
+        </w:rPr>
+        <w:t>nome_da_tabela</w:t>
+      </w:r>
+    </w:p>
+    <w:p>
+      <w:pPr>
+        <w:spacing w:beforeLines="0" w:afterLines="0"/>
+        <w:jc w:val="left"/>
+        <w:rPr>
+          <w:rFonts w:hint="default" w:ascii="Bahnschrift Light SemiCondensed" w:hAnsi="Bahnschrift Light SemiCondensed" w:cs="Bahnschrift Light SemiCondensed"/>
+          <w:color w:val="auto"/>
+          <w:sz w:val="24"/>
+          <w:szCs w:val="36"/>
+        </w:rPr>
+      </w:pPr>
+      <w:r>
+        <w:rPr>
+          <w:rFonts w:hint="default" w:ascii="Bahnschrift Light SemiCondensed" w:hAnsi="Bahnschrift Light SemiCondensed" w:cs="Bahnschrift Light SemiCondensed"/>
+          <w:color w:val="auto"/>
+          <w:sz w:val="24"/>
+          <w:szCs w:val="36"/>
+        </w:rPr>
+        <w:tab/>
+      </w:r>
+      <w:r>
+        <w:rPr>
+          <w:rFonts w:hint="default" w:ascii="Bahnschrift Light SemiCondensed" w:hAnsi="Bahnschrift Light SemiCondensed" w:cs="Bahnschrift Light SemiCondensed"/>
+          <w:color w:val="auto"/>
+          <w:sz w:val="24"/>
+          <w:szCs w:val="36"/>
+        </w:rPr>
+        <w:t>(</w:t>
+      </w:r>
+      <w:r>
+        <w:rPr>
+          <w:rFonts w:hint="default" w:ascii="Bahnschrift Light SemiCondensed" w:hAnsi="Bahnschrift Light SemiCondensed" w:cs="Bahnschrift Light SemiCondensed"/>
+          <w:color w:val="auto"/>
+          <w:sz w:val="24"/>
+          <w:szCs w:val="36"/>
+          <w:u w:val="single"/>
+          <w:lang w:val="pt-BR"/>
+        </w:rPr>
+        <w:t>coluna_da_tabela</w:t>
+      </w:r>
+      <w:r>
+        <w:rPr>
+          <w:rFonts w:hint="default" w:ascii="Bahnschrift Light SemiCondensed" w:hAnsi="Bahnschrift Light SemiCondensed" w:cs="Bahnschrift Light SemiCondensed"/>
+          <w:color w:val="auto"/>
+          <w:sz w:val="24"/>
+          <w:szCs w:val="36"/>
+        </w:rPr>
+        <w:t xml:space="preserve">) </w:t>
+      </w:r>
+    </w:p>
+    <w:p>
+      <w:pPr>
+        <w:spacing w:beforeLines="0" w:afterLines="0"/>
+        <w:jc w:val="left"/>
+        <w:rPr>
+          <w:rFonts w:hint="default" w:ascii="Bahnschrift Light SemiCondensed" w:hAnsi="Bahnschrift Light SemiCondensed" w:cs="Bahnschrift Light SemiCondensed"/>
+          <w:color w:val="auto"/>
+          <w:sz w:val="24"/>
+          <w:szCs w:val="36"/>
+        </w:rPr>
+      </w:pPr>
+      <w:r>
+        <w:rPr>
+          <w:rFonts w:hint="default" w:ascii="Bahnschrift Light SemiCondensed" w:hAnsi="Bahnschrift Light SemiCondensed" w:cs="Bahnschrift Light SemiCondensed"/>
+          <w:color w:val="auto"/>
+          <w:sz w:val="24"/>
+          <w:szCs w:val="36"/>
+        </w:rPr>
+        <w:tab/>
+      </w:r>
+      <w:r>
+        <w:rPr>
+          <w:rFonts w:hint="default" w:ascii="Bahnschrift Light SemiCondensed" w:hAnsi="Bahnschrift Light SemiCondensed" w:cs="Bahnschrift Light SemiCondensed"/>
+          <w:b w:val="0"/>
+          <w:bCs/>
+          <w:color w:val="auto"/>
+          <w:sz w:val="24"/>
+          <w:szCs w:val="36"/>
+        </w:rPr>
+        <w:t xml:space="preserve">VALUES </w:t>
+      </w:r>
+    </w:p>
+    <w:p>
+      <w:pPr>
+        <w:spacing w:beforeLines="0" w:afterLines="0"/>
+        <w:jc w:val="left"/>
+        <w:rPr>
+          <w:rFonts w:hint="default" w:ascii="Bahnschrift Light SemiCondensed" w:hAnsi="Bahnschrift Light SemiCondensed" w:cs="Bahnschrift Light SemiCondensed"/>
+          <w:color w:val="auto"/>
+          <w:sz w:val="24"/>
+          <w:szCs w:val="36"/>
+        </w:rPr>
+      </w:pPr>
+      <w:r>
+        <w:rPr>
+          <w:rFonts w:hint="default" w:ascii="Bahnschrift Light SemiCondensed" w:hAnsi="Bahnschrift Light SemiCondensed" w:cs="Bahnschrift Light SemiCondensed"/>
+          <w:color w:val="auto"/>
+          <w:sz w:val="24"/>
+          <w:szCs w:val="36"/>
+        </w:rPr>
+        <w:tab/>
+      </w:r>
+      <w:r>
+        <w:rPr>
+          <w:rFonts w:hint="default" w:ascii="Bahnschrift Light SemiCondensed" w:hAnsi="Bahnschrift Light SemiCondensed" w:cs="Bahnschrift Light SemiCondensed"/>
+          <w:color w:val="auto"/>
+          <w:sz w:val="24"/>
+          <w:szCs w:val="36"/>
+        </w:rPr>
+        <w:t>('</w:t>
+      </w:r>
+      <w:r>
+        <w:rPr>
+          <w:rFonts w:hint="default" w:ascii="Bahnschrift Light SemiCondensed" w:hAnsi="Bahnschrift Light SemiCondensed" w:cs="Bahnschrift Light SemiCondensed"/>
+          <w:color w:val="auto"/>
+          <w:sz w:val="24"/>
+          <w:szCs w:val="36"/>
+          <w:u w:val="single"/>
+          <w:lang w:val="pt-BR"/>
+        </w:rPr>
+        <w:t>dado</w:t>
+      </w:r>
+      <w:r>
+        <w:rPr>
+          <w:rFonts w:hint="default" w:ascii="Bahnschrift Light SemiCondensed" w:hAnsi="Bahnschrift Light SemiCondensed" w:cs="Bahnschrift Light SemiCondensed"/>
+          <w:color w:val="auto"/>
+          <w:sz w:val="24"/>
+          <w:szCs w:val="36"/>
+        </w:rPr>
+        <w:t>');</w:t>
+      </w:r>
+    </w:p>
+    <w:p>
+      <w:pPr>
+        <w:spacing w:beforeLines="0" w:afterLines="0"/>
+        <w:jc w:val="left"/>
+        <w:rPr>
+          <w:rFonts w:hint="default" w:ascii="Bahnschrift Light SemiCondensed" w:hAnsi="Bahnschrift Light SemiCondensed" w:cs="Bahnschrift Light SemiCondensed"/>
+          <w:i/>
+          <w:color w:val="auto"/>
+          <w:sz w:val="24"/>
+          <w:szCs w:val="36"/>
+        </w:rPr>
+      </w:pPr>
+    </w:p>
+    <w:p>
+      <w:pPr>
+        <w:spacing w:beforeLines="0" w:afterLines="0"/>
+        <w:jc w:val="left"/>
+        <w:rPr>
+          <w:rFonts w:hint="default" w:ascii="Bahnschrift Light SemiCondensed" w:hAnsi="Bahnschrift Light SemiCondensed" w:cs="Bahnschrift Light SemiCondensed"/>
+          <w:b w:val="0"/>
+          <w:bCs/>
+          <w:color w:val="auto"/>
+          <w:sz w:val="24"/>
+          <w:szCs w:val="36"/>
+        </w:rPr>
+      </w:pPr>
+      <w:r>
+        <w:rPr>
+          <w:rFonts w:hint="default" w:ascii="Bahnschrift Light SemiCondensed" w:hAnsi="Bahnschrift Light SemiCondensed" w:cs="Bahnschrift Light SemiCondensed"/>
+          <w:b w:val="0"/>
+          <w:bCs/>
+          <w:color w:val="auto"/>
+          <w:sz w:val="24"/>
+          <w:szCs w:val="36"/>
+        </w:rPr>
+        <w:t>COMMIT;</w:t>
+      </w:r>
+    </w:p>
+    <w:p>
+      <w:pPr>
+        <w:spacing w:beforeLines="0" w:afterLines="0"/>
+        <w:jc w:val="left"/>
+        <w:rPr>
+          <w:rFonts w:hint="default" w:ascii="Bahnschrift Light SemiCondensed" w:hAnsi="Bahnschrift Light SemiCondensed" w:cs="Bahnschrift Light SemiCondensed"/>
+          <w:i/>
+          <w:color w:val="auto"/>
+          <w:sz w:val="24"/>
+          <w:szCs w:val="36"/>
+        </w:rPr>
+      </w:pPr>
+    </w:p>
+    <w:p>
+      <w:pPr>
+        <w:spacing w:beforeLines="0" w:afterLines="0"/>
+        <w:jc w:val="left"/>
+        <w:rPr>
+          <w:rFonts w:hint="default" w:ascii="Bahnschrift Light SemiCondensed" w:hAnsi="Bahnschrift Light SemiCondensed" w:cs="Bahnschrift Light SemiCondensed"/>
+          <w:color w:val="auto"/>
+          <w:sz w:val="24"/>
+          <w:szCs w:val="36"/>
+          <w:lang w:val="pt-BR"/>
+        </w:rPr>
+      </w:pPr>
+      <w:r>
+        <w:rPr>
+          <w:rFonts w:hint="default" w:ascii="Bahnschrift Light SemiCondensed" w:hAnsi="Bahnschrift Light SemiCondensed" w:cs="Bahnschrift Light SemiCondensed"/>
+          <w:b/>
+          <w:bCs w:val="0"/>
+          <w:color w:val="auto"/>
+          <w:sz w:val="24"/>
+          <w:szCs w:val="36"/>
+        </w:rPr>
+        <w:t>ROLLBACK;</w:t>
+      </w:r>
+      <w:r>
+        <w:rPr>
+          <w:rFonts w:hint="default" w:ascii="Bahnschrift Light SemiCondensed" w:hAnsi="Bahnschrift Light SemiCondensed" w:cs="Bahnschrift Light SemiCondensed"/>
+          <w:b/>
+          <w:bCs w:val="0"/>
+          <w:color w:val="auto"/>
+          <w:sz w:val="24"/>
+          <w:szCs w:val="36"/>
+          <w:lang w:val="pt-BR"/>
+        </w:rPr>
+        <w:tab/>
+      </w:r>
+      <w:r>
+        <w:rPr>
+          <w:rFonts w:hint="default" w:ascii="Bahnschrift Light SemiCondensed" w:hAnsi="Bahnschrift Light SemiCondensed" w:cs="Bahnschrift Light SemiCondensed"/>
+          <w:color w:val="auto"/>
+          <w:sz w:val="24"/>
+          <w:szCs w:val="36"/>
+          <w:lang w:val="pt-BR"/>
+        </w:rPr>
+        <w:tab/>
+      </w:r>
+      <w:r>
+        <w:rPr>
+          <w:rFonts w:hint="default" w:ascii="Bahnschrift Light SemiCondensed" w:hAnsi="Bahnschrift Light SemiCondensed" w:cs="Bahnschrift Light SemiCondensed"/>
+          <w:color w:val="auto"/>
+          <w:sz w:val="24"/>
+          <w:szCs w:val="36"/>
+          <w:lang w:val="pt-BR"/>
+        </w:rPr>
+        <w:tab/>
+      </w:r>
+      <w:r>
+        <w:rPr>
+          <w:rFonts w:hint="default" w:ascii="Bahnschrift Light SemiCondensed" w:hAnsi="Bahnschrift Light SemiCondensed" w:cs="Bahnschrift Light SemiCondensed"/>
+          <w:color w:val="auto"/>
+          <w:sz w:val="24"/>
+          <w:szCs w:val="36"/>
+          <w:lang w:val="pt-BR"/>
+        </w:rPr>
+        <w:t>→</w:t>
+      </w:r>
+      <w:r>
+        <w:rPr>
+          <w:rFonts w:hint="default" w:ascii="Bahnschrift Light SemiCondensed" w:hAnsi="Bahnschrift Light SemiCondensed" w:cs="Bahnschrift Light SemiCondensed"/>
+          <w:color w:val="auto"/>
+          <w:sz w:val="24"/>
+          <w:szCs w:val="36"/>
+          <w:lang w:val="pt-BR"/>
+        </w:rPr>
+        <w:tab/>
+      </w:r>
+      <w:r>
+        <w:rPr>
+          <w:rFonts w:hint="default" w:ascii="Bahnschrift Light SemiCondensed" w:hAnsi="Bahnschrift Light SemiCondensed" w:cs="Bahnschrift Light SemiCondensed"/>
+          <w:color w:val="auto"/>
+          <w:sz w:val="24"/>
+          <w:szCs w:val="36"/>
+          <w:lang w:val="pt-BR"/>
+        </w:rPr>
+        <w:tab/>
+      </w:r>
+      <w:r>
+        <w:rPr>
+          <w:rFonts w:hint="default" w:ascii="Bahnschrift Light SemiCondensed" w:hAnsi="Bahnschrift Light SemiCondensed" w:cs="Bahnschrift Light SemiCondensed"/>
+          <w:color w:val="auto"/>
+          <w:sz w:val="24"/>
+          <w:szCs w:val="36"/>
+          <w:lang w:val="pt-BR"/>
+        </w:rPr>
+        <w:t xml:space="preserve">Comando utilizado para desfazer </w:t>
+      </w:r>
+    </w:p>
+    <w:p>
+      <w:pPr>
+        <w:spacing w:beforeLines="0" w:afterLines="0"/>
+        <w:jc w:val="left"/>
+        <w:rPr>
+          <w:rFonts w:hint="default" w:ascii="Bahnschrift Light SemiCondensed" w:hAnsi="Bahnschrift Light SemiCondensed" w:cs="Bahnschrift Light SemiCondensed"/>
+          <w:color w:val="auto"/>
+          <w:sz w:val="24"/>
+          <w:szCs w:val="36"/>
+          <w:lang w:val="pt-BR"/>
+        </w:rPr>
+      </w:pPr>
+    </w:p>
+    <w:p>
+      <w:pPr>
+        <w:spacing w:beforeLines="0" w:afterLines="0"/>
+        <w:jc w:val="left"/>
+        <w:rPr>
+          <w:rFonts w:hint="default" w:ascii="Bahnschrift Light SemiCondensed" w:hAnsi="Bahnschrift Light SemiCondensed" w:cs="Bahnschrift Light SemiCondensed"/>
+          <w:color w:val="auto"/>
+          <w:sz w:val="24"/>
+          <w:szCs w:val="36"/>
+          <w:lang w:val="pt-BR"/>
+        </w:rPr>
+      </w:pPr>
+      <w:r>
+        <w:rPr>
+          <w:rFonts w:hint="default" w:ascii="Bahnschrift Light SemiCondensed" w:hAnsi="Bahnschrift Light SemiCondensed" w:cs="Bahnschrift Light SemiCondensed"/>
+          <w:color w:val="auto"/>
+          <w:sz w:val="24"/>
+          <w:szCs w:val="36"/>
+          <w:lang w:val="pt-BR"/>
+        </w:rPr>
+        <w:t>uma transação caso algo de errado durante o processo.</w:t>
+      </w:r>
+      <w:bookmarkStart w:id="0" w:name="_GoBack"/>
+      <w:bookmarkEnd w:id="0"/>
+    </w:p>
+    <w:p>
+      <w:pPr>
+        <w:spacing w:beforeLines="0" w:afterLines="0"/>
+        <w:jc w:val="left"/>
+        <w:rPr>
+          <w:rFonts w:hint="default" w:ascii="Bahnschrift Light SemiCondensed" w:hAnsi="Bahnschrift Light SemiCondensed" w:cs="Bahnschrift Light SemiCondensed"/>
+          <w:b/>
+          <w:bCs/>
+          <w:color w:val="auto"/>
+          <w:sz w:val="24"/>
+          <w:szCs w:val="36"/>
+          <w:lang w:val="pt-BR"/>
+        </w:rPr>
+      </w:pPr>
+    </w:p>
+    <w:p>
+      <w:pPr>
+        <w:spacing w:beforeLines="0" w:afterLines="0"/>
+        <w:jc w:val="left"/>
+        <w:rPr>
+          <w:rFonts w:hint="default" w:ascii="Bahnschrift Light SemiCondensed" w:hAnsi="Bahnschrift Light SemiCondensed" w:cs="Bahnschrift Light SemiCondensed"/>
+          <w:b/>
+          <w:bCs/>
+          <w:color w:val="auto"/>
+          <w:sz w:val="24"/>
+          <w:szCs w:val="36"/>
+          <w:lang w:val="pt-BR"/>
+        </w:rPr>
+      </w:pPr>
+      <w:r>
+        <w:rPr>
+          <w:rFonts w:hint="default" w:ascii="Bahnschrift Light SemiCondensed" w:hAnsi="Bahnschrift Light SemiCondensed" w:cs="Bahnschrift Light SemiCondensed"/>
+          <w:b/>
+          <w:bCs/>
+          <w:color w:val="auto"/>
+          <w:sz w:val="24"/>
+          <w:szCs w:val="36"/>
+          <w:lang w:val="pt-BR"/>
+        </w:rPr>
+        <w:tab/>
+        <w:t/>
+      </w:r>
+      <w:r>
+        <w:rPr>
+          <w:rFonts w:hint="default" w:ascii="Bahnschrift Light SemiCondensed" w:hAnsi="Bahnschrift Light SemiCondensed" w:cs="Bahnschrift Light SemiCondensed"/>
+          <w:b/>
+          <w:bCs/>
+          <w:color w:val="auto"/>
+          <w:sz w:val="24"/>
+          <w:szCs w:val="36"/>
+          <w:lang w:val="pt-BR"/>
+        </w:rPr>
+        <w:tab/>
+      </w:r>
+    </w:p>
+    <w:p>
+      <w:pPr>
+        <w:spacing w:beforeLines="0" w:afterLines="0"/>
+        <w:jc w:val="left"/>
+        <w:rPr>
+          <w:rFonts w:hint="default" w:ascii="Bahnschrift Light SemiCondensed" w:hAnsi="Bahnschrift Light SemiCondensed" w:cs="Bahnschrift Light SemiCondensed"/>
+          <w:b/>
+          <w:bCs/>
+          <w:color w:val="auto"/>
+          <w:sz w:val="24"/>
+          <w:szCs w:val="36"/>
           <w:lang w:val="pt-BR"/>
         </w:rPr>
       </w:pPr>
@@ -24112,6 +27049,20 @@
           <w:lang w:val="pt-BR"/>
         </w:rPr>
         <w:tab/>
+      </w:r>
+      <w:r>
+        <w:rPr>
+          <w:rFonts w:hint="default" w:ascii="Bahnschrift Light SemiCondensed" w:hAnsi="Bahnschrift Light SemiCondensed"/>
+          <w:b w:val="0"/>
+          <w:bCs w:val="0"/>
+          <w:i w:val="0"/>
+          <w:iCs w:val="0"/>
+          <w:color w:val="auto"/>
+          <w:sz w:val="24"/>
+          <w:szCs w:val="24"/>
+          <w:u w:val="none"/>
+          <w:lang w:val="pt-BR"/>
+        </w:rPr>
         <w:t>Aqui vamos dar foco a Relacionamentos Múltiplo, em específico Relacionamentos Duplos, com apenas 2 entidades no caso.</w:t>
       </w:r>
     </w:p>
@@ -24145,6 +27096,20 @@
           <w:lang w:val="pt-BR"/>
         </w:rPr>
         <w:tab/>
+      </w:r>
+      <w:r>
+        <w:rPr>
+          <w:rFonts w:hint="default" w:ascii="Bahnschrift Light SemiCondensed" w:hAnsi="Bahnschrift Light SemiCondensed"/>
+          <w:b w:val="0"/>
+          <w:bCs w:val="0"/>
+          <w:i w:val="0"/>
+          <w:iCs w:val="0"/>
+          <w:color w:val="auto"/>
+          <w:sz w:val="24"/>
+          <w:szCs w:val="24"/>
+          <w:u w:val="none"/>
+          <w:lang w:val="pt-BR"/>
+        </w:rPr>
         <w:t xml:space="preserve">Damos o nome para essa estrutura lógica de </w:t>
       </w:r>
       <w:r>
@@ -24268,6 +27233,20 @@
           <w:lang w:val="pt-BR"/>
         </w:rPr>
         <w:tab/>
+      </w:r>
+      <w:r>
+        <w:rPr>
+          <w:rFonts w:hint="default" w:ascii="Bahnschrift Light SemiCondensed" w:hAnsi="Bahnschrift Light SemiCondensed"/>
+          <w:b w:val="0"/>
+          <w:bCs w:val="0"/>
+          <w:i w:val="0"/>
+          <w:iCs w:val="0"/>
+          <w:color w:val="auto"/>
+          <w:sz w:val="24"/>
+          <w:szCs w:val="24"/>
+          <w:u w:val="none"/>
+          <w:lang w:val="pt-BR"/>
+        </w:rPr>
         <w:t xml:space="preserve">Sempre que ver uma entidade veja como um container, onde dentro deste temos certos tipos de dados que chamamos de </w:t>
       </w:r>
       <w:r>
@@ -24331,6 +27310,20 @@
           <w:lang w:val="pt-BR"/>
         </w:rPr>
         <w:tab/>
+      </w:r>
+      <w:r>
+        <w:rPr>
+          <w:rFonts w:hint="default" w:ascii="Bahnschrift Light SemiCondensed" w:hAnsi="Bahnschrift Light SemiCondensed"/>
+          <w:b w:val="0"/>
+          <w:bCs w:val="0"/>
+          <w:i w:val="0"/>
+          <w:iCs w:val="0"/>
+          <w:color w:val="auto"/>
+          <w:sz w:val="24"/>
+          <w:szCs w:val="24"/>
+          <w:u w:val="none"/>
+          <w:lang w:val="pt-BR"/>
+        </w:rPr>
         <w:t>Cada entidade pode se relacionar com qualquer registro de outra tabela, e quantos registros ela precisar.</w:t>
       </w:r>
     </w:p>
@@ -24766,6 +27759,20 @@
           <w:lang w:val="pt-BR"/>
         </w:rPr>
         <w:tab/>
+      </w:r>
+      <w:r>
+        <w:rPr>
+          <w:rFonts w:hint="default" w:ascii="Bahnschrift Light SemiCondensed" w:hAnsi="Bahnschrift Light SemiCondensed"/>
+          <w:b w:val="0"/>
+          <w:bCs w:val="0"/>
+          <w:i w:val="0"/>
+          <w:iCs w:val="0"/>
+          <w:color w:val="auto"/>
+          <w:sz w:val="24"/>
+          <w:szCs w:val="24"/>
+          <w:u w:val="none"/>
+          <w:lang w:val="pt-BR"/>
+        </w:rPr>
         <w:t xml:space="preserve">A quantidade de registros que uma entidade pode se relacionar em outra entidade é chamada de </w:t>
       </w:r>
       <w:r>
@@ -24906,6 +27913,20 @@
           <w:lang w:val="pt-BR"/>
         </w:rPr>
         <w:tab/>
+      </w:r>
+      <w:r>
+        <w:rPr>
+          <w:rFonts w:hint="default" w:ascii="Bahnschrift Light SemiCondensed" w:hAnsi="Bahnschrift Light SemiCondensed"/>
+          <w:b w:val="0"/>
+          <w:bCs w:val="0"/>
+          <w:i w:val="0"/>
+          <w:iCs w:val="0"/>
+          <w:color w:val="auto"/>
+          <w:sz w:val="24"/>
+          <w:szCs w:val="24"/>
+          <w:u w:val="none"/>
+          <w:lang w:val="pt-BR"/>
+        </w:rPr>
         <w:t xml:space="preserve">Podemos ter relacionamentos </w:t>
       </w:r>
       <w:r>
@@ -25207,6 +28228,20 @@
           <w:lang w:val="pt-BR"/>
         </w:rPr>
         <w:tab/>
+      </w:r>
+      <w:r>
+        <w:rPr>
+          <w:rFonts w:hint="default" w:ascii="Bahnschrift Light SemiCondensed" w:hAnsi="Bahnschrift Light SemiCondensed"/>
+          <w:b w:val="0"/>
+          <w:bCs w:val="0"/>
+          <w:i w:val="0"/>
+          <w:iCs w:val="0"/>
+          <w:color w:val="auto"/>
+          <w:sz w:val="24"/>
+          <w:szCs w:val="24"/>
+          <w:u w:val="none"/>
+          <w:lang w:val="pt-BR"/>
+        </w:rPr>
         <w:t xml:space="preserve">Podemos ter também relacionamentos </w:t>
       </w:r>
       <w:r>
@@ -25621,6 +28656,20 @@
           <w:lang w:val="pt-BR"/>
         </w:rPr>
         <w:tab/>
+      </w:r>
+      <w:r>
+        <w:rPr>
+          <w:rFonts w:hint="default" w:ascii="Bahnschrift Light SemiCondensed" w:hAnsi="Bahnschrift Light SemiCondensed"/>
+          <w:b w:val="0"/>
+          <w:bCs w:val="0"/>
+          <w:i w:val="0"/>
+          <w:iCs w:val="0"/>
+          <w:color w:val="auto"/>
+          <w:sz w:val="24"/>
+          <w:szCs w:val="24"/>
+          <w:u w:val="none"/>
+          <w:lang w:val="pt-BR"/>
+        </w:rPr>
         <w:t xml:space="preserve">E por último podemos ter o relacionamento </w:t>
       </w:r>
       <w:r>
@@ -26024,6 +29073,20 @@
           <w:lang w:val="pt-BR"/>
         </w:rPr>
         <w:tab/>
+      </w:r>
+      <w:r>
+        <w:rPr>
+          <w:rFonts w:hint="default" w:ascii="Bahnschrift Light SemiCondensed" w:hAnsi="Bahnschrift Light SemiCondensed"/>
+          <w:b w:val="0"/>
+          <w:bCs w:val="0"/>
+          <w:i w:val="0"/>
+          <w:iCs w:val="0"/>
+          <w:color w:val="auto"/>
+          <w:sz w:val="24"/>
+          <w:szCs w:val="24"/>
+          <w:u w:val="none"/>
+          <w:lang w:val="pt-BR"/>
+        </w:rPr>
         <w:t xml:space="preserve">Para fazer esses relacionamentos vamos necessitar de outro tipo de chave que se chama </w:t>
       </w:r>
       <w:r>
@@ -26087,6 +29150,20 @@
           <w:lang w:val="pt-BR"/>
         </w:rPr>
         <w:tab/>
+      </w:r>
+      <w:r>
+        <w:rPr>
+          <w:rFonts w:hint="default" w:ascii="Bahnschrift Light SemiCondensed" w:hAnsi="Bahnschrift Light SemiCondensed"/>
+          <w:b w:val="0"/>
+          <w:bCs w:val="0"/>
+          <w:i w:val="0"/>
+          <w:iCs w:val="0"/>
+          <w:color w:val="auto"/>
+          <w:sz w:val="24"/>
+          <w:szCs w:val="24"/>
+          <w:u w:val="none"/>
+          <w:lang w:val="pt-BR"/>
+        </w:rPr>
         <w:t xml:space="preserve">Imagine o planeta terra. De um lado do planeta temos a entidade </w:t>
       </w:r>
       <w:r>
@@ -26180,6 +29257,20 @@
           <w:lang w:val="pt-BR"/>
         </w:rPr>
         <w:tab/>
+      </w:r>
+      <w:r>
+        <w:rPr>
+          <w:rFonts w:hint="default" w:ascii="Bahnschrift Light SemiCondensed" w:hAnsi="Bahnschrift Light SemiCondensed"/>
+          <w:b w:val="0"/>
+          <w:bCs w:val="0"/>
+          <w:i w:val="0"/>
+          <w:iCs w:val="0"/>
+          <w:color w:val="auto"/>
+          <w:sz w:val="24"/>
+          <w:szCs w:val="24"/>
+          <w:u w:val="none"/>
+          <w:lang w:val="pt-BR"/>
+        </w:rPr>
         <w:t xml:space="preserve">Se quisermos que a entidade X que tem uma chave </w:t>
       </w:r>
       <w:r>
@@ -26660,6 +29751,20 @@
           <w:lang w:val="pt-BR"/>
         </w:rPr>
         <w:tab/>
+      </w:r>
+      <w:r>
+        <w:rPr>
+          <w:rFonts w:hint="default" w:ascii="Bahnschrift Light SemiCondensed" w:hAnsi="Bahnschrift Light SemiCondensed"/>
+          <w:b w:val="0"/>
+          <w:bCs w:val="0"/>
+          <w:i w:val="0"/>
+          <w:iCs w:val="0"/>
+          <w:color w:val="auto"/>
+          <w:sz w:val="24"/>
+          <w:szCs w:val="24"/>
+          <w:u w:val="none"/>
+          <w:lang w:val="pt-BR"/>
+        </w:rPr>
         <w:t>Para criar por exemplo um relacionamento one-to-one precisamos pensar que podemos juntar tudo em uma tabela só.</w:t>
       </w:r>
     </w:p>
@@ -26693,6 +29798,20 @@
           <w:lang w:val="pt-BR"/>
         </w:rPr>
         <w:tab/>
+      </w:r>
+      <w:r>
+        <w:rPr>
+          <w:rFonts w:hint="default" w:ascii="Bahnschrift Light SemiCondensed" w:hAnsi="Bahnschrift Light SemiCondensed"/>
+          <w:b w:val="0"/>
+          <w:bCs w:val="0"/>
+          <w:i w:val="0"/>
+          <w:iCs w:val="0"/>
+          <w:color w:val="auto"/>
+          <w:sz w:val="24"/>
+          <w:szCs w:val="24"/>
+          <w:u w:val="none"/>
+          <w:lang w:val="pt-BR"/>
+        </w:rPr>
         <w:t>Para isso precisamos pensar primeiramente em uma entidade dominante.</w:t>
       </w:r>
     </w:p>
@@ -26726,6 +29845,20 @@
           <w:lang w:val="pt-BR"/>
         </w:rPr>
         <w:tab/>
+      </w:r>
+      <w:r>
+        <w:rPr>
+          <w:rFonts w:hint="default" w:ascii="Bahnschrift Light SemiCondensed" w:hAnsi="Bahnschrift Light SemiCondensed"/>
+          <w:b w:val="0"/>
+          <w:bCs w:val="0"/>
+          <w:i w:val="0"/>
+          <w:iCs w:val="0"/>
+          <w:color w:val="auto"/>
+          <w:sz w:val="24"/>
+          <w:szCs w:val="24"/>
+          <w:u w:val="none"/>
+          <w:lang w:val="pt-BR"/>
+        </w:rPr>
         <w:t>Então pegamos a chave primária de uma das entidades e transferimos sua copia FK para a outra entidade.</w:t>
       </w:r>
     </w:p>
@@ -26759,6 +29892,20 @@
           <w:lang w:val="pt-BR"/>
         </w:rPr>
         <w:tab/>
+      </w:r>
+      <w:r>
+        <w:rPr>
+          <w:rFonts w:hint="default" w:ascii="Bahnschrift Light SemiCondensed" w:hAnsi="Bahnschrift Light SemiCondensed"/>
+          <w:b w:val="0"/>
+          <w:bCs w:val="0"/>
+          <w:i w:val="0"/>
+          <w:iCs w:val="0"/>
+          <w:color w:val="auto"/>
+          <w:sz w:val="24"/>
+          <w:szCs w:val="24"/>
+          <w:u w:val="none"/>
+          <w:lang w:val="pt-BR"/>
+        </w:rPr>
         <w:t>O nome da FK nesse caso será o mesmo nome da chave PK na entidade original.</w:t>
       </w:r>
     </w:p>
@@ -27130,6 +30277,20 @@
           <w:lang w:val="pt-BR"/>
         </w:rPr>
         <w:tab/>
+      </w:r>
+      <w:r>
+        <w:rPr>
+          <w:rFonts w:hint="default" w:ascii="Bahnschrift Light SemiCondensed" w:hAnsi="Bahnschrift Light SemiCondensed"/>
+          <w:b w:val="0"/>
+          <w:bCs w:val="0"/>
+          <w:i w:val="0"/>
+          <w:iCs w:val="0"/>
+          <w:color w:val="auto"/>
+          <w:sz w:val="24"/>
+          <w:szCs w:val="24"/>
+          <w:u w:val="none"/>
+          <w:lang w:val="pt-BR"/>
+        </w:rPr>
         <w:t>Já para relacionamentos one-to-many ou many-to-one, fazemos da mesma maneira do relacionamento one-to-one porém a chave estrangeira seguirá outro padrão de nomenclatura.</w:t>
       </w:r>
     </w:p>
@@ -27486,6 +30647,20 @@
           <w:lang w:val="pt-BR"/>
         </w:rPr>
         <w:tab/>
+      </w:r>
+      <w:r>
+        <w:rPr>
+          <w:rFonts w:hint="default" w:ascii="Bahnschrift Light SemiCondensed" w:hAnsi="Bahnschrift Light SemiCondensed"/>
+          <w:b w:val="0"/>
+          <w:bCs w:val="0"/>
+          <w:i w:val="0"/>
+          <w:iCs w:val="0"/>
+          <w:color w:val="auto"/>
+          <w:sz w:val="24"/>
+          <w:szCs w:val="24"/>
+          <w:u w:val="none"/>
+          <w:lang w:val="pt-BR"/>
+        </w:rPr>
         <w:t>Para relacionamentos many-to-many faremos o relacionamento virar uma entidade e está se relacionará com ambas as outras duas entidades e após isso aplicamos a PK como em many-to-one.</w:t>
       </w:r>
     </w:p>
@@ -27789,10 +30964,22 @@
           <w:lang w:val="pt-BR"/>
         </w:rPr>
         <w:tab/>
+      </w:r>
+      <w:r>
+        <w:rPr>
+          <w:rFonts w:hint="default" w:ascii="Bahnschrift Light SemiCondensed" w:hAnsi="Bahnschrift Light SemiCondensed"/>
+          <w:b w:val="0"/>
+          <w:bCs w:val="0"/>
+          <w:i w:val="0"/>
+          <w:iCs w:val="0"/>
+          <w:color w:val="auto"/>
+          <w:sz w:val="24"/>
+          <w:szCs w:val="24"/>
+          <w:u w:val="none"/>
+          <w:lang w:val="pt-BR"/>
+        </w:rPr>
         <w:t>A partir desse conhecimento agora podemos aprender outro conceito que se chama JOIN.</w:t>
       </w:r>
-      <w:bookmarkStart w:id="0" w:name="_GoBack"/>
-      <w:bookmarkEnd w:id="0"/>
     </w:p>
     <w:sectPr>
       <w:pgSz w:w="11906" w:h="16838"/>

</xml_diff>

<commit_message>
Fim do Curso de Banco de Dados do Curso em Vídeo
</commit_message>
<xml_diff>
--- a/Curso de Banco de Dados Curso em Vídeo/Comandos MySQL.docx
+++ b/Curso de Banco de Dados Curso em Vídeo/Comandos MySQL.docx
@@ -30917,6 +30917,20 @@
           <w:lang w:val="pt-BR"/>
         </w:rPr>
         <w:tab/>
+      </w:r>
+      <w:r>
+        <w:rPr>
+          <w:rFonts w:hint="default" w:ascii="Bahnschrift Light SemiCondensed" w:hAnsi="Bahnschrift Light SemiCondensed"/>
+          <w:b w:val="0"/>
+          <w:bCs w:val="0"/>
+          <w:i w:val="0"/>
+          <w:iCs w:val="0"/>
+          <w:color w:val="auto"/>
+          <w:sz w:val="24"/>
+          <w:szCs w:val="24"/>
+          <w:u w:val="none"/>
+          <w:lang w:val="pt-BR"/>
+        </w:rPr>
         <w:t xml:space="preserve">Quando criamos uma Tabela SQL, precisamos definir um </w:t>
       </w:r>
       <w:r>
@@ -30980,6 +30994,20 @@
           <w:lang w:val="pt-BR"/>
         </w:rPr>
         <w:tab/>
+      </w:r>
+      <w:r>
+        <w:rPr>
+          <w:rFonts w:hint="default" w:ascii="Bahnschrift Light SemiCondensed" w:hAnsi="Bahnschrift Light SemiCondensed"/>
+          <w:b w:val="0"/>
+          <w:bCs w:val="0"/>
+          <w:i w:val="0"/>
+          <w:iCs w:val="0"/>
+          <w:color w:val="auto"/>
+          <w:sz w:val="24"/>
+          <w:szCs w:val="24"/>
+          <w:u w:val="none"/>
+          <w:lang w:val="pt-BR"/>
+        </w:rPr>
         <w:t>Ao abrir por exemplo um Backup de um arquivo SQL, vamos nos deparar com essa configuração quase no final do código...</w:t>
       </w:r>
     </w:p>
@@ -31200,6 +31228,20 @@
           <w:lang w:val="pt-BR"/>
         </w:rPr>
         <w:tab/>
+      </w:r>
+      <w:r>
+        <w:rPr>
+          <w:rFonts w:hint="default" w:ascii="Bahnschrift Light SemiCondensed" w:hAnsi="Bahnschrift Light SemiCondensed"/>
+          <w:b w:val="0"/>
+          <w:bCs w:val="0"/>
+          <w:i w:val="0"/>
+          <w:iCs w:val="0"/>
+          <w:color w:val="auto"/>
+          <w:sz w:val="24"/>
+          <w:szCs w:val="24"/>
+          <w:u w:val="none"/>
+          <w:lang w:val="pt-BR"/>
+        </w:rPr>
         <w:t xml:space="preserve">Percebemos que por padrão a </w:t>
       </w:r>
       <w:r>
@@ -31263,6 +31305,20 @@
           <w:lang w:val="pt-BR"/>
         </w:rPr>
         <w:tab/>
+      </w:r>
+      <w:r>
+        <w:rPr>
+          <w:rFonts w:hint="default" w:ascii="Bahnschrift Light SemiCondensed" w:hAnsi="Bahnschrift Light SemiCondensed"/>
+          <w:b w:val="0"/>
+          <w:bCs w:val="0"/>
+          <w:i w:val="0"/>
+          <w:iCs w:val="0"/>
+          <w:color w:val="auto"/>
+          <w:sz w:val="24"/>
+          <w:szCs w:val="24"/>
+          <w:u w:val="none"/>
+          <w:lang w:val="pt-BR"/>
+        </w:rPr>
         <w:t>O InnoDB foi criado pelo InnoBase que hoje pertence a Oracle, e este é o mecanismo que  permiti criar tabelas com algumas características importantes, como suportar Chaves Estrangeiras ( FK ).</w:t>
       </w:r>
     </w:p>
@@ -31296,6 +31352,20 @@
           <w:lang w:val="pt-BR"/>
         </w:rPr>
         <w:tab/>
+      </w:r>
+      <w:r>
+        <w:rPr>
+          <w:rFonts w:hint="default" w:ascii="Bahnschrift Light SemiCondensed" w:hAnsi="Bahnschrift Light SemiCondensed"/>
+          <w:b w:val="0"/>
+          <w:bCs w:val="0"/>
+          <w:i w:val="0"/>
+          <w:iCs w:val="0"/>
+          <w:color w:val="auto"/>
+          <w:sz w:val="24"/>
+          <w:szCs w:val="24"/>
+          <w:u w:val="none"/>
+          <w:lang w:val="pt-BR"/>
+        </w:rPr>
         <w:t xml:space="preserve">Você também pode escolher usar outros mecanismos como o </w:t>
       </w:r>
       <w:r>
@@ -31385,6 +31455,20 @@
           <w:lang w:val="pt-BR"/>
         </w:rPr>
         <w:tab/>
+      </w:r>
+      <w:r>
+        <w:rPr>
+          <w:rFonts w:hint="default" w:ascii="Bahnschrift Light SemiCondensed" w:hAnsi="Bahnschrift Light SemiCondensed"/>
+          <w:b w:val="0"/>
+          <w:bCs w:val="0"/>
+          <w:i w:val="0"/>
+          <w:iCs w:val="0"/>
+          <w:color w:val="auto"/>
+          <w:sz w:val="24"/>
+          <w:szCs w:val="24"/>
+          <w:u w:val="none"/>
+          <w:lang w:val="pt-BR"/>
+        </w:rPr>
         <w:t xml:space="preserve">Muitas empresas usavam o </w:t>
       </w:r>
       <w:r>
@@ -31550,6 +31634,16 @@
           <w:lang w:val="pt-BR"/>
         </w:rPr>
         <w:tab/>
+      </w:r>
+      <w:r>
+        <w:rPr>
+          <w:rFonts w:hint="default" w:ascii="Bahnschrift Light SemiCondensed" w:hAnsi="Bahnschrift Light SemiCondensed" w:eastAsia="SimSun" w:cs="Bahnschrift Light SemiCondensed"/>
+          <w:b w:val="0"/>
+          <w:bCs w:val="0"/>
+          <w:sz w:val="24"/>
+          <w:szCs w:val="24"/>
+          <w:lang w:val="pt-BR"/>
+        </w:rPr>
         <w:t>Toda transação precisar seguir as caracteríscas do ACID:</w:t>
       </w:r>
     </w:p>
@@ -31600,7 +31694,6 @@
           <w:lang w:val="pt-BR"/>
         </w:rPr>
         <w:tab/>
-        <w:t/>
       </w:r>
       <w:r>
         <w:rPr>
@@ -31612,6 +31705,16 @@
           <w:lang w:val="pt-BR"/>
         </w:rPr>
         <w:tab/>
+      </w:r>
+      <w:r>
+        <w:rPr>
+          <w:rFonts w:hint="default" w:ascii="Bahnschrift Light SemiCondensed" w:hAnsi="Bahnschrift Light SemiCondensed" w:eastAsia="SimSun" w:cs="Bahnschrift Light SemiCondensed"/>
+          <w:b/>
+          <w:bCs/>
+          <w:sz w:val="24"/>
+          <w:szCs w:val="24"/>
+          <w:lang w:val="pt-BR"/>
+        </w:rPr>
         <w:t>→</w:t>
       </w:r>
       <w:r>
@@ -31685,7 +31788,6 @@
           <w:lang w:val="pt-BR"/>
         </w:rPr>
         <w:tab/>
-        <w:t/>
       </w:r>
       <w:r>
         <w:rPr>
@@ -31697,6 +31799,16 @@
           <w:lang w:val="pt-BR"/>
         </w:rPr>
         <w:tab/>
+      </w:r>
+      <w:r>
+        <w:rPr>
+          <w:rFonts w:hint="default" w:ascii="Bahnschrift Light SemiCondensed" w:hAnsi="Bahnschrift Light SemiCondensed" w:eastAsia="SimSun" w:cs="Bahnschrift Light SemiCondensed"/>
+          <w:b/>
+          <w:bCs/>
+          <w:sz w:val="24"/>
+          <w:szCs w:val="24"/>
+          <w:lang w:val="pt-BR"/>
+        </w:rPr>
         <w:t>→</w:t>
       </w:r>
       <w:r>
@@ -31770,7 +31882,6 @@
           <w:lang w:val="pt-BR"/>
         </w:rPr>
         <w:tab/>
-        <w:t/>
       </w:r>
       <w:r>
         <w:rPr>
@@ -31782,6 +31893,16 @@
           <w:lang w:val="pt-BR"/>
         </w:rPr>
         <w:tab/>
+      </w:r>
+      <w:r>
+        <w:rPr>
+          <w:rFonts w:hint="default" w:ascii="Bahnschrift Light SemiCondensed" w:hAnsi="Bahnschrift Light SemiCondensed" w:eastAsia="SimSun" w:cs="Bahnschrift Light SemiCondensed"/>
+          <w:b/>
+          <w:bCs/>
+          <w:sz w:val="24"/>
+          <w:szCs w:val="24"/>
+          <w:lang w:val="pt-BR"/>
+        </w:rPr>
         <w:t>→</w:t>
       </w:r>
       <w:r>
@@ -31855,7 +31976,6 @@
           <w:lang w:val="pt-BR"/>
         </w:rPr>
         <w:tab/>
-        <w:t/>
       </w:r>
       <w:r>
         <w:rPr>
@@ -31867,6 +31987,16 @@
           <w:lang w:val="pt-BR"/>
         </w:rPr>
         <w:tab/>
+      </w:r>
+      <w:r>
+        <w:rPr>
+          <w:rFonts w:hint="default" w:ascii="Bahnschrift Light SemiCondensed" w:hAnsi="Bahnschrift Light SemiCondensed" w:eastAsia="SimSun" w:cs="Bahnschrift Light SemiCondensed"/>
+          <w:b/>
+          <w:bCs/>
+          <w:sz w:val="24"/>
+          <w:szCs w:val="24"/>
+          <w:lang w:val="pt-BR"/>
+        </w:rPr>
         <w:t>→</w:t>
       </w:r>
       <w:r>
@@ -32198,6 +32328,15 @@
           <w:lang w:val="pt-BR"/>
         </w:rPr>
         <w:tab/>
+      </w:r>
+      <w:r>
+        <w:rPr>
+          <w:rFonts w:hint="default" w:ascii="Bahnschrift Light SemiCondensed" w:hAnsi="Bahnschrift Light SemiCondensed" w:cs="Bahnschrift Light SemiCondensed"/>
+          <w:color w:val="auto"/>
+          <w:sz w:val="24"/>
+          <w:szCs w:val="24"/>
+          <w:lang w:val="pt-BR"/>
+        </w:rPr>
         <w:t>→</w:t>
       </w:r>
       <w:r>
@@ -32209,17 +32348,25 @@
           <w:lang w:val="pt-BR"/>
         </w:rPr>
         <w:tab/>
-        <w:t/>
-      </w:r>
-      <w:r>
-        <w:rPr>
-          <w:rFonts w:hint="default" w:ascii="Bahnschrift Light SemiCondensed" w:hAnsi="Bahnschrift Light SemiCondensed" w:cs="Bahnschrift Light SemiCondensed"/>
-          <w:color w:val="auto"/>
-          <w:sz w:val="24"/>
-          <w:szCs w:val="24"/>
-          <w:lang w:val="pt-BR"/>
-        </w:rPr>
-        <w:tab/>
+      </w:r>
+      <w:r>
+        <w:rPr>
+          <w:rFonts w:hint="default" w:ascii="Bahnschrift Light SemiCondensed" w:hAnsi="Bahnschrift Light SemiCondensed" w:cs="Bahnschrift Light SemiCondensed"/>
+          <w:color w:val="auto"/>
+          <w:sz w:val="24"/>
+          <w:szCs w:val="24"/>
+          <w:lang w:val="pt-BR"/>
+        </w:rPr>
+        <w:tab/>
+      </w:r>
+      <w:r>
+        <w:rPr>
+          <w:rFonts w:hint="default" w:ascii="Bahnschrift Light SemiCondensed" w:hAnsi="Bahnschrift Light SemiCondensed" w:cs="Bahnschrift Light SemiCondensed"/>
+          <w:color w:val="auto"/>
+          <w:sz w:val="24"/>
+          <w:szCs w:val="24"/>
+          <w:lang w:val="pt-BR"/>
+        </w:rPr>
         <w:t xml:space="preserve">Comando </w:t>
       </w:r>
     </w:p>
@@ -32574,28 +32721,35 @@
           <w:lang w:val="pt-BR"/>
         </w:rPr>
         <w:tab/>
-        <w:t/>
-      </w:r>
-      <w:r>
-        <w:rPr>
-          <w:rFonts w:hint="default" w:ascii="Bahnschrift Light SemiCondensed" w:hAnsi="Bahnschrift Light SemiCondensed" w:cs="Bahnschrift Light SemiCondensed"/>
-          <w:color w:val="auto"/>
-          <w:sz w:val="24"/>
-          <w:szCs w:val="24"/>
-          <w:lang w:val="pt-BR"/>
-        </w:rPr>
-        <w:tab/>
-        <w:t/>
-      </w:r>
-      <w:r>
-        <w:rPr>
-          <w:rFonts w:hint="default" w:ascii="Bahnschrift Light SemiCondensed" w:hAnsi="Bahnschrift Light SemiCondensed" w:cs="Bahnschrift Light SemiCondensed"/>
-          <w:color w:val="auto"/>
-          <w:sz w:val="24"/>
-          <w:szCs w:val="24"/>
-          <w:lang w:val="pt-BR"/>
-        </w:rPr>
-        <w:tab/>
+      </w:r>
+      <w:r>
+        <w:rPr>
+          <w:rFonts w:hint="default" w:ascii="Bahnschrift Light SemiCondensed" w:hAnsi="Bahnschrift Light SemiCondensed" w:cs="Bahnschrift Light SemiCondensed"/>
+          <w:color w:val="auto"/>
+          <w:sz w:val="24"/>
+          <w:szCs w:val="24"/>
+          <w:lang w:val="pt-BR"/>
+        </w:rPr>
+        <w:tab/>
+      </w:r>
+      <w:r>
+        <w:rPr>
+          <w:rFonts w:hint="default" w:ascii="Bahnschrift Light SemiCondensed" w:hAnsi="Bahnschrift Light SemiCondensed" w:cs="Bahnschrift Light SemiCondensed"/>
+          <w:color w:val="auto"/>
+          <w:sz w:val="24"/>
+          <w:szCs w:val="24"/>
+          <w:lang w:val="pt-BR"/>
+        </w:rPr>
+        <w:tab/>
+      </w:r>
+      <w:r>
+        <w:rPr>
+          <w:rFonts w:hint="default" w:ascii="Bahnschrift Light SemiCondensed" w:hAnsi="Bahnschrift Light SemiCondensed" w:cs="Bahnschrift Light SemiCondensed"/>
+          <w:color w:val="auto"/>
+          <w:sz w:val="24"/>
+          <w:szCs w:val="24"/>
+          <w:lang w:val="pt-BR"/>
+        </w:rPr>
         <w:t>→</w:t>
       </w:r>
       <w:r>
@@ -32607,18 +32761,16 @@
           <w:lang w:val="pt-BR"/>
         </w:rPr>
         <w:tab/>
-        <w:t/>
-      </w:r>
-      <w:r>
-        <w:rPr>
-          <w:rFonts w:hint="default" w:ascii="Bahnschrift Light SemiCondensed" w:hAnsi="Bahnschrift Light SemiCondensed" w:cs="Bahnschrift Light SemiCondensed"/>
-          <w:color w:val="auto"/>
-          <w:sz w:val="24"/>
-          <w:szCs w:val="24"/>
-          <w:lang w:val="pt-BR"/>
-        </w:rPr>
-        <w:tab/>
-        <w:t/>
+      </w:r>
+      <w:r>
+        <w:rPr>
+          <w:rFonts w:hint="default" w:ascii="Bahnschrift Light SemiCondensed" w:hAnsi="Bahnschrift Light SemiCondensed" w:cs="Bahnschrift Light SemiCondensed"/>
+          <w:color w:val="auto"/>
+          <w:sz w:val="24"/>
+          <w:szCs w:val="24"/>
+          <w:lang w:val="pt-BR"/>
+        </w:rPr>
+        <w:tab/>
       </w:r>
       <w:r>
         <w:rPr>
@@ -33778,14 +33930,654 @@
         <w:jc w:val="left"/>
         <w:rPr>
           <w:rFonts w:hint="default" w:ascii="Bahnschrift Light SemiCondensed" w:hAnsi="Bahnschrift Light SemiCondensed" w:cs="Bahnschrift Light SemiCondensed"/>
-          <w:b/>
-          <w:bCs/>
-          <w:color w:val="auto"/>
-          <w:sz w:val="24"/>
-          <w:szCs w:val="24"/>
-          <w:lang w:val="pt-BR"/>
-        </w:rPr>
-      </w:pPr>
+          <w:color w:val="auto"/>
+          <w:sz w:val="24"/>
+          <w:szCs w:val="24"/>
+          <w:lang w:val="pt-BR"/>
+        </w:rPr>
+      </w:pPr>
+      <w:r>
+        <w:rPr>
+          <w:rFonts w:hint="default" w:ascii="Bahnschrift Light SemiCondensed" w:hAnsi="Bahnschrift Light SemiCondensed" w:cs="Bahnschrift Light SemiCondensed"/>
+          <w:b/>
+          <w:color w:val="auto"/>
+          <w:sz w:val="24"/>
+          <w:szCs w:val="24"/>
+        </w:rPr>
+        <w:t>SELECT</w:t>
+      </w:r>
+      <w:r>
+        <w:rPr>
+          <w:rFonts w:hint="default" w:ascii="Bahnschrift Light SemiCondensed" w:hAnsi="Bahnschrift Light SemiCondensed" w:cs="Bahnschrift Light SemiCondensed"/>
+          <w:color w:val="auto"/>
+          <w:sz w:val="24"/>
+          <w:szCs w:val="24"/>
+        </w:rPr>
+        <w:t xml:space="preserve"> </w:t>
+      </w:r>
+      <w:r>
+        <w:rPr>
+          <w:rFonts w:hint="default" w:ascii="Bahnschrift Light SemiCondensed" w:hAnsi="Bahnschrift Light SemiCondensed" w:cs="Bahnschrift Light SemiCondensed"/>
+          <w:color w:val="auto"/>
+          <w:sz w:val="24"/>
+          <w:szCs w:val="24"/>
+          <w:lang w:val="pt-BR"/>
+        </w:rPr>
+        <w:t>*</w:t>
+      </w:r>
+    </w:p>
+    <w:p>
+      <w:pPr>
+        <w:spacing w:beforeLines="0" w:afterLines="0"/>
+        <w:jc w:val="left"/>
+        <w:rPr>
+          <w:rFonts w:hint="default" w:ascii="Bahnschrift Light SemiCondensed" w:hAnsi="Bahnschrift Light SemiCondensed" w:cs="Bahnschrift Light SemiCondensed"/>
+          <w:color w:val="auto"/>
+          <w:sz w:val="24"/>
+          <w:szCs w:val="24"/>
+          <w:lang w:val="pt-BR"/>
+        </w:rPr>
+      </w:pPr>
+      <w:r>
+        <w:rPr>
+          <w:rFonts w:hint="default" w:ascii="Bahnschrift Light SemiCondensed" w:hAnsi="Bahnschrift Light SemiCondensed" w:cs="Bahnschrift Light SemiCondensed"/>
+          <w:b/>
+          <w:color w:val="auto"/>
+          <w:sz w:val="24"/>
+          <w:szCs w:val="24"/>
+        </w:rPr>
+        <w:t>FROM</w:t>
+      </w:r>
+      <w:r>
+        <w:rPr>
+          <w:rFonts w:hint="default" w:ascii="Bahnschrift Light SemiCondensed" w:hAnsi="Bahnschrift Light SemiCondensed" w:cs="Bahnschrift Light SemiCondensed"/>
+          <w:color w:val="auto"/>
+          <w:sz w:val="24"/>
+          <w:szCs w:val="24"/>
+        </w:rPr>
+        <w:t xml:space="preserve"> </w:t>
+      </w:r>
+      <w:r>
+        <w:rPr>
+          <w:rFonts w:hint="default" w:ascii="Bahnschrift Light SemiCondensed" w:hAnsi="Bahnschrift Light SemiCondensed" w:cs="Bahnschrift Light SemiCondensed"/>
+          <w:color w:val="auto"/>
+          <w:sz w:val="24"/>
+          <w:szCs w:val="24"/>
+          <w:u w:val="single"/>
+          <w:lang w:val="pt-BR"/>
+        </w:rPr>
+        <w:t>nome_da_tabela_primaria</w:t>
+      </w:r>
+    </w:p>
+    <w:p>
+      <w:pPr>
+        <w:spacing w:beforeLines="0" w:afterLines="0"/>
+        <w:jc w:val="left"/>
+        <w:rPr>
+          <w:rFonts w:hint="default" w:ascii="Bahnschrift Light SemiCondensed" w:hAnsi="Bahnschrift Light SemiCondensed" w:cs="Bahnschrift Light SemiCondensed"/>
+          <w:b/>
+          <w:bCs/>
+          <w:color w:val="auto"/>
+          <w:sz w:val="24"/>
+          <w:szCs w:val="24"/>
+          <w:u w:val="single"/>
+          <w:lang w:val="pt-BR"/>
+        </w:rPr>
+      </w:pPr>
+      <w:r>
+        <w:rPr>
+          <w:rFonts w:hint="default" w:ascii="Bahnschrift Light SemiCondensed" w:hAnsi="Bahnschrift Light SemiCondensed" w:cs="Bahnschrift Light SemiCondensed"/>
+          <w:b/>
+          <w:color w:val="auto"/>
+          <w:sz w:val="24"/>
+          <w:szCs w:val="24"/>
+        </w:rPr>
+        <w:t>INNER</w:t>
+      </w:r>
+      <w:r>
+        <w:rPr>
+          <w:rFonts w:hint="default" w:ascii="Bahnschrift Light SemiCondensed" w:hAnsi="Bahnschrift Light SemiCondensed" w:cs="Bahnschrift Light SemiCondensed"/>
+          <w:color w:val="auto"/>
+          <w:sz w:val="24"/>
+          <w:szCs w:val="24"/>
+        </w:rPr>
+        <w:t xml:space="preserve"> </w:t>
+      </w:r>
+      <w:r>
+        <w:rPr>
+          <w:rFonts w:hint="default" w:ascii="Bahnschrift Light SemiCondensed" w:hAnsi="Bahnschrift Light SemiCondensed" w:cs="Bahnschrift Light SemiCondensed"/>
+          <w:b/>
+          <w:color w:val="auto"/>
+          <w:sz w:val="24"/>
+          <w:szCs w:val="24"/>
+        </w:rPr>
+        <w:t>JOIN</w:t>
+      </w:r>
+      <w:r>
+        <w:rPr>
+          <w:rFonts w:hint="default" w:ascii="Bahnschrift Light SemiCondensed" w:hAnsi="Bahnschrift Light SemiCondensed" w:cs="Bahnschrift Light SemiCondensed"/>
+          <w:color w:val="auto"/>
+          <w:sz w:val="24"/>
+          <w:szCs w:val="24"/>
+        </w:rPr>
+        <w:t xml:space="preserve"> </w:t>
+      </w:r>
+      <w:r>
+        <w:rPr>
+          <w:rFonts w:hint="default" w:ascii="Bahnschrift Light SemiCondensed" w:hAnsi="Bahnschrift Light SemiCondensed" w:cs="Bahnschrift Light SemiCondensed"/>
+          <w:color w:val="auto"/>
+          <w:sz w:val="24"/>
+          <w:szCs w:val="24"/>
+          <w:u w:val="single"/>
+          <w:lang w:val="pt-BR"/>
+        </w:rPr>
+        <w:t>nome_da_tabela_intermediaria</w:t>
+      </w:r>
+    </w:p>
+    <w:p>
+      <w:pPr>
+        <w:spacing w:beforeLines="0" w:afterLines="0"/>
+        <w:jc w:val="left"/>
+        <w:rPr>
+          <w:rFonts w:hint="default" w:ascii="Bahnschrift Light SemiCondensed" w:hAnsi="Bahnschrift Light SemiCondensed" w:cs="Bahnschrift Light SemiCondensed"/>
+          <w:b w:val="0"/>
+          <w:bCs w:val="0"/>
+          <w:color w:val="auto"/>
+          <w:sz w:val="24"/>
+          <w:szCs w:val="24"/>
+          <w:u w:val="single"/>
+          <w:lang w:val="pt-BR"/>
+        </w:rPr>
+      </w:pPr>
+      <w:r>
+        <w:rPr>
+          <w:rFonts w:hint="default" w:ascii="Bahnschrift Light SemiCondensed" w:hAnsi="Bahnschrift Light SemiCondensed" w:cs="Bahnschrift Light SemiCondensed"/>
+          <w:b/>
+          <w:color w:val="auto"/>
+          <w:sz w:val="24"/>
+          <w:szCs w:val="24"/>
+        </w:rPr>
+        <w:t>ON</w:t>
+      </w:r>
+      <w:r>
+        <w:rPr>
+          <w:rFonts w:hint="default" w:ascii="Bahnschrift Light SemiCondensed" w:hAnsi="Bahnschrift Light SemiCondensed" w:cs="Bahnschrift Light SemiCondensed"/>
+          <w:color w:val="auto"/>
+          <w:sz w:val="24"/>
+          <w:szCs w:val="24"/>
+        </w:rPr>
+        <w:t xml:space="preserve"> </w:t>
+      </w:r>
+      <w:r>
+        <w:rPr>
+          <w:rFonts w:hint="default" w:ascii="Bahnschrift Light SemiCondensed" w:hAnsi="Bahnschrift Light SemiCondensed" w:cs="Bahnschrift Light SemiCondensed"/>
+          <w:color w:val="auto"/>
+          <w:sz w:val="24"/>
+          <w:szCs w:val="24"/>
+          <w:u w:val="single"/>
+          <w:lang w:val="pt-BR"/>
+        </w:rPr>
+        <w:t>nome_da_tabela_de_referencia</w:t>
+      </w:r>
+      <w:r>
+        <w:rPr>
+          <w:rFonts w:hint="default" w:ascii="Bahnschrift Light SemiCondensed" w:hAnsi="Bahnschrift Light SemiCondensed" w:cs="Bahnschrift Light SemiCondensed"/>
+          <w:b/>
+          <w:bCs/>
+          <w:color w:val="auto"/>
+          <w:sz w:val="24"/>
+          <w:szCs w:val="24"/>
+          <w:u w:val="single"/>
+          <w:lang w:val="pt-BR"/>
+        </w:rPr>
+        <w:t>.</w:t>
+      </w:r>
+      <w:r>
+        <w:rPr>
+          <w:rFonts w:hint="default" w:ascii="Bahnschrift Light SemiCondensed" w:hAnsi="Bahnschrift Light SemiCondensed" w:cs="Bahnschrift Light SemiCondensed"/>
+          <w:b w:val="0"/>
+          <w:bCs w:val="0"/>
+          <w:color w:val="auto"/>
+          <w:sz w:val="24"/>
+          <w:szCs w:val="24"/>
+          <w:u w:val="single"/>
+          <w:lang w:val="pt-BR"/>
+        </w:rPr>
+        <w:t>id(FK_da_tabela_primária)</w:t>
+      </w:r>
+      <w:r>
+        <w:rPr>
+          <w:rFonts w:hint="default" w:ascii="Bahnschrift Light SemiCondensed" w:hAnsi="Bahnschrift Light SemiCondensed" w:cs="Bahnschrift Light SemiCondensed"/>
+          <w:b w:val="0"/>
+          <w:bCs w:val="0"/>
+          <w:color w:val="auto"/>
+          <w:sz w:val="24"/>
+          <w:szCs w:val="24"/>
+          <w:u w:val="none"/>
+          <w:lang w:val="pt-BR"/>
+        </w:rPr>
+        <w:t xml:space="preserve"> </w:t>
+      </w:r>
+      <w:r>
+        <w:rPr>
+          <w:rFonts w:hint="default" w:ascii="Bahnschrift Light SemiCondensed" w:hAnsi="Bahnschrift Light SemiCondensed" w:cs="Bahnschrift Light SemiCondensed"/>
+          <w:b/>
+          <w:bCs/>
+          <w:color w:val="auto"/>
+          <w:sz w:val="24"/>
+          <w:szCs w:val="24"/>
+          <w:u w:val="none"/>
+          <w:lang w:val="pt-BR"/>
+        </w:rPr>
+        <w:t xml:space="preserve">= </w:t>
+      </w:r>
+      <w:r>
+        <w:rPr>
+          <w:rFonts w:hint="default" w:ascii="Bahnschrift Light SemiCondensed" w:hAnsi="Bahnschrift Light SemiCondensed" w:cs="Bahnschrift Light SemiCondensed"/>
+          <w:color w:val="auto"/>
+          <w:sz w:val="24"/>
+          <w:szCs w:val="24"/>
+          <w:u w:val="single"/>
+          <w:lang w:val="pt-BR"/>
+        </w:rPr>
+        <w:t>nome_da_tabela_intermediaria</w:t>
+      </w:r>
+      <w:r>
+        <w:rPr>
+          <w:rFonts w:hint="default" w:ascii="Bahnschrift Light SemiCondensed" w:hAnsi="Bahnschrift Light SemiCondensed" w:cs="Bahnschrift Light SemiCondensed"/>
+          <w:b/>
+          <w:bCs/>
+          <w:color w:val="auto"/>
+          <w:sz w:val="24"/>
+          <w:szCs w:val="24"/>
+          <w:u w:val="single"/>
+          <w:lang w:val="pt-BR"/>
+        </w:rPr>
+        <w:t>.</w:t>
+      </w:r>
+      <w:r>
+        <w:rPr>
+          <w:rFonts w:hint="default" w:ascii="Bahnschrift Light SemiCondensed" w:hAnsi="Bahnschrift Light SemiCondensed" w:cs="Bahnschrift Light SemiCondensed"/>
+          <w:b w:val="0"/>
+          <w:bCs w:val="0"/>
+          <w:color w:val="auto"/>
+          <w:sz w:val="24"/>
+          <w:szCs w:val="24"/>
+          <w:u w:val="single"/>
+          <w:lang w:val="pt-BR"/>
+        </w:rPr>
+        <w:t>id(PK)</w:t>
+      </w:r>
+    </w:p>
+    <w:p>
+      <w:pPr>
+        <w:spacing w:beforeLines="0" w:afterLines="0"/>
+        <w:jc w:val="left"/>
+        <w:rPr>
+          <w:rFonts w:hint="default" w:ascii="Bahnschrift Light SemiCondensed" w:hAnsi="Bahnschrift Light SemiCondensed" w:cs="Bahnschrift Light SemiCondensed"/>
+          <w:color w:val="auto"/>
+          <w:sz w:val="24"/>
+          <w:szCs w:val="24"/>
+        </w:rPr>
+      </w:pPr>
+      <w:r>
+        <w:rPr>
+          <w:rFonts w:hint="default" w:ascii="Bahnschrift Light SemiCondensed" w:hAnsi="Bahnschrift Light SemiCondensed" w:cs="Bahnschrift Light SemiCondensed"/>
+          <w:b/>
+          <w:color w:val="auto"/>
+          <w:sz w:val="24"/>
+          <w:szCs w:val="24"/>
+        </w:rPr>
+        <w:t>INNER</w:t>
+      </w:r>
+      <w:r>
+        <w:rPr>
+          <w:rFonts w:hint="default" w:ascii="Bahnschrift Light SemiCondensed" w:hAnsi="Bahnschrift Light SemiCondensed" w:cs="Bahnschrift Light SemiCondensed"/>
+          <w:color w:val="auto"/>
+          <w:sz w:val="24"/>
+          <w:szCs w:val="24"/>
+        </w:rPr>
+        <w:t xml:space="preserve"> </w:t>
+      </w:r>
+      <w:r>
+        <w:rPr>
+          <w:rFonts w:hint="default" w:ascii="Bahnschrift Light SemiCondensed" w:hAnsi="Bahnschrift Light SemiCondensed" w:cs="Bahnschrift Light SemiCondensed"/>
+          <w:b/>
+          <w:color w:val="auto"/>
+          <w:sz w:val="24"/>
+          <w:szCs w:val="24"/>
+        </w:rPr>
+        <w:t>JOIN</w:t>
+      </w:r>
+      <w:r>
+        <w:rPr>
+          <w:rFonts w:hint="default" w:ascii="Bahnschrift Light SemiCondensed" w:hAnsi="Bahnschrift Light SemiCondensed" w:cs="Bahnschrift Light SemiCondensed"/>
+          <w:color w:val="auto"/>
+          <w:sz w:val="24"/>
+          <w:szCs w:val="24"/>
+        </w:rPr>
+        <w:t xml:space="preserve"> </w:t>
+      </w:r>
+      <w:r>
+        <w:rPr>
+          <w:rFonts w:hint="default" w:ascii="Bahnschrift Light SemiCondensed" w:hAnsi="Bahnschrift Light SemiCondensed" w:cs="Bahnschrift Light SemiCondensed"/>
+          <w:b w:val="0"/>
+          <w:bCs w:val="0"/>
+          <w:color w:val="auto"/>
+          <w:sz w:val="24"/>
+          <w:szCs w:val="24"/>
+          <w:u w:val="single"/>
+          <w:lang w:val="pt-BR"/>
+        </w:rPr>
+        <w:t>nome_da_tabela_secundaria</w:t>
+      </w:r>
+    </w:p>
+    <w:p>
+      <w:pPr>
+        <w:spacing w:beforeLines="0" w:afterLines="0"/>
+        <w:jc w:val="left"/>
+        <w:rPr>
+          <w:rFonts w:hint="default" w:ascii="Bahnschrift Light SemiCondensed" w:hAnsi="Bahnschrift Light SemiCondensed" w:cs="Bahnschrift Light SemiCondensed"/>
+          <w:color w:val="auto"/>
+          <w:sz w:val="24"/>
+          <w:szCs w:val="24"/>
+          <w:lang w:val="pt-BR"/>
+        </w:rPr>
+      </w:pPr>
+      <w:r>
+        <w:rPr>
+          <w:rFonts w:hint="default" w:ascii="Bahnschrift Light SemiCondensed" w:hAnsi="Bahnschrift Light SemiCondensed" w:cs="Bahnschrift Light SemiCondensed"/>
+          <w:b/>
+          <w:color w:val="auto"/>
+          <w:sz w:val="24"/>
+          <w:szCs w:val="24"/>
+        </w:rPr>
+        <w:t>ON</w:t>
+      </w:r>
+      <w:r>
+        <w:rPr>
+          <w:rFonts w:hint="default" w:ascii="Bahnschrift Light SemiCondensed" w:hAnsi="Bahnschrift Light SemiCondensed" w:cs="Bahnschrift Light SemiCondensed"/>
+          <w:color w:val="auto"/>
+          <w:sz w:val="24"/>
+          <w:szCs w:val="24"/>
+        </w:rPr>
+        <w:t xml:space="preserve"> </w:t>
+      </w:r>
+      <w:r>
+        <w:rPr>
+          <w:rFonts w:hint="default" w:ascii="Bahnschrift Light SemiCondensed" w:hAnsi="Bahnschrift Light SemiCondensed" w:cs="Bahnschrift Light SemiCondensed"/>
+          <w:color w:val="auto"/>
+          <w:sz w:val="24"/>
+          <w:szCs w:val="24"/>
+          <w:u w:val="single"/>
+          <w:lang w:val="pt-BR"/>
+        </w:rPr>
+        <w:t>nome_da_tabela_intermediaria</w:t>
+      </w:r>
+      <w:r>
+        <w:rPr>
+          <w:rFonts w:hint="default" w:ascii="Bahnschrift Light SemiCondensed" w:hAnsi="Bahnschrift Light SemiCondensed" w:cs="Bahnschrift Light SemiCondensed"/>
+          <w:b/>
+          <w:bCs/>
+          <w:color w:val="auto"/>
+          <w:sz w:val="24"/>
+          <w:szCs w:val="24"/>
+          <w:u w:val="single"/>
+          <w:lang w:val="pt-BR"/>
+        </w:rPr>
+        <w:t>.</w:t>
+      </w:r>
+      <w:r>
+        <w:rPr>
+          <w:rFonts w:hint="default" w:ascii="Bahnschrift Light SemiCondensed" w:hAnsi="Bahnschrift Light SemiCondensed" w:cs="Bahnschrift Light SemiCondensed"/>
+          <w:b w:val="0"/>
+          <w:bCs w:val="0"/>
+          <w:color w:val="auto"/>
+          <w:sz w:val="24"/>
+          <w:szCs w:val="24"/>
+          <w:u w:val="single"/>
+          <w:lang w:val="pt-BR"/>
+        </w:rPr>
+        <w:t>id(FK_da_tabela_secundaria)</w:t>
+      </w:r>
+      <w:r>
+        <w:rPr>
+          <w:rFonts w:hint="default" w:ascii="Bahnschrift Light SemiCondensed" w:hAnsi="Bahnschrift Light SemiCondensed" w:cs="Bahnschrift Light SemiCondensed"/>
+          <w:color w:val="auto"/>
+          <w:sz w:val="24"/>
+          <w:szCs w:val="24"/>
+        </w:rPr>
+        <w:t xml:space="preserve"> = </w:t>
+      </w:r>
+      <w:r>
+        <w:rPr>
+          <w:rFonts w:hint="default" w:ascii="Bahnschrift Light SemiCondensed" w:hAnsi="Bahnschrift Light SemiCondensed" w:cs="Bahnschrift Light SemiCondensed"/>
+          <w:color w:val="auto"/>
+          <w:sz w:val="24"/>
+          <w:szCs w:val="24"/>
+          <w:u w:val="single"/>
+          <w:lang w:val="pt-BR"/>
+        </w:rPr>
+        <w:t>nome_da_tabela_secundaria</w:t>
+      </w:r>
+      <w:r>
+        <w:rPr>
+          <w:rFonts w:hint="default" w:ascii="Bahnschrift Light SemiCondensed" w:hAnsi="Bahnschrift Light SemiCondensed" w:cs="Bahnschrift Light SemiCondensed"/>
+          <w:b/>
+          <w:bCs/>
+          <w:color w:val="auto"/>
+          <w:sz w:val="24"/>
+          <w:szCs w:val="24"/>
+          <w:u w:val="single"/>
+          <w:lang w:val="pt-BR"/>
+        </w:rPr>
+        <w:t>.</w:t>
+      </w:r>
+      <w:r>
+        <w:rPr>
+          <w:rFonts w:hint="default" w:ascii="Bahnschrift Light SemiCondensed" w:hAnsi="Bahnschrift Light SemiCondensed" w:cs="Bahnschrift Light SemiCondensed"/>
+          <w:b w:val="0"/>
+          <w:bCs w:val="0"/>
+          <w:color w:val="auto"/>
+          <w:sz w:val="24"/>
+          <w:szCs w:val="24"/>
+          <w:u w:val="single"/>
+          <w:lang w:val="pt-BR"/>
+        </w:rPr>
+        <w:t>(PK)</w:t>
+      </w:r>
+      <w:r>
+        <w:rPr>
+          <w:rFonts w:hint="default" w:ascii="Bahnschrift Light SemiCondensed" w:hAnsi="Bahnschrift Light SemiCondensed" w:cs="Bahnschrift Light SemiCondensed"/>
+          <w:color w:val="auto"/>
+          <w:sz w:val="24"/>
+          <w:szCs w:val="24"/>
+        </w:rPr>
+        <w:t>;</w:t>
+      </w:r>
+      <w:r>
+        <w:rPr>
+          <w:rFonts w:hint="default" w:ascii="Bahnschrift Light SemiCondensed" w:hAnsi="Bahnschrift Light SemiCondensed" w:cs="Bahnschrift Light SemiCondensed"/>
+          <w:color w:val="auto"/>
+          <w:sz w:val="24"/>
+          <w:szCs w:val="24"/>
+          <w:lang w:val="pt-BR"/>
+        </w:rPr>
+        <w:tab/>
+        <w:t/>
+      </w:r>
+      <w:r>
+        <w:rPr>
+          <w:rFonts w:hint="default" w:ascii="Bahnschrift Light SemiCondensed" w:hAnsi="Bahnschrift Light SemiCondensed" w:cs="Bahnschrift Light SemiCondensed"/>
+          <w:color w:val="auto"/>
+          <w:sz w:val="24"/>
+          <w:szCs w:val="24"/>
+          <w:lang w:val="pt-BR"/>
+        </w:rPr>
+        <w:tab/>
+        <w:t/>
+      </w:r>
+      <w:r>
+        <w:rPr>
+          <w:rFonts w:hint="default" w:ascii="Bahnschrift Light SemiCondensed" w:hAnsi="Bahnschrift Light SemiCondensed" w:cs="Bahnschrift Light SemiCondensed"/>
+          <w:color w:val="auto"/>
+          <w:sz w:val="24"/>
+          <w:szCs w:val="24"/>
+          <w:lang w:val="pt-BR"/>
+        </w:rPr>
+        <w:tab/>
+        <w:t>→</w:t>
+      </w:r>
+      <w:r>
+        <w:rPr>
+          <w:rFonts w:hint="default" w:ascii="Bahnschrift Light SemiCondensed" w:hAnsi="Bahnschrift Light SemiCondensed" w:cs="Bahnschrift Light SemiCondensed"/>
+          <w:color w:val="auto"/>
+          <w:sz w:val="24"/>
+          <w:szCs w:val="24"/>
+          <w:lang w:val="pt-BR"/>
+        </w:rPr>
+        <w:tab/>
+        <w:t/>
+      </w:r>
+      <w:r>
+        <w:rPr>
+          <w:rFonts w:hint="default" w:ascii="Bahnschrift Light SemiCondensed" w:hAnsi="Bahnschrift Light SemiCondensed" w:cs="Bahnschrift Light SemiCondensed"/>
+          <w:color w:val="auto"/>
+          <w:sz w:val="24"/>
+          <w:szCs w:val="24"/>
+          <w:lang w:val="pt-BR"/>
+        </w:rPr>
+        <w:tab/>
+        <w:t/>
+      </w:r>
+      <w:r>
+        <w:rPr>
+          <w:rFonts w:hint="default" w:ascii="Bahnschrift Light SemiCondensed" w:hAnsi="Bahnschrift Light SemiCondensed" w:cs="Bahnschrift Light SemiCondensed"/>
+          <w:color w:val="auto"/>
+          <w:sz w:val="24"/>
+          <w:szCs w:val="24"/>
+          <w:lang w:val="pt-BR"/>
+        </w:rPr>
+        <w:tab/>
+      </w:r>
+    </w:p>
+    <w:p>
+      <w:pPr>
+        <w:spacing w:beforeLines="0" w:afterLines="0"/>
+        <w:jc w:val="left"/>
+        <w:rPr>
+          <w:rFonts w:hint="default" w:ascii="Bahnschrift Light SemiCondensed" w:hAnsi="Bahnschrift Light SemiCondensed" w:cs="Bahnschrift Light SemiCondensed"/>
+          <w:color w:val="auto"/>
+          <w:sz w:val="24"/>
+          <w:szCs w:val="24"/>
+          <w:lang w:val="pt-BR"/>
+        </w:rPr>
+      </w:pPr>
+    </w:p>
+    <w:p>
+      <w:pPr>
+        <w:spacing w:beforeLines="0" w:afterLines="0"/>
+        <w:ind w:firstLine="708" w:firstLineChars="0"/>
+        <w:jc w:val="left"/>
+        <w:rPr>
+          <w:rFonts w:hint="default" w:ascii="Bahnschrift Light SemiCondensed" w:hAnsi="Bahnschrift Light SemiCondensed" w:cs="Bahnschrift Light SemiCondensed"/>
+          <w:b w:val="0"/>
+          <w:bCs w:val="0"/>
+          <w:color w:val="auto"/>
+          <w:sz w:val="24"/>
+          <w:szCs w:val="24"/>
+          <w:lang w:val="pt-BR"/>
+        </w:rPr>
+      </w:pPr>
+      <w:r>
+        <w:rPr>
+          <w:rFonts w:hint="default" w:ascii="Bahnschrift Light SemiCondensed" w:hAnsi="Bahnschrift Light SemiCondensed" w:cs="Bahnschrift Light SemiCondensed"/>
+          <w:color w:val="auto"/>
+          <w:sz w:val="24"/>
+          <w:szCs w:val="24"/>
+          <w:lang w:val="pt-BR"/>
+        </w:rPr>
+        <w:t xml:space="preserve">Comando utilizado para consultar os dados a partir de um relacionamento </w:t>
+      </w:r>
+      <w:r>
+        <w:rPr>
+          <w:rFonts w:hint="default" w:ascii="Bahnschrift Light SemiCondensed" w:hAnsi="Bahnschrift Light SemiCondensed" w:cs="Bahnschrift Light SemiCondensed"/>
+          <w:b/>
+          <w:bCs/>
+          <w:color w:val="auto"/>
+          <w:sz w:val="24"/>
+          <w:szCs w:val="24"/>
+          <w:lang w:val="pt-BR"/>
+        </w:rPr>
+        <w:t>many-to-many(muitos-para-muitos).</w:t>
+      </w:r>
+      <w:r>
+        <w:rPr>
+          <w:rFonts w:hint="default" w:ascii="Bahnschrift Light SemiCondensed" w:hAnsi="Bahnschrift Light SemiCondensed" w:cs="Bahnschrift Light SemiCondensed"/>
+          <w:b w:val="0"/>
+          <w:bCs w:val="0"/>
+          <w:color w:val="auto"/>
+          <w:sz w:val="24"/>
+          <w:szCs w:val="24"/>
+          <w:lang w:val="pt-BR"/>
+        </w:rPr>
+        <w:t xml:space="preserve"> </w:t>
+      </w:r>
+    </w:p>
+    <w:p>
+      <w:pPr>
+        <w:spacing w:beforeLines="0" w:afterLines="0"/>
+        <w:ind w:firstLine="708" w:firstLineChars="0"/>
+        <w:jc w:val="left"/>
+        <w:rPr>
+          <w:rFonts w:hint="default" w:ascii="Bahnschrift Light SemiCondensed" w:hAnsi="Bahnschrift Light SemiCondensed" w:cs="Bahnschrift Light SemiCondensed"/>
+          <w:b w:val="0"/>
+          <w:bCs w:val="0"/>
+          <w:color w:val="auto"/>
+          <w:sz w:val="24"/>
+          <w:szCs w:val="24"/>
+          <w:lang w:val="pt-BR"/>
+        </w:rPr>
+      </w:pPr>
+    </w:p>
+    <w:p>
+      <w:pPr>
+        <w:spacing w:beforeLines="0" w:afterLines="0"/>
+        <w:jc w:val="left"/>
+        <w:rPr>
+          <w:rFonts w:hint="default" w:ascii="Bahnschrift Light SemiCondensed" w:hAnsi="Bahnschrift Light SemiCondensed" w:cs="Bahnschrift Light SemiCondensed"/>
+          <w:b/>
+          <w:bCs/>
+          <w:color w:val="auto"/>
+          <w:sz w:val="24"/>
+          <w:szCs w:val="24"/>
+          <w:lang w:val="pt-BR"/>
+        </w:rPr>
+      </w:pPr>
+      <w:r>
+        <w:rPr>
+          <w:rFonts w:hint="default" w:ascii="Bahnschrift Light SemiCondensed" w:hAnsi="Bahnschrift Light SemiCondensed" w:cs="Bahnschrift Light SemiCondensed"/>
+          <w:b/>
+          <w:bCs/>
+          <w:color w:val="auto"/>
+          <w:sz w:val="24"/>
+          <w:szCs w:val="24"/>
+          <w:lang w:val="pt-BR"/>
+        </w:rPr>
+        <w:t xml:space="preserve">OBS.: </w:t>
+      </w:r>
+      <w:r>
+        <w:rPr>
+          <w:rFonts w:hint="default" w:ascii="Bahnschrift Light SemiCondensed" w:hAnsi="Bahnschrift Light SemiCondensed" w:cs="Bahnschrift Light SemiCondensed"/>
+          <w:b w:val="0"/>
+          <w:bCs w:val="0"/>
+          <w:color w:val="auto"/>
+          <w:sz w:val="24"/>
+          <w:szCs w:val="24"/>
+          <w:lang w:val="pt-BR"/>
+        </w:rPr>
+        <w:t>Nesse caso precisamos criar uma tabela intermediária que se relacionará com ambas as tabelas.</w:t>
+      </w:r>
       <w:bookmarkStart w:id="0" w:name="_GoBack"/>
       <w:bookmarkEnd w:id="0"/>
     </w:p>

</xml_diff>